<commit_message>
Create Database and Configuraton
</commit_message>
<xml_diff>
--- a/Laravel.docx
+++ b/Laravel.docx
@@ -145,10 +145,6 @@
             <w:insideH w:val="single" w:color="auto" w:sz="4" w:space="0"/>
             <w:insideV w:val="single" w:color="auto" w:sz="4" w:space="0"/>
           </w:tblBorders>
-          <w:tblCellMar>
-            <w:left w:w="108" w:type="dxa"/>
-            <w:right w:w="108" w:type="dxa"/>
-          </w:tblCellMar>
         </w:tblPrEx>
         <w:tc>
           <w:tcPr>
@@ -306,14 +302,6 @@
       </w:tblGrid>
       <w:tr>
         <w:tblPrEx>
-          <w:tblBorders>
-            <w:top w:val="single" w:color="auto" w:sz="4" w:space="0"/>
-            <w:left w:val="single" w:color="auto" w:sz="4" w:space="0"/>
-            <w:bottom w:val="single" w:color="auto" w:sz="4" w:space="0"/>
-            <w:right w:val="single" w:color="auto" w:sz="4" w:space="0"/>
-            <w:insideH w:val="single" w:color="auto" w:sz="4" w:space="0"/>
-            <w:insideV w:val="single" w:color="auto" w:sz="4" w:space="0"/>
-          </w:tblBorders>
           <w:tblCellMar>
             <w:left w:w="108" w:type="dxa"/>
             <w:right w:w="108" w:type="dxa"/>
@@ -405,14 +393,6 @@
     <w:p>
       <w:pPr>
         <w:jc w:val="both"/>
-        <w:rPr>
-          <w:rFonts w:hint="default"/>
-          <w:b w:val="0"/>
-          <w:bCs w:val="0"/>
-          <w:sz w:val="24"/>
-          <w:szCs w:val="24"/>
-          <w:lang w:val="en-US"/>
-        </w:rPr>
       </w:pPr>
       <w:r>
         <w:drawing>
@@ -457,8 +437,396 @@
           </wp:inline>
         </w:drawing>
       </w:r>
+    </w:p>
+    <w:p>
+      <w:pPr>
+        <w:jc w:val="both"/>
+      </w:pPr>
+    </w:p>
+    <w:p>
+      <w:pPr>
+        <w:jc w:val="both"/>
+        <w:rPr>
+          <w:rFonts w:hint="default"/>
+          <w:b/>
+          <w:bCs/>
+          <w:lang w:val="en-US"/>
+        </w:rPr>
+      </w:pPr>
+      <w:r>
+        <w:rPr>
+          <w:rFonts w:hint="default"/>
+          <w:b/>
+          <w:bCs/>
+          <w:lang w:val="en-US"/>
+        </w:rPr>
+        <w:t>Create Database and Configuration</w:t>
+      </w:r>
+    </w:p>
+    <w:p>
+      <w:pPr>
+        <w:jc w:val="both"/>
+        <w:rPr>
+          <w:rFonts w:hint="default"/>
+          <w:b/>
+          <w:bCs/>
+          <w:lang w:val="en-US"/>
+        </w:rPr>
+      </w:pPr>
+    </w:p>
+    <w:p>
+      <w:pPr>
+        <w:jc w:val="both"/>
+        <w:rPr>
+          <w:rFonts w:hint="default"/>
+          <w:b w:val="0"/>
+          <w:bCs w:val="0"/>
+          <w:lang w:val="en-US"/>
+        </w:rPr>
+      </w:pPr>
+      <w:r>
+        <w:rPr>
+          <w:rFonts w:hint="default"/>
+          <w:b w:val="0"/>
+          <w:bCs w:val="0"/>
+          <w:lang w:val="en-US"/>
+        </w:rPr>
+        <w:t>To create a database first you need to go to the phpmyadmin. In our project we are using mamp. So, to go to php myadmin you need to open MAMP and click on Open WebStart Page as shown below:</w:t>
+      </w:r>
+    </w:p>
+    <w:p>
+      <w:pPr>
+        <w:jc w:val="both"/>
+      </w:pPr>
+      <w:r>
+        <w:drawing>
+          <wp:inline distT="0" distB="0" distL="114300" distR="114300">
+            <wp:extent cx="4077970" cy="3604260"/>
+            <wp:effectExtent l="0" t="0" r="6350" b="7620"/>
+            <wp:docPr id="2" name="Picture 2"/>
+            <wp:cNvGraphicFramePr>
+              <a:graphicFrameLocks xmlns:a="http://schemas.openxmlformats.org/drawingml/2006/main" noChangeAspect="1"/>
+            </wp:cNvGraphicFramePr>
+            <a:graphic xmlns:a="http://schemas.openxmlformats.org/drawingml/2006/main">
+              <a:graphicData uri="http://schemas.openxmlformats.org/drawingml/2006/picture">
+                <pic:pic xmlns:pic="http://schemas.openxmlformats.org/drawingml/2006/picture">
+                  <pic:nvPicPr>
+                    <pic:cNvPr id="2" name="Picture 2"/>
+                    <pic:cNvPicPr>
+                      <a:picLocks noChangeAspect="1"/>
+                    </pic:cNvPicPr>
+                  </pic:nvPicPr>
+                  <pic:blipFill>
+                    <a:blip r:embed="rId5"/>
+                    <a:stretch>
+                      <a:fillRect/>
+                    </a:stretch>
+                  </pic:blipFill>
+                  <pic:spPr>
+                    <a:xfrm>
+                      <a:off x="0" y="0"/>
+                      <a:ext cx="4077970" cy="3604260"/>
+                    </a:xfrm>
+                    <a:prstGeom prst="rect">
+                      <a:avLst/>
+                    </a:prstGeom>
+                    <a:noFill/>
+                    <a:ln>
+                      <a:noFill/>
+                    </a:ln>
+                  </pic:spPr>
+                </pic:pic>
+              </a:graphicData>
+            </a:graphic>
+          </wp:inline>
+        </w:drawing>
+      </w:r>
+    </w:p>
+    <w:p>
+      <w:pPr>
+        <w:jc w:val="both"/>
+      </w:pPr>
+    </w:p>
+    <w:p>
+      <w:pPr>
+        <w:jc w:val="both"/>
+        <w:rPr>
+          <w:rFonts w:hint="default"/>
+          <w:lang w:val="en-US"/>
+        </w:rPr>
+      </w:pPr>
+      <w:r>
+        <w:rPr>
+          <w:rFonts w:hint="default"/>
+          <w:lang w:val="en-US"/>
+        </w:rPr>
+        <w:t>After clicking it mamp localhost server is opened and below you can find phpMyAdmin link where you need to click it.</w:t>
+      </w:r>
+    </w:p>
+    <w:p>
+      <w:pPr>
+        <w:jc w:val="both"/>
+      </w:pPr>
+      <w:r>
+        <w:drawing>
+          <wp:inline distT="0" distB="0" distL="114300" distR="114300">
+            <wp:extent cx="5273675" cy="2320290"/>
+            <wp:effectExtent l="0" t="0" r="14605" b="11430"/>
+            <wp:docPr id="3" name="Picture 3"/>
+            <wp:cNvGraphicFramePr>
+              <a:graphicFrameLocks xmlns:a="http://schemas.openxmlformats.org/drawingml/2006/main" noChangeAspect="1"/>
+            </wp:cNvGraphicFramePr>
+            <a:graphic xmlns:a="http://schemas.openxmlformats.org/drawingml/2006/main">
+              <a:graphicData uri="http://schemas.openxmlformats.org/drawingml/2006/picture">
+                <pic:pic xmlns:pic="http://schemas.openxmlformats.org/drawingml/2006/picture">
+                  <pic:nvPicPr>
+                    <pic:cNvPr id="3" name="Picture 3"/>
+                    <pic:cNvPicPr>
+                      <a:picLocks noChangeAspect="1"/>
+                    </pic:cNvPicPr>
+                  </pic:nvPicPr>
+                  <pic:blipFill>
+                    <a:blip r:embed="rId6"/>
+                    <a:stretch>
+                      <a:fillRect/>
+                    </a:stretch>
+                  </pic:blipFill>
+                  <pic:spPr>
+                    <a:xfrm>
+                      <a:off x="0" y="0"/>
+                      <a:ext cx="5273675" cy="2320290"/>
+                    </a:xfrm>
+                    <a:prstGeom prst="rect">
+                      <a:avLst/>
+                    </a:prstGeom>
+                    <a:noFill/>
+                    <a:ln>
+                      <a:noFill/>
+                    </a:ln>
+                  </pic:spPr>
+                </pic:pic>
+              </a:graphicData>
+            </a:graphic>
+          </wp:inline>
+        </w:drawing>
+      </w:r>
+    </w:p>
+    <w:p>
+      <w:pPr>
+        <w:jc w:val="both"/>
+      </w:pPr>
+    </w:p>
+    <w:p>
+      <w:pPr>
+        <w:jc w:val="both"/>
+        <w:rPr>
+          <w:rFonts w:hint="default"/>
+          <w:lang w:val="en-US"/>
+        </w:rPr>
+      </w:pPr>
+      <w:r>
+        <w:rPr>
+          <w:rFonts w:hint="default"/>
+          <w:lang w:val="en-US"/>
+        </w:rPr>
+        <w:t>Clicking it will redirect you to the phpmyadmin page.</w:t>
+      </w:r>
+    </w:p>
+    <w:p>
+      <w:pPr>
+        <w:jc w:val="both"/>
+      </w:pPr>
+      <w:r>
+        <w:drawing>
+          <wp:inline distT="0" distB="0" distL="114300" distR="114300">
+            <wp:extent cx="5273040" cy="2007870"/>
+            <wp:effectExtent l="0" t="0" r="0" b="3810"/>
+            <wp:docPr id="5" name="Picture 5"/>
+            <wp:cNvGraphicFramePr>
+              <a:graphicFrameLocks xmlns:a="http://schemas.openxmlformats.org/drawingml/2006/main" noChangeAspect="1"/>
+            </wp:cNvGraphicFramePr>
+            <a:graphic xmlns:a="http://schemas.openxmlformats.org/drawingml/2006/main">
+              <a:graphicData uri="http://schemas.openxmlformats.org/drawingml/2006/picture">
+                <pic:pic xmlns:pic="http://schemas.openxmlformats.org/drawingml/2006/picture">
+                  <pic:nvPicPr>
+                    <pic:cNvPr id="5" name="Picture 5"/>
+                    <pic:cNvPicPr>
+                      <a:picLocks noChangeAspect="1"/>
+                    </pic:cNvPicPr>
+                  </pic:nvPicPr>
+                  <pic:blipFill>
+                    <a:blip r:embed="rId7"/>
+                    <a:stretch>
+                      <a:fillRect/>
+                    </a:stretch>
+                  </pic:blipFill>
+                  <pic:spPr>
+                    <a:xfrm>
+                      <a:off x="0" y="0"/>
+                      <a:ext cx="5273040" cy="2007870"/>
+                    </a:xfrm>
+                    <a:prstGeom prst="rect">
+                      <a:avLst/>
+                    </a:prstGeom>
+                    <a:noFill/>
+                    <a:ln>
+                      <a:noFill/>
+                    </a:ln>
+                  </pic:spPr>
+                </pic:pic>
+              </a:graphicData>
+            </a:graphic>
+          </wp:inline>
+        </w:drawing>
+      </w:r>
+    </w:p>
+    <w:p>
+      <w:pPr>
+        <w:jc w:val="both"/>
+        <w:rPr>
+          <w:rFonts w:hint="default"/>
+          <w:lang w:val="en-US"/>
+        </w:rPr>
+      </w:pPr>
+      <w:r>
+        <w:rPr>
+          <w:rFonts w:hint="default"/>
+          <w:lang w:val="en-US"/>
+        </w:rPr>
+        <w:t>Then go to the database tab and provide database name and click on the create button.</w:t>
+      </w:r>
+    </w:p>
+    <w:p>
+      <w:pPr>
+        <w:jc w:val="both"/>
+      </w:pPr>
+      <w:r>
+        <w:drawing>
+          <wp:inline distT="0" distB="0" distL="114300" distR="114300">
+            <wp:extent cx="5271770" cy="3101340"/>
+            <wp:effectExtent l="0" t="0" r="1270" b="7620"/>
+            <wp:docPr id="6" name="Picture 6"/>
+            <wp:cNvGraphicFramePr>
+              <a:graphicFrameLocks xmlns:a="http://schemas.openxmlformats.org/drawingml/2006/main" noChangeAspect="1"/>
+            </wp:cNvGraphicFramePr>
+            <a:graphic xmlns:a="http://schemas.openxmlformats.org/drawingml/2006/main">
+              <a:graphicData uri="http://schemas.openxmlformats.org/drawingml/2006/picture">
+                <pic:pic xmlns:pic="http://schemas.openxmlformats.org/drawingml/2006/picture">
+                  <pic:nvPicPr>
+                    <pic:cNvPr id="6" name="Picture 6"/>
+                    <pic:cNvPicPr>
+                      <a:picLocks noChangeAspect="1"/>
+                    </pic:cNvPicPr>
+                  </pic:nvPicPr>
+                  <pic:blipFill>
+                    <a:blip r:embed="rId8"/>
+                    <a:stretch>
+                      <a:fillRect/>
+                    </a:stretch>
+                  </pic:blipFill>
+                  <pic:spPr>
+                    <a:xfrm>
+                      <a:off x="0" y="0"/>
+                      <a:ext cx="5271770" cy="3101340"/>
+                    </a:xfrm>
+                    <a:prstGeom prst="rect">
+                      <a:avLst/>
+                    </a:prstGeom>
+                    <a:noFill/>
+                    <a:ln>
+                      <a:noFill/>
+                    </a:ln>
+                  </pic:spPr>
+                </pic:pic>
+              </a:graphicData>
+            </a:graphic>
+          </wp:inline>
+        </w:drawing>
+      </w:r>
+    </w:p>
+    <w:p>
+      <w:pPr>
+        <w:jc w:val="both"/>
+      </w:pPr>
+    </w:p>
+    <w:p>
+      <w:pPr>
+        <w:jc w:val="both"/>
+        <w:rPr>
+          <w:rFonts w:hint="default"/>
+          <w:lang w:val="en-US"/>
+        </w:rPr>
+      </w:pPr>
+      <w:r>
+        <w:rPr>
+          <w:rFonts w:hint="default"/>
+          <w:lang w:val="en-US"/>
+        </w:rPr>
+        <w:t>After creating the database go to your project and go to .env file. Here, you go to the DB section where you need to set it as shown below:</w:t>
+      </w:r>
+    </w:p>
+    <w:p>
+      <w:pPr>
+        <w:jc w:val="both"/>
+        <w:rPr>
+          <w:rFonts w:hint="default"/>
+          <w:lang w:val="en-US"/>
+        </w:rPr>
+      </w:pPr>
+      <w:r>
+        <w:drawing>
+          <wp:inline distT="0" distB="0" distL="114300" distR="114300">
+            <wp:extent cx="3551555" cy="4053205"/>
+            <wp:effectExtent l="0" t="0" r="14605" b="635"/>
+            <wp:docPr id="7" name="Picture 7"/>
+            <wp:cNvGraphicFramePr>
+              <a:graphicFrameLocks xmlns:a="http://schemas.openxmlformats.org/drawingml/2006/main" noChangeAspect="1"/>
+            </wp:cNvGraphicFramePr>
+            <a:graphic xmlns:a="http://schemas.openxmlformats.org/drawingml/2006/main">
+              <a:graphicData uri="http://schemas.openxmlformats.org/drawingml/2006/picture">
+                <pic:pic xmlns:pic="http://schemas.openxmlformats.org/drawingml/2006/picture">
+                  <pic:nvPicPr>
+                    <pic:cNvPr id="7" name="Picture 7"/>
+                    <pic:cNvPicPr>
+                      <a:picLocks noChangeAspect="1"/>
+                    </pic:cNvPicPr>
+                  </pic:nvPicPr>
+                  <pic:blipFill>
+                    <a:blip r:embed="rId9"/>
+                    <a:stretch>
+                      <a:fillRect/>
+                    </a:stretch>
+                  </pic:blipFill>
+                  <pic:spPr>
+                    <a:xfrm>
+                      <a:off x="0" y="0"/>
+                      <a:ext cx="3551555" cy="4053205"/>
+                    </a:xfrm>
+                    <a:prstGeom prst="rect">
+                      <a:avLst/>
+                    </a:prstGeom>
+                    <a:noFill/>
+                    <a:ln>
+                      <a:noFill/>
+                    </a:ln>
+                  </pic:spPr>
+                </pic:pic>
+              </a:graphicData>
+            </a:graphic>
+          </wp:inline>
+        </w:drawing>
+      </w:r>
       <w:bookmarkStart w:id="0" w:name="_GoBack"/>
       <w:bookmarkEnd w:id="0"/>
+    </w:p>
+    <w:p>
+      <w:pPr>
+        <w:jc w:val="both"/>
+        <w:rPr>
+          <w:rFonts w:hint="default"/>
+          <w:lang w:val="en-US"/>
+        </w:rPr>
+      </w:pPr>
     </w:p>
     <w:sectPr>
       <w:pgSz w:w="11906" w:h="16838"/>

</xml_diff>

<commit_message>
Laravel Brreze Verify Email System
</commit_message>
<xml_diff>
--- a/Laravel.docx
+++ b/Laravel.docx
@@ -960,6 +960,14 @@
       </w:tblGrid>
       <w:tr>
         <w:tblPrEx>
+          <w:tblBorders>
+            <w:top w:val="single" w:color="auto" w:sz="4" w:space="0"/>
+            <w:left w:val="single" w:color="auto" w:sz="4" w:space="0"/>
+            <w:bottom w:val="single" w:color="auto" w:sz="4" w:space="0"/>
+            <w:right w:val="single" w:color="auto" w:sz="4" w:space="0"/>
+            <w:insideH w:val="single" w:color="auto" w:sz="4" w:space="0"/>
+            <w:insideV w:val="single" w:color="auto" w:sz="4" w:space="0"/>
+          </w:tblBorders>
           <w:tblCellMar>
             <w:left w:w="108" w:type="dxa"/>
             <w:right w:w="108" w:type="dxa"/>
@@ -1591,6 +1599,10 @@
             <w:insideH w:val="single" w:color="auto" w:sz="4" w:space="0"/>
             <w:insideV w:val="single" w:color="auto" w:sz="4" w:space="0"/>
           </w:tblBorders>
+          <w:tblCellMar>
+            <w:left w:w="108" w:type="dxa"/>
+            <w:right w:w="108" w:type="dxa"/>
+          </w:tblCellMar>
         </w:tblPrEx>
         <w:tc>
           <w:tcPr>
@@ -1970,15 +1982,751 @@
     <w:p>
       <w:pPr>
         <w:numPr>
+          <w:ilvl w:val="0"/>
+          <w:numId w:val="1"/>
+        </w:numPr>
+        <w:ind w:left="0" w:leftChars="0" w:firstLine="0" w:firstLineChars="0"/>
+        <w:jc w:val="both"/>
+        <w:rPr>
+          <w:rFonts w:hint="default"/>
+          <w:b/>
+          <w:bCs/>
+          <w:sz w:val="24"/>
+          <w:szCs w:val="24"/>
+          <w:lang w:val="en-US"/>
+        </w:rPr>
+      </w:pPr>
+      <w:r>
+        <w:rPr>
+          <w:rFonts w:hint="default"/>
+          <w:b/>
+          <w:bCs/>
+          <w:sz w:val="24"/>
+          <w:szCs w:val="24"/>
+          <w:lang w:val="en-US"/>
+        </w:rPr>
+        <w:t xml:space="preserve"> Laravel Breeze Verify Email System</w:t>
+      </w:r>
+    </w:p>
+    <w:p>
+      <w:pPr>
+        <w:numPr>
           <w:numId w:val="0"/>
         </w:numPr>
-        <w:ind w:leftChars="0"/>
-        <w:jc w:val="both"/>
-        <w:rPr>
-          <w:rFonts w:hint="default"/>
-          <w:lang w:val="en-US"/>
-        </w:rPr>
-      </w:pPr>
+        <w:jc w:val="both"/>
+        <w:rPr>
+          <w:rFonts w:hint="default"/>
+          <w:b/>
+          <w:bCs/>
+          <w:sz w:val="24"/>
+          <w:szCs w:val="24"/>
+          <w:lang w:val="en-US"/>
+        </w:rPr>
+      </w:pPr>
+    </w:p>
+    <w:p>
+      <w:pPr>
+        <w:numPr>
+          <w:numId w:val="0"/>
+        </w:numPr>
+        <w:jc w:val="both"/>
+        <w:rPr>
+          <w:rFonts w:hint="default"/>
+          <w:b w:val="0"/>
+          <w:bCs w:val="0"/>
+          <w:sz w:val="20"/>
+          <w:szCs w:val="20"/>
+          <w:lang w:val="en-US"/>
+        </w:rPr>
+      </w:pPr>
+      <w:r>
+        <w:rPr>
+          <w:rFonts w:hint="default"/>
+          <w:b w:val="0"/>
+          <w:bCs w:val="0"/>
+          <w:sz w:val="20"/>
+          <w:szCs w:val="20"/>
+          <w:lang w:val="en-US"/>
+        </w:rPr>
+        <w:t>Now we will create a verify email system in our project . To do this first we need to go to the mailtrap.io and login. Go to Email Sandbox-&gt;Start Testing-&gt;My Sandbox. The following page will be displayed:</w:t>
+      </w:r>
+    </w:p>
+    <w:p>
+      <w:pPr>
+        <w:numPr>
+          <w:numId w:val="0"/>
+        </w:numPr>
+        <w:jc w:val="both"/>
+      </w:pPr>
+      <w:r>
+        <w:drawing>
+          <wp:inline distT="0" distB="0" distL="114300" distR="114300">
+            <wp:extent cx="5271770" cy="2461260"/>
+            <wp:effectExtent l="0" t="0" r="1270" b="7620"/>
+            <wp:docPr id="16" name="Picture 11"/>
+            <wp:cNvGraphicFramePr>
+              <a:graphicFrameLocks xmlns:a="http://schemas.openxmlformats.org/drawingml/2006/main" noChangeAspect="1"/>
+            </wp:cNvGraphicFramePr>
+            <a:graphic xmlns:a="http://schemas.openxmlformats.org/drawingml/2006/main">
+              <a:graphicData uri="http://schemas.openxmlformats.org/drawingml/2006/picture">
+                <pic:pic xmlns:pic="http://schemas.openxmlformats.org/drawingml/2006/picture">
+                  <pic:nvPicPr>
+                    <pic:cNvPr id="16" name="Picture 11"/>
+                    <pic:cNvPicPr>
+                      <a:picLocks noChangeAspect="1"/>
+                    </pic:cNvPicPr>
+                  </pic:nvPicPr>
+                  <pic:blipFill>
+                    <a:blip r:embed="rId19"/>
+                    <a:stretch>
+                      <a:fillRect/>
+                    </a:stretch>
+                  </pic:blipFill>
+                  <pic:spPr>
+                    <a:xfrm>
+                      <a:off x="0" y="0"/>
+                      <a:ext cx="5271770" cy="2461260"/>
+                    </a:xfrm>
+                    <a:prstGeom prst="rect">
+                      <a:avLst/>
+                    </a:prstGeom>
+                    <a:noFill/>
+                    <a:ln>
+                      <a:noFill/>
+                    </a:ln>
+                  </pic:spPr>
+                </pic:pic>
+              </a:graphicData>
+            </a:graphic>
+          </wp:inline>
+        </w:drawing>
+      </w:r>
+    </w:p>
+    <w:p>
+      <w:pPr>
+        <w:numPr>
+          <w:numId w:val="0"/>
+        </w:numPr>
+        <w:jc w:val="both"/>
+      </w:pPr>
+    </w:p>
+    <w:p>
+      <w:pPr>
+        <w:numPr>
+          <w:numId w:val="0"/>
+        </w:numPr>
+        <w:jc w:val="both"/>
+        <w:rPr>
+          <w:rFonts w:hint="default"/>
+          <w:lang w:val="en-US"/>
+        </w:rPr>
+      </w:pPr>
+      <w:r>
+        <w:rPr>
+          <w:rFonts w:hint="default"/>
+          <w:lang w:val="en-US"/>
+        </w:rPr>
+        <w:t>Go to the SMTP tab and under cUrl dropdown choose PHP: Laravel 9+</w:t>
+      </w:r>
+    </w:p>
+    <w:p>
+      <w:pPr>
+        <w:numPr>
+          <w:numId w:val="0"/>
+        </w:numPr>
+        <w:jc w:val="both"/>
+      </w:pPr>
+      <w:r>
+        <w:drawing>
+          <wp:inline distT="0" distB="0" distL="114300" distR="114300">
+            <wp:extent cx="5271770" cy="4154805"/>
+            <wp:effectExtent l="0" t="0" r="1270" b="5715"/>
+            <wp:docPr id="17" name="Picture 12"/>
+            <wp:cNvGraphicFramePr>
+              <a:graphicFrameLocks xmlns:a="http://schemas.openxmlformats.org/drawingml/2006/main" noChangeAspect="1"/>
+            </wp:cNvGraphicFramePr>
+            <a:graphic xmlns:a="http://schemas.openxmlformats.org/drawingml/2006/main">
+              <a:graphicData uri="http://schemas.openxmlformats.org/drawingml/2006/picture">
+                <pic:pic xmlns:pic="http://schemas.openxmlformats.org/drawingml/2006/picture">
+                  <pic:nvPicPr>
+                    <pic:cNvPr id="17" name="Picture 12"/>
+                    <pic:cNvPicPr>
+                      <a:picLocks noChangeAspect="1"/>
+                    </pic:cNvPicPr>
+                  </pic:nvPicPr>
+                  <pic:blipFill>
+                    <a:blip r:embed="rId20"/>
+                    <a:stretch>
+                      <a:fillRect/>
+                    </a:stretch>
+                  </pic:blipFill>
+                  <pic:spPr>
+                    <a:xfrm>
+                      <a:off x="0" y="0"/>
+                      <a:ext cx="5271770" cy="4154805"/>
+                    </a:xfrm>
+                    <a:prstGeom prst="rect">
+                      <a:avLst/>
+                    </a:prstGeom>
+                    <a:noFill/>
+                    <a:ln>
+                      <a:noFill/>
+                    </a:ln>
+                  </pic:spPr>
+                </pic:pic>
+              </a:graphicData>
+            </a:graphic>
+          </wp:inline>
+        </w:drawing>
+      </w:r>
+    </w:p>
+    <w:p>
+      <w:pPr>
+        <w:numPr>
+          <w:numId w:val="0"/>
+        </w:numPr>
+        <w:jc w:val="both"/>
+      </w:pPr>
+    </w:p>
+    <w:p>
+      <w:pPr>
+        <w:numPr>
+          <w:numId w:val="0"/>
+        </w:numPr>
+        <w:jc w:val="both"/>
+        <w:rPr>
+          <w:rFonts w:hint="default"/>
+          <w:lang w:val="en-US"/>
+        </w:rPr>
+      </w:pPr>
+      <w:r>
+        <w:rPr>
+          <w:rFonts w:hint="default"/>
+          <w:lang w:val="en-US"/>
+        </w:rPr>
+        <w:t>Now you need to copy the code that is shown when you select the laravel 9+ option and accordingly need to enter the data as shown in .env file as shown below:</w:t>
+      </w:r>
+    </w:p>
+    <w:p>
+      <w:pPr>
+        <w:numPr>
+          <w:numId w:val="0"/>
+        </w:numPr>
+        <w:jc w:val="both"/>
+        <w:rPr>
+          <w:rFonts w:hint="default"/>
+          <w:b w:val="0"/>
+          <w:bCs w:val="0"/>
+          <w:sz w:val="20"/>
+          <w:szCs w:val="20"/>
+          <w:lang w:val="en-US"/>
+        </w:rPr>
+      </w:pPr>
+    </w:p>
+    <w:p>
+      <w:pPr>
+        <w:numPr>
+          <w:numId w:val="0"/>
+        </w:numPr>
+        <w:jc w:val="both"/>
+      </w:pPr>
+      <w:r>
+        <w:drawing>
+          <wp:inline distT="0" distB="0" distL="114300" distR="114300">
+            <wp:extent cx="5269865" cy="2191385"/>
+            <wp:effectExtent l="0" t="0" r="3175" b="3175"/>
+            <wp:docPr id="18" name="Picture 13"/>
+            <wp:cNvGraphicFramePr>
+              <a:graphicFrameLocks xmlns:a="http://schemas.openxmlformats.org/drawingml/2006/main" noChangeAspect="1"/>
+            </wp:cNvGraphicFramePr>
+            <a:graphic xmlns:a="http://schemas.openxmlformats.org/drawingml/2006/main">
+              <a:graphicData uri="http://schemas.openxmlformats.org/drawingml/2006/picture">
+                <pic:pic xmlns:pic="http://schemas.openxmlformats.org/drawingml/2006/picture">
+                  <pic:nvPicPr>
+                    <pic:cNvPr id="18" name="Picture 13"/>
+                    <pic:cNvPicPr>
+                      <a:picLocks noChangeAspect="1"/>
+                    </pic:cNvPicPr>
+                  </pic:nvPicPr>
+                  <pic:blipFill>
+                    <a:blip r:embed="rId21"/>
+                    <a:stretch>
+                      <a:fillRect/>
+                    </a:stretch>
+                  </pic:blipFill>
+                  <pic:spPr>
+                    <a:xfrm>
+                      <a:off x="0" y="0"/>
+                      <a:ext cx="5269865" cy="2191385"/>
+                    </a:xfrm>
+                    <a:prstGeom prst="rect">
+                      <a:avLst/>
+                    </a:prstGeom>
+                    <a:noFill/>
+                    <a:ln>
+                      <a:noFill/>
+                    </a:ln>
+                  </pic:spPr>
+                </pic:pic>
+              </a:graphicData>
+            </a:graphic>
+          </wp:inline>
+        </w:drawing>
+      </w:r>
+      <w:r>
+        <w:drawing>
+          <wp:inline distT="0" distB="0" distL="114300" distR="114300">
+            <wp:extent cx="2415540" cy="1577340"/>
+            <wp:effectExtent l="0" t="0" r="7620" b="7620"/>
+            <wp:docPr id="19" name="Picture 14"/>
+            <wp:cNvGraphicFramePr>
+              <a:graphicFrameLocks xmlns:a="http://schemas.openxmlformats.org/drawingml/2006/main" noChangeAspect="1"/>
+            </wp:cNvGraphicFramePr>
+            <a:graphic xmlns:a="http://schemas.openxmlformats.org/drawingml/2006/main">
+              <a:graphicData uri="http://schemas.openxmlformats.org/drawingml/2006/picture">
+                <pic:pic xmlns:pic="http://schemas.openxmlformats.org/drawingml/2006/picture">
+                  <pic:nvPicPr>
+                    <pic:cNvPr id="19" name="Picture 14"/>
+                    <pic:cNvPicPr>
+                      <a:picLocks noChangeAspect="1"/>
+                    </pic:cNvPicPr>
+                  </pic:nvPicPr>
+                  <pic:blipFill>
+                    <a:blip r:embed="rId22"/>
+                    <a:stretch>
+                      <a:fillRect/>
+                    </a:stretch>
+                  </pic:blipFill>
+                  <pic:spPr>
+                    <a:xfrm>
+                      <a:off x="0" y="0"/>
+                      <a:ext cx="2415540" cy="1577340"/>
+                    </a:xfrm>
+                    <a:prstGeom prst="rect">
+                      <a:avLst/>
+                    </a:prstGeom>
+                    <a:noFill/>
+                    <a:ln>
+                      <a:noFill/>
+                    </a:ln>
+                  </pic:spPr>
+                </pic:pic>
+              </a:graphicData>
+            </a:graphic>
+          </wp:inline>
+        </w:drawing>
+      </w:r>
+    </w:p>
+    <w:p>
+      <w:pPr>
+        <w:numPr>
+          <w:numId w:val="0"/>
+        </w:numPr>
+        <w:jc w:val="both"/>
+      </w:pPr>
+    </w:p>
+    <w:p>
+      <w:pPr>
+        <w:numPr>
+          <w:numId w:val="0"/>
+        </w:numPr>
+        <w:jc w:val="both"/>
+        <w:rPr>
+          <w:rFonts w:hint="default"/>
+          <w:lang w:val="en-US"/>
+        </w:rPr>
+      </w:pPr>
+      <w:r>
+        <w:rPr>
+          <w:rFonts w:hint="default"/>
+          <w:lang w:val="en-US"/>
+        </w:rPr>
+        <w:t xml:space="preserve">After setting up the smtp now you need to go to the app-&gt;Models-&gt;User.php. Here, you need to add  the following functionality </w:t>
+      </w:r>
+    </w:p>
+    <w:tbl>
+      <w:tblPr>
+        <w:tblStyle w:val="4"/>
+        <w:tblW w:w="0" w:type="auto"/>
+        <w:tblInd w:w="0" w:type="dxa"/>
+        <w:tblBorders>
+          <w:top w:val="single" w:color="auto" w:sz="4" w:space="0"/>
+          <w:left w:val="single" w:color="auto" w:sz="4" w:space="0"/>
+          <w:bottom w:val="single" w:color="auto" w:sz="4" w:space="0"/>
+          <w:right w:val="single" w:color="auto" w:sz="4" w:space="0"/>
+          <w:insideH w:val="single" w:color="auto" w:sz="4" w:space="0"/>
+          <w:insideV w:val="single" w:color="auto" w:sz="4" w:space="0"/>
+        </w:tblBorders>
+        <w:tblLayout w:type="autofit"/>
+        <w:tblCellMar>
+          <w:left w:w="108" w:type="dxa"/>
+          <w:right w:w="108" w:type="dxa"/>
+        </w:tblCellMar>
+      </w:tblPr>
+      <w:tblGrid>
+        <w:gridCol w:w="8522"/>
+      </w:tblGrid>
+      <w:tr>
+        <w:tblPrEx>
+          <w:tblBorders>
+            <w:top w:val="single" w:color="auto" w:sz="4" w:space="0"/>
+            <w:left w:val="single" w:color="auto" w:sz="4" w:space="0"/>
+            <w:bottom w:val="single" w:color="auto" w:sz="4" w:space="0"/>
+            <w:right w:val="single" w:color="auto" w:sz="4" w:space="0"/>
+            <w:insideH w:val="single" w:color="auto" w:sz="4" w:space="0"/>
+            <w:insideV w:val="single" w:color="auto" w:sz="4" w:space="0"/>
+          </w:tblBorders>
+          <w:tblCellMar>
+            <w:left w:w="108" w:type="dxa"/>
+            <w:right w:w="108" w:type="dxa"/>
+          </w:tblCellMar>
+        </w:tblPrEx>
+        <w:tc>
+          <w:tcPr>
+            <w:tcW w:w="8522" w:type="dxa"/>
+          </w:tcPr>
+          <w:p>
+            <w:pPr>
+              <w:numPr>
+                <w:numId w:val="0"/>
+              </w:numPr>
+              <w:jc w:val="both"/>
+              <w:rPr>
+                <w:rFonts w:hint="default"/>
+                <w:vertAlign w:val="baseline"/>
+                <w:lang w:val="en-US"/>
+              </w:rPr>
+            </w:pPr>
+            <w:r>
+              <w:rPr>
+                <w:rFonts w:hint="default"/>
+                <w:vertAlign w:val="baseline"/>
+                <w:lang w:val="en-US"/>
+              </w:rPr>
+              <w:t>use Illuminate\Contracts\Auth\MustVerifyEmail;</w:t>
+            </w:r>
+          </w:p>
+        </w:tc>
+      </w:tr>
+      <w:tr>
+        <w:tblPrEx>
+          <w:tblBorders>
+            <w:top w:val="single" w:color="auto" w:sz="4" w:space="0"/>
+            <w:left w:val="single" w:color="auto" w:sz="4" w:space="0"/>
+            <w:bottom w:val="single" w:color="auto" w:sz="4" w:space="0"/>
+            <w:right w:val="single" w:color="auto" w:sz="4" w:space="0"/>
+            <w:insideH w:val="single" w:color="auto" w:sz="4" w:space="0"/>
+            <w:insideV w:val="single" w:color="auto" w:sz="4" w:space="0"/>
+          </w:tblBorders>
+          <w:tblCellMar>
+            <w:left w:w="108" w:type="dxa"/>
+            <w:right w:w="108" w:type="dxa"/>
+          </w:tblCellMar>
+        </w:tblPrEx>
+        <w:tc>
+          <w:tcPr>
+            <w:tcW w:w="8522" w:type="dxa"/>
+          </w:tcPr>
+          <w:p>
+            <w:pPr>
+              <w:numPr>
+                <w:numId w:val="0"/>
+              </w:numPr>
+              <w:jc w:val="both"/>
+              <w:rPr>
+                <w:rFonts w:hint="default"/>
+                <w:vertAlign w:val="baseline"/>
+                <w:lang w:val="en-US"/>
+              </w:rPr>
+            </w:pPr>
+            <w:r>
+              <w:drawing>
+                <wp:inline distT="0" distB="0" distL="114300" distR="114300">
+                  <wp:extent cx="4884420" cy="5387340"/>
+                  <wp:effectExtent l="0" t="0" r="7620" b="7620"/>
+                  <wp:docPr id="20" name="Picture 15"/>
+                  <wp:cNvGraphicFramePr>
+                    <a:graphicFrameLocks xmlns:a="http://schemas.openxmlformats.org/drawingml/2006/main" noChangeAspect="1"/>
+                  </wp:cNvGraphicFramePr>
+                  <a:graphic xmlns:a="http://schemas.openxmlformats.org/drawingml/2006/main">
+                    <a:graphicData uri="http://schemas.openxmlformats.org/drawingml/2006/picture">
+                      <pic:pic xmlns:pic="http://schemas.openxmlformats.org/drawingml/2006/picture">
+                        <pic:nvPicPr>
+                          <pic:cNvPr id="20" name="Picture 15"/>
+                          <pic:cNvPicPr>
+                            <a:picLocks noChangeAspect="1"/>
+                          </pic:cNvPicPr>
+                        </pic:nvPicPr>
+                        <pic:blipFill>
+                          <a:blip r:embed="rId23"/>
+                          <a:stretch>
+                            <a:fillRect/>
+                          </a:stretch>
+                        </pic:blipFill>
+                        <pic:spPr>
+                          <a:xfrm>
+                            <a:off x="0" y="0"/>
+                            <a:ext cx="4884420" cy="5387340"/>
+                          </a:xfrm>
+                          <a:prstGeom prst="rect">
+                            <a:avLst/>
+                          </a:prstGeom>
+                          <a:noFill/>
+                          <a:ln>
+                            <a:noFill/>
+                          </a:ln>
+                        </pic:spPr>
+                      </pic:pic>
+                    </a:graphicData>
+                  </a:graphic>
+                </wp:inline>
+              </w:drawing>
+            </w:r>
+          </w:p>
+        </w:tc>
+      </w:tr>
+    </w:tbl>
+    <w:p>
+      <w:pPr>
+        <w:numPr>
+          <w:numId w:val="0"/>
+        </w:numPr>
+        <w:jc w:val="both"/>
+        <w:rPr>
+          <w:rFonts w:hint="default"/>
+          <w:lang w:val="en-US"/>
+        </w:rPr>
+      </w:pPr>
+    </w:p>
+    <w:p>
+      <w:pPr>
+        <w:numPr>
+          <w:numId w:val="0"/>
+        </w:numPr>
+        <w:jc w:val="both"/>
+        <w:rPr>
+          <w:rFonts w:hint="default"/>
+          <w:lang w:val="en-US"/>
+        </w:rPr>
+      </w:pPr>
+      <w:r>
+        <w:rPr>
+          <w:rFonts w:hint="default"/>
+          <w:lang w:val="en-US"/>
+        </w:rPr>
+        <w:t>To use this functionality you need to add the code as shown in the below picture:</w:t>
+      </w:r>
+    </w:p>
+    <w:p>
+      <w:pPr>
+        <w:numPr>
+          <w:numId w:val="0"/>
+        </w:numPr>
+        <w:jc w:val="both"/>
+      </w:pPr>
+      <w:r>
+        <w:drawing>
+          <wp:inline distT="0" distB="0" distL="114300" distR="114300">
+            <wp:extent cx="4625340" cy="5006340"/>
+            <wp:effectExtent l="0" t="0" r="7620" b="7620"/>
+            <wp:docPr id="21" name="Picture 16"/>
+            <wp:cNvGraphicFramePr>
+              <a:graphicFrameLocks xmlns:a="http://schemas.openxmlformats.org/drawingml/2006/main" noChangeAspect="1"/>
+            </wp:cNvGraphicFramePr>
+            <a:graphic xmlns:a="http://schemas.openxmlformats.org/drawingml/2006/main">
+              <a:graphicData uri="http://schemas.openxmlformats.org/drawingml/2006/picture">
+                <pic:pic xmlns:pic="http://schemas.openxmlformats.org/drawingml/2006/picture">
+                  <pic:nvPicPr>
+                    <pic:cNvPr id="21" name="Picture 16"/>
+                    <pic:cNvPicPr>
+                      <a:picLocks noChangeAspect="1"/>
+                    </pic:cNvPicPr>
+                  </pic:nvPicPr>
+                  <pic:blipFill>
+                    <a:blip r:embed="rId24"/>
+                    <a:stretch>
+                      <a:fillRect/>
+                    </a:stretch>
+                  </pic:blipFill>
+                  <pic:spPr>
+                    <a:xfrm>
+                      <a:off x="0" y="0"/>
+                      <a:ext cx="4625340" cy="5006340"/>
+                    </a:xfrm>
+                    <a:prstGeom prst="rect">
+                      <a:avLst/>
+                    </a:prstGeom>
+                    <a:noFill/>
+                    <a:ln>
+                      <a:noFill/>
+                    </a:ln>
+                  </pic:spPr>
+                </pic:pic>
+              </a:graphicData>
+            </a:graphic>
+          </wp:inline>
+        </w:drawing>
+      </w:r>
+    </w:p>
+    <w:p>
+      <w:pPr>
+        <w:numPr>
+          <w:numId w:val="0"/>
+        </w:numPr>
+        <w:jc w:val="both"/>
+      </w:pPr>
+    </w:p>
+    <w:p>
+      <w:pPr>
+        <w:numPr>
+          <w:numId w:val="0"/>
+        </w:numPr>
+        <w:jc w:val="both"/>
+        <w:rPr>
+          <w:rFonts w:hint="default"/>
+          <w:lang w:val="en-US"/>
+        </w:rPr>
+      </w:pPr>
+      <w:r>
+        <w:rPr>
+          <w:rFonts w:hint="default"/>
+          <w:lang w:val="en-US"/>
+        </w:rPr>
+        <w:t>Then below go to the following  code</w:t>
+      </w:r>
+    </w:p>
+    <w:p>
+      <w:pPr>
+        <w:numPr>
+          <w:numId w:val="0"/>
+        </w:numPr>
+        <w:jc w:val="both"/>
+      </w:pPr>
+      <w:r>
+        <w:drawing>
+          <wp:inline distT="0" distB="0" distL="114300" distR="114300">
+            <wp:extent cx="1905000" cy="1028700"/>
+            <wp:effectExtent l="0" t="0" r="0" b="7620"/>
+            <wp:docPr id="22" name="Picture 17"/>
+            <wp:cNvGraphicFramePr>
+              <a:graphicFrameLocks xmlns:a="http://schemas.openxmlformats.org/drawingml/2006/main" noChangeAspect="1"/>
+            </wp:cNvGraphicFramePr>
+            <a:graphic xmlns:a="http://schemas.openxmlformats.org/drawingml/2006/main">
+              <a:graphicData uri="http://schemas.openxmlformats.org/drawingml/2006/picture">
+                <pic:pic xmlns:pic="http://schemas.openxmlformats.org/drawingml/2006/picture">
+                  <pic:nvPicPr>
+                    <pic:cNvPr id="22" name="Picture 17"/>
+                    <pic:cNvPicPr>
+                      <a:picLocks noChangeAspect="1"/>
+                    </pic:cNvPicPr>
+                  </pic:nvPicPr>
+                  <pic:blipFill>
+                    <a:blip r:embed="rId25"/>
+                    <a:stretch>
+                      <a:fillRect/>
+                    </a:stretch>
+                  </pic:blipFill>
+                  <pic:spPr>
+                    <a:xfrm>
+                      <a:off x="0" y="0"/>
+                      <a:ext cx="1905000" cy="1028700"/>
+                    </a:xfrm>
+                    <a:prstGeom prst="rect">
+                      <a:avLst/>
+                    </a:prstGeom>
+                    <a:noFill/>
+                    <a:ln>
+                      <a:noFill/>
+                    </a:ln>
+                  </pic:spPr>
+                </pic:pic>
+              </a:graphicData>
+            </a:graphic>
+          </wp:inline>
+        </w:drawing>
+      </w:r>
+    </w:p>
+    <w:p>
+      <w:pPr>
+        <w:numPr>
+          <w:numId w:val="0"/>
+        </w:numPr>
+        <w:jc w:val="both"/>
+      </w:pPr>
+    </w:p>
+    <w:p>
+      <w:pPr>
+        <w:numPr>
+          <w:numId w:val="0"/>
+        </w:numPr>
+        <w:jc w:val="both"/>
+        <w:rPr>
+          <w:rFonts w:hint="default"/>
+          <w:lang w:val="en-US"/>
+        </w:rPr>
+      </w:pPr>
+      <w:r>
+        <w:rPr>
+          <w:rFonts w:hint="default"/>
+          <w:lang w:val="en-US"/>
+        </w:rPr>
+        <w:t xml:space="preserve">And change it as </w:t>
+      </w:r>
+    </w:p>
+    <w:p>
+      <w:pPr>
+        <w:numPr>
+          <w:numId w:val="0"/>
+        </w:numPr>
+        <w:jc w:val="both"/>
+        <w:rPr>
+          <w:rFonts w:hint="default"/>
+          <w:lang w:val="en-US"/>
+        </w:rPr>
+      </w:pPr>
+      <w:r>
+        <w:drawing>
+          <wp:inline distT="0" distB="0" distL="114300" distR="114300">
+            <wp:extent cx="2072640" cy="381000"/>
+            <wp:effectExtent l="0" t="0" r="0" b="0"/>
+            <wp:docPr id="23" name="Picture 18"/>
+            <wp:cNvGraphicFramePr>
+              <a:graphicFrameLocks xmlns:a="http://schemas.openxmlformats.org/drawingml/2006/main" noChangeAspect="1"/>
+            </wp:cNvGraphicFramePr>
+            <a:graphic xmlns:a="http://schemas.openxmlformats.org/drawingml/2006/main">
+              <a:graphicData uri="http://schemas.openxmlformats.org/drawingml/2006/picture">
+                <pic:pic xmlns:pic="http://schemas.openxmlformats.org/drawingml/2006/picture">
+                  <pic:nvPicPr>
+                    <pic:cNvPr id="23" name="Picture 18"/>
+                    <pic:cNvPicPr>
+                      <a:picLocks noChangeAspect="1"/>
+                    </pic:cNvPicPr>
+                  </pic:nvPicPr>
+                  <pic:blipFill>
+                    <a:blip r:embed="rId26"/>
+                    <a:stretch>
+                      <a:fillRect/>
+                    </a:stretch>
+                  </pic:blipFill>
+                  <pic:spPr>
+                    <a:xfrm>
+                      <a:off x="0" y="0"/>
+                      <a:ext cx="2072640" cy="381000"/>
+                    </a:xfrm>
+                    <a:prstGeom prst="rect">
+                      <a:avLst/>
+                    </a:prstGeom>
+                    <a:noFill/>
+                    <a:ln>
+                      <a:noFill/>
+                    </a:ln>
+                  </pic:spPr>
+                </pic:pic>
+              </a:graphicData>
+            </a:graphic>
+          </wp:inline>
+        </w:drawing>
+      </w:r>
       <w:bookmarkStart w:id="0" w:name="_GoBack"/>
       <w:bookmarkEnd w:id="0"/>
     </w:p>
@@ -2017,7 +2765,7 @@
   <w:docDefaults>
     <w:rPrDefault>
       <w:rPr>
-        <w:rFonts w:asciiTheme="minorHAnsi" w:hAnsiTheme="minorHAnsi" w:eastAsiaTheme="minorEastAsia" w:cstheme="minorBidi"/>
+        <w:rFonts w:ascii="Times New Roman" w:hAnsi="Times New Roman" w:eastAsia="SimSun" w:cs="Times New Roman"/>
       </w:rPr>
     </w:rPrDefault>
     <w:pPrDefault/>

</xml_diff>

<commit_message>
Laravel Brreze Verify Email System and updated doc file
</commit_message>
<xml_diff>
--- a/Laravel.docx
+++ b/Laravel.docx
@@ -879,23 +879,13 @@
           <w:szCs w:val="24"/>
           <w:lang w:val="en-US"/>
         </w:rPr>
-        <w:t xml:space="preserve"> </w:t>
-      </w:r>
-      <w:r>
-        <w:rPr>
-          <w:rFonts w:hint="default"/>
-          <w:b/>
-          <w:bCs/>
-          <w:sz w:val="24"/>
-          <w:szCs w:val="24"/>
-          <w:lang w:val="en-US"/>
-        </w:rPr>
-        <w:t>Install Laravel Breeze</w:t>
-      </w:r>
-    </w:p>
-    <w:p>
-      <w:pPr>
-        <w:numPr>
+        <w:t xml:space="preserve"> Install Laravel Breeze</w:t>
+      </w:r>
+    </w:p>
+    <w:p>
+      <w:pPr>
+        <w:numPr>
+          <w:ilvl w:val="0"/>
           <w:numId w:val="0"/>
         </w:numPr>
         <w:jc w:val="both"/>
@@ -912,6 +902,7 @@
     <w:p>
       <w:pPr>
         <w:numPr>
+          <w:ilvl w:val="0"/>
           <w:numId w:val="0"/>
         </w:numPr>
         <w:jc w:val="both"/>
@@ -951,7 +942,9 @@
         </w:tblBorders>
         <w:tblLayout w:type="autofit"/>
         <w:tblCellMar>
+          <w:top w:w="0" w:type="dxa"/>
           <w:left w:w="108" w:type="dxa"/>
+          <w:bottom w:w="0" w:type="dxa"/>
           <w:right w:w="108" w:type="dxa"/>
         </w:tblCellMar>
       </w:tblPr>
@@ -969,7 +962,9 @@
             <w:insideV w:val="single" w:color="auto" w:sz="4" w:space="0"/>
           </w:tblBorders>
           <w:tblCellMar>
+            <w:top w:w="0" w:type="dxa"/>
             <w:left w:w="108" w:type="dxa"/>
+            <w:bottom w:w="0" w:type="dxa"/>
             <w:right w:w="108" w:type="dxa"/>
           </w:tblCellMar>
         </w:tblPrEx>
@@ -979,7 +974,9 @@
           </w:tcPr>
           <w:p>
             <w:pPr>
+              <w:widowControl w:val="0"/>
               <w:numPr>
+                <w:ilvl w:val="0"/>
                 <w:numId w:val="0"/>
               </w:numPr>
               <w:jc w:val="both"/>
@@ -1012,6 +1009,7 @@
     <w:p>
       <w:pPr>
         <w:numPr>
+          <w:ilvl w:val="0"/>
           <w:numId w:val="0"/>
         </w:numPr>
         <w:jc w:val="both"/>
@@ -1028,6 +1026,7 @@
     <w:p>
       <w:pPr>
         <w:numPr>
+          <w:ilvl w:val="0"/>
           <w:numId w:val="0"/>
         </w:numPr>
         <w:ind w:leftChars="0"/>
@@ -1068,7 +1067,9 @@
         </w:tblBorders>
         <w:tblLayout w:type="autofit"/>
         <w:tblCellMar>
+          <w:top w:w="0" w:type="dxa"/>
           <w:left w:w="108" w:type="dxa"/>
+          <w:bottom w:w="0" w:type="dxa"/>
           <w:right w:w="108" w:type="dxa"/>
         </w:tblCellMar>
       </w:tblPr>
@@ -1086,7 +1087,9 @@
             <w:insideV w:val="single" w:color="auto" w:sz="4" w:space="0"/>
           </w:tblBorders>
           <w:tblCellMar>
+            <w:top w:w="0" w:type="dxa"/>
             <w:left w:w="108" w:type="dxa"/>
+            <w:bottom w:w="0" w:type="dxa"/>
             <w:right w:w="108" w:type="dxa"/>
           </w:tblCellMar>
         </w:tblPrEx>
@@ -1096,7 +1099,9 @@
           </w:tcPr>
           <w:p>
             <w:pPr>
+              <w:widowControl w:val="0"/>
               <w:numPr>
+                <w:ilvl w:val="0"/>
                 <w:numId w:val="0"/>
               </w:numPr>
               <w:jc w:val="both"/>
@@ -1129,6 +1134,7 @@
     <w:p>
       <w:pPr>
         <w:numPr>
+          <w:ilvl w:val="0"/>
           <w:numId w:val="0"/>
         </w:numPr>
         <w:ind w:leftChars="0"/>
@@ -1146,6 +1152,7 @@
     <w:p>
       <w:pPr>
         <w:numPr>
+          <w:ilvl w:val="0"/>
           <w:numId w:val="0"/>
         </w:numPr>
         <w:ind w:leftChars="0"/>
@@ -1174,6 +1181,7 @@
     <w:p>
       <w:pPr>
         <w:numPr>
+          <w:ilvl w:val="0"/>
           <w:numId w:val="0"/>
         </w:numPr>
         <w:ind w:leftChars="0"/>
@@ -1226,6 +1234,7 @@
     <w:p>
       <w:pPr>
         <w:numPr>
+          <w:ilvl w:val="0"/>
           <w:numId w:val="0"/>
         </w:numPr>
         <w:ind w:leftChars="0"/>
@@ -1235,6 +1244,7 @@
     <w:p>
       <w:pPr>
         <w:numPr>
+          <w:ilvl w:val="0"/>
           <w:numId w:val="0"/>
         </w:numPr>
         <w:ind w:leftChars="0"/>
@@ -1425,7 +1435,9 @@
         </w:tblBorders>
         <w:tblLayout w:type="autofit"/>
         <w:tblCellMar>
+          <w:top w:w="0" w:type="dxa"/>
           <w:left w:w="108" w:type="dxa"/>
+          <w:bottom w:w="0" w:type="dxa"/>
           <w:right w:w="108" w:type="dxa"/>
         </w:tblCellMar>
       </w:tblPr>
@@ -1442,6 +1454,12 @@
             <w:insideH w:val="single" w:color="auto" w:sz="4" w:space="0"/>
             <w:insideV w:val="single" w:color="auto" w:sz="4" w:space="0"/>
           </w:tblBorders>
+          <w:tblCellMar>
+            <w:top w:w="0" w:type="dxa"/>
+            <w:left w:w="108" w:type="dxa"/>
+            <w:bottom w:w="0" w:type="dxa"/>
+            <w:right w:w="108" w:type="dxa"/>
+          </w:tblCellMar>
         </w:tblPrEx>
         <w:tc>
           <w:tcPr>
@@ -1449,6 +1467,7 @@
           </w:tcPr>
           <w:p>
             <w:pPr>
+              <w:widowControl w:val="0"/>
               <w:jc w:val="both"/>
               <w:rPr>
                 <w:rFonts w:hint="default"/>
@@ -1478,7 +1497,9 @@
             <w:insideV w:val="single" w:color="auto" w:sz="4" w:space="0"/>
           </w:tblBorders>
           <w:tblCellMar>
+            <w:top w:w="0" w:type="dxa"/>
             <w:left w:w="108" w:type="dxa"/>
+            <w:bottom w:w="0" w:type="dxa"/>
             <w:right w:w="108" w:type="dxa"/>
           </w:tblCellMar>
         </w:tblPrEx>
@@ -1488,6 +1509,7 @@
           </w:tcPr>
           <w:p>
             <w:pPr>
+              <w:widowControl w:val="0"/>
               <w:jc w:val="both"/>
               <w:rPr>
                 <w:rFonts w:hint="default"/>
@@ -1582,7 +1604,9 @@
         </w:tblBorders>
         <w:tblLayout w:type="autofit"/>
         <w:tblCellMar>
+          <w:top w:w="0" w:type="dxa"/>
           <w:left w:w="108" w:type="dxa"/>
+          <w:bottom w:w="0" w:type="dxa"/>
           <w:right w:w="108" w:type="dxa"/>
         </w:tblCellMar>
       </w:tblPr>
@@ -1600,7 +1624,9 @@
             <w:insideV w:val="single" w:color="auto" w:sz="4" w:space="0"/>
           </w:tblBorders>
           <w:tblCellMar>
+            <w:top w:w="0" w:type="dxa"/>
             <w:left w:w="108" w:type="dxa"/>
+            <w:bottom w:w="0" w:type="dxa"/>
             <w:right w:w="108" w:type="dxa"/>
           </w:tblCellMar>
         </w:tblPrEx>
@@ -1610,6 +1636,7 @@
           </w:tcPr>
           <w:p>
             <w:pPr>
+              <w:widowControl w:val="0"/>
               <w:jc w:val="both"/>
               <w:rPr>
                 <w:rFonts w:hint="default"/>
@@ -1969,6 +1996,7 @@
     <w:p>
       <w:pPr>
         <w:numPr>
+          <w:ilvl w:val="0"/>
           <w:numId w:val="0"/>
         </w:numPr>
         <w:ind w:leftChars="0"/>
@@ -2011,6 +2039,7 @@
     <w:p>
       <w:pPr>
         <w:numPr>
+          <w:ilvl w:val="0"/>
           <w:numId w:val="0"/>
         </w:numPr>
         <w:jc w:val="both"/>
@@ -2027,6 +2056,7 @@
     <w:p>
       <w:pPr>
         <w:numPr>
+          <w:ilvl w:val="0"/>
           <w:numId w:val="0"/>
         </w:numPr>
         <w:jc w:val="both"/>
@@ -2054,6 +2084,7 @@
     <w:p>
       <w:pPr>
         <w:numPr>
+          <w:ilvl w:val="0"/>
           <w:numId w:val="0"/>
         </w:numPr>
         <w:jc w:val="both"/>
@@ -2105,14 +2136,16 @@
     <w:p>
       <w:pPr>
         <w:numPr>
-          <w:numId w:val="0"/>
-        </w:numPr>
-        <w:jc w:val="both"/>
-      </w:pPr>
-    </w:p>
-    <w:p>
-      <w:pPr>
-        <w:numPr>
+          <w:ilvl w:val="0"/>
+          <w:numId w:val="0"/>
+        </w:numPr>
+        <w:jc w:val="both"/>
+      </w:pPr>
+    </w:p>
+    <w:p>
+      <w:pPr>
+        <w:numPr>
+          <w:ilvl w:val="0"/>
           <w:numId w:val="0"/>
         </w:numPr>
         <w:jc w:val="both"/>
@@ -2132,6 +2165,7 @@
     <w:p>
       <w:pPr>
         <w:numPr>
+          <w:ilvl w:val="0"/>
           <w:numId w:val="0"/>
         </w:numPr>
         <w:jc w:val="both"/>
@@ -2183,14 +2217,16 @@
     <w:p>
       <w:pPr>
         <w:numPr>
-          <w:numId w:val="0"/>
-        </w:numPr>
-        <w:jc w:val="both"/>
-      </w:pPr>
-    </w:p>
-    <w:p>
-      <w:pPr>
-        <w:numPr>
+          <w:ilvl w:val="0"/>
+          <w:numId w:val="0"/>
+        </w:numPr>
+        <w:jc w:val="both"/>
+      </w:pPr>
+    </w:p>
+    <w:p>
+      <w:pPr>
+        <w:numPr>
+          <w:ilvl w:val="0"/>
           <w:numId w:val="0"/>
         </w:numPr>
         <w:jc w:val="both"/>
@@ -2210,6 +2246,7 @@
     <w:p>
       <w:pPr>
         <w:numPr>
+          <w:ilvl w:val="0"/>
           <w:numId w:val="0"/>
         </w:numPr>
         <w:jc w:val="both"/>
@@ -2226,6 +2263,7 @@
     <w:p>
       <w:pPr>
         <w:numPr>
+          <w:ilvl w:val="0"/>
           <w:numId w:val="0"/>
         </w:numPr>
         <w:jc w:val="both"/>
@@ -2320,14 +2358,16 @@
     <w:p>
       <w:pPr>
         <w:numPr>
-          <w:numId w:val="0"/>
-        </w:numPr>
-        <w:jc w:val="both"/>
-      </w:pPr>
-    </w:p>
-    <w:p>
-      <w:pPr>
-        <w:numPr>
+          <w:ilvl w:val="0"/>
+          <w:numId w:val="0"/>
+        </w:numPr>
+        <w:jc w:val="both"/>
+      </w:pPr>
+    </w:p>
+    <w:p>
+      <w:pPr>
+        <w:numPr>
+          <w:ilvl w:val="0"/>
           <w:numId w:val="0"/>
         </w:numPr>
         <w:jc w:val="both"/>
@@ -2359,7 +2399,9 @@
         </w:tblBorders>
         <w:tblLayout w:type="autofit"/>
         <w:tblCellMar>
+          <w:top w:w="0" w:type="dxa"/>
           <w:left w:w="108" w:type="dxa"/>
+          <w:bottom w:w="0" w:type="dxa"/>
           <w:right w:w="108" w:type="dxa"/>
         </w:tblCellMar>
       </w:tblPr>
@@ -2377,7 +2419,9 @@
             <w:insideV w:val="single" w:color="auto" w:sz="4" w:space="0"/>
           </w:tblBorders>
           <w:tblCellMar>
+            <w:top w:w="0" w:type="dxa"/>
             <w:left w:w="108" w:type="dxa"/>
+            <w:bottom w:w="0" w:type="dxa"/>
             <w:right w:w="108" w:type="dxa"/>
           </w:tblCellMar>
         </w:tblPrEx>
@@ -2387,7 +2431,9 @@
           </w:tcPr>
           <w:p>
             <w:pPr>
+              <w:widowControl w:val="0"/>
               <w:numPr>
+                <w:ilvl w:val="0"/>
                 <w:numId w:val="0"/>
               </w:numPr>
               <w:jc w:val="both"/>
@@ -2419,7 +2465,9 @@
             <w:insideV w:val="single" w:color="auto" w:sz="4" w:space="0"/>
           </w:tblBorders>
           <w:tblCellMar>
+            <w:top w:w="0" w:type="dxa"/>
             <w:left w:w="108" w:type="dxa"/>
+            <w:bottom w:w="0" w:type="dxa"/>
             <w:right w:w="108" w:type="dxa"/>
           </w:tblCellMar>
         </w:tblPrEx>
@@ -2429,7 +2477,9 @@
           </w:tcPr>
           <w:p>
             <w:pPr>
+              <w:widowControl w:val="0"/>
               <w:numPr>
+                <w:ilvl w:val="0"/>
                 <w:numId w:val="0"/>
               </w:numPr>
               <w:jc w:val="both"/>
@@ -2489,18 +2539,20 @@
     <w:p>
       <w:pPr>
         <w:numPr>
-          <w:numId w:val="0"/>
-        </w:numPr>
-        <w:jc w:val="both"/>
-        <w:rPr>
-          <w:rFonts w:hint="default"/>
-          <w:lang w:val="en-US"/>
-        </w:rPr>
-      </w:pPr>
-    </w:p>
-    <w:p>
-      <w:pPr>
-        <w:numPr>
+          <w:ilvl w:val="0"/>
+          <w:numId w:val="0"/>
+        </w:numPr>
+        <w:jc w:val="both"/>
+        <w:rPr>
+          <w:rFonts w:hint="default"/>
+          <w:lang w:val="en-US"/>
+        </w:rPr>
+      </w:pPr>
+    </w:p>
+    <w:p>
+      <w:pPr>
+        <w:numPr>
+          <w:ilvl w:val="0"/>
           <w:numId w:val="0"/>
         </w:numPr>
         <w:jc w:val="both"/>
@@ -2520,6 +2572,7 @@
     <w:p>
       <w:pPr>
         <w:numPr>
+          <w:ilvl w:val="0"/>
           <w:numId w:val="0"/>
         </w:numPr>
         <w:jc w:val="both"/>
@@ -2571,14 +2624,16 @@
     <w:p>
       <w:pPr>
         <w:numPr>
-          <w:numId w:val="0"/>
-        </w:numPr>
-        <w:jc w:val="both"/>
-      </w:pPr>
-    </w:p>
-    <w:p>
-      <w:pPr>
-        <w:numPr>
+          <w:ilvl w:val="0"/>
+          <w:numId w:val="0"/>
+        </w:numPr>
+        <w:jc w:val="both"/>
+      </w:pPr>
+    </w:p>
+    <w:p>
+      <w:pPr>
+        <w:numPr>
+          <w:ilvl w:val="0"/>
           <w:numId w:val="0"/>
         </w:numPr>
         <w:jc w:val="both"/>
@@ -2598,6 +2653,7 @@
     <w:p>
       <w:pPr>
         <w:numPr>
+          <w:ilvl w:val="0"/>
           <w:numId w:val="0"/>
         </w:numPr>
         <w:jc w:val="both"/>
@@ -2649,14 +2705,16 @@
     <w:p>
       <w:pPr>
         <w:numPr>
-          <w:numId w:val="0"/>
-        </w:numPr>
-        <w:jc w:val="both"/>
-      </w:pPr>
-    </w:p>
-    <w:p>
-      <w:pPr>
-        <w:numPr>
+          <w:ilvl w:val="0"/>
+          <w:numId w:val="0"/>
+        </w:numPr>
+        <w:jc w:val="both"/>
+      </w:pPr>
+    </w:p>
+    <w:p>
+      <w:pPr>
+        <w:numPr>
+          <w:ilvl w:val="0"/>
           <w:numId w:val="0"/>
         </w:numPr>
         <w:jc w:val="both"/>
@@ -2676,13 +2734,10 @@
     <w:p>
       <w:pPr>
         <w:numPr>
-          <w:numId w:val="0"/>
-        </w:numPr>
-        <w:jc w:val="both"/>
-        <w:rPr>
-          <w:rFonts w:hint="default"/>
-          <w:lang w:val="en-US"/>
-        </w:rPr>
+          <w:ilvl w:val="0"/>
+          <w:numId w:val="0"/>
+        </w:numPr>
+        <w:jc w:val="both"/>
       </w:pPr>
       <w:r>
         <w:drawing>
@@ -2712,6 +2767,287 @@
                     <a:xfrm>
                       <a:off x="0" y="0"/>
                       <a:ext cx="2072640" cy="381000"/>
+                    </a:xfrm>
+                    <a:prstGeom prst="rect">
+                      <a:avLst/>
+                    </a:prstGeom>
+                    <a:noFill/>
+                    <a:ln>
+                      <a:noFill/>
+                    </a:ln>
+                  </pic:spPr>
+                </pic:pic>
+              </a:graphicData>
+            </a:graphic>
+          </wp:inline>
+        </w:drawing>
+      </w:r>
+    </w:p>
+    <w:p>
+      <w:pPr>
+        <w:numPr>
+          <w:ilvl w:val="0"/>
+          <w:numId w:val="0"/>
+        </w:numPr>
+        <w:jc w:val="both"/>
+      </w:pPr>
+    </w:p>
+    <w:p>
+      <w:pPr>
+        <w:numPr>
+          <w:ilvl w:val="0"/>
+          <w:numId w:val="0"/>
+        </w:numPr>
+        <w:jc w:val="both"/>
+        <w:rPr>
+          <w:rFonts w:hint="default"/>
+          <w:lang w:val="en-US"/>
+        </w:rPr>
+      </w:pPr>
+      <w:r>
+        <w:rPr>
+          <w:rFonts w:hint="default"/>
+          <w:lang w:val="en-US"/>
+        </w:rPr>
+        <w:t>After changing this go to your server and click on register and register your user as shown below:</w:t>
+      </w:r>
+    </w:p>
+    <w:p>
+      <w:pPr>
+        <w:numPr>
+          <w:ilvl w:val="0"/>
+          <w:numId w:val="0"/>
+        </w:numPr>
+        <w:jc w:val="both"/>
+        <w:rPr>
+          <w:rFonts w:hint="default"/>
+          <w:lang w:val="en-US"/>
+        </w:rPr>
+      </w:pPr>
+    </w:p>
+    <w:p>
+      <w:pPr>
+        <w:numPr>
+          <w:ilvl w:val="0"/>
+          <w:numId w:val="0"/>
+        </w:numPr>
+        <w:jc w:val="both"/>
+      </w:pPr>
+      <w:r>
+        <w:drawing>
+          <wp:inline distT="0" distB="0" distL="114300" distR="114300">
+            <wp:extent cx="5266690" cy="3791585"/>
+            <wp:effectExtent l="0" t="0" r="6350" b="3175"/>
+            <wp:docPr id="24" name="Picture 1"/>
+            <wp:cNvGraphicFramePr>
+              <a:graphicFrameLocks xmlns:a="http://schemas.openxmlformats.org/drawingml/2006/main" noChangeAspect="1"/>
+            </wp:cNvGraphicFramePr>
+            <a:graphic xmlns:a="http://schemas.openxmlformats.org/drawingml/2006/main">
+              <a:graphicData uri="http://schemas.openxmlformats.org/drawingml/2006/picture">
+                <pic:pic xmlns:pic="http://schemas.openxmlformats.org/drawingml/2006/picture">
+                  <pic:nvPicPr>
+                    <pic:cNvPr id="24" name="Picture 1"/>
+                    <pic:cNvPicPr>
+                      <a:picLocks noChangeAspect="1"/>
+                    </pic:cNvPicPr>
+                  </pic:nvPicPr>
+                  <pic:blipFill>
+                    <a:blip r:embed="rId27"/>
+                    <a:stretch>
+                      <a:fillRect/>
+                    </a:stretch>
+                  </pic:blipFill>
+                  <pic:spPr>
+                    <a:xfrm>
+                      <a:off x="0" y="0"/>
+                      <a:ext cx="5266690" cy="3791585"/>
+                    </a:xfrm>
+                    <a:prstGeom prst="rect">
+                      <a:avLst/>
+                    </a:prstGeom>
+                    <a:noFill/>
+                    <a:ln>
+                      <a:noFill/>
+                    </a:ln>
+                  </pic:spPr>
+                </pic:pic>
+              </a:graphicData>
+            </a:graphic>
+          </wp:inline>
+        </w:drawing>
+      </w:r>
+    </w:p>
+    <w:p>
+      <w:pPr>
+        <w:numPr>
+          <w:ilvl w:val="0"/>
+          <w:numId w:val="0"/>
+        </w:numPr>
+        <w:jc w:val="both"/>
+      </w:pPr>
+    </w:p>
+    <w:p>
+      <w:pPr>
+        <w:numPr>
+          <w:ilvl w:val="0"/>
+          <w:numId w:val="0"/>
+        </w:numPr>
+        <w:jc w:val="both"/>
+        <w:rPr>
+          <w:rFonts w:hint="default"/>
+          <w:lang w:val="en-US"/>
+        </w:rPr>
+      </w:pPr>
+      <w:r>
+        <w:rPr>
+          <w:rFonts w:hint="default"/>
+          <w:lang w:val="en-US"/>
+        </w:rPr>
+        <w:t>After that it will send you the verification message in your mailtrap and when you click on it you will see the result as shown below:</w:t>
+      </w:r>
+    </w:p>
+    <w:p>
+      <w:pPr>
+        <w:numPr>
+          <w:ilvl w:val="0"/>
+          <w:numId w:val="0"/>
+        </w:numPr>
+        <w:jc w:val="both"/>
+        <w:rPr>
+          <w:rFonts w:hint="default"/>
+          <w:lang w:val="en-US"/>
+        </w:rPr>
+      </w:pPr>
+      <w:r>
+        <w:drawing>
+          <wp:inline distT="0" distB="0" distL="114300" distR="114300">
+            <wp:extent cx="5264150" cy="2636520"/>
+            <wp:effectExtent l="0" t="0" r="8890" b="0"/>
+            <wp:docPr id="25" name="Picture 2"/>
+            <wp:cNvGraphicFramePr>
+              <a:graphicFrameLocks xmlns:a="http://schemas.openxmlformats.org/drawingml/2006/main" noChangeAspect="1"/>
+            </wp:cNvGraphicFramePr>
+            <a:graphic xmlns:a="http://schemas.openxmlformats.org/drawingml/2006/main">
+              <a:graphicData uri="http://schemas.openxmlformats.org/drawingml/2006/picture">
+                <pic:pic xmlns:pic="http://schemas.openxmlformats.org/drawingml/2006/picture">
+                  <pic:nvPicPr>
+                    <pic:cNvPr id="25" name="Picture 2"/>
+                    <pic:cNvPicPr>
+                      <a:picLocks noChangeAspect="1"/>
+                    </pic:cNvPicPr>
+                  </pic:nvPicPr>
+                  <pic:blipFill>
+                    <a:blip r:embed="rId28"/>
+                    <a:stretch>
+                      <a:fillRect/>
+                    </a:stretch>
+                  </pic:blipFill>
+                  <pic:spPr>
+                    <a:xfrm>
+                      <a:off x="0" y="0"/>
+                      <a:ext cx="5264150" cy="2636520"/>
+                    </a:xfrm>
+                    <a:prstGeom prst="rect">
+                      <a:avLst/>
+                    </a:prstGeom>
+                    <a:noFill/>
+                    <a:ln>
+                      <a:noFill/>
+                    </a:ln>
+                  </pic:spPr>
+                </pic:pic>
+              </a:graphicData>
+            </a:graphic>
+          </wp:inline>
+        </w:drawing>
+      </w:r>
+    </w:p>
+    <w:p>
+      <w:pPr>
+        <w:numPr>
+          <w:ilvl w:val="0"/>
+          <w:numId w:val="0"/>
+        </w:numPr>
+        <w:jc w:val="both"/>
+        <w:rPr>
+          <w:rFonts w:hint="default"/>
+          <w:lang w:val="en-US"/>
+        </w:rPr>
+      </w:pPr>
+    </w:p>
+    <w:p>
+      <w:pPr>
+        <w:numPr>
+          <w:ilvl w:val="0"/>
+          <w:numId w:val="0"/>
+        </w:numPr>
+        <w:jc w:val="both"/>
+        <w:rPr>
+          <w:rFonts w:hint="default"/>
+          <w:lang w:val="en-US"/>
+        </w:rPr>
+      </w:pPr>
+    </w:p>
+    <w:p>
+      <w:pPr>
+        <w:numPr>
+          <w:ilvl w:val="0"/>
+          <w:numId w:val="0"/>
+        </w:numPr>
+        <w:jc w:val="both"/>
+        <w:rPr>
+          <w:rFonts w:hint="default"/>
+          <w:lang w:val="en-US"/>
+        </w:rPr>
+      </w:pPr>
+      <w:r>
+        <w:rPr>
+          <w:rFonts w:hint="default"/>
+          <w:lang w:val="en-US"/>
+        </w:rPr>
+        <w:t>When you click on verify email address option your email will be verified and the email verified field will shown in the database.</w:t>
+      </w:r>
+    </w:p>
+    <w:p>
+      <w:pPr>
+        <w:numPr>
+          <w:ilvl w:val="0"/>
+          <w:numId w:val="0"/>
+        </w:numPr>
+        <w:jc w:val="both"/>
+        <w:rPr>
+          <w:rFonts w:hint="default"/>
+          <w:lang w:val="en-US"/>
+        </w:rPr>
+      </w:pPr>
+      <w:r>
+        <w:drawing>
+          <wp:inline distT="0" distB="0" distL="114300" distR="114300">
+            <wp:extent cx="5267960" cy="613410"/>
+            <wp:effectExtent l="0" t="0" r="5080" b="11430"/>
+            <wp:docPr id="26" name="Picture 3"/>
+            <wp:cNvGraphicFramePr>
+              <a:graphicFrameLocks xmlns:a="http://schemas.openxmlformats.org/drawingml/2006/main" noChangeAspect="1"/>
+            </wp:cNvGraphicFramePr>
+            <a:graphic xmlns:a="http://schemas.openxmlformats.org/drawingml/2006/main">
+              <a:graphicData uri="http://schemas.openxmlformats.org/drawingml/2006/picture">
+                <pic:pic xmlns:pic="http://schemas.openxmlformats.org/drawingml/2006/picture">
+                  <pic:nvPicPr>
+                    <pic:cNvPr id="26" name="Picture 3"/>
+                    <pic:cNvPicPr>
+                      <a:picLocks noChangeAspect="1"/>
+                    </pic:cNvPicPr>
+                  </pic:nvPicPr>
+                  <pic:blipFill>
+                    <a:blip r:embed="rId29"/>
+                    <a:stretch>
+                      <a:fillRect/>
+                    </a:stretch>
+                  </pic:blipFill>
+                  <pic:spPr>
+                    <a:xfrm>
+                      <a:off x="0" y="0"/>
+                      <a:ext cx="5267960" cy="613410"/>
                     </a:xfrm>
                     <a:prstGeom prst="rect">
                       <a:avLst/>

</xml_diff>

<commit_message>
Laravel Breeze reset Password System
</commit_message>
<xml_diff>
--- a/Laravel.docx
+++ b/Laravel.docx
@@ -151,12 +151,6 @@
             <w:insideH w:val="single" w:color="auto" w:sz="4" w:space="0"/>
             <w:insideV w:val="single" w:color="auto" w:sz="4" w:space="0"/>
           </w:tblBorders>
-          <w:tblCellMar>
-            <w:top w:w="0" w:type="dxa"/>
-            <w:left w:w="108" w:type="dxa"/>
-            <w:bottom w:w="0" w:type="dxa"/>
-            <w:right w:w="108" w:type="dxa"/>
-          </w:tblCellMar>
         </w:tblPrEx>
         <w:tc>
           <w:tcPr>
@@ -3015,10 +3009,6 @@
           <w:numId w:val="0"/>
         </w:numPr>
         <w:jc w:val="both"/>
-        <w:rPr>
-          <w:rFonts w:hint="default"/>
-          <w:lang w:val="en-US"/>
-        </w:rPr>
       </w:pPr>
       <w:r>
         <w:drawing>
@@ -3063,8 +3053,603 @@
           </wp:inline>
         </w:drawing>
       </w:r>
+    </w:p>
+    <w:p>
+      <w:pPr>
+        <w:numPr>
+          <w:ilvl w:val="0"/>
+          <w:numId w:val="0"/>
+        </w:numPr>
+        <w:jc w:val="both"/>
+      </w:pPr>
+    </w:p>
+    <w:p>
+      <w:pPr>
+        <w:numPr>
+          <w:ilvl w:val="0"/>
+          <w:numId w:val="1"/>
+        </w:numPr>
+        <w:ind w:left="0" w:leftChars="0" w:firstLine="0" w:firstLineChars="0"/>
+        <w:jc w:val="both"/>
+        <w:rPr>
+          <w:rFonts w:hint="default"/>
+          <w:b/>
+          <w:bCs/>
+          <w:sz w:val="24"/>
+          <w:szCs w:val="24"/>
+          <w:lang w:val="en-US"/>
+        </w:rPr>
+      </w:pPr>
+      <w:r>
+        <w:rPr>
+          <w:rFonts w:hint="default"/>
+          <w:b/>
+          <w:bCs/>
+          <w:sz w:val="24"/>
+          <w:szCs w:val="24"/>
+          <w:lang w:val="en-US"/>
+        </w:rPr>
+        <w:t>Laravel Breeze reset Password System</w:t>
+      </w:r>
+    </w:p>
+    <w:p>
+      <w:pPr>
+        <w:numPr>
+          <w:numId w:val="0"/>
+        </w:numPr>
+        <w:jc w:val="both"/>
+        <w:rPr>
+          <w:rFonts w:hint="default"/>
+          <w:b/>
+          <w:bCs/>
+          <w:sz w:val="24"/>
+          <w:szCs w:val="24"/>
+          <w:lang w:val="en-US"/>
+        </w:rPr>
+      </w:pPr>
+    </w:p>
+    <w:p>
+      <w:pPr>
+        <w:numPr>
+          <w:numId w:val="0"/>
+        </w:numPr>
+        <w:jc w:val="both"/>
+        <w:rPr>
+          <w:rFonts w:hint="default"/>
+          <w:b w:val="0"/>
+          <w:bCs w:val="0"/>
+          <w:sz w:val="20"/>
+          <w:szCs w:val="20"/>
+          <w:lang w:val="en-US"/>
+        </w:rPr>
+      </w:pPr>
+      <w:r>
+        <w:rPr>
+          <w:rFonts w:hint="default"/>
+          <w:b w:val="0"/>
+          <w:bCs w:val="0"/>
+          <w:sz w:val="20"/>
+          <w:szCs w:val="20"/>
+          <w:lang w:val="en-US"/>
+        </w:rPr>
+        <w:t>First you need to go to the login page and click on the forgot password link.</w:t>
+      </w:r>
+    </w:p>
+    <w:p>
+      <w:pPr>
+        <w:numPr>
+          <w:numId w:val="0"/>
+        </w:numPr>
+        <w:jc w:val="both"/>
+      </w:pPr>
+      <w:r>
+        <w:drawing>
+          <wp:inline distT="0" distB="0" distL="114300" distR="114300">
+            <wp:extent cx="5271135" cy="4668520"/>
+            <wp:effectExtent l="0" t="0" r="1905" b="10160"/>
+            <wp:docPr id="27" name="Picture 4"/>
+            <wp:cNvGraphicFramePr>
+              <a:graphicFrameLocks xmlns:a="http://schemas.openxmlformats.org/drawingml/2006/main" noChangeAspect="1"/>
+            </wp:cNvGraphicFramePr>
+            <a:graphic xmlns:a="http://schemas.openxmlformats.org/drawingml/2006/main">
+              <a:graphicData uri="http://schemas.openxmlformats.org/drawingml/2006/picture">
+                <pic:pic xmlns:pic="http://schemas.openxmlformats.org/drawingml/2006/picture">
+                  <pic:nvPicPr>
+                    <pic:cNvPr id="27" name="Picture 4"/>
+                    <pic:cNvPicPr>
+                      <a:picLocks noChangeAspect="1"/>
+                    </pic:cNvPicPr>
+                  </pic:nvPicPr>
+                  <pic:blipFill>
+                    <a:blip r:embed="rId30"/>
+                    <a:stretch>
+                      <a:fillRect/>
+                    </a:stretch>
+                  </pic:blipFill>
+                  <pic:spPr>
+                    <a:xfrm>
+                      <a:off x="0" y="0"/>
+                      <a:ext cx="5271135" cy="4668520"/>
+                    </a:xfrm>
+                    <a:prstGeom prst="rect">
+                      <a:avLst/>
+                    </a:prstGeom>
+                    <a:noFill/>
+                    <a:ln>
+                      <a:noFill/>
+                    </a:ln>
+                  </pic:spPr>
+                </pic:pic>
+              </a:graphicData>
+            </a:graphic>
+          </wp:inline>
+        </w:drawing>
+      </w:r>
+    </w:p>
+    <w:p>
+      <w:pPr>
+        <w:numPr>
+          <w:numId w:val="0"/>
+        </w:numPr>
+        <w:jc w:val="both"/>
+      </w:pPr>
+    </w:p>
+    <w:p>
+      <w:pPr>
+        <w:numPr>
+          <w:numId w:val="0"/>
+        </w:numPr>
+        <w:jc w:val="both"/>
+        <w:rPr>
+          <w:rFonts w:hint="default"/>
+          <w:lang w:val="en-US"/>
+        </w:rPr>
+      </w:pPr>
+      <w:r>
+        <w:rPr>
+          <w:rFonts w:hint="default"/>
+          <w:lang w:val="en-US"/>
+        </w:rPr>
+        <w:t>Then you will be redirected to the forgot password page. Here, enter the email that you want to reset the password and click on the email password reset link button.</w:t>
+      </w:r>
+    </w:p>
+    <w:p>
+      <w:pPr>
+        <w:numPr>
+          <w:numId w:val="0"/>
+        </w:numPr>
+        <w:jc w:val="both"/>
+        <w:rPr>
+          <w:rFonts w:hint="default"/>
+          <w:lang w:val="en-US"/>
+        </w:rPr>
+      </w:pPr>
+    </w:p>
+    <w:p>
+      <w:pPr>
+        <w:numPr>
+          <w:numId w:val="0"/>
+        </w:numPr>
+        <w:jc w:val="both"/>
+        <w:rPr>
+          <w:rFonts w:hint="default"/>
+          <w:lang w:val="en-US"/>
+        </w:rPr>
+      </w:pPr>
+    </w:p>
+    <w:p>
+      <w:pPr>
+        <w:numPr>
+          <w:numId w:val="0"/>
+        </w:numPr>
+        <w:jc w:val="both"/>
+      </w:pPr>
+      <w:r>
+        <w:drawing>
+          <wp:inline distT="0" distB="0" distL="114300" distR="114300">
+            <wp:extent cx="4450715" cy="3037205"/>
+            <wp:effectExtent l="0" t="0" r="14605" b="10795"/>
+            <wp:docPr id="29" name="Picture 6"/>
+            <wp:cNvGraphicFramePr>
+              <a:graphicFrameLocks xmlns:a="http://schemas.openxmlformats.org/drawingml/2006/main" noChangeAspect="1"/>
+            </wp:cNvGraphicFramePr>
+            <a:graphic xmlns:a="http://schemas.openxmlformats.org/drawingml/2006/main">
+              <a:graphicData uri="http://schemas.openxmlformats.org/drawingml/2006/picture">
+                <pic:pic xmlns:pic="http://schemas.openxmlformats.org/drawingml/2006/picture">
+                  <pic:nvPicPr>
+                    <pic:cNvPr id="29" name="Picture 6"/>
+                    <pic:cNvPicPr>
+                      <a:picLocks noChangeAspect="1"/>
+                    </pic:cNvPicPr>
+                  </pic:nvPicPr>
+                  <pic:blipFill>
+                    <a:blip r:embed="rId31"/>
+                    <a:stretch>
+                      <a:fillRect/>
+                    </a:stretch>
+                  </pic:blipFill>
+                  <pic:spPr>
+                    <a:xfrm>
+                      <a:off x="0" y="0"/>
+                      <a:ext cx="4450715" cy="3037205"/>
+                    </a:xfrm>
+                    <a:prstGeom prst="rect">
+                      <a:avLst/>
+                    </a:prstGeom>
+                    <a:noFill/>
+                    <a:ln>
+                      <a:noFill/>
+                    </a:ln>
+                  </pic:spPr>
+                </pic:pic>
+              </a:graphicData>
+            </a:graphic>
+          </wp:inline>
+        </w:drawing>
+      </w:r>
+    </w:p>
+    <w:p>
+      <w:pPr>
+        <w:numPr>
+          <w:numId w:val="0"/>
+        </w:numPr>
+        <w:jc w:val="both"/>
+      </w:pPr>
+    </w:p>
+    <w:p>
+      <w:pPr>
+        <w:numPr>
+          <w:numId w:val="0"/>
+        </w:numPr>
+        <w:jc w:val="both"/>
+        <w:rPr>
+          <w:rFonts w:hint="default"/>
+          <w:lang w:val="en-US"/>
+        </w:rPr>
+      </w:pPr>
+      <w:r>
+        <w:rPr>
+          <w:rFonts w:hint="default"/>
+          <w:lang w:val="en-US"/>
+        </w:rPr>
+        <w:t>After that you will receive a mail in your mail as shown and when clicked on reset password it will redirect you to the reset password page.</w:t>
+      </w:r>
+    </w:p>
+    <w:p>
+      <w:pPr>
+        <w:numPr>
+          <w:numId w:val="0"/>
+        </w:numPr>
+        <w:jc w:val="both"/>
+      </w:pPr>
+      <w:r>
+        <w:drawing>
+          <wp:inline distT="0" distB="0" distL="114300" distR="114300">
+            <wp:extent cx="5267960" cy="2675255"/>
+            <wp:effectExtent l="0" t="0" r="5080" b="6985"/>
+            <wp:docPr id="30" name="Picture 7"/>
+            <wp:cNvGraphicFramePr>
+              <a:graphicFrameLocks xmlns:a="http://schemas.openxmlformats.org/drawingml/2006/main" noChangeAspect="1"/>
+            </wp:cNvGraphicFramePr>
+            <a:graphic xmlns:a="http://schemas.openxmlformats.org/drawingml/2006/main">
+              <a:graphicData uri="http://schemas.openxmlformats.org/drawingml/2006/picture">
+                <pic:pic xmlns:pic="http://schemas.openxmlformats.org/drawingml/2006/picture">
+                  <pic:nvPicPr>
+                    <pic:cNvPr id="30" name="Picture 7"/>
+                    <pic:cNvPicPr>
+                      <a:picLocks noChangeAspect="1"/>
+                    </pic:cNvPicPr>
+                  </pic:nvPicPr>
+                  <pic:blipFill>
+                    <a:blip r:embed="rId32"/>
+                    <a:stretch>
+                      <a:fillRect/>
+                    </a:stretch>
+                  </pic:blipFill>
+                  <pic:spPr>
+                    <a:xfrm>
+                      <a:off x="0" y="0"/>
+                      <a:ext cx="5267960" cy="2675255"/>
+                    </a:xfrm>
+                    <a:prstGeom prst="rect">
+                      <a:avLst/>
+                    </a:prstGeom>
+                    <a:noFill/>
+                    <a:ln>
+                      <a:noFill/>
+                    </a:ln>
+                  </pic:spPr>
+                </pic:pic>
+              </a:graphicData>
+            </a:graphic>
+          </wp:inline>
+        </w:drawing>
+      </w:r>
+    </w:p>
+    <w:p>
+      <w:pPr>
+        <w:numPr>
+          <w:numId w:val="0"/>
+        </w:numPr>
+        <w:jc w:val="both"/>
+      </w:pPr>
+    </w:p>
+    <w:p>
+      <w:pPr>
+        <w:numPr>
+          <w:numId w:val="0"/>
+        </w:numPr>
+        <w:jc w:val="both"/>
+        <w:rPr>
+          <w:rFonts w:hint="default"/>
+          <w:lang w:val="en-US"/>
+        </w:rPr>
+      </w:pPr>
+      <w:r>
+        <w:rPr>
+          <w:rFonts w:hint="default"/>
+          <w:lang w:val="en-US"/>
+        </w:rPr>
+        <w:t>Then in the reset password email you will be asked to enter the password and confirm password as shown below and click on reset button.</w:t>
+      </w:r>
+    </w:p>
+    <w:p>
+      <w:pPr>
+        <w:numPr>
+          <w:numId w:val="0"/>
+        </w:numPr>
+        <w:jc w:val="both"/>
+        <w:rPr>
+          <w:rFonts w:hint="default"/>
+          <w:lang w:val="en-US"/>
+        </w:rPr>
+      </w:pPr>
+    </w:p>
+    <w:p>
+      <w:pPr>
+        <w:numPr>
+          <w:numId w:val="0"/>
+        </w:numPr>
+        <w:jc w:val="both"/>
+      </w:pPr>
+      <w:r>
+        <w:drawing>
+          <wp:inline distT="0" distB="0" distL="114300" distR="114300">
+            <wp:extent cx="5151120" cy="4427220"/>
+            <wp:effectExtent l="0" t="0" r="0" b="7620"/>
+            <wp:docPr id="32" name="Picture 9"/>
+            <wp:cNvGraphicFramePr>
+              <a:graphicFrameLocks xmlns:a="http://schemas.openxmlformats.org/drawingml/2006/main" noChangeAspect="1"/>
+            </wp:cNvGraphicFramePr>
+            <a:graphic xmlns:a="http://schemas.openxmlformats.org/drawingml/2006/main">
+              <a:graphicData uri="http://schemas.openxmlformats.org/drawingml/2006/picture">
+                <pic:pic xmlns:pic="http://schemas.openxmlformats.org/drawingml/2006/picture">
+                  <pic:nvPicPr>
+                    <pic:cNvPr id="32" name="Picture 9"/>
+                    <pic:cNvPicPr>
+                      <a:picLocks noChangeAspect="1"/>
+                    </pic:cNvPicPr>
+                  </pic:nvPicPr>
+                  <pic:blipFill>
+                    <a:blip r:embed="rId33"/>
+                    <a:stretch>
+                      <a:fillRect/>
+                    </a:stretch>
+                  </pic:blipFill>
+                  <pic:spPr>
+                    <a:xfrm>
+                      <a:off x="0" y="0"/>
+                      <a:ext cx="5151120" cy="4427220"/>
+                    </a:xfrm>
+                    <a:prstGeom prst="rect">
+                      <a:avLst/>
+                    </a:prstGeom>
+                    <a:noFill/>
+                    <a:ln>
+                      <a:noFill/>
+                    </a:ln>
+                  </pic:spPr>
+                </pic:pic>
+              </a:graphicData>
+            </a:graphic>
+          </wp:inline>
+        </w:drawing>
+      </w:r>
+    </w:p>
+    <w:p>
+      <w:pPr>
+        <w:numPr>
+          <w:numId w:val="0"/>
+        </w:numPr>
+        <w:jc w:val="both"/>
+        <w:rPr>
+          <w:rFonts w:hint="default"/>
+          <w:lang w:val="en-US"/>
+        </w:rPr>
+      </w:pPr>
+      <w:r>
+        <w:rPr>
+          <w:rFonts w:hint="default"/>
+          <w:lang w:val="en-US"/>
+        </w:rPr>
+        <w:t xml:space="preserve"> </w:t>
+      </w:r>
+    </w:p>
+    <w:p>
+      <w:pPr>
+        <w:numPr>
+          <w:numId w:val="0"/>
+        </w:numPr>
+        <w:jc w:val="both"/>
+        <w:rPr>
+          <w:rFonts w:hint="default"/>
+          <w:b w:val="0"/>
+          <w:bCs w:val="0"/>
+          <w:lang w:val="en-US"/>
+        </w:rPr>
+      </w:pPr>
+      <w:r>
+        <w:rPr>
+          <w:rFonts w:hint="default"/>
+          <w:b/>
+          <w:bCs/>
+          <w:lang w:val="en-US"/>
+        </w:rPr>
+        <w:t>Note:</w:t>
+      </w:r>
+      <w:r>
+        <w:rPr>
+          <w:rFonts w:hint="default"/>
+          <w:lang w:val="en-US"/>
+        </w:rPr>
+        <w:t xml:space="preserve">After you click on forget password button in your email you will also see the data in </w:t>
+      </w:r>
+      <w:r>
+        <w:rPr>
+          <w:rFonts w:hint="default"/>
+          <w:b/>
+          <w:bCs/>
+          <w:lang w:val="en-US"/>
+        </w:rPr>
+        <w:t xml:space="preserve">password_reset_tokens </w:t>
+      </w:r>
+      <w:r>
+        <w:rPr>
+          <w:rFonts w:hint="default"/>
+          <w:b w:val="0"/>
+          <w:bCs w:val="0"/>
+          <w:lang w:val="en-US"/>
+        </w:rPr>
+        <w:t>table in the database.</w:t>
+      </w:r>
+    </w:p>
+    <w:p>
+      <w:pPr>
+        <w:numPr>
+          <w:numId w:val="0"/>
+        </w:numPr>
+        <w:jc w:val="both"/>
+        <w:rPr>
+          <w:rFonts w:hint="default"/>
+          <w:b w:val="0"/>
+          <w:bCs w:val="0"/>
+          <w:lang w:val="en-US"/>
+        </w:rPr>
+      </w:pPr>
+    </w:p>
+    <w:p>
+      <w:pPr>
+        <w:numPr>
+          <w:numId w:val="0"/>
+        </w:numPr>
+        <w:jc w:val="both"/>
+      </w:pPr>
+      <w:r>
+        <w:drawing>
+          <wp:inline distT="0" distB="0" distL="114300" distR="114300">
+            <wp:extent cx="5270500" cy="358775"/>
+            <wp:effectExtent l="0" t="0" r="2540" b="6985"/>
+            <wp:docPr id="31" name="Picture 8"/>
+            <wp:cNvGraphicFramePr>
+              <a:graphicFrameLocks xmlns:a="http://schemas.openxmlformats.org/drawingml/2006/main" noChangeAspect="1"/>
+            </wp:cNvGraphicFramePr>
+            <a:graphic xmlns:a="http://schemas.openxmlformats.org/drawingml/2006/main">
+              <a:graphicData uri="http://schemas.openxmlformats.org/drawingml/2006/picture">
+                <pic:pic xmlns:pic="http://schemas.openxmlformats.org/drawingml/2006/picture">
+                  <pic:nvPicPr>
+                    <pic:cNvPr id="31" name="Picture 8"/>
+                    <pic:cNvPicPr>
+                      <a:picLocks noChangeAspect="1"/>
+                    </pic:cNvPicPr>
+                  </pic:nvPicPr>
+                  <pic:blipFill>
+                    <a:blip r:embed="rId34"/>
+                    <a:stretch>
+                      <a:fillRect/>
+                    </a:stretch>
+                  </pic:blipFill>
+                  <pic:spPr>
+                    <a:xfrm>
+                      <a:off x="0" y="0"/>
+                      <a:ext cx="5270500" cy="358775"/>
+                    </a:xfrm>
+                    <a:prstGeom prst="rect">
+                      <a:avLst/>
+                    </a:prstGeom>
+                    <a:noFill/>
+                    <a:ln>
+                      <a:noFill/>
+                    </a:ln>
+                  </pic:spPr>
+                </pic:pic>
+              </a:graphicData>
+            </a:graphic>
+          </wp:inline>
+        </w:drawing>
+      </w:r>
+    </w:p>
+    <w:p>
+      <w:pPr>
+        <w:numPr>
+          <w:numId w:val="0"/>
+        </w:numPr>
+        <w:jc w:val="both"/>
+      </w:pPr>
+    </w:p>
+    <w:p>
+      <w:pPr>
+        <w:numPr>
+          <w:ilvl w:val="0"/>
+          <w:numId w:val="1"/>
+        </w:numPr>
+        <w:ind w:left="0" w:leftChars="0" w:firstLine="0" w:firstLineChars="0"/>
+        <w:jc w:val="both"/>
+        <w:rPr>
+          <w:rFonts w:hint="default"/>
+          <w:b/>
+          <w:bCs/>
+          <w:sz w:val="24"/>
+          <w:szCs w:val="24"/>
+          <w:lang w:val="en-US"/>
+        </w:rPr>
+      </w:pPr>
       <w:bookmarkStart w:id="0" w:name="_GoBack"/>
-      <w:bookmarkEnd w:id="0"/>
+      <w:r>
+        <w:rPr>
+          <w:rFonts w:hint="default"/>
+          <w:b/>
+          <w:bCs/>
+          <w:sz w:val="24"/>
+          <w:szCs w:val="24"/>
+          <w:lang w:val="en-US"/>
+        </w:rPr>
+        <w:t>Laravel Multi Auth with Breeze Part 1</w:t>
+      </w:r>
+    </w:p>
+    <w:bookmarkEnd w:id="0"/>
+    <w:p>
+      <w:pPr>
+        <w:numPr>
+          <w:numId w:val="0"/>
+        </w:numPr>
+        <w:jc w:val="both"/>
+        <w:rPr>
+          <w:rFonts w:hint="default"/>
+          <w:lang w:val="en-US"/>
+        </w:rPr>
+      </w:pPr>
+    </w:p>
+    <w:p>
+      <w:pPr>
+        <w:numPr>
+          <w:numId w:val="0"/>
+        </w:numPr>
+        <w:jc w:val="both"/>
+        <w:rPr>
+          <w:rFonts w:hint="default"/>
+          <w:lang w:val="en-US"/>
+        </w:rPr>
+      </w:pPr>
     </w:p>
     <w:sectPr>
       <w:pgSz w:w="11906" w:h="16838"/>

</xml_diff>

<commit_message>
Laravel Multi Auth with Breeze Pt1. Added admin model and admins migration.
</commit_message>
<xml_diff>
--- a/Laravel.docx
+++ b/Laravel.docx
@@ -151,6 +151,12 @@
             <w:insideH w:val="single" w:color="auto" w:sz="4" w:space="0"/>
             <w:insideV w:val="single" w:color="auto" w:sz="4" w:space="0"/>
           </w:tblBorders>
+          <w:tblCellMar>
+            <w:top w:w="0" w:type="dxa"/>
+            <w:left w:w="108" w:type="dxa"/>
+            <w:bottom w:w="0" w:type="dxa"/>
+            <w:right w:w="108" w:type="dxa"/>
+          </w:tblCellMar>
         </w:tblPrEx>
         <w:tc>
           <w:tcPr>
@@ -3613,7 +3619,6 @@
           <w:lang w:val="en-US"/>
         </w:rPr>
       </w:pPr>
-      <w:bookmarkStart w:id="0" w:name="_GoBack"/>
       <w:r>
         <w:rPr>
           <w:rFonts w:hint="default"/>
@@ -3626,7 +3631,1179 @@
         <w:t>Laravel Multi Auth with Breeze Part 1</w:t>
       </w:r>
     </w:p>
-    <w:bookmarkEnd w:id="0"/>
+    <w:p>
+      <w:pPr>
+        <w:numPr>
+          <w:numId w:val="0"/>
+        </w:numPr>
+        <w:jc w:val="both"/>
+        <w:rPr>
+          <w:rFonts w:hint="default"/>
+          <w:b/>
+          <w:bCs/>
+          <w:sz w:val="24"/>
+          <w:szCs w:val="24"/>
+          <w:lang w:val="en-US"/>
+        </w:rPr>
+      </w:pPr>
+    </w:p>
+    <w:p>
+      <w:pPr>
+        <w:numPr>
+          <w:numId w:val="0"/>
+        </w:numPr>
+        <w:jc w:val="both"/>
+        <w:rPr>
+          <w:rFonts w:hint="default"/>
+          <w:b w:val="0"/>
+          <w:bCs w:val="0"/>
+          <w:sz w:val="20"/>
+          <w:szCs w:val="20"/>
+          <w:lang w:val="en-US"/>
+        </w:rPr>
+      </w:pPr>
+      <w:r>
+        <w:rPr>
+          <w:rFonts w:hint="default"/>
+          <w:b w:val="0"/>
+          <w:bCs w:val="0"/>
+          <w:sz w:val="20"/>
+          <w:szCs w:val="20"/>
+          <w:lang w:val="en-US"/>
+        </w:rPr>
+        <w:t>Here we need to make the admin authentication. To do that first you need to enter the following command:</w:t>
+      </w:r>
+    </w:p>
+    <w:tbl>
+      <w:tblPr>
+        <w:tblStyle w:val="4"/>
+        <w:tblW w:w="0" w:type="auto"/>
+        <w:tblInd w:w="0" w:type="dxa"/>
+        <w:tblBorders>
+          <w:top w:val="single" w:color="auto" w:sz="4" w:space="0"/>
+          <w:left w:val="single" w:color="auto" w:sz="4" w:space="0"/>
+          <w:bottom w:val="single" w:color="auto" w:sz="4" w:space="0"/>
+          <w:right w:val="single" w:color="auto" w:sz="4" w:space="0"/>
+          <w:insideH w:val="single" w:color="auto" w:sz="4" w:space="0"/>
+          <w:insideV w:val="single" w:color="auto" w:sz="4" w:space="0"/>
+        </w:tblBorders>
+        <w:tblLayout w:type="autofit"/>
+        <w:tblCellMar>
+          <w:left w:w="108" w:type="dxa"/>
+          <w:right w:w="108" w:type="dxa"/>
+        </w:tblCellMar>
+      </w:tblPr>
+      <w:tblGrid>
+        <w:gridCol w:w="8522"/>
+      </w:tblGrid>
+      <w:tr>
+        <w:tblPrEx>
+          <w:tblBorders>
+            <w:top w:val="single" w:color="auto" w:sz="4" w:space="0"/>
+            <w:left w:val="single" w:color="auto" w:sz="4" w:space="0"/>
+            <w:bottom w:val="single" w:color="auto" w:sz="4" w:space="0"/>
+            <w:right w:val="single" w:color="auto" w:sz="4" w:space="0"/>
+            <w:insideH w:val="single" w:color="auto" w:sz="4" w:space="0"/>
+            <w:insideV w:val="single" w:color="auto" w:sz="4" w:space="0"/>
+          </w:tblBorders>
+          <w:tblCellMar>
+            <w:left w:w="108" w:type="dxa"/>
+            <w:right w:w="108" w:type="dxa"/>
+          </w:tblCellMar>
+        </w:tblPrEx>
+        <w:tc>
+          <w:tcPr>
+            <w:tcW w:w="8522" w:type="dxa"/>
+          </w:tcPr>
+          <w:p>
+            <w:pPr>
+              <w:numPr>
+                <w:numId w:val="0"/>
+              </w:numPr>
+              <w:jc w:val="both"/>
+              <w:rPr>
+                <w:rFonts w:hint="default"/>
+                <w:b w:val="0"/>
+                <w:bCs w:val="0"/>
+                <w:sz w:val="20"/>
+                <w:szCs w:val="20"/>
+                <w:vertAlign w:val="baseline"/>
+                <w:lang w:val="en-US"/>
+              </w:rPr>
+            </w:pPr>
+            <w:r>
+              <w:rPr>
+                <w:rFonts w:hint="default"/>
+                <w:b w:val="0"/>
+                <w:bCs w:val="0"/>
+                <w:sz w:val="20"/>
+                <w:szCs w:val="20"/>
+                <w:vertAlign w:val="baseline"/>
+                <w:lang w:val="en-US"/>
+              </w:rPr>
+              <w:t>php artisan make:model Admin -m</w:t>
+            </w:r>
+          </w:p>
+        </w:tc>
+      </w:tr>
+    </w:tbl>
+    <w:p>
+      <w:pPr>
+        <w:numPr>
+          <w:numId w:val="0"/>
+        </w:numPr>
+        <w:jc w:val="both"/>
+        <w:rPr>
+          <w:rFonts w:hint="default"/>
+          <w:b w:val="0"/>
+          <w:bCs w:val="0"/>
+          <w:sz w:val="20"/>
+          <w:szCs w:val="20"/>
+          <w:lang w:val="en-US"/>
+        </w:rPr>
+      </w:pPr>
+    </w:p>
+    <w:p>
+      <w:pPr>
+        <w:numPr>
+          <w:numId w:val="0"/>
+        </w:numPr>
+        <w:jc w:val="both"/>
+      </w:pPr>
+      <w:r>
+        <w:drawing>
+          <wp:inline distT="0" distB="0" distL="114300" distR="114300">
+            <wp:extent cx="6281420" cy="565150"/>
+            <wp:effectExtent l="0" t="0" r="12700" b="13970"/>
+            <wp:docPr id="33" name="Picture 10"/>
+            <wp:cNvGraphicFramePr>
+              <a:graphicFrameLocks xmlns:a="http://schemas.openxmlformats.org/drawingml/2006/main" noChangeAspect="1"/>
+            </wp:cNvGraphicFramePr>
+            <a:graphic xmlns:a="http://schemas.openxmlformats.org/drawingml/2006/main">
+              <a:graphicData uri="http://schemas.openxmlformats.org/drawingml/2006/picture">
+                <pic:pic xmlns:pic="http://schemas.openxmlformats.org/drawingml/2006/picture">
+                  <pic:nvPicPr>
+                    <pic:cNvPr id="33" name="Picture 10"/>
+                    <pic:cNvPicPr>
+                      <a:picLocks noChangeAspect="1"/>
+                    </pic:cNvPicPr>
+                  </pic:nvPicPr>
+                  <pic:blipFill>
+                    <a:blip r:embed="rId35"/>
+                    <a:stretch>
+                      <a:fillRect/>
+                    </a:stretch>
+                  </pic:blipFill>
+                  <pic:spPr>
+                    <a:xfrm>
+                      <a:off x="0" y="0"/>
+                      <a:ext cx="6281420" cy="565150"/>
+                    </a:xfrm>
+                    <a:prstGeom prst="rect">
+                      <a:avLst/>
+                    </a:prstGeom>
+                    <a:noFill/>
+                    <a:ln>
+                      <a:noFill/>
+                    </a:ln>
+                  </pic:spPr>
+                </pic:pic>
+              </a:graphicData>
+            </a:graphic>
+          </wp:inline>
+        </w:drawing>
+      </w:r>
+    </w:p>
+    <w:p>
+      <w:pPr>
+        <w:numPr>
+          <w:numId w:val="0"/>
+        </w:numPr>
+        <w:jc w:val="both"/>
+        <w:rPr>
+          <w:rFonts w:hint="default"/>
+          <w:lang w:val="en-US"/>
+        </w:rPr>
+      </w:pPr>
+    </w:p>
+    <w:p>
+      <w:pPr>
+        <w:numPr>
+          <w:numId w:val="0"/>
+        </w:numPr>
+        <w:jc w:val="both"/>
+        <w:rPr>
+          <w:rFonts w:hint="default"/>
+          <w:lang w:val="en-US"/>
+        </w:rPr>
+      </w:pPr>
+      <w:r>
+        <w:rPr>
+          <w:rFonts w:hint="default"/>
+          <w:lang w:val="en-US"/>
+        </w:rPr>
+        <w:t>The above command will create an admin model and a database migration file for the admins table.</w:t>
+      </w:r>
+    </w:p>
+    <w:p>
+      <w:pPr>
+        <w:numPr>
+          <w:numId w:val="0"/>
+        </w:numPr>
+        <w:jc w:val="both"/>
+        <w:rPr>
+          <w:rFonts w:hint="default"/>
+          <w:lang w:val="en-US"/>
+        </w:rPr>
+      </w:pPr>
+    </w:p>
+    <w:p>
+      <w:pPr>
+        <w:numPr>
+          <w:numId w:val="0"/>
+        </w:numPr>
+        <w:jc w:val="both"/>
+        <w:rPr>
+          <w:rFonts w:hint="default"/>
+          <w:lang w:val="en-US"/>
+        </w:rPr>
+      </w:pPr>
+      <w:r>
+        <w:rPr>
+          <w:rFonts w:hint="default"/>
+          <w:lang w:val="en-US"/>
+        </w:rPr>
+        <w:t>After that go to the admins migration (database-&gt;migrations-&gt;create_admins_table.php) and add fields as shown below:</w:t>
+      </w:r>
+    </w:p>
+    <w:p>
+      <w:pPr>
+        <w:numPr>
+          <w:numId w:val="0"/>
+        </w:numPr>
+        <w:jc w:val="both"/>
+        <w:rPr>
+          <w:rFonts w:hint="default"/>
+          <w:lang w:val="en-US"/>
+        </w:rPr>
+      </w:pPr>
+    </w:p>
+    <w:p>
+      <w:pPr>
+        <w:numPr>
+          <w:numId w:val="0"/>
+        </w:numPr>
+        <w:jc w:val="both"/>
+      </w:pPr>
+      <w:r>
+        <w:drawing>
+          <wp:inline distT="0" distB="0" distL="114300" distR="114300">
+            <wp:extent cx="5270500" cy="3080385"/>
+            <wp:effectExtent l="0" t="0" r="2540" b="13335"/>
+            <wp:docPr id="37" name="Picture 14"/>
+            <wp:cNvGraphicFramePr>
+              <a:graphicFrameLocks xmlns:a="http://schemas.openxmlformats.org/drawingml/2006/main" noChangeAspect="1"/>
+            </wp:cNvGraphicFramePr>
+            <a:graphic xmlns:a="http://schemas.openxmlformats.org/drawingml/2006/main">
+              <a:graphicData uri="http://schemas.openxmlformats.org/drawingml/2006/picture">
+                <pic:pic xmlns:pic="http://schemas.openxmlformats.org/drawingml/2006/picture">
+                  <pic:nvPicPr>
+                    <pic:cNvPr id="37" name="Picture 14"/>
+                    <pic:cNvPicPr>
+                      <a:picLocks noChangeAspect="1"/>
+                    </pic:cNvPicPr>
+                  </pic:nvPicPr>
+                  <pic:blipFill>
+                    <a:blip r:embed="rId36"/>
+                    <a:stretch>
+                      <a:fillRect/>
+                    </a:stretch>
+                  </pic:blipFill>
+                  <pic:spPr>
+                    <a:xfrm>
+                      <a:off x="0" y="0"/>
+                      <a:ext cx="5270500" cy="3080385"/>
+                    </a:xfrm>
+                    <a:prstGeom prst="rect">
+                      <a:avLst/>
+                    </a:prstGeom>
+                    <a:noFill/>
+                    <a:ln>
+                      <a:noFill/>
+                    </a:ln>
+                  </pic:spPr>
+                </pic:pic>
+              </a:graphicData>
+            </a:graphic>
+          </wp:inline>
+        </w:drawing>
+      </w:r>
+    </w:p>
+    <w:p>
+      <w:pPr>
+        <w:numPr>
+          <w:numId w:val="0"/>
+        </w:numPr>
+        <w:jc w:val="both"/>
+      </w:pPr>
+    </w:p>
+    <w:p>
+      <w:pPr>
+        <w:numPr>
+          <w:numId w:val="0"/>
+        </w:numPr>
+        <w:jc w:val="both"/>
+        <w:rPr>
+          <w:rFonts w:hint="default"/>
+          <w:lang w:val="en-US"/>
+        </w:rPr>
+      </w:pPr>
+      <w:r>
+        <w:rPr>
+          <w:rFonts w:hint="default"/>
+          <w:lang w:val="en-US"/>
+        </w:rPr>
+        <w:t>After that go to the Admin Models (app-&gt;models-&gt;Admin.php) and add code as shown below:</w:t>
+      </w:r>
+    </w:p>
+    <w:p>
+      <w:pPr>
+        <w:numPr>
+          <w:numId w:val="0"/>
+        </w:numPr>
+        <w:jc w:val="both"/>
+      </w:pPr>
+      <w:r>
+        <w:drawing>
+          <wp:inline distT="0" distB="0" distL="114300" distR="114300">
+            <wp:extent cx="5271135" cy="3814445"/>
+            <wp:effectExtent l="0" t="0" r="1905" b="10795"/>
+            <wp:docPr id="35" name="Picture 12"/>
+            <wp:cNvGraphicFramePr>
+              <a:graphicFrameLocks xmlns:a="http://schemas.openxmlformats.org/drawingml/2006/main" noChangeAspect="1"/>
+            </wp:cNvGraphicFramePr>
+            <a:graphic xmlns:a="http://schemas.openxmlformats.org/drawingml/2006/main">
+              <a:graphicData uri="http://schemas.openxmlformats.org/drawingml/2006/picture">
+                <pic:pic xmlns:pic="http://schemas.openxmlformats.org/drawingml/2006/picture">
+                  <pic:nvPicPr>
+                    <pic:cNvPr id="35" name="Picture 12"/>
+                    <pic:cNvPicPr>
+                      <a:picLocks noChangeAspect="1"/>
+                    </pic:cNvPicPr>
+                  </pic:nvPicPr>
+                  <pic:blipFill>
+                    <a:blip r:embed="rId37"/>
+                    <a:stretch>
+                      <a:fillRect/>
+                    </a:stretch>
+                  </pic:blipFill>
+                  <pic:spPr>
+                    <a:xfrm>
+                      <a:off x="0" y="0"/>
+                      <a:ext cx="5271135" cy="3814445"/>
+                    </a:xfrm>
+                    <a:prstGeom prst="rect">
+                      <a:avLst/>
+                    </a:prstGeom>
+                    <a:noFill/>
+                    <a:ln>
+                      <a:noFill/>
+                    </a:ln>
+                  </pic:spPr>
+                </pic:pic>
+              </a:graphicData>
+            </a:graphic>
+          </wp:inline>
+        </w:drawing>
+      </w:r>
+    </w:p>
+    <w:p>
+      <w:pPr>
+        <w:numPr>
+          <w:numId w:val="0"/>
+        </w:numPr>
+        <w:jc w:val="both"/>
+      </w:pPr>
+    </w:p>
+    <w:p>
+      <w:pPr>
+        <w:numPr>
+          <w:numId w:val="0"/>
+        </w:numPr>
+        <w:jc w:val="both"/>
+        <w:rPr>
+          <w:rFonts w:hint="default"/>
+          <w:lang w:val="en-US"/>
+        </w:rPr>
+      </w:pPr>
+      <w:r>
+        <w:rPr>
+          <w:rFonts w:hint="default"/>
+          <w:lang w:val="en-US"/>
+        </w:rPr>
+        <w:t>After that you need to migrate the admins table to the database. To do that you need to use the command:</w:t>
+      </w:r>
+    </w:p>
+    <w:tbl>
+      <w:tblPr>
+        <w:tblStyle w:val="4"/>
+        <w:tblW w:w="0" w:type="auto"/>
+        <w:tblInd w:w="0" w:type="dxa"/>
+        <w:tblBorders>
+          <w:top w:val="single" w:color="auto" w:sz="4" w:space="0"/>
+          <w:left w:val="single" w:color="auto" w:sz="4" w:space="0"/>
+          <w:bottom w:val="single" w:color="auto" w:sz="4" w:space="0"/>
+          <w:right w:val="single" w:color="auto" w:sz="4" w:space="0"/>
+          <w:insideH w:val="single" w:color="auto" w:sz="4" w:space="0"/>
+          <w:insideV w:val="single" w:color="auto" w:sz="4" w:space="0"/>
+        </w:tblBorders>
+        <w:tblLayout w:type="autofit"/>
+        <w:tblCellMar>
+          <w:left w:w="108" w:type="dxa"/>
+          <w:right w:w="108" w:type="dxa"/>
+        </w:tblCellMar>
+      </w:tblPr>
+      <w:tblGrid>
+        <w:gridCol w:w="8522"/>
+      </w:tblGrid>
+      <w:tr>
+        <w:tblPrEx>
+          <w:tblBorders>
+            <w:top w:val="single" w:color="auto" w:sz="4" w:space="0"/>
+            <w:left w:val="single" w:color="auto" w:sz="4" w:space="0"/>
+            <w:bottom w:val="single" w:color="auto" w:sz="4" w:space="0"/>
+            <w:right w:val="single" w:color="auto" w:sz="4" w:space="0"/>
+            <w:insideH w:val="single" w:color="auto" w:sz="4" w:space="0"/>
+            <w:insideV w:val="single" w:color="auto" w:sz="4" w:space="0"/>
+          </w:tblBorders>
+          <w:tblCellMar>
+            <w:left w:w="108" w:type="dxa"/>
+            <w:right w:w="108" w:type="dxa"/>
+          </w:tblCellMar>
+        </w:tblPrEx>
+        <w:tc>
+          <w:tcPr>
+            <w:tcW w:w="8522" w:type="dxa"/>
+          </w:tcPr>
+          <w:p>
+            <w:pPr>
+              <w:numPr>
+                <w:numId w:val="0"/>
+              </w:numPr>
+              <w:jc w:val="both"/>
+              <w:rPr>
+                <w:rFonts w:hint="default"/>
+                <w:vertAlign w:val="baseline"/>
+                <w:lang w:val="en-US"/>
+              </w:rPr>
+            </w:pPr>
+            <w:r>
+              <w:rPr>
+                <w:rFonts w:hint="default"/>
+                <w:vertAlign w:val="baseline"/>
+                <w:lang w:val="en-US"/>
+              </w:rPr>
+              <w:t>php artisan migrate</w:t>
+            </w:r>
+          </w:p>
+        </w:tc>
+      </w:tr>
+    </w:tbl>
+    <w:p>
+      <w:pPr>
+        <w:numPr>
+          <w:numId w:val="0"/>
+        </w:numPr>
+        <w:jc w:val="both"/>
+        <w:rPr>
+          <w:rFonts w:hint="default"/>
+          <w:lang w:val="en-US"/>
+        </w:rPr>
+      </w:pPr>
+    </w:p>
+    <w:p>
+      <w:pPr>
+        <w:numPr>
+          <w:numId w:val="0"/>
+        </w:numPr>
+        <w:jc w:val="both"/>
+        <w:rPr>
+          <w:rFonts w:hint="default"/>
+          <w:lang w:val="en-US"/>
+        </w:rPr>
+      </w:pPr>
+      <w:r>
+        <w:rPr>
+          <w:rFonts w:hint="default"/>
+          <w:lang w:val="en-US"/>
+        </w:rPr>
+        <w:t>After you run the above command the table can be seen in your database.</w:t>
+      </w:r>
+    </w:p>
+    <w:p>
+      <w:pPr>
+        <w:numPr>
+          <w:numId w:val="0"/>
+        </w:numPr>
+        <w:jc w:val="both"/>
+        <w:rPr>
+          <w:rFonts w:hint="default"/>
+          <w:lang w:val="en-US"/>
+        </w:rPr>
+      </w:pPr>
+    </w:p>
+    <w:p>
+      <w:pPr>
+        <w:numPr>
+          <w:numId w:val="0"/>
+        </w:numPr>
+        <w:jc w:val="both"/>
+        <w:rPr>
+          <w:rFonts w:hint="default"/>
+          <w:lang w:val="en-US"/>
+        </w:rPr>
+      </w:pPr>
+      <w:r>
+        <w:drawing>
+          <wp:inline distT="0" distB="0" distL="114300" distR="114300">
+            <wp:extent cx="5267960" cy="2435860"/>
+            <wp:effectExtent l="0" t="0" r="5080" b="2540"/>
+            <wp:docPr id="38" name="Picture 15"/>
+            <wp:cNvGraphicFramePr>
+              <a:graphicFrameLocks xmlns:a="http://schemas.openxmlformats.org/drawingml/2006/main" noChangeAspect="1"/>
+            </wp:cNvGraphicFramePr>
+            <a:graphic xmlns:a="http://schemas.openxmlformats.org/drawingml/2006/main">
+              <a:graphicData uri="http://schemas.openxmlformats.org/drawingml/2006/picture">
+                <pic:pic xmlns:pic="http://schemas.openxmlformats.org/drawingml/2006/picture">
+                  <pic:nvPicPr>
+                    <pic:cNvPr id="38" name="Picture 15"/>
+                    <pic:cNvPicPr>
+                      <a:picLocks noChangeAspect="1"/>
+                    </pic:cNvPicPr>
+                  </pic:nvPicPr>
+                  <pic:blipFill>
+                    <a:blip r:embed="rId38"/>
+                    <a:stretch>
+                      <a:fillRect/>
+                    </a:stretch>
+                  </pic:blipFill>
+                  <pic:spPr>
+                    <a:xfrm>
+                      <a:off x="0" y="0"/>
+                      <a:ext cx="5267960" cy="2435860"/>
+                    </a:xfrm>
+                    <a:prstGeom prst="rect">
+                      <a:avLst/>
+                    </a:prstGeom>
+                    <a:noFill/>
+                    <a:ln>
+                      <a:noFill/>
+                    </a:ln>
+                  </pic:spPr>
+                </pic:pic>
+              </a:graphicData>
+            </a:graphic>
+          </wp:inline>
+        </w:drawing>
+      </w:r>
+    </w:p>
+    <w:p>
+      <w:pPr>
+        <w:numPr>
+          <w:numId w:val="0"/>
+        </w:numPr>
+        <w:jc w:val="both"/>
+        <w:rPr>
+          <w:rFonts w:hint="default"/>
+          <w:lang w:val="en-US"/>
+        </w:rPr>
+      </w:pPr>
+    </w:p>
+    <w:p>
+      <w:pPr>
+        <w:numPr>
+          <w:numId w:val="0"/>
+        </w:numPr>
+        <w:jc w:val="both"/>
+        <w:rPr>
+          <w:rFonts w:hint="default"/>
+          <w:lang w:val="en-US"/>
+        </w:rPr>
+      </w:pPr>
+      <w:r>
+        <w:rPr>
+          <w:rFonts w:hint="default"/>
+          <w:lang w:val="en-US"/>
+        </w:rPr>
+        <w:t>After the table is created there are no data. So, here we will add our demo data. To insert the demo data we can use the folliowing command:</w:t>
+      </w:r>
+    </w:p>
+    <w:p>
+      <w:pPr>
+        <w:numPr>
+          <w:numId w:val="0"/>
+        </w:numPr>
+        <w:jc w:val="both"/>
+        <w:rPr>
+          <w:rFonts w:hint="default"/>
+          <w:lang w:val="en-US"/>
+        </w:rPr>
+      </w:pPr>
+    </w:p>
+    <w:tbl>
+      <w:tblPr>
+        <w:tblStyle w:val="4"/>
+        <w:tblW w:w="0" w:type="auto"/>
+        <w:tblInd w:w="0" w:type="dxa"/>
+        <w:tblBorders>
+          <w:top w:val="single" w:color="auto" w:sz="4" w:space="0"/>
+          <w:left w:val="single" w:color="auto" w:sz="4" w:space="0"/>
+          <w:bottom w:val="single" w:color="auto" w:sz="4" w:space="0"/>
+          <w:right w:val="single" w:color="auto" w:sz="4" w:space="0"/>
+          <w:insideH w:val="single" w:color="auto" w:sz="4" w:space="0"/>
+          <w:insideV w:val="single" w:color="auto" w:sz="4" w:space="0"/>
+        </w:tblBorders>
+        <w:tblLayout w:type="autofit"/>
+        <w:tblCellMar>
+          <w:left w:w="108" w:type="dxa"/>
+          <w:right w:w="108" w:type="dxa"/>
+        </w:tblCellMar>
+      </w:tblPr>
+      <w:tblGrid>
+        <w:gridCol w:w="8522"/>
+      </w:tblGrid>
+      <w:tr>
+        <w:tblPrEx>
+          <w:tblBorders>
+            <w:top w:val="single" w:color="auto" w:sz="4" w:space="0"/>
+            <w:left w:val="single" w:color="auto" w:sz="4" w:space="0"/>
+            <w:bottom w:val="single" w:color="auto" w:sz="4" w:space="0"/>
+            <w:right w:val="single" w:color="auto" w:sz="4" w:space="0"/>
+            <w:insideH w:val="single" w:color="auto" w:sz="4" w:space="0"/>
+            <w:insideV w:val="single" w:color="auto" w:sz="4" w:space="0"/>
+          </w:tblBorders>
+          <w:tblCellMar>
+            <w:left w:w="108" w:type="dxa"/>
+            <w:right w:w="108" w:type="dxa"/>
+          </w:tblCellMar>
+        </w:tblPrEx>
+        <w:tc>
+          <w:tcPr>
+            <w:tcW w:w="8522" w:type="dxa"/>
+          </w:tcPr>
+          <w:p>
+            <w:pPr>
+              <w:numPr>
+                <w:numId w:val="0"/>
+              </w:numPr>
+              <w:jc w:val="both"/>
+              <w:rPr>
+                <w:rFonts w:hint="default"/>
+                <w:vertAlign w:val="baseline"/>
+                <w:lang w:val="en-US"/>
+              </w:rPr>
+            </w:pPr>
+            <w:r>
+              <w:rPr>
+                <w:rFonts w:hint="default"/>
+                <w:vertAlign w:val="baseline"/>
+                <w:lang w:val="en-US"/>
+              </w:rPr>
+              <w:t>php artisan make:seeder AdminSeeder (AdminSeeder is the seeder file name)</w:t>
+            </w:r>
+          </w:p>
+        </w:tc>
+      </w:tr>
+    </w:tbl>
+    <w:p>
+      <w:pPr>
+        <w:numPr>
+          <w:numId w:val="0"/>
+        </w:numPr>
+        <w:jc w:val="both"/>
+        <w:rPr>
+          <w:rFonts w:hint="default"/>
+          <w:lang w:val="en-US"/>
+        </w:rPr>
+      </w:pPr>
+    </w:p>
+    <w:p>
+      <w:pPr>
+        <w:numPr>
+          <w:numId w:val="0"/>
+        </w:numPr>
+        <w:jc w:val="both"/>
+        <w:rPr>
+          <w:rFonts w:hint="default"/>
+          <w:lang w:val="en-US"/>
+        </w:rPr>
+      </w:pPr>
+      <w:r>
+        <w:rPr>
+          <w:rFonts w:hint="default"/>
+          <w:lang w:val="en-US"/>
+        </w:rPr>
+        <w:t>Then go to your AdminSeeder file (database-&gt;seeders-&gt;AdminSeeder.php) and add code as shown:</w:t>
+      </w:r>
+    </w:p>
+    <w:p>
+      <w:pPr>
+        <w:numPr>
+          <w:numId w:val="0"/>
+        </w:numPr>
+        <w:jc w:val="both"/>
+      </w:pPr>
+      <w:r>
+        <w:drawing>
+          <wp:inline distT="0" distB="0" distL="114300" distR="114300">
+            <wp:extent cx="5273675" cy="2652395"/>
+            <wp:effectExtent l="0" t="0" r="14605" b="14605"/>
+            <wp:docPr id="39" name="Picture 16"/>
+            <wp:cNvGraphicFramePr>
+              <a:graphicFrameLocks xmlns:a="http://schemas.openxmlformats.org/drawingml/2006/main" noChangeAspect="1"/>
+            </wp:cNvGraphicFramePr>
+            <a:graphic xmlns:a="http://schemas.openxmlformats.org/drawingml/2006/main">
+              <a:graphicData uri="http://schemas.openxmlformats.org/drawingml/2006/picture">
+                <pic:pic xmlns:pic="http://schemas.openxmlformats.org/drawingml/2006/picture">
+                  <pic:nvPicPr>
+                    <pic:cNvPr id="39" name="Picture 16"/>
+                    <pic:cNvPicPr>
+                      <a:picLocks noChangeAspect="1"/>
+                    </pic:cNvPicPr>
+                  </pic:nvPicPr>
+                  <pic:blipFill>
+                    <a:blip r:embed="rId39"/>
+                    <a:stretch>
+                      <a:fillRect/>
+                    </a:stretch>
+                  </pic:blipFill>
+                  <pic:spPr>
+                    <a:xfrm>
+                      <a:off x="0" y="0"/>
+                      <a:ext cx="5273675" cy="2652395"/>
+                    </a:xfrm>
+                    <a:prstGeom prst="rect">
+                      <a:avLst/>
+                    </a:prstGeom>
+                    <a:noFill/>
+                    <a:ln>
+                      <a:noFill/>
+                    </a:ln>
+                  </pic:spPr>
+                </pic:pic>
+              </a:graphicData>
+            </a:graphic>
+          </wp:inline>
+        </w:drawing>
+      </w:r>
+    </w:p>
+    <w:p>
+      <w:pPr>
+        <w:numPr>
+          <w:numId w:val="0"/>
+        </w:numPr>
+        <w:jc w:val="both"/>
+      </w:pPr>
+    </w:p>
+    <w:p>
+      <w:pPr>
+        <w:numPr>
+          <w:numId w:val="0"/>
+        </w:numPr>
+        <w:jc w:val="both"/>
+        <w:rPr>
+          <w:rFonts w:hint="default"/>
+          <w:lang w:val="en-US"/>
+        </w:rPr>
+      </w:pPr>
+      <w:r>
+        <w:rPr>
+          <w:rFonts w:hint="default"/>
+          <w:lang w:val="en-US"/>
+        </w:rPr>
+        <w:t>Then you need to go to DatabaseSeeder.php (database-&gt;seeders-&gt;DatabaseSeeder.php) and following code:</w:t>
+      </w:r>
+    </w:p>
+    <w:tbl>
+      <w:tblPr>
+        <w:tblStyle w:val="4"/>
+        <w:tblW w:w="0" w:type="auto"/>
+        <w:tblInd w:w="0" w:type="dxa"/>
+        <w:tblBorders>
+          <w:top w:val="single" w:color="auto" w:sz="4" w:space="0"/>
+          <w:left w:val="single" w:color="auto" w:sz="4" w:space="0"/>
+          <w:bottom w:val="single" w:color="auto" w:sz="4" w:space="0"/>
+          <w:right w:val="single" w:color="auto" w:sz="4" w:space="0"/>
+          <w:insideH w:val="single" w:color="auto" w:sz="4" w:space="0"/>
+          <w:insideV w:val="single" w:color="auto" w:sz="4" w:space="0"/>
+        </w:tblBorders>
+        <w:tblLayout w:type="autofit"/>
+        <w:tblCellMar>
+          <w:left w:w="108" w:type="dxa"/>
+          <w:right w:w="108" w:type="dxa"/>
+        </w:tblCellMar>
+      </w:tblPr>
+      <w:tblGrid>
+        <w:gridCol w:w="8522"/>
+      </w:tblGrid>
+      <w:tr>
+        <w:tblPrEx>
+          <w:tblBorders>
+            <w:top w:val="single" w:color="auto" w:sz="4" w:space="0"/>
+            <w:left w:val="single" w:color="auto" w:sz="4" w:space="0"/>
+            <w:bottom w:val="single" w:color="auto" w:sz="4" w:space="0"/>
+            <w:right w:val="single" w:color="auto" w:sz="4" w:space="0"/>
+            <w:insideH w:val="single" w:color="auto" w:sz="4" w:space="0"/>
+            <w:insideV w:val="single" w:color="auto" w:sz="4" w:space="0"/>
+          </w:tblBorders>
+          <w:tblCellMar>
+            <w:left w:w="108" w:type="dxa"/>
+            <w:right w:w="108" w:type="dxa"/>
+          </w:tblCellMar>
+        </w:tblPrEx>
+        <w:tc>
+          <w:tcPr>
+            <w:tcW w:w="8522" w:type="dxa"/>
+          </w:tcPr>
+          <w:p>
+            <w:pPr>
+              <w:numPr>
+                <w:numId w:val="0"/>
+              </w:numPr>
+              <w:jc w:val="both"/>
+              <w:rPr>
+                <w:rFonts w:hint="default"/>
+                <w:vertAlign w:val="baseline"/>
+                <w:lang w:val="en-US"/>
+              </w:rPr>
+            </w:pPr>
+            <w:r>
+              <w:rPr>
+                <w:rFonts w:hint="default"/>
+                <w:vertAlign w:val="baseline"/>
+                <w:lang w:val="en-US"/>
+              </w:rPr>
+              <w:t>$this-&gt;call([AdminSeeder::class])</w:t>
+            </w:r>
+          </w:p>
+        </w:tc>
+      </w:tr>
+    </w:tbl>
+    <w:p>
+      <w:pPr>
+        <w:numPr>
+          <w:numId w:val="0"/>
+        </w:numPr>
+        <w:jc w:val="both"/>
+      </w:pPr>
+      <w:r>
+        <w:drawing>
+          <wp:inline distT="0" distB="0" distL="114300" distR="114300">
+            <wp:extent cx="5269230" cy="2576830"/>
+            <wp:effectExtent l="0" t="0" r="3810" b="13970"/>
+            <wp:docPr id="40" name="Picture 17"/>
+            <wp:cNvGraphicFramePr>
+              <a:graphicFrameLocks xmlns:a="http://schemas.openxmlformats.org/drawingml/2006/main" noChangeAspect="1"/>
+            </wp:cNvGraphicFramePr>
+            <a:graphic xmlns:a="http://schemas.openxmlformats.org/drawingml/2006/main">
+              <a:graphicData uri="http://schemas.openxmlformats.org/drawingml/2006/picture">
+                <pic:pic xmlns:pic="http://schemas.openxmlformats.org/drawingml/2006/picture">
+                  <pic:nvPicPr>
+                    <pic:cNvPr id="40" name="Picture 17"/>
+                    <pic:cNvPicPr>
+                      <a:picLocks noChangeAspect="1"/>
+                    </pic:cNvPicPr>
+                  </pic:nvPicPr>
+                  <pic:blipFill>
+                    <a:blip r:embed="rId40"/>
+                    <a:stretch>
+                      <a:fillRect/>
+                    </a:stretch>
+                  </pic:blipFill>
+                  <pic:spPr>
+                    <a:xfrm>
+                      <a:off x="0" y="0"/>
+                      <a:ext cx="5269230" cy="2576830"/>
+                    </a:xfrm>
+                    <a:prstGeom prst="rect">
+                      <a:avLst/>
+                    </a:prstGeom>
+                    <a:noFill/>
+                    <a:ln>
+                      <a:noFill/>
+                    </a:ln>
+                  </pic:spPr>
+                </pic:pic>
+              </a:graphicData>
+            </a:graphic>
+          </wp:inline>
+        </w:drawing>
+      </w:r>
+    </w:p>
+    <w:p>
+      <w:pPr>
+        <w:numPr>
+          <w:numId w:val="0"/>
+        </w:numPr>
+        <w:jc w:val="both"/>
+      </w:pPr>
+    </w:p>
+    <w:p>
+      <w:pPr>
+        <w:numPr>
+          <w:numId w:val="0"/>
+        </w:numPr>
+        <w:jc w:val="both"/>
+        <w:rPr>
+          <w:rFonts w:hint="default"/>
+          <w:lang w:val="en-US"/>
+        </w:rPr>
+      </w:pPr>
+      <w:r>
+        <w:rPr>
+          <w:rFonts w:hint="default"/>
+          <w:lang w:val="en-US"/>
+        </w:rPr>
+        <w:t>After this you need to go to the terminal and insert the following command:</w:t>
+      </w:r>
+    </w:p>
+    <w:p>
+      <w:pPr>
+        <w:numPr>
+          <w:numId w:val="0"/>
+        </w:numPr>
+        <w:jc w:val="both"/>
+        <w:rPr>
+          <w:rFonts w:hint="default"/>
+          <w:lang w:val="en-US"/>
+        </w:rPr>
+      </w:pPr>
+    </w:p>
+    <w:tbl>
+      <w:tblPr>
+        <w:tblStyle w:val="4"/>
+        <w:tblW w:w="0" w:type="auto"/>
+        <w:tblInd w:w="0" w:type="dxa"/>
+        <w:tblBorders>
+          <w:top w:val="single" w:color="auto" w:sz="4" w:space="0"/>
+          <w:left w:val="single" w:color="auto" w:sz="4" w:space="0"/>
+          <w:bottom w:val="single" w:color="auto" w:sz="4" w:space="0"/>
+          <w:right w:val="single" w:color="auto" w:sz="4" w:space="0"/>
+          <w:insideH w:val="single" w:color="auto" w:sz="4" w:space="0"/>
+          <w:insideV w:val="single" w:color="auto" w:sz="4" w:space="0"/>
+        </w:tblBorders>
+        <w:tblLayout w:type="autofit"/>
+        <w:tblCellMar>
+          <w:left w:w="108" w:type="dxa"/>
+          <w:right w:w="108" w:type="dxa"/>
+        </w:tblCellMar>
+      </w:tblPr>
+      <w:tblGrid>
+        <w:gridCol w:w="8522"/>
+      </w:tblGrid>
+      <w:tr>
+        <w:tblPrEx>
+          <w:tblBorders>
+            <w:top w:val="single" w:color="auto" w:sz="4" w:space="0"/>
+            <w:left w:val="single" w:color="auto" w:sz="4" w:space="0"/>
+            <w:bottom w:val="single" w:color="auto" w:sz="4" w:space="0"/>
+            <w:right w:val="single" w:color="auto" w:sz="4" w:space="0"/>
+            <w:insideH w:val="single" w:color="auto" w:sz="4" w:space="0"/>
+            <w:insideV w:val="single" w:color="auto" w:sz="4" w:space="0"/>
+          </w:tblBorders>
+          <w:tblCellMar>
+            <w:left w:w="108" w:type="dxa"/>
+            <w:right w:w="108" w:type="dxa"/>
+          </w:tblCellMar>
+        </w:tblPrEx>
+        <w:tc>
+          <w:tcPr>
+            <w:tcW w:w="8522" w:type="dxa"/>
+          </w:tcPr>
+          <w:p>
+            <w:pPr>
+              <w:numPr>
+                <w:numId w:val="0"/>
+              </w:numPr>
+              <w:jc w:val="both"/>
+              <w:rPr>
+                <w:rFonts w:hint="default"/>
+                <w:vertAlign w:val="baseline"/>
+                <w:lang w:val="en-US"/>
+              </w:rPr>
+            </w:pPr>
+            <w:r>
+              <w:rPr>
+                <w:rFonts w:hint="default"/>
+                <w:vertAlign w:val="baseline"/>
+                <w:lang w:val="en-US"/>
+              </w:rPr>
+              <w:t>php artisan db:seed</w:t>
+            </w:r>
+          </w:p>
+        </w:tc>
+      </w:tr>
+    </w:tbl>
+    <w:p>
+      <w:pPr>
+        <w:numPr>
+          <w:numId w:val="0"/>
+        </w:numPr>
+        <w:jc w:val="both"/>
+        <w:rPr>
+          <w:rFonts w:hint="default"/>
+          <w:lang w:val="en-US"/>
+        </w:rPr>
+      </w:pPr>
+    </w:p>
+    <w:p>
+      <w:pPr>
+        <w:numPr>
+          <w:numId w:val="0"/>
+        </w:numPr>
+        <w:jc w:val="both"/>
+        <w:rPr>
+          <w:rFonts w:hint="default"/>
+          <w:lang w:val="en-US"/>
+        </w:rPr>
+      </w:pPr>
+      <w:r>
+        <w:rPr>
+          <w:rFonts w:hint="default"/>
+          <w:lang w:val="en-US"/>
+        </w:rPr>
+        <w:t>Doing this will add data in your table as shown below:</w:t>
+      </w:r>
+    </w:p>
+    <w:p>
+      <w:pPr>
+        <w:numPr>
+          <w:numId w:val="0"/>
+        </w:numPr>
+        <w:jc w:val="both"/>
+        <w:rPr>
+          <w:rFonts w:hint="default"/>
+          <w:lang w:val="en-US"/>
+        </w:rPr>
+      </w:pPr>
+      <w:r>
+        <w:drawing>
+          <wp:inline distT="0" distB="0" distL="114300" distR="114300">
+            <wp:extent cx="5264785" cy="1776095"/>
+            <wp:effectExtent l="0" t="0" r="8255" b="6985"/>
+            <wp:docPr id="41" name="Picture 18"/>
+            <wp:cNvGraphicFramePr>
+              <a:graphicFrameLocks xmlns:a="http://schemas.openxmlformats.org/drawingml/2006/main" noChangeAspect="1"/>
+            </wp:cNvGraphicFramePr>
+            <a:graphic xmlns:a="http://schemas.openxmlformats.org/drawingml/2006/main">
+              <a:graphicData uri="http://schemas.openxmlformats.org/drawingml/2006/picture">
+                <pic:pic xmlns:pic="http://schemas.openxmlformats.org/drawingml/2006/picture">
+                  <pic:nvPicPr>
+                    <pic:cNvPr id="41" name="Picture 18"/>
+                    <pic:cNvPicPr>
+                      <a:picLocks noChangeAspect="1"/>
+                    </pic:cNvPicPr>
+                  </pic:nvPicPr>
+                  <pic:blipFill>
+                    <a:blip r:embed="rId41"/>
+                    <a:stretch>
+                      <a:fillRect/>
+                    </a:stretch>
+                  </pic:blipFill>
+                  <pic:spPr>
+                    <a:xfrm>
+                      <a:off x="0" y="0"/>
+                      <a:ext cx="5264785" cy="1776095"/>
+                    </a:xfrm>
+                    <a:prstGeom prst="rect">
+                      <a:avLst/>
+                    </a:prstGeom>
+                    <a:noFill/>
+                    <a:ln>
+                      <a:noFill/>
+                    </a:ln>
+                  </pic:spPr>
+                </pic:pic>
+              </a:graphicData>
+            </a:graphic>
+          </wp:inline>
+        </w:drawing>
+      </w:r>
+      <w:bookmarkStart w:id="0" w:name="_GoBack"/>
+      <w:bookmarkEnd w:id="0"/>
+    </w:p>
+    <w:p>
+      <w:pPr>
+        <w:numPr>
+          <w:numId w:val="0"/>
+        </w:numPr>
+        <w:jc w:val="both"/>
+        <w:rPr>
+          <w:rFonts w:hint="default"/>
+          <w:lang w:val="en-US"/>
+        </w:rPr>
+      </w:pPr>
+    </w:p>
+    <w:p>
+      <w:pPr>
+        <w:numPr>
+          <w:numId w:val="0"/>
+        </w:numPr>
+        <w:jc w:val="both"/>
+        <w:rPr>
+          <w:rFonts w:hint="default"/>
+          <w:lang w:val="en-US"/>
+        </w:rPr>
+      </w:pPr>
+    </w:p>
+    <w:p>
+      <w:pPr>
+        <w:numPr>
+          <w:numId w:val="0"/>
+        </w:numPr>
+        <w:jc w:val="both"/>
+        <w:rPr>
+          <w:rFonts w:hint="default"/>
+          <w:lang w:val="en-US"/>
+        </w:rPr>
+      </w:pPr>
+    </w:p>
+    <w:p>
+      <w:pPr>
+        <w:numPr>
+          <w:numId w:val="0"/>
+        </w:numPr>
+        <w:jc w:val="both"/>
+        <w:rPr>
+          <w:rFonts w:hint="default"/>
+          <w:lang w:val="en-US"/>
+        </w:rPr>
+      </w:pPr>
+    </w:p>
+    <w:p>
+      <w:pPr>
+        <w:numPr>
+          <w:numId w:val="0"/>
+        </w:numPr>
+        <w:jc w:val="both"/>
+        <w:rPr>
+          <w:rFonts w:hint="default"/>
+          <w:lang w:val="en-US"/>
+        </w:rPr>
+      </w:pPr>
+    </w:p>
+    <w:p>
+      <w:pPr>
+        <w:numPr>
+          <w:numId w:val="0"/>
+        </w:numPr>
+        <w:jc w:val="both"/>
+        <w:rPr>
+          <w:rFonts w:hint="default"/>
+          <w:lang w:val="en-US"/>
+        </w:rPr>
+      </w:pPr>
+    </w:p>
     <w:p>
       <w:pPr>
         <w:numPr>

</xml_diff>

<commit_message>
Laravel Multi Auth with breeze pt3 and added admin login and admin dashboard
</commit_message>
<xml_diff>
--- a/Laravel.docx
+++ b/Laravel.docx
@@ -3101,6 +3101,7 @@
     <w:p>
       <w:pPr>
         <w:numPr>
+          <w:ilvl w:val="0"/>
           <w:numId w:val="0"/>
         </w:numPr>
         <w:jc w:val="both"/>
@@ -3117,6 +3118,7 @@
     <w:p>
       <w:pPr>
         <w:numPr>
+          <w:ilvl w:val="0"/>
           <w:numId w:val="0"/>
         </w:numPr>
         <w:jc w:val="both"/>
@@ -3144,6 +3146,7 @@
     <w:p>
       <w:pPr>
         <w:numPr>
+          <w:ilvl w:val="0"/>
           <w:numId w:val="0"/>
         </w:numPr>
         <w:jc w:val="both"/>
@@ -3195,14 +3198,16 @@
     <w:p>
       <w:pPr>
         <w:numPr>
-          <w:numId w:val="0"/>
-        </w:numPr>
-        <w:jc w:val="both"/>
-      </w:pPr>
-    </w:p>
-    <w:p>
-      <w:pPr>
-        <w:numPr>
+          <w:ilvl w:val="0"/>
+          <w:numId w:val="0"/>
+        </w:numPr>
+        <w:jc w:val="both"/>
+      </w:pPr>
+    </w:p>
+    <w:p>
+      <w:pPr>
+        <w:numPr>
+          <w:ilvl w:val="0"/>
           <w:numId w:val="0"/>
         </w:numPr>
         <w:jc w:val="both"/>
@@ -3222,30 +3227,33 @@
     <w:p>
       <w:pPr>
         <w:numPr>
-          <w:numId w:val="0"/>
-        </w:numPr>
-        <w:jc w:val="both"/>
-        <w:rPr>
-          <w:rFonts w:hint="default"/>
-          <w:lang w:val="en-US"/>
-        </w:rPr>
-      </w:pPr>
-    </w:p>
-    <w:p>
-      <w:pPr>
-        <w:numPr>
-          <w:numId w:val="0"/>
-        </w:numPr>
-        <w:jc w:val="both"/>
-        <w:rPr>
-          <w:rFonts w:hint="default"/>
-          <w:lang w:val="en-US"/>
-        </w:rPr>
-      </w:pPr>
-    </w:p>
-    <w:p>
-      <w:pPr>
-        <w:numPr>
+          <w:ilvl w:val="0"/>
+          <w:numId w:val="0"/>
+        </w:numPr>
+        <w:jc w:val="both"/>
+        <w:rPr>
+          <w:rFonts w:hint="default"/>
+          <w:lang w:val="en-US"/>
+        </w:rPr>
+      </w:pPr>
+    </w:p>
+    <w:p>
+      <w:pPr>
+        <w:numPr>
+          <w:ilvl w:val="0"/>
+          <w:numId w:val="0"/>
+        </w:numPr>
+        <w:jc w:val="both"/>
+        <w:rPr>
+          <w:rFonts w:hint="default"/>
+          <w:lang w:val="en-US"/>
+        </w:rPr>
+      </w:pPr>
+    </w:p>
+    <w:p>
+      <w:pPr>
+        <w:numPr>
+          <w:ilvl w:val="0"/>
           <w:numId w:val="0"/>
         </w:numPr>
         <w:jc w:val="both"/>
@@ -3297,14 +3305,16 @@
     <w:p>
       <w:pPr>
         <w:numPr>
-          <w:numId w:val="0"/>
-        </w:numPr>
-        <w:jc w:val="both"/>
-      </w:pPr>
-    </w:p>
-    <w:p>
-      <w:pPr>
-        <w:numPr>
+          <w:ilvl w:val="0"/>
+          <w:numId w:val="0"/>
+        </w:numPr>
+        <w:jc w:val="both"/>
+      </w:pPr>
+    </w:p>
+    <w:p>
+      <w:pPr>
+        <w:numPr>
+          <w:ilvl w:val="0"/>
           <w:numId w:val="0"/>
         </w:numPr>
         <w:jc w:val="both"/>
@@ -3324,6 +3334,7 @@
     <w:p>
       <w:pPr>
         <w:numPr>
+          <w:ilvl w:val="0"/>
           <w:numId w:val="0"/>
         </w:numPr>
         <w:jc w:val="both"/>
@@ -3375,14 +3386,16 @@
     <w:p>
       <w:pPr>
         <w:numPr>
-          <w:numId w:val="0"/>
-        </w:numPr>
-        <w:jc w:val="both"/>
-      </w:pPr>
-    </w:p>
-    <w:p>
-      <w:pPr>
-        <w:numPr>
+          <w:ilvl w:val="0"/>
+          <w:numId w:val="0"/>
+        </w:numPr>
+        <w:jc w:val="both"/>
+      </w:pPr>
+    </w:p>
+    <w:p>
+      <w:pPr>
+        <w:numPr>
+          <w:ilvl w:val="0"/>
           <w:numId w:val="0"/>
         </w:numPr>
         <w:jc w:val="both"/>
@@ -3402,18 +3415,20 @@
     <w:p>
       <w:pPr>
         <w:numPr>
-          <w:numId w:val="0"/>
-        </w:numPr>
-        <w:jc w:val="both"/>
-        <w:rPr>
-          <w:rFonts w:hint="default"/>
-          <w:lang w:val="en-US"/>
-        </w:rPr>
-      </w:pPr>
-    </w:p>
-    <w:p>
-      <w:pPr>
-        <w:numPr>
+          <w:ilvl w:val="0"/>
+          <w:numId w:val="0"/>
+        </w:numPr>
+        <w:jc w:val="both"/>
+        <w:rPr>
+          <w:rFonts w:hint="default"/>
+          <w:lang w:val="en-US"/>
+        </w:rPr>
+      </w:pPr>
+    </w:p>
+    <w:p>
+      <w:pPr>
+        <w:numPr>
+          <w:ilvl w:val="0"/>
           <w:numId w:val="0"/>
         </w:numPr>
         <w:jc w:val="both"/>
@@ -3465,6 +3480,7 @@
     <w:p>
       <w:pPr>
         <w:numPr>
+          <w:ilvl w:val="0"/>
           <w:numId w:val="0"/>
         </w:numPr>
         <w:jc w:val="both"/>
@@ -3484,6 +3500,7 @@
     <w:p>
       <w:pPr>
         <w:numPr>
+          <w:ilvl w:val="0"/>
           <w:numId w:val="0"/>
         </w:numPr>
         <w:jc w:val="both"/>
@@ -3532,6 +3549,7 @@
     <w:p>
       <w:pPr>
         <w:numPr>
+          <w:ilvl w:val="0"/>
           <w:numId w:val="0"/>
         </w:numPr>
         <w:jc w:val="both"/>
@@ -3546,6 +3564,7 @@
     <w:p>
       <w:pPr>
         <w:numPr>
+          <w:ilvl w:val="0"/>
           <w:numId w:val="0"/>
         </w:numPr>
         <w:jc w:val="both"/>
@@ -3597,6 +3616,7 @@
     <w:p>
       <w:pPr>
         <w:numPr>
+          <w:ilvl w:val="0"/>
           <w:numId w:val="0"/>
         </w:numPr>
         <w:jc w:val="both"/>
@@ -3634,6 +3654,7 @@
     <w:p>
       <w:pPr>
         <w:numPr>
+          <w:ilvl w:val="0"/>
           <w:numId w:val="0"/>
         </w:numPr>
         <w:jc w:val="both"/>
@@ -3650,6 +3671,7 @@
     <w:p>
       <w:pPr>
         <w:numPr>
+          <w:ilvl w:val="0"/>
           <w:numId w:val="0"/>
         </w:numPr>
         <w:jc w:val="both"/>
@@ -3672,6 +3694,1283 @@
           <w:lang w:val="en-US"/>
         </w:rPr>
         <w:t>Here we need to make the admin authentication. To do that first you need to enter the following command:</w:t>
+      </w:r>
+    </w:p>
+    <w:tbl>
+      <w:tblPr>
+        <w:tblStyle w:val="4"/>
+        <w:tblW w:w="0" w:type="auto"/>
+        <w:tblInd w:w="0" w:type="dxa"/>
+        <w:tblBorders>
+          <w:top w:val="single" w:color="auto" w:sz="4" w:space="0"/>
+          <w:left w:val="single" w:color="auto" w:sz="4" w:space="0"/>
+          <w:bottom w:val="single" w:color="auto" w:sz="4" w:space="0"/>
+          <w:right w:val="single" w:color="auto" w:sz="4" w:space="0"/>
+          <w:insideH w:val="single" w:color="auto" w:sz="4" w:space="0"/>
+          <w:insideV w:val="single" w:color="auto" w:sz="4" w:space="0"/>
+        </w:tblBorders>
+        <w:tblLayout w:type="autofit"/>
+        <w:tblCellMar>
+          <w:top w:w="0" w:type="dxa"/>
+          <w:left w:w="108" w:type="dxa"/>
+          <w:bottom w:w="0" w:type="dxa"/>
+          <w:right w:w="108" w:type="dxa"/>
+        </w:tblCellMar>
+      </w:tblPr>
+      <w:tblGrid>
+        <w:gridCol w:w="8522"/>
+      </w:tblGrid>
+      <w:tr>
+        <w:tblPrEx>
+          <w:tblBorders>
+            <w:top w:val="single" w:color="auto" w:sz="4" w:space="0"/>
+            <w:left w:val="single" w:color="auto" w:sz="4" w:space="0"/>
+            <w:bottom w:val="single" w:color="auto" w:sz="4" w:space="0"/>
+            <w:right w:val="single" w:color="auto" w:sz="4" w:space="0"/>
+            <w:insideH w:val="single" w:color="auto" w:sz="4" w:space="0"/>
+            <w:insideV w:val="single" w:color="auto" w:sz="4" w:space="0"/>
+          </w:tblBorders>
+          <w:tblCellMar>
+            <w:top w:w="0" w:type="dxa"/>
+            <w:left w:w="108" w:type="dxa"/>
+            <w:bottom w:w="0" w:type="dxa"/>
+            <w:right w:w="108" w:type="dxa"/>
+          </w:tblCellMar>
+        </w:tblPrEx>
+        <w:tc>
+          <w:tcPr>
+            <w:tcW w:w="8522" w:type="dxa"/>
+          </w:tcPr>
+          <w:p>
+            <w:pPr>
+              <w:widowControl w:val="0"/>
+              <w:numPr>
+                <w:ilvl w:val="0"/>
+                <w:numId w:val="0"/>
+              </w:numPr>
+              <w:jc w:val="both"/>
+              <w:rPr>
+                <w:rFonts w:hint="default"/>
+                <w:b w:val="0"/>
+                <w:bCs w:val="0"/>
+                <w:sz w:val="20"/>
+                <w:szCs w:val="20"/>
+                <w:vertAlign w:val="baseline"/>
+                <w:lang w:val="en-US"/>
+              </w:rPr>
+            </w:pPr>
+            <w:r>
+              <w:rPr>
+                <w:rFonts w:hint="default"/>
+                <w:b w:val="0"/>
+                <w:bCs w:val="0"/>
+                <w:sz w:val="20"/>
+                <w:szCs w:val="20"/>
+                <w:vertAlign w:val="baseline"/>
+                <w:lang w:val="en-US"/>
+              </w:rPr>
+              <w:t>php artisan make:model Admin -m</w:t>
+            </w:r>
+          </w:p>
+        </w:tc>
+      </w:tr>
+    </w:tbl>
+    <w:p>
+      <w:pPr>
+        <w:numPr>
+          <w:ilvl w:val="0"/>
+          <w:numId w:val="0"/>
+        </w:numPr>
+        <w:jc w:val="both"/>
+        <w:rPr>
+          <w:rFonts w:hint="default"/>
+          <w:b w:val="0"/>
+          <w:bCs w:val="0"/>
+          <w:sz w:val="20"/>
+          <w:szCs w:val="20"/>
+          <w:lang w:val="en-US"/>
+        </w:rPr>
+      </w:pPr>
+    </w:p>
+    <w:p>
+      <w:pPr>
+        <w:numPr>
+          <w:ilvl w:val="0"/>
+          <w:numId w:val="0"/>
+        </w:numPr>
+        <w:jc w:val="both"/>
+      </w:pPr>
+      <w:r>
+        <w:drawing>
+          <wp:inline distT="0" distB="0" distL="114300" distR="114300">
+            <wp:extent cx="6281420" cy="565150"/>
+            <wp:effectExtent l="0" t="0" r="12700" b="13970"/>
+            <wp:docPr id="33" name="Picture 10"/>
+            <wp:cNvGraphicFramePr>
+              <a:graphicFrameLocks xmlns:a="http://schemas.openxmlformats.org/drawingml/2006/main" noChangeAspect="1"/>
+            </wp:cNvGraphicFramePr>
+            <a:graphic xmlns:a="http://schemas.openxmlformats.org/drawingml/2006/main">
+              <a:graphicData uri="http://schemas.openxmlformats.org/drawingml/2006/picture">
+                <pic:pic xmlns:pic="http://schemas.openxmlformats.org/drawingml/2006/picture">
+                  <pic:nvPicPr>
+                    <pic:cNvPr id="33" name="Picture 10"/>
+                    <pic:cNvPicPr>
+                      <a:picLocks noChangeAspect="1"/>
+                    </pic:cNvPicPr>
+                  </pic:nvPicPr>
+                  <pic:blipFill>
+                    <a:blip r:embed="rId35"/>
+                    <a:stretch>
+                      <a:fillRect/>
+                    </a:stretch>
+                  </pic:blipFill>
+                  <pic:spPr>
+                    <a:xfrm>
+                      <a:off x="0" y="0"/>
+                      <a:ext cx="6281420" cy="565150"/>
+                    </a:xfrm>
+                    <a:prstGeom prst="rect">
+                      <a:avLst/>
+                    </a:prstGeom>
+                    <a:noFill/>
+                    <a:ln>
+                      <a:noFill/>
+                    </a:ln>
+                  </pic:spPr>
+                </pic:pic>
+              </a:graphicData>
+            </a:graphic>
+          </wp:inline>
+        </w:drawing>
+      </w:r>
+    </w:p>
+    <w:p>
+      <w:pPr>
+        <w:numPr>
+          <w:ilvl w:val="0"/>
+          <w:numId w:val="0"/>
+        </w:numPr>
+        <w:jc w:val="both"/>
+        <w:rPr>
+          <w:rFonts w:hint="default"/>
+          <w:lang w:val="en-US"/>
+        </w:rPr>
+      </w:pPr>
+    </w:p>
+    <w:p>
+      <w:pPr>
+        <w:numPr>
+          <w:ilvl w:val="0"/>
+          <w:numId w:val="0"/>
+        </w:numPr>
+        <w:jc w:val="both"/>
+        <w:rPr>
+          <w:rFonts w:hint="default"/>
+          <w:lang w:val="en-US"/>
+        </w:rPr>
+      </w:pPr>
+      <w:r>
+        <w:rPr>
+          <w:rFonts w:hint="default"/>
+          <w:lang w:val="en-US"/>
+        </w:rPr>
+        <w:t>The above command will create an admin model and a database migration file for the admins table.</w:t>
+      </w:r>
+    </w:p>
+    <w:p>
+      <w:pPr>
+        <w:numPr>
+          <w:ilvl w:val="0"/>
+          <w:numId w:val="0"/>
+        </w:numPr>
+        <w:jc w:val="both"/>
+        <w:rPr>
+          <w:rFonts w:hint="default"/>
+          <w:lang w:val="en-US"/>
+        </w:rPr>
+      </w:pPr>
+    </w:p>
+    <w:p>
+      <w:pPr>
+        <w:numPr>
+          <w:ilvl w:val="0"/>
+          <w:numId w:val="0"/>
+        </w:numPr>
+        <w:jc w:val="both"/>
+        <w:rPr>
+          <w:rFonts w:hint="default"/>
+          <w:lang w:val="en-US"/>
+        </w:rPr>
+      </w:pPr>
+      <w:r>
+        <w:rPr>
+          <w:rFonts w:hint="default"/>
+          <w:lang w:val="en-US"/>
+        </w:rPr>
+        <w:t>After that go to the admins migration (database-&gt;migrations-&gt;create_admins_table.php) and add fields as shown below:</w:t>
+      </w:r>
+    </w:p>
+    <w:p>
+      <w:pPr>
+        <w:numPr>
+          <w:ilvl w:val="0"/>
+          <w:numId w:val="0"/>
+        </w:numPr>
+        <w:jc w:val="both"/>
+        <w:rPr>
+          <w:rFonts w:hint="default"/>
+          <w:lang w:val="en-US"/>
+        </w:rPr>
+      </w:pPr>
+    </w:p>
+    <w:p>
+      <w:pPr>
+        <w:numPr>
+          <w:ilvl w:val="0"/>
+          <w:numId w:val="0"/>
+        </w:numPr>
+        <w:jc w:val="both"/>
+      </w:pPr>
+      <w:r>
+        <w:drawing>
+          <wp:inline distT="0" distB="0" distL="114300" distR="114300">
+            <wp:extent cx="5270500" cy="3080385"/>
+            <wp:effectExtent l="0" t="0" r="2540" b="13335"/>
+            <wp:docPr id="37" name="Picture 14"/>
+            <wp:cNvGraphicFramePr>
+              <a:graphicFrameLocks xmlns:a="http://schemas.openxmlformats.org/drawingml/2006/main" noChangeAspect="1"/>
+            </wp:cNvGraphicFramePr>
+            <a:graphic xmlns:a="http://schemas.openxmlformats.org/drawingml/2006/main">
+              <a:graphicData uri="http://schemas.openxmlformats.org/drawingml/2006/picture">
+                <pic:pic xmlns:pic="http://schemas.openxmlformats.org/drawingml/2006/picture">
+                  <pic:nvPicPr>
+                    <pic:cNvPr id="37" name="Picture 14"/>
+                    <pic:cNvPicPr>
+                      <a:picLocks noChangeAspect="1"/>
+                    </pic:cNvPicPr>
+                  </pic:nvPicPr>
+                  <pic:blipFill>
+                    <a:blip r:embed="rId36"/>
+                    <a:stretch>
+                      <a:fillRect/>
+                    </a:stretch>
+                  </pic:blipFill>
+                  <pic:spPr>
+                    <a:xfrm>
+                      <a:off x="0" y="0"/>
+                      <a:ext cx="5270500" cy="3080385"/>
+                    </a:xfrm>
+                    <a:prstGeom prst="rect">
+                      <a:avLst/>
+                    </a:prstGeom>
+                    <a:noFill/>
+                    <a:ln>
+                      <a:noFill/>
+                    </a:ln>
+                  </pic:spPr>
+                </pic:pic>
+              </a:graphicData>
+            </a:graphic>
+          </wp:inline>
+        </w:drawing>
+      </w:r>
+    </w:p>
+    <w:p>
+      <w:pPr>
+        <w:numPr>
+          <w:ilvl w:val="0"/>
+          <w:numId w:val="0"/>
+        </w:numPr>
+        <w:jc w:val="both"/>
+      </w:pPr>
+    </w:p>
+    <w:p>
+      <w:pPr>
+        <w:numPr>
+          <w:ilvl w:val="0"/>
+          <w:numId w:val="0"/>
+        </w:numPr>
+        <w:jc w:val="both"/>
+        <w:rPr>
+          <w:rFonts w:hint="default"/>
+          <w:lang w:val="en-US"/>
+        </w:rPr>
+      </w:pPr>
+      <w:r>
+        <w:rPr>
+          <w:rFonts w:hint="default"/>
+          <w:lang w:val="en-US"/>
+        </w:rPr>
+        <w:t>After that go to the Admin Models (app-&gt;models-&gt;Admin.php) and add code as shown below:</w:t>
+      </w:r>
+    </w:p>
+    <w:p>
+      <w:pPr>
+        <w:numPr>
+          <w:ilvl w:val="0"/>
+          <w:numId w:val="0"/>
+        </w:numPr>
+        <w:jc w:val="both"/>
+      </w:pPr>
+      <w:r>
+        <w:drawing>
+          <wp:inline distT="0" distB="0" distL="114300" distR="114300">
+            <wp:extent cx="5271135" cy="3814445"/>
+            <wp:effectExtent l="0" t="0" r="1905" b="10795"/>
+            <wp:docPr id="35" name="Picture 12"/>
+            <wp:cNvGraphicFramePr>
+              <a:graphicFrameLocks xmlns:a="http://schemas.openxmlformats.org/drawingml/2006/main" noChangeAspect="1"/>
+            </wp:cNvGraphicFramePr>
+            <a:graphic xmlns:a="http://schemas.openxmlformats.org/drawingml/2006/main">
+              <a:graphicData uri="http://schemas.openxmlformats.org/drawingml/2006/picture">
+                <pic:pic xmlns:pic="http://schemas.openxmlformats.org/drawingml/2006/picture">
+                  <pic:nvPicPr>
+                    <pic:cNvPr id="35" name="Picture 12"/>
+                    <pic:cNvPicPr>
+                      <a:picLocks noChangeAspect="1"/>
+                    </pic:cNvPicPr>
+                  </pic:nvPicPr>
+                  <pic:blipFill>
+                    <a:blip r:embed="rId37"/>
+                    <a:stretch>
+                      <a:fillRect/>
+                    </a:stretch>
+                  </pic:blipFill>
+                  <pic:spPr>
+                    <a:xfrm>
+                      <a:off x="0" y="0"/>
+                      <a:ext cx="5271135" cy="3814445"/>
+                    </a:xfrm>
+                    <a:prstGeom prst="rect">
+                      <a:avLst/>
+                    </a:prstGeom>
+                    <a:noFill/>
+                    <a:ln>
+                      <a:noFill/>
+                    </a:ln>
+                  </pic:spPr>
+                </pic:pic>
+              </a:graphicData>
+            </a:graphic>
+          </wp:inline>
+        </w:drawing>
+      </w:r>
+    </w:p>
+    <w:p>
+      <w:pPr>
+        <w:numPr>
+          <w:ilvl w:val="0"/>
+          <w:numId w:val="0"/>
+        </w:numPr>
+        <w:jc w:val="both"/>
+      </w:pPr>
+    </w:p>
+    <w:p>
+      <w:pPr>
+        <w:numPr>
+          <w:ilvl w:val="0"/>
+          <w:numId w:val="0"/>
+        </w:numPr>
+        <w:jc w:val="both"/>
+        <w:rPr>
+          <w:rFonts w:hint="default"/>
+          <w:lang w:val="en-US"/>
+        </w:rPr>
+      </w:pPr>
+      <w:r>
+        <w:rPr>
+          <w:rFonts w:hint="default"/>
+          <w:lang w:val="en-US"/>
+        </w:rPr>
+        <w:t>After that you need to migrate the admins table to the database. To do that you need to use the command:</w:t>
+      </w:r>
+    </w:p>
+    <w:tbl>
+      <w:tblPr>
+        <w:tblStyle w:val="4"/>
+        <w:tblW w:w="0" w:type="auto"/>
+        <w:tblInd w:w="0" w:type="dxa"/>
+        <w:tblBorders>
+          <w:top w:val="single" w:color="auto" w:sz="4" w:space="0"/>
+          <w:left w:val="single" w:color="auto" w:sz="4" w:space="0"/>
+          <w:bottom w:val="single" w:color="auto" w:sz="4" w:space="0"/>
+          <w:right w:val="single" w:color="auto" w:sz="4" w:space="0"/>
+          <w:insideH w:val="single" w:color="auto" w:sz="4" w:space="0"/>
+          <w:insideV w:val="single" w:color="auto" w:sz="4" w:space="0"/>
+        </w:tblBorders>
+        <w:tblLayout w:type="autofit"/>
+        <w:tblCellMar>
+          <w:top w:w="0" w:type="dxa"/>
+          <w:left w:w="108" w:type="dxa"/>
+          <w:bottom w:w="0" w:type="dxa"/>
+          <w:right w:w="108" w:type="dxa"/>
+        </w:tblCellMar>
+      </w:tblPr>
+      <w:tblGrid>
+        <w:gridCol w:w="8522"/>
+      </w:tblGrid>
+      <w:tr>
+        <w:tblPrEx>
+          <w:tblBorders>
+            <w:top w:val="single" w:color="auto" w:sz="4" w:space="0"/>
+            <w:left w:val="single" w:color="auto" w:sz="4" w:space="0"/>
+            <w:bottom w:val="single" w:color="auto" w:sz="4" w:space="0"/>
+            <w:right w:val="single" w:color="auto" w:sz="4" w:space="0"/>
+            <w:insideH w:val="single" w:color="auto" w:sz="4" w:space="0"/>
+            <w:insideV w:val="single" w:color="auto" w:sz="4" w:space="0"/>
+          </w:tblBorders>
+          <w:tblCellMar>
+            <w:top w:w="0" w:type="dxa"/>
+            <w:left w:w="108" w:type="dxa"/>
+            <w:bottom w:w="0" w:type="dxa"/>
+            <w:right w:w="108" w:type="dxa"/>
+          </w:tblCellMar>
+        </w:tblPrEx>
+        <w:tc>
+          <w:tcPr>
+            <w:tcW w:w="8522" w:type="dxa"/>
+          </w:tcPr>
+          <w:p>
+            <w:pPr>
+              <w:widowControl w:val="0"/>
+              <w:numPr>
+                <w:ilvl w:val="0"/>
+                <w:numId w:val="0"/>
+              </w:numPr>
+              <w:jc w:val="both"/>
+              <w:rPr>
+                <w:rFonts w:hint="default"/>
+                <w:vertAlign w:val="baseline"/>
+                <w:lang w:val="en-US"/>
+              </w:rPr>
+            </w:pPr>
+            <w:r>
+              <w:rPr>
+                <w:rFonts w:hint="default"/>
+                <w:vertAlign w:val="baseline"/>
+                <w:lang w:val="en-US"/>
+              </w:rPr>
+              <w:t>php artisan migrate</w:t>
+            </w:r>
+          </w:p>
+        </w:tc>
+      </w:tr>
+    </w:tbl>
+    <w:p>
+      <w:pPr>
+        <w:numPr>
+          <w:ilvl w:val="0"/>
+          <w:numId w:val="0"/>
+        </w:numPr>
+        <w:jc w:val="both"/>
+        <w:rPr>
+          <w:rFonts w:hint="default"/>
+          <w:lang w:val="en-US"/>
+        </w:rPr>
+      </w:pPr>
+    </w:p>
+    <w:p>
+      <w:pPr>
+        <w:numPr>
+          <w:ilvl w:val="0"/>
+          <w:numId w:val="0"/>
+        </w:numPr>
+        <w:jc w:val="both"/>
+        <w:rPr>
+          <w:rFonts w:hint="default"/>
+          <w:lang w:val="en-US"/>
+        </w:rPr>
+      </w:pPr>
+      <w:r>
+        <w:rPr>
+          <w:rFonts w:hint="default"/>
+          <w:lang w:val="en-US"/>
+        </w:rPr>
+        <w:t>After you run the above command the table can be seen in your database.</w:t>
+      </w:r>
+    </w:p>
+    <w:p>
+      <w:pPr>
+        <w:numPr>
+          <w:ilvl w:val="0"/>
+          <w:numId w:val="0"/>
+        </w:numPr>
+        <w:jc w:val="both"/>
+        <w:rPr>
+          <w:rFonts w:hint="default"/>
+          <w:lang w:val="en-US"/>
+        </w:rPr>
+      </w:pPr>
+    </w:p>
+    <w:p>
+      <w:pPr>
+        <w:numPr>
+          <w:ilvl w:val="0"/>
+          <w:numId w:val="0"/>
+        </w:numPr>
+        <w:jc w:val="both"/>
+        <w:rPr>
+          <w:rFonts w:hint="default"/>
+          <w:lang w:val="en-US"/>
+        </w:rPr>
+      </w:pPr>
+      <w:r>
+        <w:drawing>
+          <wp:inline distT="0" distB="0" distL="114300" distR="114300">
+            <wp:extent cx="5267960" cy="2435860"/>
+            <wp:effectExtent l="0" t="0" r="5080" b="2540"/>
+            <wp:docPr id="38" name="Picture 15"/>
+            <wp:cNvGraphicFramePr>
+              <a:graphicFrameLocks xmlns:a="http://schemas.openxmlformats.org/drawingml/2006/main" noChangeAspect="1"/>
+            </wp:cNvGraphicFramePr>
+            <a:graphic xmlns:a="http://schemas.openxmlformats.org/drawingml/2006/main">
+              <a:graphicData uri="http://schemas.openxmlformats.org/drawingml/2006/picture">
+                <pic:pic xmlns:pic="http://schemas.openxmlformats.org/drawingml/2006/picture">
+                  <pic:nvPicPr>
+                    <pic:cNvPr id="38" name="Picture 15"/>
+                    <pic:cNvPicPr>
+                      <a:picLocks noChangeAspect="1"/>
+                    </pic:cNvPicPr>
+                  </pic:nvPicPr>
+                  <pic:blipFill>
+                    <a:blip r:embed="rId38"/>
+                    <a:stretch>
+                      <a:fillRect/>
+                    </a:stretch>
+                  </pic:blipFill>
+                  <pic:spPr>
+                    <a:xfrm>
+                      <a:off x="0" y="0"/>
+                      <a:ext cx="5267960" cy="2435860"/>
+                    </a:xfrm>
+                    <a:prstGeom prst="rect">
+                      <a:avLst/>
+                    </a:prstGeom>
+                    <a:noFill/>
+                    <a:ln>
+                      <a:noFill/>
+                    </a:ln>
+                  </pic:spPr>
+                </pic:pic>
+              </a:graphicData>
+            </a:graphic>
+          </wp:inline>
+        </w:drawing>
+      </w:r>
+    </w:p>
+    <w:p>
+      <w:pPr>
+        <w:numPr>
+          <w:ilvl w:val="0"/>
+          <w:numId w:val="0"/>
+        </w:numPr>
+        <w:jc w:val="both"/>
+        <w:rPr>
+          <w:rFonts w:hint="default"/>
+          <w:lang w:val="en-US"/>
+        </w:rPr>
+      </w:pPr>
+    </w:p>
+    <w:p>
+      <w:pPr>
+        <w:numPr>
+          <w:ilvl w:val="0"/>
+          <w:numId w:val="0"/>
+        </w:numPr>
+        <w:jc w:val="both"/>
+        <w:rPr>
+          <w:rFonts w:hint="default"/>
+          <w:lang w:val="en-US"/>
+        </w:rPr>
+      </w:pPr>
+      <w:r>
+        <w:rPr>
+          <w:rFonts w:hint="default"/>
+          <w:lang w:val="en-US"/>
+        </w:rPr>
+        <w:t>After the table is created there are no data. So, here we will add our demo data. To insert the demo data we can use the folliowing command:</w:t>
+      </w:r>
+    </w:p>
+    <w:p>
+      <w:pPr>
+        <w:numPr>
+          <w:ilvl w:val="0"/>
+          <w:numId w:val="0"/>
+        </w:numPr>
+        <w:jc w:val="both"/>
+        <w:rPr>
+          <w:rFonts w:hint="default"/>
+          <w:lang w:val="en-US"/>
+        </w:rPr>
+      </w:pPr>
+    </w:p>
+    <w:tbl>
+      <w:tblPr>
+        <w:tblStyle w:val="4"/>
+        <w:tblW w:w="0" w:type="auto"/>
+        <w:tblInd w:w="0" w:type="dxa"/>
+        <w:tblBorders>
+          <w:top w:val="single" w:color="auto" w:sz="4" w:space="0"/>
+          <w:left w:val="single" w:color="auto" w:sz="4" w:space="0"/>
+          <w:bottom w:val="single" w:color="auto" w:sz="4" w:space="0"/>
+          <w:right w:val="single" w:color="auto" w:sz="4" w:space="0"/>
+          <w:insideH w:val="single" w:color="auto" w:sz="4" w:space="0"/>
+          <w:insideV w:val="single" w:color="auto" w:sz="4" w:space="0"/>
+        </w:tblBorders>
+        <w:tblLayout w:type="autofit"/>
+        <w:tblCellMar>
+          <w:top w:w="0" w:type="dxa"/>
+          <w:left w:w="108" w:type="dxa"/>
+          <w:bottom w:w="0" w:type="dxa"/>
+          <w:right w:w="108" w:type="dxa"/>
+        </w:tblCellMar>
+      </w:tblPr>
+      <w:tblGrid>
+        <w:gridCol w:w="8522"/>
+      </w:tblGrid>
+      <w:tr>
+        <w:tblPrEx>
+          <w:tblBorders>
+            <w:top w:val="single" w:color="auto" w:sz="4" w:space="0"/>
+            <w:left w:val="single" w:color="auto" w:sz="4" w:space="0"/>
+            <w:bottom w:val="single" w:color="auto" w:sz="4" w:space="0"/>
+            <w:right w:val="single" w:color="auto" w:sz="4" w:space="0"/>
+            <w:insideH w:val="single" w:color="auto" w:sz="4" w:space="0"/>
+            <w:insideV w:val="single" w:color="auto" w:sz="4" w:space="0"/>
+          </w:tblBorders>
+          <w:tblCellMar>
+            <w:top w:w="0" w:type="dxa"/>
+            <w:left w:w="108" w:type="dxa"/>
+            <w:bottom w:w="0" w:type="dxa"/>
+            <w:right w:w="108" w:type="dxa"/>
+          </w:tblCellMar>
+        </w:tblPrEx>
+        <w:tc>
+          <w:tcPr>
+            <w:tcW w:w="8522" w:type="dxa"/>
+          </w:tcPr>
+          <w:p>
+            <w:pPr>
+              <w:widowControl w:val="0"/>
+              <w:numPr>
+                <w:ilvl w:val="0"/>
+                <w:numId w:val="0"/>
+              </w:numPr>
+              <w:jc w:val="both"/>
+              <w:rPr>
+                <w:rFonts w:hint="default"/>
+                <w:vertAlign w:val="baseline"/>
+                <w:lang w:val="en-US"/>
+              </w:rPr>
+            </w:pPr>
+            <w:r>
+              <w:rPr>
+                <w:rFonts w:hint="default"/>
+                <w:vertAlign w:val="baseline"/>
+                <w:lang w:val="en-US"/>
+              </w:rPr>
+              <w:t>php artisan make:seeder AdminSeeder (AdminSeeder is the seeder file name)</w:t>
+            </w:r>
+          </w:p>
+        </w:tc>
+      </w:tr>
+    </w:tbl>
+    <w:p>
+      <w:pPr>
+        <w:numPr>
+          <w:ilvl w:val="0"/>
+          <w:numId w:val="0"/>
+        </w:numPr>
+        <w:jc w:val="both"/>
+        <w:rPr>
+          <w:rFonts w:hint="default"/>
+          <w:lang w:val="en-US"/>
+        </w:rPr>
+      </w:pPr>
+    </w:p>
+    <w:p>
+      <w:pPr>
+        <w:numPr>
+          <w:ilvl w:val="0"/>
+          <w:numId w:val="0"/>
+        </w:numPr>
+        <w:jc w:val="both"/>
+        <w:rPr>
+          <w:rFonts w:hint="default"/>
+          <w:lang w:val="en-US"/>
+        </w:rPr>
+      </w:pPr>
+      <w:r>
+        <w:rPr>
+          <w:rFonts w:hint="default"/>
+          <w:lang w:val="en-US"/>
+        </w:rPr>
+        <w:t>Then go to your AdminSeeder file (database-&gt;seeders-&gt;AdminSeeder.php) and add code as shown:</w:t>
+      </w:r>
+    </w:p>
+    <w:p>
+      <w:pPr>
+        <w:numPr>
+          <w:ilvl w:val="0"/>
+          <w:numId w:val="0"/>
+        </w:numPr>
+        <w:jc w:val="both"/>
+      </w:pPr>
+      <w:r>
+        <w:drawing>
+          <wp:inline distT="0" distB="0" distL="114300" distR="114300">
+            <wp:extent cx="5273675" cy="2652395"/>
+            <wp:effectExtent l="0" t="0" r="14605" b="14605"/>
+            <wp:docPr id="39" name="Picture 16"/>
+            <wp:cNvGraphicFramePr>
+              <a:graphicFrameLocks xmlns:a="http://schemas.openxmlformats.org/drawingml/2006/main" noChangeAspect="1"/>
+            </wp:cNvGraphicFramePr>
+            <a:graphic xmlns:a="http://schemas.openxmlformats.org/drawingml/2006/main">
+              <a:graphicData uri="http://schemas.openxmlformats.org/drawingml/2006/picture">
+                <pic:pic xmlns:pic="http://schemas.openxmlformats.org/drawingml/2006/picture">
+                  <pic:nvPicPr>
+                    <pic:cNvPr id="39" name="Picture 16"/>
+                    <pic:cNvPicPr>
+                      <a:picLocks noChangeAspect="1"/>
+                    </pic:cNvPicPr>
+                  </pic:nvPicPr>
+                  <pic:blipFill>
+                    <a:blip r:embed="rId39"/>
+                    <a:stretch>
+                      <a:fillRect/>
+                    </a:stretch>
+                  </pic:blipFill>
+                  <pic:spPr>
+                    <a:xfrm>
+                      <a:off x="0" y="0"/>
+                      <a:ext cx="5273675" cy="2652395"/>
+                    </a:xfrm>
+                    <a:prstGeom prst="rect">
+                      <a:avLst/>
+                    </a:prstGeom>
+                    <a:noFill/>
+                    <a:ln>
+                      <a:noFill/>
+                    </a:ln>
+                  </pic:spPr>
+                </pic:pic>
+              </a:graphicData>
+            </a:graphic>
+          </wp:inline>
+        </w:drawing>
+      </w:r>
+    </w:p>
+    <w:p>
+      <w:pPr>
+        <w:numPr>
+          <w:ilvl w:val="0"/>
+          <w:numId w:val="0"/>
+        </w:numPr>
+        <w:jc w:val="both"/>
+      </w:pPr>
+    </w:p>
+    <w:p>
+      <w:pPr>
+        <w:numPr>
+          <w:ilvl w:val="0"/>
+          <w:numId w:val="0"/>
+        </w:numPr>
+        <w:jc w:val="both"/>
+        <w:rPr>
+          <w:rFonts w:hint="default"/>
+          <w:lang w:val="en-US"/>
+        </w:rPr>
+      </w:pPr>
+      <w:r>
+        <w:rPr>
+          <w:rFonts w:hint="default"/>
+          <w:lang w:val="en-US"/>
+        </w:rPr>
+        <w:t>Then you need to go to DatabaseSeeder.php (database-&gt;seeders-&gt;DatabaseSeeder.php) and following code:</w:t>
+      </w:r>
+    </w:p>
+    <w:tbl>
+      <w:tblPr>
+        <w:tblStyle w:val="4"/>
+        <w:tblW w:w="0" w:type="auto"/>
+        <w:tblInd w:w="0" w:type="dxa"/>
+        <w:tblBorders>
+          <w:top w:val="single" w:color="auto" w:sz="4" w:space="0"/>
+          <w:left w:val="single" w:color="auto" w:sz="4" w:space="0"/>
+          <w:bottom w:val="single" w:color="auto" w:sz="4" w:space="0"/>
+          <w:right w:val="single" w:color="auto" w:sz="4" w:space="0"/>
+          <w:insideH w:val="single" w:color="auto" w:sz="4" w:space="0"/>
+          <w:insideV w:val="single" w:color="auto" w:sz="4" w:space="0"/>
+        </w:tblBorders>
+        <w:tblLayout w:type="autofit"/>
+        <w:tblCellMar>
+          <w:top w:w="0" w:type="dxa"/>
+          <w:left w:w="108" w:type="dxa"/>
+          <w:bottom w:w="0" w:type="dxa"/>
+          <w:right w:w="108" w:type="dxa"/>
+        </w:tblCellMar>
+      </w:tblPr>
+      <w:tblGrid>
+        <w:gridCol w:w="8522"/>
+      </w:tblGrid>
+      <w:tr>
+        <w:tblPrEx>
+          <w:tblBorders>
+            <w:top w:val="single" w:color="auto" w:sz="4" w:space="0"/>
+            <w:left w:val="single" w:color="auto" w:sz="4" w:space="0"/>
+            <w:bottom w:val="single" w:color="auto" w:sz="4" w:space="0"/>
+            <w:right w:val="single" w:color="auto" w:sz="4" w:space="0"/>
+            <w:insideH w:val="single" w:color="auto" w:sz="4" w:space="0"/>
+            <w:insideV w:val="single" w:color="auto" w:sz="4" w:space="0"/>
+          </w:tblBorders>
+          <w:tblCellMar>
+            <w:top w:w="0" w:type="dxa"/>
+            <w:left w:w="108" w:type="dxa"/>
+            <w:bottom w:w="0" w:type="dxa"/>
+            <w:right w:w="108" w:type="dxa"/>
+          </w:tblCellMar>
+        </w:tblPrEx>
+        <w:tc>
+          <w:tcPr>
+            <w:tcW w:w="8522" w:type="dxa"/>
+          </w:tcPr>
+          <w:p>
+            <w:pPr>
+              <w:widowControl w:val="0"/>
+              <w:numPr>
+                <w:ilvl w:val="0"/>
+                <w:numId w:val="0"/>
+              </w:numPr>
+              <w:jc w:val="both"/>
+              <w:rPr>
+                <w:rFonts w:hint="default"/>
+                <w:vertAlign w:val="baseline"/>
+                <w:lang w:val="en-US"/>
+              </w:rPr>
+            </w:pPr>
+            <w:r>
+              <w:rPr>
+                <w:rFonts w:hint="default"/>
+                <w:vertAlign w:val="baseline"/>
+                <w:lang w:val="en-US"/>
+              </w:rPr>
+              <w:t>$this-&gt;call([AdminSeeder::class])</w:t>
+            </w:r>
+          </w:p>
+        </w:tc>
+      </w:tr>
+    </w:tbl>
+    <w:p>
+      <w:pPr>
+        <w:numPr>
+          <w:ilvl w:val="0"/>
+          <w:numId w:val="0"/>
+        </w:numPr>
+        <w:jc w:val="both"/>
+      </w:pPr>
+      <w:r>
+        <w:drawing>
+          <wp:inline distT="0" distB="0" distL="114300" distR="114300">
+            <wp:extent cx="5269230" cy="2576830"/>
+            <wp:effectExtent l="0" t="0" r="3810" b="13970"/>
+            <wp:docPr id="40" name="Picture 17"/>
+            <wp:cNvGraphicFramePr>
+              <a:graphicFrameLocks xmlns:a="http://schemas.openxmlformats.org/drawingml/2006/main" noChangeAspect="1"/>
+            </wp:cNvGraphicFramePr>
+            <a:graphic xmlns:a="http://schemas.openxmlformats.org/drawingml/2006/main">
+              <a:graphicData uri="http://schemas.openxmlformats.org/drawingml/2006/picture">
+                <pic:pic xmlns:pic="http://schemas.openxmlformats.org/drawingml/2006/picture">
+                  <pic:nvPicPr>
+                    <pic:cNvPr id="40" name="Picture 17"/>
+                    <pic:cNvPicPr>
+                      <a:picLocks noChangeAspect="1"/>
+                    </pic:cNvPicPr>
+                  </pic:nvPicPr>
+                  <pic:blipFill>
+                    <a:blip r:embed="rId40"/>
+                    <a:stretch>
+                      <a:fillRect/>
+                    </a:stretch>
+                  </pic:blipFill>
+                  <pic:spPr>
+                    <a:xfrm>
+                      <a:off x="0" y="0"/>
+                      <a:ext cx="5269230" cy="2576830"/>
+                    </a:xfrm>
+                    <a:prstGeom prst="rect">
+                      <a:avLst/>
+                    </a:prstGeom>
+                    <a:noFill/>
+                    <a:ln>
+                      <a:noFill/>
+                    </a:ln>
+                  </pic:spPr>
+                </pic:pic>
+              </a:graphicData>
+            </a:graphic>
+          </wp:inline>
+        </w:drawing>
+      </w:r>
+    </w:p>
+    <w:p>
+      <w:pPr>
+        <w:numPr>
+          <w:ilvl w:val="0"/>
+          <w:numId w:val="0"/>
+        </w:numPr>
+        <w:jc w:val="both"/>
+      </w:pPr>
+    </w:p>
+    <w:p>
+      <w:pPr>
+        <w:numPr>
+          <w:ilvl w:val="0"/>
+          <w:numId w:val="0"/>
+        </w:numPr>
+        <w:jc w:val="both"/>
+        <w:rPr>
+          <w:rFonts w:hint="default"/>
+          <w:lang w:val="en-US"/>
+        </w:rPr>
+      </w:pPr>
+      <w:r>
+        <w:rPr>
+          <w:rFonts w:hint="default"/>
+          <w:lang w:val="en-US"/>
+        </w:rPr>
+        <w:t>After this you need to go to the terminal and insert the following command:</w:t>
+      </w:r>
+    </w:p>
+    <w:p>
+      <w:pPr>
+        <w:numPr>
+          <w:ilvl w:val="0"/>
+          <w:numId w:val="0"/>
+        </w:numPr>
+        <w:jc w:val="both"/>
+        <w:rPr>
+          <w:rFonts w:hint="default"/>
+          <w:lang w:val="en-US"/>
+        </w:rPr>
+      </w:pPr>
+    </w:p>
+    <w:tbl>
+      <w:tblPr>
+        <w:tblStyle w:val="4"/>
+        <w:tblW w:w="0" w:type="auto"/>
+        <w:tblInd w:w="0" w:type="dxa"/>
+        <w:tblBorders>
+          <w:top w:val="single" w:color="auto" w:sz="4" w:space="0"/>
+          <w:left w:val="single" w:color="auto" w:sz="4" w:space="0"/>
+          <w:bottom w:val="single" w:color="auto" w:sz="4" w:space="0"/>
+          <w:right w:val="single" w:color="auto" w:sz="4" w:space="0"/>
+          <w:insideH w:val="single" w:color="auto" w:sz="4" w:space="0"/>
+          <w:insideV w:val="single" w:color="auto" w:sz="4" w:space="0"/>
+        </w:tblBorders>
+        <w:tblLayout w:type="autofit"/>
+        <w:tblCellMar>
+          <w:top w:w="0" w:type="dxa"/>
+          <w:left w:w="108" w:type="dxa"/>
+          <w:bottom w:w="0" w:type="dxa"/>
+          <w:right w:w="108" w:type="dxa"/>
+        </w:tblCellMar>
+      </w:tblPr>
+      <w:tblGrid>
+        <w:gridCol w:w="8522"/>
+      </w:tblGrid>
+      <w:tr>
+        <w:tblPrEx>
+          <w:tblBorders>
+            <w:top w:val="single" w:color="auto" w:sz="4" w:space="0"/>
+            <w:left w:val="single" w:color="auto" w:sz="4" w:space="0"/>
+            <w:bottom w:val="single" w:color="auto" w:sz="4" w:space="0"/>
+            <w:right w:val="single" w:color="auto" w:sz="4" w:space="0"/>
+            <w:insideH w:val="single" w:color="auto" w:sz="4" w:space="0"/>
+            <w:insideV w:val="single" w:color="auto" w:sz="4" w:space="0"/>
+          </w:tblBorders>
+          <w:tblCellMar>
+            <w:top w:w="0" w:type="dxa"/>
+            <w:left w:w="108" w:type="dxa"/>
+            <w:bottom w:w="0" w:type="dxa"/>
+            <w:right w:w="108" w:type="dxa"/>
+          </w:tblCellMar>
+        </w:tblPrEx>
+        <w:tc>
+          <w:tcPr>
+            <w:tcW w:w="8522" w:type="dxa"/>
+          </w:tcPr>
+          <w:p>
+            <w:pPr>
+              <w:widowControl w:val="0"/>
+              <w:numPr>
+                <w:ilvl w:val="0"/>
+                <w:numId w:val="0"/>
+              </w:numPr>
+              <w:jc w:val="both"/>
+              <w:rPr>
+                <w:rFonts w:hint="default"/>
+                <w:vertAlign w:val="baseline"/>
+                <w:lang w:val="en-US"/>
+              </w:rPr>
+            </w:pPr>
+            <w:r>
+              <w:rPr>
+                <w:rFonts w:hint="default"/>
+                <w:vertAlign w:val="baseline"/>
+                <w:lang w:val="en-US"/>
+              </w:rPr>
+              <w:t>php artisan db:seed</w:t>
+            </w:r>
+          </w:p>
+        </w:tc>
+      </w:tr>
+    </w:tbl>
+    <w:p>
+      <w:pPr>
+        <w:numPr>
+          <w:ilvl w:val="0"/>
+          <w:numId w:val="0"/>
+        </w:numPr>
+        <w:jc w:val="both"/>
+        <w:rPr>
+          <w:rFonts w:hint="default"/>
+          <w:lang w:val="en-US"/>
+        </w:rPr>
+      </w:pPr>
+    </w:p>
+    <w:p>
+      <w:pPr>
+        <w:numPr>
+          <w:ilvl w:val="0"/>
+          <w:numId w:val="0"/>
+        </w:numPr>
+        <w:jc w:val="both"/>
+        <w:rPr>
+          <w:rFonts w:hint="default"/>
+          <w:lang w:val="en-US"/>
+        </w:rPr>
+      </w:pPr>
+      <w:r>
+        <w:rPr>
+          <w:rFonts w:hint="default"/>
+          <w:lang w:val="en-US"/>
+        </w:rPr>
+        <w:t>Doing this will add data in your table as shown below:</w:t>
+      </w:r>
+    </w:p>
+    <w:p>
+      <w:pPr>
+        <w:numPr>
+          <w:ilvl w:val="0"/>
+          <w:numId w:val="0"/>
+        </w:numPr>
+        <w:jc w:val="both"/>
+        <w:rPr>
+          <w:rFonts w:hint="default"/>
+          <w:lang w:val="en-US"/>
+        </w:rPr>
+      </w:pPr>
+      <w:r>
+        <w:drawing>
+          <wp:inline distT="0" distB="0" distL="114300" distR="114300">
+            <wp:extent cx="5264785" cy="1776095"/>
+            <wp:effectExtent l="0" t="0" r="8255" b="6985"/>
+            <wp:docPr id="41" name="Picture 18"/>
+            <wp:cNvGraphicFramePr>
+              <a:graphicFrameLocks xmlns:a="http://schemas.openxmlformats.org/drawingml/2006/main" noChangeAspect="1"/>
+            </wp:cNvGraphicFramePr>
+            <a:graphic xmlns:a="http://schemas.openxmlformats.org/drawingml/2006/main">
+              <a:graphicData uri="http://schemas.openxmlformats.org/drawingml/2006/picture">
+                <pic:pic xmlns:pic="http://schemas.openxmlformats.org/drawingml/2006/picture">
+                  <pic:nvPicPr>
+                    <pic:cNvPr id="41" name="Picture 18"/>
+                    <pic:cNvPicPr>
+                      <a:picLocks noChangeAspect="1"/>
+                    </pic:cNvPicPr>
+                  </pic:nvPicPr>
+                  <pic:blipFill>
+                    <a:blip r:embed="rId41"/>
+                    <a:stretch>
+                      <a:fillRect/>
+                    </a:stretch>
+                  </pic:blipFill>
+                  <pic:spPr>
+                    <a:xfrm>
+                      <a:off x="0" y="0"/>
+                      <a:ext cx="5264785" cy="1776095"/>
+                    </a:xfrm>
+                    <a:prstGeom prst="rect">
+                      <a:avLst/>
+                    </a:prstGeom>
+                    <a:noFill/>
+                    <a:ln>
+                      <a:noFill/>
+                    </a:ln>
+                  </pic:spPr>
+                </pic:pic>
+              </a:graphicData>
+            </a:graphic>
+          </wp:inline>
+        </w:drawing>
+      </w:r>
+    </w:p>
+    <w:p>
+      <w:pPr>
+        <w:numPr>
+          <w:ilvl w:val="0"/>
+          <w:numId w:val="0"/>
+        </w:numPr>
+        <w:jc w:val="both"/>
+        <w:rPr>
+          <w:rFonts w:hint="default"/>
+          <w:lang w:val="en-US"/>
+        </w:rPr>
+      </w:pPr>
+    </w:p>
+    <w:p>
+      <w:pPr>
+        <w:numPr>
+          <w:ilvl w:val="0"/>
+          <w:numId w:val="1"/>
+        </w:numPr>
+        <w:ind w:left="0" w:leftChars="0" w:firstLine="0" w:firstLineChars="0"/>
+        <w:jc w:val="both"/>
+        <w:rPr>
+          <w:rFonts w:hint="default"/>
+          <w:b/>
+          <w:bCs/>
+          <w:sz w:val="24"/>
+          <w:szCs w:val="24"/>
+          <w:lang w:val="en-US"/>
+        </w:rPr>
+      </w:pPr>
+      <w:r>
+        <w:rPr>
+          <w:rFonts w:hint="default"/>
+          <w:b/>
+          <w:bCs/>
+          <w:sz w:val="24"/>
+          <w:szCs w:val="24"/>
+          <w:lang w:val="en-US"/>
+        </w:rPr>
+        <w:t>Laravel Multi Auth with Breeze Part 2 (admin side)</w:t>
+      </w:r>
+    </w:p>
+    <w:p>
+      <w:pPr>
+        <w:numPr>
+          <w:numId w:val="0"/>
+        </w:numPr>
+        <w:jc w:val="both"/>
+        <w:rPr>
+          <w:rFonts w:hint="default"/>
+          <w:b/>
+          <w:bCs/>
+          <w:sz w:val="24"/>
+          <w:szCs w:val="24"/>
+          <w:lang w:val="en-US"/>
+        </w:rPr>
+      </w:pPr>
+    </w:p>
+    <w:p>
+      <w:pPr>
+        <w:numPr>
+          <w:ilvl w:val="0"/>
+          <w:numId w:val="0"/>
+        </w:numPr>
+        <w:ind w:leftChars="0"/>
+        <w:jc w:val="both"/>
+        <w:rPr>
+          <w:rFonts w:hint="default"/>
+          <w:b/>
+          <w:bCs/>
+          <w:sz w:val="20"/>
+          <w:szCs w:val="20"/>
+          <w:lang w:val="en-US"/>
+        </w:rPr>
+      </w:pPr>
+      <w:r>
+        <w:rPr>
+          <w:rFonts w:hint="default"/>
+          <w:b/>
+          <w:bCs/>
+          <w:sz w:val="20"/>
+          <w:szCs w:val="20"/>
+          <w:lang w:val="en-US"/>
+        </w:rPr>
+        <w:t>What is a controller?</w:t>
+      </w:r>
+    </w:p>
+    <w:p>
+      <w:pPr>
+        <w:numPr>
+          <w:numId w:val="0"/>
+        </w:numPr>
+        <w:jc w:val="both"/>
+        <w:rPr>
+          <w:rFonts w:hint="default"/>
+          <w:b w:val="0"/>
+          <w:bCs w:val="0"/>
+          <w:sz w:val="20"/>
+          <w:szCs w:val="20"/>
+          <w:lang w:val="en-US"/>
+        </w:rPr>
+      </w:pPr>
+      <w:r>
+        <w:rPr>
+          <w:rFonts w:hint="default"/>
+          <w:b w:val="0"/>
+          <w:bCs w:val="0"/>
+          <w:sz w:val="20"/>
+          <w:szCs w:val="20"/>
+          <w:lang w:val="en-US"/>
+        </w:rPr>
+        <w:t>Controller is used to handle the logic of your application. It receives requests from users, processes the required data, interacts with models or databases, and returns a response or view.</w:t>
+      </w:r>
+    </w:p>
+    <w:p>
+      <w:pPr>
+        <w:numPr>
+          <w:numId w:val="0"/>
+        </w:numPr>
+        <w:ind w:leftChars="0"/>
+        <w:jc w:val="both"/>
+        <w:rPr>
+          <w:rFonts w:hint="default"/>
+          <w:b/>
+          <w:bCs/>
+          <w:sz w:val="24"/>
+          <w:szCs w:val="24"/>
+          <w:lang w:val="en-US"/>
+        </w:rPr>
+      </w:pPr>
+    </w:p>
+    <w:p>
+      <w:pPr>
+        <w:numPr>
+          <w:numId w:val="0"/>
+        </w:numPr>
+        <w:ind w:leftChars="0"/>
+        <w:jc w:val="both"/>
+        <w:rPr>
+          <w:rFonts w:hint="default"/>
+          <w:b w:val="0"/>
+          <w:bCs w:val="0"/>
+          <w:sz w:val="20"/>
+          <w:szCs w:val="20"/>
+          <w:lang w:val="en-US"/>
+        </w:rPr>
+      </w:pPr>
+      <w:r>
+        <w:rPr>
+          <w:rFonts w:hint="default"/>
+          <w:b w:val="0"/>
+          <w:bCs w:val="0"/>
+          <w:sz w:val="20"/>
+          <w:szCs w:val="20"/>
+          <w:lang w:val="en-US"/>
+        </w:rPr>
+        <w:t>First you need to create a controller. Here, we will create the Admin Controller with the following command:</w:t>
       </w:r>
     </w:p>
     <w:tbl>
@@ -3741,7 +5040,7 @@
                 <w:vertAlign w:val="baseline"/>
                 <w:lang w:val="en-US"/>
               </w:rPr>
-              <w:t>php artisan make:model Admin -m</w:t>
+              <w:t>php artisan make:controller AdminController</w:t>
             </w:r>
           </w:p>
         </w:tc>
@@ -3752,6 +5051,7 @@
         <w:numPr>
           <w:numId w:val="0"/>
         </w:numPr>
+        <w:ind w:leftChars="0"/>
         <w:jc w:val="both"/>
         <w:rPr>
           <w:rFonts w:hint="default"/>
@@ -3768,14 +5068,43 @@
         <w:numPr>
           <w:numId w:val="0"/>
         </w:numPr>
+        <w:ind w:leftChars="0"/>
+        <w:jc w:val="both"/>
+        <w:rPr>
+          <w:rFonts w:hint="default"/>
+          <w:b w:val="0"/>
+          <w:bCs w:val="0"/>
+          <w:sz w:val="20"/>
+          <w:szCs w:val="20"/>
+          <w:lang w:val="en-US"/>
+        </w:rPr>
+      </w:pPr>
+      <w:r>
+        <w:rPr>
+          <w:rFonts w:hint="default"/>
+          <w:b w:val="0"/>
+          <w:bCs w:val="0"/>
+          <w:sz w:val="20"/>
+          <w:szCs w:val="20"/>
+          <w:lang w:val="en-US"/>
+        </w:rPr>
+        <w:t>This will create the controller named AdminController(app-&gt;http-&gt;controllers-&gt;AdminController.php)</w:t>
+      </w:r>
+    </w:p>
+    <w:p>
+      <w:pPr>
+        <w:numPr>
+          <w:numId w:val="0"/>
+        </w:numPr>
+        <w:ind w:leftChars="0"/>
         <w:jc w:val="both"/>
       </w:pPr>
       <w:r>
         <w:drawing>
           <wp:inline distT="0" distB="0" distL="114300" distR="114300">
-            <wp:extent cx="6281420" cy="565150"/>
-            <wp:effectExtent l="0" t="0" r="12700" b="13970"/>
-            <wp:docPr id="33" name="Picture 10"/>
+            <wp:extent cx="3558540" cy="2522220"/>
+            <wp:effectExtent l="0" t="0" r="7620" b="7620"/>
+            <wp:docPr id="28" name="Picture 1"/>
             <wp:cNvGraphicFramePr>
               <a:graphicFrameLocks xmlns:a="http://schemas.openxmlformats.org/drawingml/2006/main" noChangeAspect="1"/>
             </wp:cNvGraphicFramePr>
@@ -3783,13 +5112,13 @@
               <a:graphicData uri="http://schemas.openxmlformats.org/drawingml/2006/picture">
                 <pic:pic xmlns:pic="http://schemas.openxmlformats.org/drawingml/2006/picture">
                   <pic:nvPicPr>
-                    <pic:cNvPr id="33" name="Picture 10"/>
+                    <pic:cNvPr id="28" name="Picture 1"/>
                     <pic:cNvPicPr>
                       <a:picLocks noChangeAspect="1"/>
                     </pic:cNvPicPr>
                   </pic:nvPicPr>
                   <pic:blipFill>
-                    <a:blip r:embed="rId35"/>
+                    <a:blip r:embed="rId42"/>
                     <a:stretch>
                       <a:fillRect/>
                     </a:stretch>
@@ -3797,7 +5126,7 @@
                   <pic:spPr>
                     <a:xfrm>
                       <a:off x="0" y="0"/>
-                      <a:ext cx="6281420" cy="565150"/>
+                      <a:ext cx="3558540" cy="2522220"/>
                     </a:xfrm>
                     <a:prstGeom prst="rect">
                       <a:avLst/>
@@ -3819,229 +5148,1098 @@
         <w:numPr>
           <w:numId w:val="0"/>
         </w:numPr>
-        <w:jc w:val="both"/>
-        <w:rPr>
-          <w:rFonts w:hint="default"/>
-          <w:lang w:val="en-US"/>
-        </w:rPr>
-      </w:pPr>
-    </w:p>
-    <w:p>
-      <w:pPr>
-        <w:numPr>
-          <w:numId w:val="0"/>
-        </w:numPr>
-        <w:jc w:val="both"/>
-        <w:rPr>
-          <w:rFonts w:hint="default"/>
-          <w:lang w:val="en-US"/>
-        </w:rPr>
-      </w:pPr>
-      <w:r>
-        <w:rPr>
-          <w:rFonts w:hint="default"/>
-          <w:lang w:val="en-US"/>
-        </w:rPr>
-        <w:t>The above command will create an admin model and a database migration file for the admins table.</w:t>
-      </w:r>
-    </w:p>
-    <w:p>
-      <w:pPr>
-        <w:numPr>
-          <w:numId w:val="0"/>
-        </w:numPr>
-        <w:jc w:val="both"/>
-        <w:rPr>
-          <w:rFonts w:hint="default"/>
-          <w:lang w:val="en-US"/>
-        </w:rPr>
-      </w:pPr>
-    </w:p>
-    <w:p>
-      <w:pPr>
-        <w:numPr>
-          <w:numId w:val="0"/>
-        </w:numPr>
-        <w:jc w:val="both"/>
-        <w:rPr>
-          <w:rFonts w:hint="default"/>
-          <w:lang w:val="en-US"/>
-        </w:rPr>
-      </w:pPr>
-      <w:r>
-        <w:rPr>
-          <w:rFonts w:hint="default"/>
-          <w:lang w:val="en-US"/>
-        </w:rPr>
-        <w:t>After that go to the admins migration (database-&gt;migrations-&gt;create_admins_table.php) and add fields as shown below:</w:t>
-      </w:r>
-    </w:p>
-    <w:p>
-      <w:pPr>
-        <w:numPr>
-          <w:numId w:val="0"/>
-        </w:numPr>
-        <w:jc w:val="both"/>
-        <w:rPr>
-          <w:rFonts w:hint="default"/>
-          <w:lang w:val="en-US"/>
-        </w:rPr>
-      </w:pPr>
-    </w:p>
-    <w:p>
-      <w:pPr>
-        <w:numPr>
-          <w:numId w:val="0"/>
-        </w:numPr>
-        <w:jc w:val="both"/>
-      </w:pPr>
-      <w:r>
-        <w:drawing>
-          <wp:inline distT="0" distB="0" distL="114300" distR="114300">
-            <wp:extent cx="5270500" cy="3080385"/>
-            <wp:effectExtent l="0" t="0" r="2540" b="13335"/>
-            <wp:docPr id="37" name="Picture 14"/>
-            <wp:cNvGraphicFramePr>
-              <a:graphicFrameLocks xmlns:a="http://schemas.openxmlformats.org/drawingml/2006/main" noChangeAspect="1"/>
-            </wp:cNvGraphicFramePr>
-            <a:graphic xmlns:a="http://schemas.openxmlformats.org/drawingml/2006/main">
-              <a:graphicData uri="http://schemas.openxmlformats.org/drawingml/2006/picture">
-                <pic:pic xmlns:pic="http://schemas.openxmlformats.org/drawingml/2006/picture">
-                  <pic:nvPicPr>
-                    <pic:cNvPr id="37" name="Picture 14"/>
-                    <pic:cNvPicPr>
-                      <a:picLocks noChangeAspect="1"/>
-                    </pic:cNvPicPr>
-                  </pic:nvPicPr>
-                  <pic:blipFill>
-                    <a:blip r:embed="rId36"/>
-                    <a:stretch>
-                      <a:fillRect/>
-                    </a:stretch>
-                  </pic:blipFill>
-                  <pic:spPr>
-                    <a:xfrm>
-                      <a:off x="0" y="0"/>
-                      <a:ext cx="5270500" cy="3080385"/>
-                    </a:xfrm>
-                    <a:prstGeom prst="rect">
-                      <a:avLst/>
-                    </a:prstGeom>
-                    <a:noFill/>
-                    <a:ln>
-                      <a:noFill/>
-                    </a:ln>
-                  </pic:spPr>
-                </pic:pic>
-              </a:graphicData>
-            </a:graphic>
-          </wp:inline>
-        </w:drawing>
-      </w:r>
-    </w:p>
-    <w:p>
-      <w:pPr>
-        <w:numPr>
-          <w:numId w:val="0"/>
-        </w:numPr>
-        <w:jc w:val="both"/>
-      </w:pPr>
-    </w:p>
-    <w:p>
-      <w:pPr>
-        <w:numPr>
-          <w:numId w:val="0"/>
-        </w:numPr>
-        <w:jc w:val="both"/>
-        <w:rPr>
-          <w:rFonts w:hint="default"/>
-          <w:lang w:val="en-US"/>
-        </w:rPr>
-      </w:pPr>
-      <w:r>
-        <w:rPr>
-          <w:rFonts w:hint="default"/>
-          <w:lang w:val="en-US"/>
-        </w:rPr>
-        <w:t>After that go to the Admin Models (app-&gt;models-&gt;Admin.php) and add code as shown below:</w:t>
-      </w:r>
-    </w:p>
-    <w:p>
-      <w:pPr>
-        <w:numPr>
-          <w:numId w:val="0"/>
-        </w:numPr>
-        <w:jc w:val="both"/>
-      </w:pPr>
-      <w:r>
-        <w:drawing>
-          <wp:inline distT="0" distB="0" distL="114300" distR="114300">
-            <wp:extent cx="5271135" cy="3814445"/>
-            <wp:effectExtent l="0" t="0" r="1905" b="10795"/>
-            <wp:docPr id="35" name="Picture 12"/>
-            <wp:cNvGraphicFramePr>
-              <a:graphicFrameLocks xmlns:a="http://schemas.openxmlformats.org/drawingml/2006/main" noChangeAspect="1"/>
-            </wp:cNvGraphicFramePr>
-            <a:graphic xmlns:a="http://schemas.openxmlformats.org/drawingml/2006/main">
-              <a:graphicData uri="http://schemas.openxmlformats.org/drawingml/2006/picture">
-                <pic:pic xmlns:pic="http://schemas.openxmlformats.org/drawingml/2006/picture">
-                  <pic:nvPicPr>
-                    <pic:cNvPr id="35" name="Picture 12"/>
-                    <pic:cNvPicPr>
-                      <a:picLocks noChangeAspect="1"/>
-                    </pic:cNvPicPr>
-                  </pic:nvPicPr>
-                  <pic:blipFill>
-                    <a:blip r:embed="rId37"/>
-                    <a:stretch>
-                      <a:fillRect/>
-                    </a:stretch>
-                  </pic:blipFill>
-                  <pic:spPr>
-                    <a:xfrm>
-                      <a:off x="0" y="0"/>
-                      <a:ext cx="5271135" cy="3814445"/>
-                    </a:xfrm>
-                    <a:prstGeom prst="rect">
-                      <a:avLst/>
-                    </a:prstGeom>
-                    <a:noFill/>
-                    <a:ln>
-                      <a:noFill/>
-                    </a:ln>
-                  </pic:spPr>
-                </pic:pic>
-              </a:graphicData>
-            </a:graphic>
-          </wp:inline>
-        </w:drawing>
-      </w:r>
-    </w:p>
-    <w:p>
-      <w:pPr>
-        <w:numPr>
-          <w:numId w:val="0"/>
-        </w:numPr>
-        <w:jc w:val="both"/>
-      </w:pPr>
-    </w:p>
-    <w:p>
-      <w:pPr>
-        <w:numPr>
-          <w:numId w:val="0"/>
-        </w:numPr>
-        <w:jc w:val="both"/>
-        <w:rPr>
-          <w:rFonts w:hint="default"/>
-          <w:lang w:val="en-US"/>
-        </w:rPr>
-      </w:pPr>
-      <w:r>
-        <w:rPr>
-          <w:rFonts w:hint="default"/>
-          <w:lang w:val="en-US"/>
-        </w:rPr>
-        <w:t>After that you need to migrate the admins table to the database. To do that you need to use the command:</w:t>
+        <w:ind w:leftChars="0"/>
+        <w:jc w:val="both"/>
+      </w:pPr>
+    </w:p>
+    <w:p>
+      <w:pPr>
+        <w:numPr>
+          <w:numId w:val="0"/>
+        </w:numPr>
+        <w:ind w:leftChars="0"/>
+        <w:jc w:val="both"/>
+        <w:rPr>
+          <w:rFonts w:hint="default"/>
+          <w:lang w:val="en-US"/>
+        </w:rPr>
+      </w:pPr>
+      <w:r>
+        <w:rPr>
+          <w:rFonts w:hint="default"/>
+          <w:lang w:val="en-US"/>
+        </w:rPr>
+        <w:t>After creating the admin controller now you need to go the Admin Model. In the Admin model you need to assign the following:</w:t>
+      </w:r>
+    </w:p>
+    <w:p>
+      <w:pPr>
+        <w:numPr>
+          <w:numId w:val="0"/>
+        </w:numPr>
+        <w:ind w:leftChars="0"/>
+        <w:jc w:val="both"/>
+        <w:rPr>
+          <w:rFonts w:hint="default"/>
+          <w:lang w:val="en-US"/>
+        </w:rPr>
+      </w:pPr>
+    </w:p>
+    <w:tbl>
+      <w:tblPr>
+        <w:tblStyle w:val="4"/>
+        <w:tblW w:w="0" w:type="auto"/>
+        <w:tblInd w:w="0" w:type="dxa"/>
+        <w:tblBorders>
+          <w:top w:val="single" w:color="auto" w:sz="4" w:space="0"/>
+          <w:left w:val="single" w:color="auto" w:sz="4" w:space="0"/>
+          <w:bottom w:val="single" w:color="auto" w:sz="4" w:space="0"/>
+          <w:right w:val="single" w:color="auto" w:sz="4" w:space="0"/>
+          <w:insideH w:val="single" w:color="auto" w:sz="4" w:space="0"/>
+          <w:insideV w:val="single" w:color="auto" w:sz="4" w:space="0"/>
+        </w:tblBorders>
+        <w:tblLayout w:type="autofit"/>
+        <w:tblCellMar>
+          <w:left w:w="108" w:type="dxa"/>
+          <w:right w:w="108" w:type="dxa"/>
+        </w:tblCellMar>
+      </w:tblPr>
+      <w:tblGrid>
+        <w:gridCol w:w="8522"/>
+      </w:tblGrid>
+      <w:tr>
+        <w:tblPrEx>
+          <w:tblBorders>
+            <w:top w:val="single" w:color="auto" w:sz="4" w:space="0"/>
+            <w:left w:val="single" w:color="auto" w:sz="4" w:space="0"/>
+            <w:bottom w:val="single" w:color="auto" w:sz="4" w:space="0"/>
+            <w:right w:val="single" w:color="auto" w:sz="4" w:space="0"/>
+            <w:insideH w:val="single" w:color="auto" w:sz="4" w:space="0"/>
+            <w:insideV w:val="single" w:color="auto" w:sz="4" w:space="0"/>
+          </w:tblBorders>
+          <w:tblCellMar>
+            <w:left w:w="108" w:type="dxa"/>
+            <w:right w:w="108" w:type="dxa"/>
+          </w:tblCellMar>
+        </w:tblPrEx>
+        <w:tc>
+          <w:tcPr>
+            <w:tcW w:w="8522" w:type="dxa"/>
+          </w:tcPr>
+          <w:p>
+            <w:pPr>
+              <w:numPr>
+                <w:ilvl w:val="0"/>
+                <w:numId w:val="0"/>
+              </w:numPr>
+              <w:ind w:leftChars="0"/>
+              <w:jc w:val="both"/>
+              <w:rPr>
+                <w:rFonts w:hint="default"/>
+                <w:vertAlign w:val="baseline"/>
+                <w:lang w:val="en-US"/>
+              </w:rPr>
+            </w:pPr>
+            <w:r>
+              <w:rPr>
+                <w:rFonts w:hint="default"/>
+                <w:lang w:val="en-US"/>
+              </w:rPr>
+              <w:t>Protected $guard = ‘admin’;</w:t>
+            </w:r>
+          </w:p>
+        </w:tc>
+      </w:tr>
+      <w:tr>
+        <w:tblPrEx>
+          <w:tblBorders>
+            <w:top w:val="single" w:color="auto" w:sz="4" w:space="0"/>
+            <w:left w:val="single" w:color="auto" w:sz="4" w:space="0"/>
+            <w:bottom w:val="single" w:color="auto" w:sz="4" w:space="0"/>
+            <w:right w:val="single" w:color="auto" w:sz="4" w:space="0"/>
+            <w:insideH w:val="single" w:color="auto" w:sz="4" w:space="0"/>
+            <w:insideV w:val="single" w:color="auto" w:sz="4" w:space="0"/>
+          </w:tblBorders>
+          <w:tblCellMar>
+            <w:left w:w="108" w:type="dxa"/>
+            <w:right w:w="108" w:type="dxa"/>
+          </w:tblCellMar>
+        </w:tblPrEx>
+        <w:tc>
+          <w:tcPr>
+            <w:tcW w:w="8522" w:type="dxa"/>
+          </w:tcPr>
+          <w:p>
+            <w:pPr>
+              <w:numPr>
+                <w:ilvl w:val="0"/>
+                <w:numId w:val="0"/>
+              </w:numPr>
+              <w:ind w:leftChars="0"/>
+              <w:jc w:val="both"/>
+              <w:rPr>
+                <w:rFonts w:hint="default"/>
+                <w:lang w:val="en-US"/>
+              </w:rPr>
+            </w:pPr>
+            <w:r>
+              <w:rPr>
+                <w:rFonts w:hint="default"/>
+                <w:lang w:val="en-US"/>
+              </w:rPr>
+              <w:t>&lt;?php</w:t>
+            </w:r>
+          </w:p>
+          <w:p>
+            <w:pPr>
+              <w:numPr>
+                <w:ilvl w:val="0"/>
+                <w:numId w:val="0"/>
+              </w:numPr>
+              <w:ind w:leftChars="0"/>
+              <w:jc w:val="both"/>
+              <w:rPr>
+                <w:rFonts w:hint="default"/>
+                <w:lang w:val="en-US"/>
+              </w:rPr>
+            </w:pPr>
+          </w:p>
+          <w:p>
+            <w:pPr>
+              <w:numPr>
+                <w:ilvl w:val="0"/>
+                <w:numId w:val="0"/>
+              </w:numPr>
+              <w:ind w:leftChars="0"/>
+              <w:jc w:val="both"/>
+              <w:rPr>
+                <w:rFonts w:hint="default"/>
+                <w:lang w:val="en-US"/>
+              </w:rPr>
+            </w:pPr>
+            <w:r>
+              <w:rPr>
+                <w:rFonts w:hint="default"/>
+                <w:lang w:val="en-US"/>
+              </w:rPr>
+              <w:t>namespace App\Models;</w:t>
+            </w:r>
+          </w:p>
+          <w:p>
+            <w:pPr>
+              <w:numPr>
+                <w:ilvl w:val="0"/>
+                <w:numId w:val="0"/>
+              </w:numPr>
+              <w:ind w:leftChars="0"/>
+              <w:jc w:val="both"/>
+              <w:rPr>
+                <w:rFonts w:hint="default"/>
+                <w:lang w:val="en-US"/>
+              </w:rPr>
+            </w:pPr>
+          </w:p>
+          <w:p>
+            <w:pPr>
+              <w:numPr>
+                <w:ilvl w:val="0"/>
+                <w:numId w:val="0"/>
+              </w:numPr>
+              <w:ind w:leftChars="0"/>
+              <w:jc w:val="both"/>
+              <w:rPr>
+                <w:rFonts w:hint="default"/>
+                <w:lang w:val="en-US"/>
+              </w:rPr>
+            </w:pPr>
+            <w:r>
+              <w:rPr>
+                <w:rFonts w:hint="default"/>
+                <w:lang w:val="en-US"/>
+              </w:rPr>
+              <w:t>use Database\Factories\UserFactory;</w:t>
+            </w:r>
+          </w:p>
+          <w:p>
+            <w:pPr>
+              <w:numPr>
+                <w:ilvl w:val="0"/>
+                <w:numId w:val="0"/>
+              </w:numPr>
+              <w:ind w:leftChars="0"/>
+              <w:jc w:val="both"/>
+              <w:rPr>
+                <w:rFonts w:hint="default"/>
+                <w:lang w:val="en-US"/>
+              </w:rPr>
+            </w:pPr>
+            <w:r>
+              <w:rPr>
+                <w:rFonts w:hint="default"/>
+                <w:lang w:val="en-US"/>
+              </w:rPr>
+              <w:t>use Illuminate\Database\Eloquent\Factories\HasFactory;</w:t>
+            </w:r>
+          </w:p>
+          <w:p>
+            <w:pPr>
+              <w:numPr>
+                <w:ilvl w:val="0"/>
+                <w:numId w:val="0"/>
+              </w:numPr>
+              <w:ind w:leftChars="0"/>
+              <w:jc w:val="both"/>
+              <w:rPr>
+                <w:rFonts w:hint="default"/>
+                <w:lang w:val="en-US"/>
+              </w:rPr>
+            </w:pPr>
+            <w:r>
+              <w:rPr>
+                <w:rFonts w:hint="default"/>
+                <w:lang w:val="en-US"/>
+              </w:rPr>
+              <w:t>use Illuminate\Foundation\Auth\User as Authenticatable;</w:t>
+            </w:r>
+          </w:p>
+          <w:p>
+            <w:pPr>
+              <w:numPr>
+                <w:ilvl w:val="0"/>
+                <w:numId w:val="0"/>
+              </w:numPr>
+              <w:ind w:leftChars="0"/>
+              <w:jc w:val="both"/>
+              <w:rPr>
+                <w:rFonts w:hint="default"/>
+                <w:lang w:val="en-US"/>
+              </w:rPr>
+            </w:pPr>
+            <w:r>
+              <w:rPr>
+                <w:rFonts w:hint="default"/>
+                <w:lang w:val="en-US"/>
+              </w:rPr>
+              <w:t>use Illuminate\Notifications\Notifiable;</w:t>
+            </w:r>
+          </w:p>
+          <w:p>
+            <w:pPr>
+              <w:numPr>
+                <w:ilvl w:val="0"/>
+                <w:numId w:val="0"/>
+              </w:numPr>
+              <w:ind w:leftChars="0"/>
+              <w:jc w:val="both"/>
+              <w:rPr>
+                <w:rFonts w:hint="default"/>
+                <w:lang w:val="en-US"/>
+              </w:rPr>
+            </w:pPr>
+          </w:p>
+          <w:p>
+            <w:pPr>
+              <w:numPr>
+                <w:ilvl w:val="0"/>
+                <w:numId w:val="0"/>
+              </w:numPr>
+              <w:ind w:leftChars="0"/>
+              <w:jc w:val="both"/>
+              <w:rPr>
+                <w:rFonts w:hint="default"/>
+                <w:lang w:val="en-US"/>
+              </w:rPr>
+            </w:pPr>
+            <w:r>
+              <w:rPr>
+                <w:rFonts w:hint="default"/>
+                <w:lang w:val="en-US"/>
+              </w:rPr>
+              <w:t>class Admin extends Authenticatable</w:t>
+            </w:r>
+          </w:p>
+          <w:p>
+            <w:pPr>
+              <w:numPr>
+                <w:ilvl w:val="0"/>
+                <w:numId w:val="0"/>
+              </w:numPr>
+              <w:ind w:leftChars="0"/>
+              <w:jc w:val="both"/>
+              <w:rPr>
+                <w:rFonts w:hint="default"/>
+                <w:lang w:val="en-US"/>
+              </w:rPr>
+            </w:pPr>
+            <w:r>
+              <w:rPr>
+                <w:rFonts w:hint="default"/>
+                <w:lang w:val="en-US"/>
+              </w:rPr>
+              <w:t>{</w:t>
+            </w:r>
+          </w:p>
+          <w:p>
+            <w:pPr>
+              <w:numPr>
+                <w:ilvl w:val="0"/>
+                <w:numId w:val="0"/>
+              </w:numPr>
+              <w:ind w:leftChars="0"/>
+              <w:jc w:val="both"/>
+              <w:rPr>
+                <w:rFonts w:hint="default"/>
+                <w:lang w:val="en-US"/>
+              </w:rPr>
+            </w:pPr>
+            <w:r>
+              <w:rPr>
+                <w:rFonts w:hint="default"/>
+                <w:lang w:val="en-US"/>
+              </w:rPr>
+              <w:t xml:space="preserve">    /** @use HasFactory&lt;UserFactory&gt; */</w:t>
+            </w:r>
+          </w:p>
+          <w:p>
+            <w:pPr>
+              <w:numPr>
+                <w:ilvl w:val="0"/>
+                <w:numId w:val="0"/>
+              </w:numPr>
+              <w:ind w:leftChars="0"/>
+              <w:jc w:val="both"/>
+              <w:rPr>
+                <w:rFonts w:hint="default"/>
+                <w:lang w:val="en-US"/>
+              </w:rPr>
+            </w:pPr>
+            <w:r>
+              <w:rPr>
+                <w:rFonts w:hint="default"/>
+                <w:lang w:val="en-US"/>
+              </w:rPr>
+              <w:t xml:space="preserve">    use HasFactory, Notifiable;</w:t>
+            </w:r>
+          </w:p>
+          <w:p>
+            <w:pPr>
+              <w:numPr>
+                <w:ilvl w:val="0"/>
+                <w:numId w:val="0"/>
+              </w:numPr>
+              <w:ind w:leftChars="0"/>
+              <w:jc w:val="both"/>
+              <w:rPr>
+                <w:rFonts w:hint="default"/>
+                <w:lang w:val="en-US"/>
+              </w:rPr>
+            </w:pPr>
+          </w:p>
+          <w:p>
+            <w:pPr>
+              <w:numPr>
+                <w:ilvl w:val="0"/>
+                <w:numId w:val="0"/>
+              </w:numPr>
+              <w:ind w:leftChars="0"/>
+              <w:jc w:val="both"/>
+              <w:rPr>
+                <w:rFonts w:hint="default"/>
+                <w:lang w:val="en-US"/>
+              </w:rPr>
+            </w:pPr>
+            <w:r>
+              <w:rPr>
+                <w:rFonts w:hint="default"/>
+                <w:lang w:val="en-US"/>
+              </w:rPr>
+              <w:t xml:space="preserve">    /**</w:t>
+            </w:r>
+          </w:p>
+          <w:p>
+            <w:pPr>
+              <w:numPr>
+                <w:ilvl w:val="0"/>
+                <w:numId w:val="0"/>
+              </w:numPr>
+              <w:ind w:leftChars="0"/>
+              <w:jc w:val="both"/>
+              <w:rPr>
+                <w:rFonts w:hint="default"/>
+                <w:lang w:val="en-US"/>
+              </w:rPr>
+            </w:pPr>
+            <w:r>
+              <w:rPr>
+                <w:rFonts w:hint="default"/>
+                <w:lang w:val="en-US"/>
+              </w:rPr>
+              <w:t xml:space="preserve">     * The attributes that are mass assignable.</w:t>
+            </w:r>
+          </w:p>
+          <w:p>
+            <w:pPr>
+              <w:numPr>
+                <w:ilvl w:val="0"/>
+                <w:numId w:val="0"/>
+              </w:numPr>
+              <w:ind w:leftChars="0"/>
+              <w:jc w:val="both"/>
+              <w:rPr>
+                <w:rFonts w:hint="default"/>
+                <w:lang w:val="en-US"/>
+              </w:rPr>
+            </w:pPr>
+            <w:r>
+              <w:rPr>
+                <w:rFonts w:hint="default"/>
+                <w:lang w:val="en-US"/>
+              </w:rPr>
+              <w:t xml:space="preserve">     *</w:t>
+            </w:r>
+          </w:p>
+          <w:p>
+            <w:pPr>
+              <w:numPr>
+                <w:ilvl w:val="0"/>
+                <w:numId w:val="0"/>
+              </w:numPr>
+              <w:ind w:leftChars="0"/>
+              <w:jc w:val="both"/>
+              <w:rPr>
+                <w:rFonts w:hint="default"/>
+                <w:lang w:val="en-US"/>
+              </w:rPr>
+            </w:pPr>
+            <w:r>
+              <w:rPr>
+                <w:rFonts w:hint="default"/>
+                <w:lang w:val="en-US"/>
+              </w:rPr>
+              <w:t xml:space="preserve">     * @var list&lt;string&gt;</w:t>
+            </w:r>
+          </w:p>
+          <w:p>
+            <w:pPr>
+              <w:numPr>
+                <w:ilvl w:val="0"/>
+                <w:numId w:val="0"/>
+              </w:numPr>
+              <w:ind w:leftChars="0"/>
+              <w:jc w:val="both"/>
+              <w:rPr>
+                <w:rFonts w:hint="default"/>
+                <w:lang w:val="en-US"/>
+              </w:rPr>
+            </w:pPr>
+            <w:r>
+              <w:rPr>
+                <w:rFonts w:hint="default"/>
+                <w:lang w:val="en-US"/>
+              </w:rPr>
+              <w:t xml:space="preserve">     */</w:t>
+            </w:r>
+          </w:p>
+          <w:p>
+            <w:pPr>
+              <w:numPr>
+                <w:ilvl w:val="0"/>
+                <w:numId w:val="0"/>
+              </w:numPr>
+              <w:ind w:leftChars="0"/>
+              <w:jc w:val="both"/>
+              <w:rPr>
+                <w:rFonts w:hint="default"/>
+                <w:lang w:val="en-US"/>
+              </w:rPr>
+            </w:pPr>
+            <w:r>
+              <w:rPr>
+                <w:rFonts w:hint="default"/>
+                <w:lang w:val="en-US"/>
+              </w:rPr>
+              <w:t xml:space="preserve">    </w:t>
+            </w:r>
+            <w:r>
+              <w:rPr>
+                <w:rFonts w:hint="default"/>
+                <w:highlight w:val="green"/>
+                <w:lang w:val="en-US"/>
+              </w:rPr>
+              <w:t>protected $guard = 'admin';</w:t>
+            </w:r>
+          </w:p>
+          <w:p>
+            <w:pPr>
+              <w:numPr>
+                <w:ilvl w:val="0"/>
+                <w:numId w:val="0"/>
+              </w:numPr>
+              <w:ind w:leftChars="0"/>
+              <w:jc w:val="both"/>
+              <w:rPr>
+                <w:rFonts w:hint="default"/>
+                <w:lang w:val="en-US"/>
+              </w:rPr>
+            </w:pPr>
+            <w:r>
+              <w:rPr>
+                <w:rFonts w:hint="default"/>
+                <w:lang w:val="en-US"/>
+              </w:rPr>
+              <w:t xml:space="preserve">    protected $guarded = [];</w:t>
+            </w:r>
+          </w:p>
+          <w:p>
+            <w:pPr>
+              <w:numPr>
+                <w:ilvl w:val="0"/>
+                <w:numId w:val="0"/>
+              </w:numPr>
+              <w:ind w:leftChars="0"/>
+              <w:jc w:val="both"/>
+              <w:rPr>
+                <w:rFonts w:hint="default"/>
+                <w:lang w:val="en-US"/>
+              </w:rPr>
+            </w:pPr>
+          </w:p>
+          <w:p>
+            <w:pPr>
+              <w:numPr>
+                <w:ilvl w:val="0"/>
+                <w:numId w:val="0"/>
+              </w:numPr>
+              <w:ind w:leftChars="0"/>
+              <w:jc w:val="both"/>
+              <w:rPr>
+                <w:rFonts w:hint="default"/>
+                <w:lang w:val="en-US"/>
+              </w:rPr>
+            </w:pPr>
+            <w:r>
+              <w:rPr>
+                <w:rFonts w:hint="default"/>
+                <w:lang w:val="en-US"/>
+              </w:rPr>
+              <w:t xml:space="preserve">    /**</w:t>
+            </w:r>
+          </w:p>
+          <w:p>
+            <w:pPr>
+              <w:numPr>
+                <w:ilvl w:val="0"/>
+                <w:numId w:val="0"/>
+              </w:numPr>
+              <w:ind w:leftChars="0"/>
+              <w:jc w:val="both"/>
+              <w:rPr>
+                <w:rFonts w:hint="default"/>
+                <w:lang w:val="en-US"/>
+              </w:rPr>
+            </w:pPr>
+            <w:r>
+              <w:rPr>
+                <w:rFonts w:hint="default"/>
+                <w:lang w:val="en-US"/>
+              </w:rPr>
+              <w:t xml:space="preserve">     * The attributes that should be hidden for serialization.</w:t>
+            </w:r>
+          </w:p>
+          <w:p>
+            <w:pPr>
+              <w:numPr>
+                <w:ilvl w:val="0"/>
+                <w:numId w:val="0"/>
+              </w:numPr>
+              <w:ind w:leftChars="0"/>
+              <w:jc w:val="both"/>
+              <w:rPr>
+                <w:rFonts w:hint="default"/>
+                <w:lang w:val="en-US"/>
+              </w:rPr>
+            </w:pPr>
+            <w:r>
+              <w:rPr>
+                <w:rFonts w:hint="default"/>
+                <w:lang w:val="en-US"/>
+              </w:rPr>
+              <w:t xml:space="preserve">     *</w:t>
+            </w:r>
+          </w:p>
+          <w:p>
+            <w:pPr>
+              <w:numPr>
+                <w:ilvl w:val="0"/>
+                <w:numId w:val="0"/>
+              </w:numPr>
+              <w:ind w:leftChars="0"/>
+              <w:jc w:val="both"/>
+              <w:rPr>
+                <w:rFonts w:hint="default"/>
+                <w:lang w:val="en-US"/>
+              </w:rPr>
+            </w:pPr>
+            <w:r>
+              <w:rPr>
+                <w:rFonts w:hint="default"/>
+                <w:lang w:val="en-US"/>
+              </w:rPr>
+              <w:t xml:space="preserve">     * @var list&lt;string&gt;</w:t>
+            </w:r>
+          </w:p>
+          <w:p>
+            <w:pPr>
+              <w:numPr>
+                <w:ilvl w:val="0"/>
+                <w:numId w:val="0"/>
+              </w:numPr>
+              <w:ind w:leftChars="0"/>
+              <w:jc w:val="both"/>
+              <w:rPr>
+                <w:rFonts w:hint="default"/>
+                <w:lang w:val="en-US"/>
+              </w:rPr>
+            </w:pPr>
+            <w:r>
+              <w:rPr>
+                <w:rFonts w:hint="default"/>
+                <w:lang w:val="en-US"/>
+              </w:rPr>
+              <w:t xml:space="preserve">     */</w:t>
+            </w:r>
+          </w:p>
+          <w:p>
+            <w:pPr>
+              <w:numPr>
+                <w:ilvl w:val="0"/>
+                <w:numId w:val="0"/>
+              </w:numPr>
+              <w:ind w:leftChars="0"/>
+              <w:jc w:val="both"/>
+              <w:rPr>
+                <w:rFonts w:hint="default"/>
+                <w:lang w:val="en-US"/>
+              </w:rPr>
+            </w:pPr>
+            <w:r>
+              <w:rPr>
+                <w:rFonts w:hint="default"/>
+                <w:lang w:val="en-US"/>
+              </w:rPr>
+              <w:t xml:space="preserve">    protected $hidden = [</w:t>
+            </w:r>
+          </w:p>
+          <w:p>
+            <w:pPr>
+              <w:numPr>
+                <w:ilvl w:val="0"/>
+                <w:numId w:val="0"/>
+              </w:numPr>
+              <w:ind w:leftChars="0"/>
+              <w:jc w:val="both"/>
+              <w:rPr>
+                <w:rFonts w:hint="default"/>
+                <w:lang w:val="en-US"/>
+              </w:rPr>
+            </w:pPr>
+            <w:r>
+              <w:rPr>
+                <w:rFonts w:hint="default"/>
+                <w:lang w:val="en-US"/>
+              </w:rPr>
+              <w:t xml:space="preserve">        'password',</w:t>
+            </w:r>
+          </w:p>
+          <w:p>
+            <w:pPr>
+              <w:numPr>
+                <w:ilvl w:val="0"/>
+                <w:numId w:val="0"/>
+              </w:numPr>
+              <w:ind w:leftChars="0"/>
+              <w:jc w:val="both"/>
+              <w:rPr>
+                <w:rFonts w:hint="default"/>
+                <w:lang w:val="en-US"/>
+              </w:rPr>
+            </w:pPr>
+            <w:r>
+              <w:rPr>
+                <w:rFonts w:hint="default"/>
+                <w:lang w:val="en-US"/>
+              </w:rPr>
+              <w:t xml:space="preserve">        'remember_token',</w:t>
+            </w:r>
+          </w:p>
+          <w:p>
+            <w:pPr>
+              <w:numPr>
+                <w:ilvl w:val="0"/>
+                <w:numId w:val="0"/>
+              </w:numPr>
+              <w:ind w:leftChars="0"/>
+              <w:jc w:val="both"/>
+              <w:rPr>
+                <w:rFonts w:hint="default"/>
+                <w:lang w:val="en-US"/>
+              </w:rPr>
+            </w:pPr>
+            <w:r>
+              <w:rPr>
+                <w:rFonts w:hint="default"/>
+                <w:lang w:val="en-US"/>
+              </w:rPr>
+              <w:t xml:space="preserve">    ];</w:t>
+            </w:r>
+          </w:p>
+          <w:p>
+            <w:pPr>
+              <w:numPr>
+                <w:ilvl w:val="0"/>
+                <w:numId w:val="0"/>
+              </w:numPr>
+              <w:ind w:leftChars="0"/>
+              <w:jc w:val="both"/>
+              <w:rPr>
+                <w:rFonts w:hint="default"/>
+                <w:lang w:val="en-US"/>
+              </w:rPr>
+            </w:pPr>
+          </w:p>
+          <w:p>
+            <w:pPr>
+              <w:numPr>
+                <w:ilvl w:val="0"/>
+                <w:numId w:val="0"/>
+              </w:numPr>
+              <w:ind w:leftChars="0"/>
+              <w:jc w:val="both"/>
+              <w:rPr>
+                <w:rFonts w:hint="default"/>
+                <w:lang w:val="en-US"/>
+              </w:rPr>
+            </w:pPr>
+            <w:r>
+              <w:rPr>
+                <w:rFonts w:hint="default"/>
+                <w:lang w:val="en-US"/>
+              </w:rPr>
+              <w:t xml:space="preserve">    /**</w:t>
+            </w:r>
+          </w:p>
+          <w:p>
+            <w:pPr>
+              <w:numPr>
+                <w:ilvl w:val="0"/>
+                <w:numId w:val="0"/>
+              </w:numPr>
+              <w:ind w:leftChars="0"/>
+              <w:jc w:val="both"/>
+              <w:rPr>
+                <w:rFonts w:hint="default"/>
+                <w:lang w:val="en-US"/>
+              </w:rPr>
+            </w:pPr>
+            <w:r>
+              <w:rPr>
+                <w:rFonts w:hint="default"/>
+                <w:lang w:val="en-US"/>
+              </w:rPr>
+              <w:t xml:space="preserve">     * Get the attributes that should be cast.</w:t>
+            </w:r>
+          </w:p>
+          <w:p>
+            <w:pPr>
+              <w:numPr>
+                <w:ilvl w:val="0"/>
+                <w:numId w:val="0"/>
+              </w:numPr>
+              <w:ind w:leftChars="0"/>
+              <w:jc w:val="both"/>
+              <w:rPr>
+                <w:rFonts w:hint="default"/>
+                <w:lang w:val="en-US"/>
+              </w:rPr>
+            </w:pPr>
+            <w:r>
+              <w:rPr>
+                <w:rFonts w:hint="default"/>
+                <w:lang w:val="en-US"/>
+              </w:rPr>
+              <w:t xml:space="preserve">     *</w:t>
+            </w:r>
+          </w:p>
+          <w:p>
+            <w:pPr>
+              <w:numPr>
+                <w:ilvl w:val="0"/>
+                <w:numId w:val="0"/>
+              </w:numPr>
+              <w:ind w:leftChars="0"/>
+              <w:jc w:val="both"/>
+              <w:rPr>
+                <w:rFonts w:hint="default"/>
+                <w:lang w:val="en-US"/>
+              </w:rPr>
+            </w:pPr>
+            <w:r>
+              <w:rPr>
+                <w:rFonts w:hint="default"/>
+                <w:lang w:val="en-US"/>
+              </w:rPr>
+              <w:t xml:space="preserve">     * @return array&lt;string, string&gt;</w:t>
+            </w:r>
+          </w:p>
+          <w:p>
+            <w:pPr>
+              <w:numPr>
+                <w:ilvl w:val="0"/>
+                <w:numId w:val="0"/>
+              </w:numPr>
+              <w:ind w:leftChars="0"/>
+              <w:jc w:val="both"/>
+              <w:rPr>
+                <w:rFonts w:hint="default"/>
+                <w:lang w:val="en-US"/>
+              </w:rPr>
+            </w:pPr>
+            <w:r>
+              <w:rPr>
+                <w:rFonts w:hint="default"/>
+                <w:lang w:val="en-US"/>
+              </w:rPr>
+              <w:t xml:space="preserve">     */</w:t>
+            </w:r>
+          </w:p>
+          <w:p>
+            <w:pPr>
+              <w:numPr>
+                <w:ilvl w:val="0"/>
+                <w:numId w:val="0"/>
+              </w:numPr>
+              <w:ind w:leftChars="0"/>
+              <w:jc w:val="both"/>
+              <w:rPr>
+                <w:rFonts w:hint="default"/>
+                <w:lang w:val="en-US"/>
+              </w:rPr>
+            </w:pPr>
+            <w:r>
+              <w:rPr>
+                <w:rFonts w:hint="default"/>
+                <w:lang w:val="en-US"/>
+              </w:rPr>
+              <w:t xml:space="preserve">    protected function casts(): array</w:t>
+            </w:r>
+          </w:p>
+          <w:p>
+            <w:pPr>
+              <w:numPr>
+                <w:ilvl w:val="0"/>
+                <w:numId w:val="0"/>
+              </w:numPr>
+              <w:ind w:leftChars="0"/>
+              <w:jc w:val="both"/>
+              <w:rPr>
+                <w:rFonts w:hint="default"/>
+                <w:lang w:val="en-US"/>
+              </w:rPr>
+            </w:pPr>
+            <w:r>
+              <w:rPr>
+                <w:rFonts w:hint="default"/>
+                <w:lang w:val="en-US"/>
+              </w:rPr>
+              <w:t xml:space="preserve">    {</w:t>
+            </w:r>
+          </w:p>
+          <w:p>
+            <w:pPr>
+              <w:numPr>
+                <w:ilvl w:val="0"/>
+                <w:numId w:val="0"/>
+              </w:numPr>
+              <w:ind w:leftChars="0"/>
+              <w:jc w:val="both"/>
+              <w:rPr>
+                <w:rFonts w:hint="default"/>
+                <w:lang w:val="en-US"/>
+              </w:rPr>
+            </w:pPr>
+            <w:r>
+              <w:rPr>
+                <w:rFonts w:hint="default"/>
+                <w:lang w:val="en-US"/>
+              </w:rPr>
+              <w:t xml:space="preserve">        return [</w:t>
+            </w:r>
+          </w:p>
+          <w:p>
+            <w:pPr>
+              <w:numPr>
+                <w:ilvl w:val="0"/>
+                <w:numId w:val="0"/>
+              </w:numPr>
+              <w:ind w:leftChars="0"/>
+              <w:jc w:val="both"/>
+              <w:rPr>
+                <w:rFonts w:hint="default"/>
+                <w:lang w:val="en-US"/>
+              </w:rPr>
+            </w:pPr>
+            <w:r>
+              <w:rPr>
+                <w:rFonts w:hint="default"/>
+                <w:lang w:val="en-US"/>
+              </w:rPr>
+              <w:t xml:space="preserve">            'email_verified_at' =&gt; 'datetime',</w:t>
+            </w:r>
+          </w:p>
+          <w:p>
+            <w:pPr>
+              <w:numPr>
+                <w:ilvl w:val="0"/>
+                <w:numId w:val="0"/>
+              </w:numPr>
+              <w:ind w:leftChars="0"/>
+              <w:jc w:val="both"/>
+              <w:rPr>
+                <w:rFonts w:hint="default"/>
+                <w:lang w:val="en-US"/>
+              </w:rPr>
+            </w:pPr>
+            <w:r>
+              <w:rPr>
+                <w:rFonts w:hint="default"/>
+                <w:lang w:val="en-US"/>
+              </w:rPr>
+              <w:t xml:space="preserve">            'password' =&gt; 'hashed',</w:t>
+            </w:r>
+          </w:p>
+          <w:p>
+            <w:pPr>
+              <w:numPr>
+                <w:ilvl w:val="0"/>
+                <w:numId w:val="0"/>
+              </w:numPr>
+              <w:ind w:leftChars="0"/>
+              <w:jc w:val="both"/>
+              <w:rPr>
+                <w:rFonts w:hint="default"/>
+                <w:lang w:val="en-US"/>
+              </w:rPr>
+            </w:pPr>
+            <w:r>
+              <w:rPr>
+                <w:rFonts w:hint="default"/>
+                <w:lang w:val="en-US"/>
+              </w:rPr>
+              <w:t xml:space="preserve">        ];</w:t>
+            </w:r>
+          </w:p>
+          <w:p>
+            <w:pPr>
+              <w:numPr>
+                <w:ilvl w:val="0"/>
+                <w:numId w:val="0"/>
+              </w:numPr>
+              <w:ind w:leftChars="0"/>
+              <w:jc w:val="both"/>
+              <w:rPr>
+                <w:rFonts w:hint="default"/>
+                <w:lang w:val="en-US"/>
+              </w:rPr>
+            </w:pPr>
+            <w:r>
+              <w:rPr>
+                <w:rFonts w:hint="default"/>
+                <w:lang w:val="en-US"/>
+              </w:rPr>
+              <w:t xml:space="preserve">    }</w:t>
+            </w:r>
+          </w:p>
+          <w:p>
+            <w:pPr>
+              <w:numPr>
+                <w:ilvl w:val="0"/>
+                <w:numId w:val="0"/>
+              </w:numPr>
+              <w:ind w:leftChars="0"/>
+              <w:jc w:val="both"/>
+              <w:rPr>
+                <w:rFonts w:hint="default"/>
+                <w:lang w:val="en-US"/>
+              </w:rPr>
+            </w:pPr>
+            <w:r>
+              <w:rPr>
+                <w:rFonts w:hint="default"/>
+                <w:lang w:val="en-US"/>
+              </w:rPr>
+              <w:t>}</w:t>
+            </w:r>
+          </w:p>
+          <w:p>
+            <w:pPr>
+              <w:numPr>
+                <w:ilvl w:val="0"/>
+                <w:numId w:val="0"/>
+              </w:numPr>
+              <w:ind w:leftChars="0"/>
+              <w:jc w:val="both"/>
+              <w:rPr>
+                <w:rFonts w:hint="default"/>
+                <w:lang w:val="en-US"/>
+              </w:rPr>
+            </w:pPr>
+          </w:p>
+        </w:tc>
+      </w:tr>
+    </w:tbl>
+    <w:p>
+      <w:pPr>
+        <w:numPr>
+          <w:numId w:val="0"/>
+        </w:numPr>
+        <w:ind w:leftChars="0"/>
+        <w:jc w:val="both"/>
+        <w:rPr>
+          <w:rFonts w:hint="default"/>
+          <w:b w:val="0"/>
+          <w:bCs w:val="0"/>
+          <w:sz w:val="20"/>
+          <w:szCs w:val="20"/>
+          <w:lang w:val="en-US"/>
+        </w:rPr>
+      </w:pPr>
+    </w:p>
+    <w:p>
+      <w:pPr>
+        <w:numPr>
+          <w:numId w:val="0"/>
+        </w:numPr>
+        <w:ind w:leftChars="0"/>
+        <w:jc w:val="both"/>
+        <w:rPr>
+          <w:rFonts w:hint="default"/>
+          <w:b w:val="0"/>
+          <w:bCs w:val="0"/>
+          <w:sz w:val="20"/>
+          <w:szCs w:val="20"/>
+          <w:lang w:val="en-US"/>
+        </w:rPr>
+      </w:pPr>
+      <w:r>
+        <w:rPr>
+          <w:rFonts w:hint="default"/>
+          <w:b w:val="0"/>
+          <w:bCs w:val="0"/>
+          <w:sz w:val="20"/>
+          <w:szCs w:val="20"/>
+          <w:lang w:val="en-US"/>
+        </w:rPr>
+        <w:t xml:space="preserve"> Then you need to go the auth.php(config-&gt;auth.php) file. Here you need to  go to the Authentication Guards section where you need to add the following code and is also shown in the picture.</w:t>
       </w:r>
     </w:p>
     <w:tbl>
@@ -4093,6 +6291,10 @@
               <w:jc w:val="both"/>
               <w:rPr>
                 <w:rFonts w:hint="default"/>
+                <w:b w:val="0"/>
+                <w:bCs w:val="0"/>
+                <w:sz w:val="20"/>
+                <w:szCs w:val="20"/>
                 <w:vertAlign w:val="baseline"/>
                 <w:lang w:val="en-US"/>
               </w:rPr>
@@ -4100,10 +6302,182 @@
             <w:r>
               <w:rPr>
                 <w:rFonts w:hint="default"/>
+                <w:b w:val="0"/>
+                <w:bCs w:val="0"/>
+                <w:sz w:val="20"/>
+                <w:szCs w:val="20"/>
                 <w:vertAlign w:val="baseline"/>
                 <w:lang w:val="en-US"/>
               </w:rPr>
-              <w:t>php artisan migrate</w:t>
+              <w:t xml:space="preserve"> 'admin' =&gt; [</w:t>
+            </w:r>
+          </w:p>
+          <w:p>
+            <w:pPr>
+              <w:numPr>
+                <w:numId w:val="0"/>
+              </w:numPr>
+              <w:jc w:val="both"/>
+              <w:rPr>
+                <w:rFonts w:hint="default"/>
+                <w:b w:val="0"/>
+                <w:bCs w:val="0"/>
+                <w:sz w:val="20"/>
+                <w:szCs w:val="20"/>
+                <w:vertAlign w:val="baseline"/>
+                <w:lang w:val="en-US"/>
+              </w:rPr>
+            </w:pPr>
+            <w:r>
+              <w:rPr>
+                <w:rFonts w:hint="default"/>
+                <w:b w:val="0"/>
+                <w:bCs w:val="0"/>
+                <w:sz w:val="20"/>
+                <w:szCs w:val="20"/>
+                <w:vertAlign w:val="baseline"/>
+                <w:lang w:val="en-US"/>
+              </w:rPr>
+              <w:t xml:space="preserve">            'driver' =&gt; 'session',</w:t>
+            </w:r>
+          </w:p>
+          <w:p>
+            <w:pPr>
+              <w:numPr>
+                <w:numId w:val="0"/>
+              </w:numPr>
+              <w:jc w:val="both"/>
+              <w:rPr>
+                <w:rFonts w:hint="default"/>
+                <w:b w:val="0"/>
+                <w:bCs w:val="0"/>
+                <w:sz w:val="20"/>
+                <w:szCs w:val="20"/>
+                <w:vertAlign w:val="baseline"/>
+                <w:lang w:val="en-US"/>
+              </w:rPr>
+            </w:pPr>
+            <w:r>
+              <w:rPr>
+                <w:rFonts w:hint="default"/>
+                <w:b w:val="0"/>
+                <w:bCs w:val="0"/>
+                <w:sz w:val="20"/>
+                <w:szCs w:val="20"/>
+                <w:vertAlign w:val="baseline"/>
+                <w:lang w:val="en-US"/>
+              </w:rPr>
+              <w:t xml:space="preserve">            'provider' =&gt; 'admins',</w:t>
+            </w:r>
+          </w:p>
+          <w:p>
+            <w:pPr>
+              <w:numPr>
+                <w:numId w:val="0"/>
+              </w:numPr>
+              <w:jc w:val="both"/>
+              <w:rPr>
+                <w:rFonts w:hint="default"/>
+                <w:b w:val="0"/>
+                <w:bCs w:val="0"/>
+                <w:sz w:val="20"/>
+                <w:szCs w:val="20"/>
+                <w:vertAlign w:val="baseline"/>
+                <w:lang w:val="en-US"/>
+              </w:rPr>
+            </w:pPr>
+            <w:r>
+              <w:rPr>
+                <w:rFonts w:hint="default"/>
+                <w:b w:val="0"/>
+                <w:bCs w:val="0"/>
+                <w:sz w:val="20"/>
+                <w:szCs w:val="20"/>
+                <w:vertAlign w:val="baseline"/>
+                <w:lang w:val="en-US"/>
+              </w:rPr>
+              <w:t xml:space="preserve">        ],   </w:t>
+            </w:r>
+          </w:p>
+        </w:tc>
+      </w:tr>
+      <w:tr>
+        <w:tblPrEx>
+          <w:tblBorders>
+            <w:top w:val="single" w:color="auto" w:sz="4" w:space="0"/>
+            <w:left w:val="single" w:color="auto" w:sz="4" w:space="0"/>
+            <w:bottom w:val="single" w:color="auto" w:sz="4" w:space="0"/>
+            <w:right w:val="single" w:color="auto" w:sz="4" w:space="0"/>
+            <w:insideH w:val="single" w:color="auto" w:sz="4" w:space="0"/>
+            <w:insideV w:val="single" w:color="auto" w:sz="4" w:space="0"/>
+          </w:tblBorders>
+          <w:tblCellMar>
+            <w:left w:w="108" w:type="dxa"/>
+            <w:right w:w="108" w:type="dxa"/>
+          </w:tblCellMar>
+        </w:tblPrEx>
+        <w:tc>
+          <w:tcPr>
+            <w:tcW w:w="8522" w:type="dxa"/>
+          </w:tcPr>
+          <w:p>
+            <w:pPr>
+              <w:numPr>
+                <w:numId w:val="0"/>
+              </w:numPr>
+              <w:jc w:val="both"/>
+              <w:rPr>
+                <w:rFonts w:hint="default"/>
+                <w:b w:val="0"/>
+                <w:bCs w:val="0"/>
+                <w:sz w:val="20"/>
+                <w:szCs w:val="20"/>
+                <w:vertAlign w:val="baseline"/>
+                <w:lang w:val="en-US"/>
+              </w:rPr>
+            </w:pPr>
+            <w:r>
+              <w:drawing>
+                <wp:inline distT="0" distB="0" distL="114300" distR="114300">
+                  <wp:extent cx="5268595" cy="3725545"/>
+                  <wp:effectExtent l="0" t="0" r="4445" b="8255"/>
+                  <wp:docPr id="34" name="Picture 2"/>
+                  <wp:cNvGraphicFramePr>
+                    <a:graphicFrameLocks xmlns:a="http://schemas.openxmlformats.org/drawingml/2006/main" noChangeAspect="1"/>
+                  </wp:cNvGraphicFramePr>
+                  <a:graphic xmlns:a="http://schemas.openxmlformats.org/drawingml/2006/main">
+                    <a:graphicData uri="http://schemas.openxmlformats.org/drawingml/2006/picture">
+                      <pic:pic xmlns:pic="http://schemas.openxmlformats.org/drawingml/2006/picture">
+                        <pic:nvPicPr>
+                          <pic:cNvPr id="34" name="Picture 2"/>
+                          <pic:cNvPicPr>
+                            <a:picLocks noChangeAspect="1"/>
+                          </pic:cNvPicPr>
+                        </pic:nvPicPr>
+                        <pic:blipFill>
+                          <a:blip r:embed="rId43"/>
+                          <a:stretch>
+                            <a:fillRect/>
+                          </a:stretch>
+                        </pic:blipFill>
+                        <pic:spPr>
+                          <a:xfrm>
+                            <a:off x="0" y="0"/>
+                            <a:ext cx="5268595" cy="3725545"/>
+                          </a:xfrm>
+                          <a:prstGeom prst="rect">
+                            <a:avLst/>
+                          </a:prstGeom>
+                          <a:noFill/>
+                          <a:ln>
+                            <a:noFill/>
+                          </a:ln>
+                        </pic:spPr>
+                      </pic:pic>
+                    </a:graphicData>
+                  </a:graphic>
+                </wp:inline>
+              </w:drawing>
             </w:r>
           </w:p>
         </w:tc>
@@ -4114,141 +6488,315 @@
         <w:numPr>
           <w:numId w:val="0"/>
         </w:numPr>
-        <w:jc w:val="both"/>
-        <w:rPr>
-          <w:rFonts w:hint="default"/>
-          <w:lang w:val="en-US"/>
-        </w:rPr>
-      </w:pPr>
-    </w:p>
-    <w:p>
-      <w:pPr>
-        <w:numPr>
-          <w:numId w:val="0"/>
-        </w:numPr>
-        <w:jc w:val="both"/>
-        <w:rPr>
-          <w:rFonts w:hint="default"/>
-          <w:lang w:val="en-US"/>
-        </w:rPr>
-      </w:pPr>
-      <w:r>
-        <w:rPr>
-          <w:rFonts w:hint="default"/>
-          <w:lang w:val="en-US"/>
-        </w:rPr>
-        <w:t>After you run the above command the table can be seen in your database.</w:t>
-      </w:r>
-    </w:p>
-    <w:p>
-      <w:pPr>
-        <w:numPr>
-          <w:numId w:val="0"/>
-        </w:numPr>
-        <w:jc w:val="both"/>
-        <w:rPr>
-          <w:rFonts w:hint="default"/>
-          <w:lang w:val="en-US"/>
-        </w:rPr>
-      </w:pPr>
-    </w:p>
-    <w:p>
-      <w:pPr>
-        <w:numPr>
-          <w:numId w:val="0"/>
-        </w:numPr>
-        <w:jc w:val="both"/>
-        <w:rPr>
-          <w:rFonts w:hint="default"/>
-          <w:lang w:val="en-US"/>
-        </w:rPr>
-      </w:pPr>
-      <w:r>
-        <w:drawing>
-          <wp:inline distT="0" distB="0" distL="114300" distR="114300">
-            <wp:extent cx="5267960" cy="2435860"/>
-            <wp:effectExtent l="0" t="0" r="5080" b="2540"/>
-            <wp:docPr id="38" name="Picture 15"/>
-            <wp:cNvGraphicFramePr>
-              <a:graphicFrameLocks xmlns:a="http://schemas.openxmlformats.org/drawingml/2006/main" noChangeAspect="1"/>
-            </wp:cNvGraphicFramePr>
-            <a:graphic xmlns:a="http://schemas.openxmlformats.org/drawingml/2006/main">
-              <a:graphicData uri="http://schemas.openxmlformats.org/drawingml/2006/picture">
-                <pic:pic xmlns:pic="http://schemas.openxmlformats.org/drawingml/2006/picture">
-                  <pic:nvPicPr>
-                    <pic:cNvPr id="38" name="Picture 15"/>
-                    <pic:cNvPicPr>
-                      <a:picLocks noChangeAspect="1"/>
-                    </pic:cNvPicPr>
-                  </pic:nvPicPr>
-                  <pic:blipFill>
-                    <a:blip r:embed="rId38"/>
-                    <a:stretch>
-                      <a:fillRect/>
-                    </a:stretch>
-                  </pic:blipFill>
-                  <pic:spPr>
-                    <a:xfrm>
-                      <a:off x="0" y="0"/>
-                      <a:ext cx="5267960" cy="2435860"/>
-                    </a:xfrm>
-                    <a:prstGeom prst="rect">
-                      <a:avLst/>
-                    </a:prstGeom>
-                    <a:noFill/>
-                    <a:ln>
-                      <a:noFill/>
-                    </a:ln>
-                  </pic:spPr>
-                </pic:pic>
-              </a:graphicData>
-            </a:graphic>
-          </wp:inline>
-        </w:drawing>
-      </w:r>
-    </w:p>
-    <w:p>
-      <w:pPr>
-        <w:numPr>
-          <w:numId w:val="0"/>
-        </w:numPr>
-        <w:jc w:val="both"/>
-        <w:rPr>
-          <w:rFonts w:hint="default"/>
-          <w:lang w:val="en-US"/>
-        </w:rPr>
-      </w:pPr>
-    </w:p>
-    <w:p>
-      <w:pPr>
-        <w:numPr>
-          <w:numId w:val="0"/>
-        </w:numPr>
-        <w:jc w:val="both"/>
-        <w:rPr>
-          <w:rFonts w:hint="default"/>
-          <w:lang w:val="en-US"/>
-        </w:rPr>
-      </w:pPr>
-      <w:r>
-        <w:rPr>
-          <w:rFonts w:hint="default"/>
-          <w:lang w:val="en-US"/>
-        </w:rPr>
-        <w:t>After the table is created there are no data. So, here we will add our demo data. To insert the demo data we can use the folliowing command:</w:t>
-      </w:r>
-    </w:p>
-    <w:p>
-      <w:pPr>
-        <w:numPr>
-          <w:numId w:val="0"/>
-        </w:numPr>
-        <w:jc w:val="both"/>
-        <w:rPr>
-          <w:rFonts w:hint="default"/>
-          <w:lang w:val="en-US"/>
-        </w:rPr>
-      </w:pPr>
+        <w:ind w:leftChars="0"/>
+        <w:jc w:val="both"/>
+        <w:rPr>
+          <w:rFonts w:hint="default"/>
+          <w:b w:val="0"/>
+          <w:bCs w:val="0"/>
+          <w:sz w:val="20"/>
+          <w:szCs w:val="20"/>
+          <w:lang w:val="en-US"/>
+        </w:rPr>
+      </w:pPr>
+    </w:p>
+    <w:p>
+      <w:pPr>
+        <w:numPr>
+          <w:ilvl w:val="0"/>
+          <w:numId w:val="0"/>
+        </w:numPr>
+        <w:jc w:val="both"/>
+        <w:rPr>
+          <w:rFonts w:hint="default"/>
+          <w:lang w:val="en-US"/>
+        </w:rPr>
+      </w:pPr>
+    </w:p>
+    <w:p>
+      <w:pPr>
+        <w:numPr>
+          <w:ilvl w:val="0"/>
+          <w:numId w:val="0"/>
+        </w:numPr>
+        <w:jc w:val="both"/>
+        <w:rPr>
+          <w:rFonts w:hint="default"/>
+          <w:lang w:val="en-US"/>
+        </w:rPr>
+      </w:pPr>
+    </w:p>
+    <w:p>
+      <w:pPr>
+        <w:numPr>
+          <w:ilvl w:val="0"/>
+          <w:numId w:val="0"/>
+        </w:numPr>
+        <w:jc w:val="both"/>
+        <w:rPr>
+          <w:rFonts w:hint="default"/>
+          <w:lang w:val="en-US"/>
+        </w:rPr>
+      </w:pPr>
+      <w:r>
+        <w:rPr>
+          <w:rFonts w:hint="default"/>
+          <w:lang w:val="en-US"/>
+        </w:rPr>
+        <w:t>After that you need to go to the provider section and add the following code as shown in the following picture.</w:t>
+      </w:r>
+    </w:p>
+    <w:tbl>
+      <w:tblPr>
+        <w:tblStyle w:val="4"/>
+        <w:tblW w:w="0" w:type="auto"/>
+        <w:tblInd w:w="0" w:type="dxa"/>
+        <w:tblBorders>
+          <w:top w:val="single" w:color="auto" w:sz="4" w:space="0"/>
+          <w:left w:val="single" w:color="auto" w:sz="4" w:space="0"/>
+          <w:bottom w:val="single" w:color="auto" w:sz="4" w:space="0"/>
+          <w:right w:val="single" w:color="auto" w:sz="4" w:space="0"/>
+          <w:insideH w:val="single" w:color="auto" w:sz="4" w:space="0"/>
+          <w:insideV w:val="single" w:color="auto" w:sz="4" w:space="0"/>
+        </w:tblBorders>
+        <w:tblLayout w:type="autofit"/>
+        <w:tblCellMar>
+          <w:left w:w="108" w:type="dxa"/>
+          <w:right w:w="108" w:type="dxa"/>
+        </w:tblCellMar>
+      </w:tblPr>
+      <w:tblGrid>
+        <w:gridCol w:w="8522"/>
+      </w:tblGrid>
+      <w:tr>
+        <w:tblPrEx>
+          <w:tblBorders>
+            <w:top w:val="single" w:color="auto" w:sz="4" w:space="0"/>
+            <w:left w:val="single" w:color="auto" w:sz="4" w:space="0"/>
+            <w:bottom w:val="single" w:color="auto" w:sz="4" w:space="0"/>
+            <w:right w:val="single" w:color="auto" w:sz="4" w:space="0"/>
+            <w:insideH w:val="single" w:color="auto" w:sz="4" w:space="0"/>
+            <w:insideV w:val="single" w:color="auto" w:sz="4" w:space="0"/>
+          </w:tblBorders>
+        </w:tblPrEx>
+        <w:tc>
+          <w:tcPr>
+            <w:tcW w:w="8522" w:type="dxa"/>
+          </w:tcPr>
+          <w:p>
+            <w:pPr>
+              <w:numPr>
+                <w:ilvl w:val="0"/>
+                <w:numId w:val="0"/>
+              </w:numPr>
+              <w:jc w:val="both"/>
+              <w:rPr>
+                <w:rFonts w:hint="default"/>
+                <w:vertAlign w:val="baseline"/>
+                <w:lang w:val="en-US"/>
+              </w:rPr>
+            </w:pPr>
+            <w:r>
+              <w:rPr>
+                <w:rFonts w:hint="default"/>
+                <w:vertAlign w:val="baseline"/>
+                <w:lang w:val="en-US"/>
+              </w:rPr>
+              <w:t xml:space="preserve"> 'admins' =&gt; [</w:t>
+            </w:r>
+          </w:p>
+          <w:p>
+            <w:pPr>
+              <w:numPr>
+                <w:ilvl w:val="0"/>
+                <w:numId w:val="0"/>
+              </w:numPr>
+              <w:jc w:val="both"/>
+              <w:rPr>
+                <w:rFonts w:hint="default"/>
+                <w:vertAlign w:val="baseline"/>
+                <w:lang w:val="en-US"/>
+              </w:rPr>
+            </w:pPr>
+            <w:r>
+              <w:rPr>
+                <w:rFonts w:hint="default"/>
+                <w:vertAlign w:val="baseline"/>
+                <w:lang w:val="en-US"/>
+              </w:rPr>
+              <w:t xml:space="preserve">            'driver' =&gt; 'eloquent',</w:t>
+            </w:r>
+          </w:p>
+          <w:p>
+            <w:pPr>
+              <w:numPr>
+                <w:ilvl w:val="0"/>
+                <w:numId w:val="0"/>
+              </w:numPr>
+              <w:jc w:val="both"/>
+              <w:rPr>
+                <w:rFonts w:hint="default"/>
+                <w:vertAlign w:val="baseline"/>
+                <w:lang w:val="en-US"/>
+              </w:rPr>
+            </w:pPr>
+            <w:r>
+              <w:rPr>
+                <w:rFonts w:hint="default"/>
+                <w:vertAlign w:val="baseline"/>
+                <w:lang w:val="en-US"/>
+              </w:rPr>
+              <w:t xml:space="preserve">            'model' =&gt; env('AUTH_MODEL', App\Models\Admin::class),</w:t>
+            </w:r>
+          </w:p>
+          <w:p>
+            <w:pPr>
+              <w:numPr>
+                <w:ilvl w:val="0"/>
+                <w:numId w:val="0"/>
+              </w:numPr>
+              <w:jc w:val="both"/>
+              <w:rPr>
+                <w:rFonts w:hint="default"/>
+                <w:vertAlign w:val="baseline"/>
+                <w:lang w:val="en-US"/>
+              </w:rPr>
+            </w:pPr>
+            <w:r>
+              <w:rPr>
+                <w:rFonts w:hint="default"/>
+                <w:vertAlign w:val="baseline"/>
+                <w:lang w:val="en-US"/>
+              </w:rPr>
+              <w:t xml:space="preserve">        ],</w:t>
+            </w:r>
+          </w:p>
+        </w:tc>
+      </w:tr>
+      <w:tr>
+        <w:tblPrEx>
+          <w:tblBorders>
+            <w:top w:val="single" w:color="auto" w:sz="4" w:space="0"/>
+            <w:left w:val="single" w:color="auto" w:sz="4" w:space="0"/>
+            <w:bottom w:val="single" w:color="auto" w:sz="4" w:space="0"/>
+            <w:right w:val="single" w:color="auto" w:sz="4" w:space="0"/>
+            <w:insideH w:val="single" w:color="auto" w:sz="4" w:space="0"/>
+            <w:insideV w:val="single" w:color="auto" w:sz="4" w:space="0"/>
+          </w:tblBorders>
+          <w:tblCellMar>
+            <w:left w:w="108" w:type="dxa"/>
+            <w:right w:w="108" w:type="dxa"/>
+          </w:tblCellMar>
+        </w:tblPrEx>
+        <w:tc>
+          <w:tcPr>
+            <w:tcW w:w="8522" w:type="dxa"/>
+          </w:tcPr>
+          <w:p>
+            <w:pPr>
+              <w:numPr>
+                <w:ilvl w:val="0"/>
+                <w:numId w:val="0"/>
+              </w:numPr>
+              <w:jc w:val="both"/>
+              <w:rPr>
+                <w:rFonts w:hint="default"/>
+                <w:vertAlign w:val="baseline"/>
+                <w:lang w:val="en-US"/>
+              </w:rPr>
+            </w:pPr>
+            <w:r>
+              <w:drawing>
+                <wp:inline distT="0" distB="0" distL="114300" distR="114300">
+                  <wp:extent cx="5271770" cy="3191510"/>
+                  <wp:effectExtent l="0" t="0" r="1270" b="8890"/>
+                  <wp:docPr id="36" name="Picture 3"/>
+                  <wp:cNvGraphicFramePr>
+                    <a:graphicFrameLocks xmlns:a="http://schemas.openxmlformats.org/drawingml/2006/main" noChangeAspect="1"/>
+                  </wp:cNvGraphicFramePr>
+                  <a:graphic xmlns:a="http://schemas.openxmlformats.org/drawingml/2006/main">
+                    <a:graphicData uri="http://schemas.openxmlformats.org/drawingml/2006/picture">
+                      <pic:pic xmlns:pic="http://schemas.openxmlformats.org/drawingml/2006/picture">
+                        <pic:nvPicPr>
+                          <pic:cNvPr id="36" name="Picture 3"/>
+                          <pic:cNvPicPr>
+                            <a:picLocks noChangeAspect="1"/>
+                          </pic:cNvPicPr>
+                        </pic:nvPicPr>
+                        <pic:blipFill>
+                          <a:blip r:embed="rId44"/>
+                          <a:stretch>
+                            <a:fillRect/>
+                          </a:stretch>
+                        </pic:blipFill>
+                        <pic:spPr>
+                          <a:xfrm>
+                            <a:off x="0" y="0"/>
+                            <a:ext cx="5271770" cy="3191510"/>
+                          </a:xfrm>
+                          <a:prstGeom prst="rect">
+                            <a:avLst/>
+                          </a:prstGeom>
+                          <a:noFill/>
+                          <a:ln>
+                            <a:noFill/>
+                          </a:ln>
+                        </pic:spPr>
+                      </pic:pic>
+                    </a:graphicData>
+                  </a:graphic>
+                </wp:inline>
+              </w:drawing>
+            </w:r>
+          </w:p>
+        </w:tc>
+      </w:tr>
+    </w:tbl>
+    <w:p>
+      <w:pPr>
+        <w:numPr>
+          <w:ilvl w:val="0"/>
+          <w:numId w:val="0"/>
+        </w:numPr>
+        <w:jc w:val="both"/>
+        <w:rPr>
+          <w:rFonts w:hint="default"/>
+          <w:lang w:val="en-US"/>
+        </w:rPr>
+      </w:pPr>
+    </w:p>
+    <w:p>
+      <w:pPr>
+        <w:numPr>
+          <w:ilvl w:val="0"/>
+          <w:numId w:val="0"/>
+        </w:numPr>
+        <w:jc w:val="both"/>
+        <w:rPr>
+          <w:rFonts w:hint="default"/>
+          <w:lang w:val="en-US"/>
+        </w:rPr>
+      </w:pPr>
+    </w:p>
+    <w:p>
+      <w:pPr>
+        <w:numPr>
+          <w:ilvl w:val="0"/>
+          <w:numId w:val="0"/>
+        </w:numPr>
+        <w:jc w:val="both"/>
+        <w:rPr>
+          <w:rFonts w:hint="default"/>
+          <w:lang w:val="en-US"/>
+        </w:rPr>
+      </w:pPr>
+      <w:r>
+        <w:rPr>
+          <w:rFonts w:hint="default"/>
+          <w:lang w:val="en-US"/>
+        </w:rPr>
+        <w:t>After adding both the guard and provider as done above you need to go to the web.php(routes-&gt;web.php) to assign routes. Now , at the top you need to add the following code so that your web.php will support AdminController.</w:t>
+      </w:r>
     </w:p>
     <w:tbl>
       <w:tblPr>
@@ -4294,6 +6842,7 @@
           <w:p>
             <w:pPr>
               <w:numPr>
+                <w:ilvl w:val="0"/>
                 <w:numId w:val="0"/>
               </w:numPr>
               <w:jc w:val="both"/>
@@ -4309,7 +6858,81 @@
                 <w:vertAlign w:val="baseline"/>
                 <w:lang w:val="en-US"/>
               </w:rPr>
-              <w:t>php artisan make:seeder AdminSeeder (AdminSeeder is the seeder file name)</w:t>
+              <w:t>use App\Http\Controller\AdminController;</w:t>
+            </w:r>
+          </w:p>
+        </w:tc>
+      </w:tr>
+      <w:tr>
+        <w:tblPrEx>
+          <w:tblBorders>
+            <w:top w:val="single" w:color="auto" w:sz="4" w:space="0"/>
+            <w:left w:val="single" w:color="auto" w:sz="4" w:space="0"/>
+            <w:bottom w:val="single" w:color="auto" w:sz="4" w:space="0"/>
+            <w:right w:val="single" w:color="auto" w:sz="4" w:space="0"/>
+            <w:insideH w:val="single" w:color="auto" w:sz="4" w:space="0"/>
+            <w:insideV w:val="single" w:color="auto" w:sz="4" w:space="0"/>
+          </w:tblBorders>
+        </w:tblPrEx>
+        <w:tc>
+          <w:tcPr>
+            <w:tcW w:w="8522" w:type="dxa"/>
+          </w:tcPr>
+          <w:p>
+            <w:pPr>
+              <w:numPr>
+                <w:ilvl w:val="0"/>
+                <w:numId w:val="0"/>
+              </w:numPr>
+              <w:jc w:val="both"/>
+              <w:rPr>
+                <w:rFonts w:hint="default"/>
+                <w:vertAlign w:val="baseline"/>
+                <w:lang w:val="en-US"/>
+              </w:rPr>
+            </w:pPr>
+            <w:r>
+              <w:drawing>
+                <wp:inline distT="0" distB="0" distL="114300" distR="114300">
+                  <wp:extent cx="5269865" cy="2883535"/>
+                  <wp:effectExtent l="0" t="0" r="3175" b="12065"/>
+                  <wp:docPr id="42" name="Picture 4"/>
+                  <wp:cNvGraphicFramePr>
+                    <a:graphicFrameLocks xmlns:a="http://schemas.openxmlformats.org/drawingml/2006/main" noChangeAspect="1"/>
+                  </wp:cNvGraphicFramePr>
+                  <a:graphic xmlns:a="http://schemas.openxmlformats.org/drawingml/2006/main">
+                    <a:graphicData uri="http://schemas.openxmlformats.org/drawingml/2006/picture">
+                      <pic:pic xmlns:pic="http://schemas.openxmlformats.org/drawingml/2006/picture">
+                        <pic:nvPicPr>
+                          <pic:cNvPr id="42" name="Picture 4"/>
+                          <pic:cNvPicPr>
+                            <a:picLocks noChangeAspect="1"/>
+                          </pic:cNvPicPr>
+                        </pic:nvPicPr>
+                        <pic:blipFill>
+                          <a:blip r:embed="rId45"/>
+                          <a:stretch>
+                            <a:fillRect/>
+                          </a:stretch>
+                        </pic:blipFill>
+                        <pic:spPr>
+                          <a:xfrm>
+                            <a:off x="0" y="0"/>
+                            <a:ext cx="5269865" cy="2883535"/>
+                          </a:xfrm>
+                          <a:prstGeom prst="rect">
+                            <a:avLst/>
+                          </a:prstGeom>
+                          <a:noFill/>
+                          <a:ln>
+                            <a:noFill/>
+                          </a:ln>
+                        </pic:spPr>
+                      </pic:pic>
+                    </a:graphicData>
+                  </a:graphic>
+                </wp:inline>
+              </w:drawing>
             </w:r>
           </w:p>
         </w:tc>
@@ -4318,111 +6941,48 @@
     <w:p>
       <w:pPr>
         <w:numPr>
-          <w:numId w:val="0"/>
-        </w:numPr>
-        <w:jc w:val="both"/>
-        <w:rPr>
-          <w:rFonts w:hint="default"/>
-          <w:lang w:val="en-US"/>
-        </w:rPr>
-      </w:pPr>
-    </w:p>
-    <w:p>
-      <w:pPr>
-        <w:numPr>
-          <w:numId w:val="0"/>
-        </w:numPr>
-        <w:jc w:val="both"/>
-        <w:rPr>
-          <w:rFonts w:hint="default"/>
-          <w:lang w:val="en-US"/>
-        </w:rPr>
-      </w:pPr>
-      <w:r>
-        <w:rPr>
-          <w:rFonts w:hint="default"/>
-          <w:lang w:val="en-US"/>
-        </w:rPr>
-        <w:t>Then go to your AdminSeeder file (database-&gt;seeders-&gt;AdminSeeder.php) and add code as shown:</w:t>
-      </w:r>
-    </w:p>
-    <w:p>
-      <w:pPr>
-        <w:numPr>
-          <w:numId w:val="0"/>
-        </w:numPr>
-        <w:jc w:val="both"/>
-      </w:pPr>
-      <w:r>
-        <w:drawing>
-          <wp:inline distT="0" distB="0" distL="114300" distR="114300">
-            <wp:extent cx="5273675" cy="2652395"/>
-            <wp:effectExtent l="0" t="0" r="14605" b="14605"/>
-            <wp:docPr id="39" name="Picture 16"/>
-            <wp:cNvGraphicFramePr>
-              <a:graphicFrameLocks xmlns:a="http://schemas.openxmlformats.org/drawingml/2006/main" noChangeAspect="1"/>
-            </wp:cNvGraphicFramePr>
-            <a:graphic xmlns:a="http://schemas.openxmlformats.org/drawingml/2006/main">
-              <a:graphicData uri="http://schemas.openxmlformats.org/drawingml/2006/picture">
-                <pic:pic xmlns:pic="http://schemas.openxmlformats.org/drawingml/2006/picture">
-                  <pic:nvPicPr>
-                    <pic:cNvPr id="39" name="Picture 16"/>
-                    <pic:cNvPicPr>
-                      <a:picLocks noChangeAspect="1"/>
-                    </pic:cNvPicPr>
-                  </pic:nvPicPr>
-                  <pic:blipFill>
-                    <a:blip r:embed="rId39"/>
-                    <a:stretch>
-                      <a:fillRect/>
-                    </a:stretch>
-                  </pic:blipFill>
-                  <pic:spPr>
-                    <a:xfrm>
-                      <a:off x="0" y="0"/>
-                      <a:ext cx="5273675" cy="2652395"/>
-                    </a:xfrm>
-                    <a:prstGeom prst="rect">
-                      <a:avLst/>
-                    </a:prstGeom>
-                    <a:noFill/>
-                    <a:ln>
-                      <a:noFill/>
-                    </a:ln>
-                  </pic:spPr>
-                </pic:pic>
-              </a:graphicData>
-            </a:graphic>
-          </wp:inline>
-        </w:drawing>
-      </w:r>
-    </w:p>
-    <w:p>
-      <w:pPr>
-        <w:numPr>
-          <w:numId w:val="0"/>
-        </w:numPr>
-        <w:jc w:val="both"/>
-      </w:pPr>
-    </w:p>
-    <w:p>
-      <w:pPr>
-        <w:numPr>
-          <w:numId w:val="0"/>
-        </w:numPr>
-        <w:jc w:val="both"/>
-        <w:rPr>
-          <w:rFonts w:hint="default"/>
-          <w:lang w:val="en-US"/>
-        </w:rPr>
-      </w:pPr>
-      <w:r>
-        <w:rPr>
-          <w:rFonts w:hint="default"/>
-          <w:lang w:val="en-US"/>
-        </w:rPr>
-        <w:t>Then you need to go to DatabaseSeeder.php (database-&gt;seeders-&gt;DatabaseSeeder.php) and following code:</w:t>
-      </w:r>
+          <w:ilvl w:val="0"/>
+          <w:numId w:val="0"/>
+        </w:numPr>
+        <w:jc w:val="both"/>
+        <w:rPr>
+          <w:rFonts w:hint="default"/>
+          <w:lang w:val="en-US"/>
+        </w:rPr>
+      </w:pPr>
+    </w:p>
+    <w:p>
+      <w:pPr>
+        <w:numPr>
+          <w:ilvl w:val="0"/>
+          <w:numId w:val="0"/>
+        </w:numPr>
+        <w:jc w:val="both"/>
+        <w:rPr>
+          <w:rFonts w:hint="default"/>
+          <w:lang w:val="en-US"/>
+        </w:rPr>
+      </w:pPr>
+      <w:r>
+        <w:rPr>
+          <w:rFonts w:hint="default"/>
+          <w:lang w:val="en-US"/>
+        </w:rPr>
+        <w:t>Now you need to add the route as mentioned below in yoour web.php file.</w:t>
+      </w:r>
+    </w:p>
+    <w:p>
+      <w:pPr>
+        <w:numPr>
+          <w:ilvl w:val="0"/>
+          <w:numId w:val="0"/>
+        </w:numPr>
+        <w:jc w:val="both"/>
+        <w:rPr>
+          <w:rFonts w:hint="default"/>
+          <w:lang w:val="en-US"/>
+        </w:rPr>
+      </w:pPr>
     </w:p>
     <w:tbl>
       <w:tblPr>
@@ -4468,6 +7028,7 @@
           <w:p>
             <w:pPr>
               <w:numPr>
+                <w:ilvl w:val="0"/>
                 <w:numId w:val="0"/>
               </w:numPr>
               <w:jc w:val="both"/>
@@ -4483,7 +7044,85 @@
                 <w:vertAlign w:val="baseline"/>
                 <w:lang w:val="en-US"/>
               </w:rPr>
-              <w:t>$this-&gt;call([AdminSeeder::class])</w:t>
+              <w:t>Route::get('/admin/login', [AdminController::class, 'AdminLogin'])-&gt;name('admin.login');</w:t>
+            </w:r>
+          </w:p>
+        </w:tc>
+      </w:tr>
+      <w:tr>
+        <w:tblPrEx>
+          <w:tblBorders>
+            <w:top w:val="single" w:color="auto" w:sz="4" w:space="0"/>
+            <w:left w:val="single" w:color="auto" w:sz="4" w:space="0"/>
+            <w:bottom w:val="single" w:color="auto" w:sz="4" w:space="0"/>
+            <w:right w:val="single" w:color="auto" w:sz="4" w:space="0"/>
+            <w:insideH w:val="single" w:color="auto" w:sz="4" w:space="0"/>
+            <w:insideV w:val="single" w:color="auto" w:sz="4" w:space="0"/>
+          </w:tblBorders>
+          <w:tblCellMar>
+            <w:left w:w="108" w:type="dxa"/>
+            <w:right w:w="108" w:type="dxa"/>
+          </w:tblCellMar>
+        </w:tblPrEx>
+        <w:tc>
+          <w:tcPr>
+            <w:tcW w:w="8522" w:type="dxa"/>
+          </w:tcPr>
+          <w:p>
+            <w:pPr>
+              <w:numPr>
+                <w:ilvl w:val="0"/>
+                <w:numId w:val="0"/>
+              </w:numPr>
+              <w:jc w:val="both"/>
+              <w:rPr>
+                <w:rFonts w:hint="default"/>
+                <w:vertAlign w:val="baseline"/>
+                <w:lang w:val="en-US"/>
+              </w:rPr>
+            </w:pPr>
+            <w:r>
+              <w:drawing>
+                <wp:inline distT="0" distB="0" distL="114300" distR="114300">
+                  <wp:extent cx="5273675" cy="339725"/>
+                  <wp:effectExtent l="0" t="0" r="14605" b="10795"/>
+                  <wp:docPr id="48" name="Picture 10"/>
+                  <wp:cNvGraphicFramePr>
+                    <a:graphicFrameLocks xmlns:a="http://schemas.openxmlformats.org/drawingml/2006/main" noChangeAspect="1"/>
+                  </wp:cNvGraphicFramePr>
+                  <a:graphic xmlns:a="http://schemas.openxmlformats.org/drawingml/2006/main">
+                    <a:graphicData uri="http://schemas.openxmlformats.org/drawingml/2006/picture">
+                      <pic:pic xmlns:pic="http://schemas.openxmlformats.org/drawingml/2006/picture">
+                        <pic:nvPicPr>
+                          <pic:cNvPr id="48" name="Picture 10"/>
+                          <pic:cNvPicPr>
+                            <a:picLocks noChangeAspect="1"/>
+                          </pic:cNvPicPr>
+                        </pic:nvPicPr>
+                        <pic:blipFill>
+                          <a:blip r:embed="rId46"/>
+                          <a:stretch>
+                            <a:fillRect/>
+                          </a:stretch>
+                        </pic:blipFill>
+                        <pic:spPr>
+                          <a:xfrm>
+                            <a:off x="0" y="0"/>
+                            <a:ext cx="5273675" cy="339725"/>
+                          </a:xfrm>
+                          <a:prstGeom prst="rect">
+                            <a:avLst/>
+                          </a:prstGeom>
+                          <a:noFill/>
+                          <a:ln>
+                            <a:noFill/>
+                          </a:ln>
+                        </pic:spPr>
+                      </pic:pic>
+                    </a:graphicData>
+                  </a:graphic>
+                </wp:inline>
+              </w:drawing>
             </w:r>
           </w:p>
         </w:tc>
@@ -4492,92 +7131,42 @@
     <w:p>
       <w:pPr>
         <w:numPr>
-          <w:numId w:val="0"/>
-        </w:numPr>
-        <w:jc w:val="both"/>
-      </w:pPr>
-      <w:r>
-        <w:drawing>
-          <wp:inline distT="0" distB="0" distL="114300" distR="114300">
-            <wp:extent cx="5269230" cy="2576830"/>
-            <wp:effectExtent l="0" t="0" r="3810" b="13970"/>
-            <wp:docPr id="40" name="Picture 17"/>
-            <wp:cNvGraphicFramePr>
-              <a:graphicFrameLocks xmlns:a="http://schemas.openxmlformats.org/drawingml/2006/main" noChangeAspect="1"/>
-            </wp:cNvGraphicFramePr>
-            <a:graphic xmlns:a="http://schemas.openxmlformats.org/drawingml/2006/main">
-              <a:graphicData uri="http://schemas.openxmlformats.org/drawingml/2006/picture">
-                <pic:pic xmlns:pic="http://schemas.openxmlformats.org/drawingml/2006/picture">
-                  <pic:nvPicPr>
-                    <pic:cNvPr id="40" name="Picture 17"/>
-                    <pic:cNvPicPr>
-                      <a:picLocks noChangeAspect="1"/>
-                    </pic:cNvPicPr>
-                  </pic:nvPicPr>
-                  <pic:blipFill>
-                    <a:blip r:embed="rId40"/>
-                    <a:stretch>
-                      <a:fillRect/>
-                    </a:stretch>
-                  </pic:blipFill>
-                  <pic:spPr>
-                    <a:xfrm>
-                      <a:off x="0" y="0"/>
-                      <a:ext cx="5269230" cy="2576830"/>
-                    </a:xfrm>
-                    <a:prstGeom prst="rect">
-                      <a:avLst/>
-                    </a:prstGeom>
-                    <a:noFill/>
-                    <a:ln>
-                      <a:noFill/>
-                    </a:ln>
-                  </pic:spPr>
-                </pic:pic>
-              </a:graphicData>
-            </a:graphic>
-          </wp:inline>
-        </w:drawing>
-      </w:r>
-    </w:p>
-    <w:p>
-      <w:pPr>
-        <w:numPr>
-          <w:numId w:val="0"/>
-        </w:numPr>
-        <w:jc w:val="both"/>
-      </w:pPr>
-    </w:p>
-    <w:p>
-      <w:pPr>
-        <w:numPr>
-          <w:numId w:val="0"/>
-        </w:numPr>
-        <w:jc w:val="both"/>
-        <w:rPr>
-          <w:rFonts w:hint="default"/>
-          <w:lang w:val="en-US"/>
-        </w:rPr>
-      </w:pPr>
-      <w:r>
-        <w:rPr>
-          <w:rFonts w:hint="default"/>
-          <w:lang w:val="en-US"/>
-        </w:rPr>
-        <w:t>After this you need to go to the terminal and insert the following command:</w:t>
-      </w:r>
-    </w:p>
-    <w:p>
-      <w:pPr>
-        <w:numPr>
-          <w:numId w:val="0"/>
-        </w:numPr>
-        <w:jc w:val="both"/>
-        <w:rPr>
-          <w:rFonts w:hint="default"/>
-          <w:lang w:val="en-US"/>
-        </w:rPr>
-      </w:pPr>
+          <w:ilvl w:val="0"/>
+          <w:numId w:val="0"/>
+        </w:numPr>
+        <w:jc w:val="both"/>
+        <w:rPr>
+          <w:rFonts w:hint="default"/>
+          <w:lang w:val="en-US"/>
+        </w:rPr>
+      </w:pPr>
+      <w:r>
+        <w:rPr>
+          <w:rFonts w:hint="default"/>
+          <w:lang w:val="en-US"/>
+        </w:rPr>
+        <w:t xml:space="preserve"> </w:t>
+      </w:r>
+    </w:p>
+    <w:p>
+      <w:pPr>
+        <w:numPr>
+          <w:ilvl w:val="0"/>
+          <w:numId w:val="0"/>
+        </w:numPr>
+        <w:jc w:val="both"/>
+        <w:rPr>
+          <w:rFonts w:hint="default"/>
+          <w:lang w:val="en-US"/>
+        </w:rPr>
+      </w:pPr>
+      <w:r>
+        <w:rPr>
+          <w:rFonts w:hint="default"/>
+          <w:lang w:val="en-US"/>
+        </w:rPr>
+        <w:t>After you have defined the route go to the AdminController and create a public funtion name Admin Login:</w:t>
+      </w:r>
     </w:p>
     <w:tbl>
       <w:tblPr>
@@ -4623,6 +7212,7 @@
           <w:p>
             <w:pPr>
               <w:numPr>
+                <w:ilvl w:val="0"/>
                 <w:numId w:val="0"/>
               </w:numPr>
               <w:jc w:val="both"/>
@@ -4638,7 +7228,129 @@
                 <w:vertAlign w:val="baseline"/>
                 <w:lang w:val="en-US"/>
               </w:rPr>
-              <w:t>php artisan db:seed</w:t>
+              <w:t xml:space="preserve"> public function AdminLogin(){</w:t>
+            </w:r>
+          </w:p>
+          <w:p>
+            <w:pPr>
+              <w:numPr>
+                <w:ilvl w:val="0"/>
+                <w:numId w:val="0"/>
+              </w:numPr>
+              <w:jc w:val="both"/>
+              <w:rPr>
+                <w:rFonts w:hint="default"/>
+                <w:vertAlign w:val="baseline"/>
+                <w:lang w:val="en-US"/>
+              </w:rPr>
+            </w:pPr>
+            <w:r>
+              <w:rPr>
+                <w:rFonts w:hint="default"/>
+                <w:vertAlign w:val="baseline"/>
+                <w:lang w:val="en-US"/>
+              </w:rPr>
+              <w:t xml:space="preserve">    return view('admin.login');</w:t>
+            </w:r>
+          </w:p>
+          <w:p>
+            <w:pPr>
+              <w:numPr>
+                <w:ilvl w:val="0"/>
+                <w:numId w:val="0"/>
+              </w:numPr>
+              <w:jc w:val="both"/>
+              <w:rPr>
+                <w:rFonts w:hint="default"/>
+                <w:vertAlign w:val="baseline"/>
+                <w:lang w:val="en-US"/>
+              </w:rPr>
+            </w:pPr>
+            <w:r>
+              <w:rPr>
+                <w:rFonts w:hint="default"/>
+                <w:vertAlign w:val="baseline"/>
+                <w:lang w:val="en-US"/>
+              </w:rPr>
+              <w:t xml:space="preserve">    }</w:t>
+            </w:r>
+          </w:p>
+        </w:tc>
+      </w:tr>
+      <w:tr>
+        <w:tblPrEx>
+          <w:tblBorders>
+            <w:top w:val="single" w:color="auto" w:sz="4" w:space="0"/>
+            <w:left w:val="single" w:color="auto" w:sz="4" w:space="0"/>
+            <w:bottom w:val="single" w:color="auto" w:sz="4" w:space="0"/>
+            <w:right w:val="single" w:color="auto" w:sz="4" w:space="0"/>
+            <w:insideH w:val="single" w:color="auto" w:sz="4" w:space="0"/>
+            <w:insideV w:val="single" w:color="auto" w:sz="4" w:space="0"/>
+          </w:tblBorders>
+          <w:tblCellMar>
+            <w:left w:w="108" w:type="dxa"/>
+            <w:right w:w="108" w:type="dxa"/>
+          </w:tblCellMar>
+        </w:tblPrEx>
+        <w:tc>
+          <w:tcPr>
+            <w:tcW w:w="8522" w:type="dxa"/>
+          </w:tcPr>
+          <w:p>
+            <w:pPr>
+              <w:numPr>
+                <w:ilvl w:val="0"/>
+                <w:numId w:val="0"/>
+              </w:numPr>
+              <w:jc w:val="both"/>
+              <w:rPr>
+                <w:rFonts w:hint="default"/>
+                <w:vertAlign w:val="baseline"/>
+                <w:lang w:val="en-US"/>
+              </w:rPr>
+            </w:pPr>
+            <w:r>
+              <w:drawing>
+                <wp:inline distT="0" distB="0" distL="114300" distR="114300">
+                  <wp:extent cx="2796540" cy="1348740"/>
+                  <wp:effectExtent l="0" t="0" r="7620" b="7620"/>
+                  <wp:docPr id="45" name="Picture 7"/>
+                  <wp:cNvGraphicFramePr>
+                    <a:graphicFrameLocks xmlns:a="http://schemas.openxmlformats.org/drawingml/2006/main" noChangeAspect="1"/>
+                  </wp:cNvGraphicFramePr>
+                  <a:graphic xmlns:a="http://schemas.openxmlformats.org/drawingml/2006/main">
+                    <a:graphicData uri="http://schemas.openxmlformats.org/drawingml/2006/picture">
+                      <pic:pic xmlns:pic="http://schemas.openxmlformats.org/drawingml/2006/picture">
+                        <pic:nvPicPr>
+                          <pic:cNvPr id="45" name="Picture 7"/>
+                          <pic:cNvPicPr>
+                            <a:picLocks noChangeAspect="1"/>
+                          </pic:cNvPicPr>
+                        </pic:nvPicPr>
+                        <pic:blipFill>
+                          <a:blip r:embed="rId47"/>
+                          <a:stretch>
+                            <a:fillRect/>
+                          </a:stretch>
+                        </pic:blipFill>
+                        <pic:spPr>
+                          <a:xfrm>
+                            <a:off x="0" y="0"/>
+                            <a:ext cx="2796540" cy="1348740"/>
+                          </a:xfrm>
+                          <a:prstGeom prst="rect">
+                            <a:avLst/>
+                          </a:prstGeom>
+                          <a:noFill/>
+                          <a:ln>
+                            <a:noFill/>
+                          </a:ln>
+                        </pic:spPr>
+                      </pic:pic>
+                    </a:graphicData>
+                  </a:graphic>
+                </wp:inline>
+              </w:drawing>
             </w:r>
           </w:p>
         </w:tc>
@@ -4647,51 +7359,63 @@
     <w:p>
       <w:pPr>
         <w:numPr>
-          <w:numId w:val="0"/>
-        </w:numPr>
-        <w:jc w:val="both"/>
-        <w:rPr>
-          <w:rFonts w:hint="default"/>
-          <w:lang w:val="en-US"/>
-        </w:rPr>
-      </w:pPr>
-    </w:p>
-    <w:p>
-      <w:pPr>
-        <w:numPr>
-          <w:numId w:val="0"/>
-        </w:numPr>
-        <w:jc w:val="both"/>
-        <w:rPr>
-          <w:rFonts w:hint="default"/>
-          <w:lang w:val="en-US"/>
-        </w:rPr>
-      </w:pPr>
-      <w:r>
-        <w:rPr>
-          <w:rFonts w:hint="default"/>
-          <w:lang w:val="en-US"/>
-        </w:rPr>
-        <w:t>Doing this will add data in your table as shown below:</w:t>
-      </w:r>
-    </w:p>
-    <w:p>
-      <w:pPr>
-        <w:numPr>
-          <w:numId w:val="0"/>
-        </w:numPr>
-        <w:jc w:val="both"/>
-        <w:rPr>
-          <w:rFonts w:hint="default"/>
-          <w:lang w:val="en-US"/>
-        </w:rPr>
+          <w:ilvl w:val="0"/>
+          <w:numId w:val="0"/>
+        </w:numPr>
+        <w:jc w:val="both"/>
+        <w:rPr>
+          <w:rFonts w:hint="default"/>
+          <w:lang w:val="en-US"/>
+        </w:rPr>
+      </w:pPr>
+    </w:p>
+    <w:p>
+      <w:pPr>
+        <w:numPr>
+          <w:ilvl w:val="0"/>
+          <w:numId w:val="0"/>
+        </w:numPr>
+        <w:jc w:val="both"/>
+        <w:rPr>
+          <w:rFonts w:hint="default"/>
+          <w:lang w:val="en-US"/>
+        </w:rPr>
+      </w:pPr>
+      <w:r>
+        <w:rPr>
+          <w:rFonts w:hint="default"/>
+          <w:lang w:val="en-US"/>
+        </w:rPr>
+        <w:t>Now you need to create the view. To create the view ‘admin.login’ you need to go to the views. (resources-&gt;views). Inside the views you need to create a new folder admin and inside which you need to create a new file as login.(resources-&gt;views-&gt;admin-&gt;login)</w:t>
+      </w:r>
+    </w:p>
+    <w:p>
+      <w:pPr>
+        <w:numPr>
+          <w:ilvl w:val="0"/>
+          <w:numId w:val="0"/>
+        </w:numPr>
+        <w:jc w:val="both"/>
+        <w:rPr>
+          <w:rFonts w:hint="default"/>
+          <w:lang w:val="en-US"/>
+        </w:rPr>
+      </w:pPr>
+    </w:p>
+    <w:p>
+      <w:pPr>
+        <w:numPr>
+          <w:ilvl w:val="0"/>
+          <w:numId w:val="0"/>
+        </w:numPr>
+        <w:jc w:val="both"/>
       </w:pPr>
       <w:r>
         <w:drawing>
           <wp:inline distT="0" distB="0" distL="114300" distR="114300">
-            <wp:extent cx="5264785" cy="1776095"/>
-            <wp:effectExtent l="0" t="0" r="8255" b="6985"/>
-            <wp:docPr id="41" name="Picture 18"/>
+            <wp:extent cx="2263140" cy="1158240"/>
+            <wp:effectExtent l="0" t="0" r="7620" b="0"/>
+            <wp:docPr id="46" name="Picture 8"/>
             <wp:cNvGraphicFramePr>
               <a:graphicFrameLocks xmlns:a="http://schemas.openxmlformats.org/drawingml/2006/main" noChangeAspect="1"/>
             </wp:cNvGraphicFramePr>
@@ -4699,13 +7423,13 @@
               <a:graphicData uri="http://schemas.openxmlformats.org/drawingml/2006/picture">
                 <pic:pic xmlns:pic="http://schemas.openxmlformats.org/drawingml/2006/picture">
                   <pic:nvPicPr>
-                    <pic:cNvPr id="41" name="Picture 18"/>
+                    <pic:cNvPr id="46" name="Picture 8"/>
                     <pic:cNvPicPr>
                       <a:picLocks noChangeAspect="1"/>
                     </pic:cNvPicPr>
                   </pic:nvPicPr>
                   <pic:blipFill>
-                    <a:blip r:embed="rId41"/>
+                    <a:blip r:embed="rId48"/>
                     <a:stretch>
                       <a:fillRect/>
                     </a:stretch>
@@ -4713,7 +7437,7 @@
                   <pic:spPr>
                     <a:xfrm>
                       <a:off x="0" y="0"/>
-                      <a:ext cx="5264785" cy="1776095"/>
+                      <a:ext cx="2263140" cy="1158240"/>
                     </a:xfrm>
                     <a:prstGeom prst="rect">
                       <a:avLst/>
@@ -4729,96 +7453,179 @@
           </wp:inline>
         </w:drawing>
       </w:r>
+    </w:p>
+    <w:p>
+      <w:pPr>
+        <w:numPr>
+          <w:ilvl w:val="0"/>
+          <w:numId w:val="0"/>
+        </w:numPr>
+        <w:jc w:val="both"/>
+      </w:pPr>
+    </w:p>
+    <w:p>
+      <w:pPr>
+        <w:numPr>
+          <w:ilvl w:val="0"/>
+          <w:numId w:val="0"/>
+        </w:numPr>
+        <w:jc w:val="both"/>
+        <w:rPr>
+          <w:rFonts w:hint="default"/>
+          <w:lang w:val="en-US"/>
+        </w:rPr>
+      </w:pPr>
+      <w:r>
+        <w:rPr>
+          <w:rFonts w:hint="default"/>
+          <w:lang w:val="en-US"/>
+        </w:rPr>
+        <w:t>Now create a simple html structure for the admin login as shown below:</w:t>
+      </w:r>
+    </w:p>
+    <w:p>
+      <w:pPr>
+        <w:numPr>
+          <w:ilvl w:val="0"/>
+          <w:numId w:val="0"/>
+        </w:numPr>
+        <w:jc w:val="both"/>
+      </w:pPr>
+      <w:r>
+        <w:drawing>
+          <wp:inline distT="0" distB="0" distL="114300" distR="114300">
+            <wp:extent cx="5273040" cy="1911350"/>
+            <wp:effectExtent l="0" t="0" r="0" b="8890"/>
+            <wp:docPr id="47" name="Picture 9"/>
+            <wp:cNvGraphicFramePr>
+              <a:graphicFrameLocks xmlns:a="http://schemas.openxmlformats.org/drawingml/2006/main" noChangeAspect="1"/>
+            </wp:cNvGraphicFramePr>
+            <a:graphic xmlns:a="http://schemas.openxmlformats.org/drawingml/2006/main">
+              <a:graphicData uri="http://schemas.openxmlformats.org/drawingml/2006/picture">
+                <pic:pic xmlns:pic="http://schemas.openxmlformats.org/drawingml/2006/picture">
+                  <pic:nvPicPr>
+                    <pic:cNvPr id="47" name="Picture 9"/>
+                    <pic:cNvPicPr>
+                      <a:picLocks noChangeAspect="1"/>
+                    </pic:cNvPicPr>
+                  </pic:nvPicPr>
+                  <pic:blipFill>
+                    <a:blip r:embed="rId49"/>
+                    <a:stretch>
+                      <a:fillRect/>
+                    </a:stretch>
+                  </pic:blipFill>
+                  <pic:spPr>
+                    <a:xfrm>
+                      <a:off x="0" y="0"/>
+                      <a:ext cx="5273040" cy="1911350"/>
+                    </a:xfrm>
+                    <a:prstGeom prst="rect">
+                      <a:avLst/>
+                    </a:prstGeom>
+                    <a:noFill/>
+                    <a:ln>
+                      <a:noFill/>
+                    </a:ln>
+                  </pic:spPr>
+                </pic:pic>
+              </a:graphicData>
+            </a:graphic>
+          </wp:inline>
+        </w:drawing>
+      </w:r>
+    </w:p>
+    <w:p>
+      <w:pPr>
+        <w:numPr>
+          <w:ilvl w:val="0"/>
+          <w:numId w:val="0"/>
+        </w:numPr>
+        <w:jc w:val="both"/>
+      </w:pPr>
+    </w:p>
+    <w:p>
+      <w:pPr>
+        <w:numPr>
+          <w:ilvl w:val="0"/>
+          <w:numId w:val="0"/>
+        </w:numPr>
+        <w:jc w:val="both"/>
+        <w:rPr>
+          <w:rFonts w:hint="default"/>
+          <w:lang w:val="en-US"/>
+        </w:rPr>
+      </w:pPr>
+      <w:r>
+        <w:rPr>
+          <w:rFonts w:hint="default"/>
+          <w:lang w:val="en-US"/>
+        </w:rPr>
+        <w:t>After this clear the cache and go to your project. In the project go to the url and type /admin/login and you will be redirected to admin login page.</w:t>
+      </w:r>
+    </w:p>
+    <w:p>
+      <w:pPr>
+        <w:numPr>
+          <w:ilvl w:val="0"/>
+          <w:numId w:val="0"/>
+        </w:numPr>
+        <w:jc w:val="both"/>
+        <w:rPr>
+          <w:rFonts w:hint="default"/>
+          <w:lang w:val="en-US"/>
+        </w:rPr>
+      </w:pPr>
+      <w:r>
+        <w:drawing>
+          <wp:inline distT="0" distB="0" distL="114300" distR="114300">
+            <wp:extent cx="5262880" cy="1522730"/>
+            <wp:effectExtent l="0" t="0" r="10160" b="1270"/>
+            <wp:docPr id="49" name="Picture 11"/>
+            <wp:cNvGraphicFramePr>
+              <a:graphicFrameLocks xmlns:a="http://schemas.openxmlformats.org/drawingml/2006/main" noChangeAspect="1"/>
+            </wp:cNvGraphicFramePr>
+            <a:graphic xmlns:a="http://schemas.openxmlformats.org/drawingml/2006/main">
+              <a:graphicData uri="http://schemas.openxmlformats.org/drawingml/2006/picture">
+                <pic:pic xmlns:pic="http://schemas.openxmlformats.org/drawingml/2006/picture">
+                  <pic:nvPicPr>
+                    <pic:cNvPr id="49" name="Picture 11"/>
+                    <pic:cNvPicPr>
+                      <a:picLocks noChangeAspect="1"/>
+                    </pic:cNvPicPr>
+                  </pic:nvPicPr>
+                  <pic:blipFill>
+                    <a:blip r:embed="rId50"/>
+                    <a:stretch>
+                      <a:fillRect/>
+                    </a:stretch>
+                  </pic:blipFill>
+                  <pic:spPr>
+                    <a:xfrm>
+                      <a:off x="0" y="0"/>
+                      <a:ext cx="5262880" cy="1522730"/>
+                    </a:xfrm>
+                    <a:prstGeom prst="rect">
+                      <a:avLst/>
+                    </a:prstGeom>
+                    <a:noFill/>
+                    <a:ln>
+                      <a:noFill/>
+                    </a:ln>
+                  </pic:spPr>
+                </pic:pic>
+              </a:graphicData>
+            </a:graphic>
+          </wp:inline>
+        </w:drawing>
+      </w:r>
       <w:bookmarkStart w:id="0" w:name="_GoBack"/>
       <w:bookmarkEnd w:id="0"/>
     </w:p>
     <w:p>
       <w:pPr>
         <w:numPr>
-          <w:numId w:val="0"/>
-        </w:numPr>
-        <w:jc w:val="both"/>
-        <w:rPr>
-          <w:rFonts w:hint="default"/>
-          <w:lang w:val="en-US"/>
-        </w:rPr>
-      </w:pPr>
-    </w:p>
-    <w:p>
-      <w:pPr>
-        <w:numPr>
-          <w:numId w:val="0"/>
-        </w:numPr>
-        <w:jc w:val="both"/>
-        <w:rPr>
-          <w:rFonts w:hint="default"/>
-          <w:lang w:val="en-US"/>
-        </w:rPr>
-      </w:pPr>
-    </w:p>
-    <w:p>
-      <w:pPr>
-        <w:numPr>
-          <w:numId w:val="0"/>
-        </w:numPr>
-        <w:jc w:val="both"/>
-        <w:rPr>
-          <w:rFonts w:hint="default"/>
-          <w:lang w:val="en-US"/>
-        </w:rPr>
-      </w:pPr>
-    </w:p>
-    <w:p>
-      <w:pPr>
-        <w:numPr>
-          <w:numId w:val="0"/>
-        </w:numPr>
-        <w:jc w:val="both"/>
-        <w:rPr>
-          <w:rFonts w:hint="default"/>
-          <w:lang w:val="en-US"/>
-        </w:rPr>
-      </w:pPr>
-    </w:p>
-    <w:p>
-      <w:pPr>
-        <w:numPr>
-          <w:numId w:val="0"/>
-        </w:numPr>
-        <w:jc w:val="both"/>
-        <w:rPr>
-          <w:rFonts w:hint="default"/>
-          <w:lang w:val="en-US"/>
-        </w:rPr>
-      </w:pPr>
-    </w:p>
-    <w:p>
-      <w:pPr>
-        <w:numPr>
-          <w:numId w:val="0"/>
-        </w:numPr>
-        <w:jc w:val="both"/>
-        <w:rPr>
-          <w:rFonts w:hint="default"/>
-          <w:lang w:val="en-US"/>
-        </w:rPr>
-      </w:pPr>
-    </w:p>
-    <w:p>
-      <w:pPr>
-        <w:numPr>
-          <w:numId w:val="0"/>
-        </w:numPr>
-        <w:jc w:val="both"/>
-        <w:rPr>
-          <w:rFonts w:hint="default"/>
-          <w:lang w:val="en-US"/>
-        </w:rPr>
-      </w:pPr>
-    </w:p>
-    <w:p>
-      <w:pPr>
-        <w:numPr>
+          <w:ilvl w:val="0"/>
           <w:numId w:val="0"/>
         </w:numPr>
         <w:jc w:val="both"/>
@@ -4972,7 +7779,7 @@
     <w:lsdException w:unhideWhenUsed="0" w:uiPriority="0" w:semiHidden="0" w:name="HTML Sample"/>
     <w:lsdException w:unhideWhenUsed="0" w:uiPriority="0" w:semiHidden="0" w:name="HTML Typewriter"/>
     <w:lsdException w:unhideWhenUsed="0" w:uiPriority="0" w:semiHidden="0" w:name="HTML Variable"/>
-    <w:lsdException w:unhideWhenUsed="0" w:uiPriority="0" w:name="Normal Table"/>
+    <w:lsdException w:qFormat="1" w:unhideWhenUsed="0" w:uiPriority="0" w:name="Normal Table"/>
     <w:lsdException w:unhideWhenUsed="0" w:uiPriority="0" w:semiHidden="0" w:name="annotation subject"/>
     <w:lsdException w:unhideWhenUsed="0" w:uiPriority="0" w:semiHidden="0" w:name="Table Simple 1"/>
     <w:lsdException w:unhideWhenUsed="0" w:uiPriority="0" w:semiHidden="0" w:name="Table Simple 2"/>
@@ -5136,6 +7943,7 @@
   <w:style w:type="table" w:default="1" w:styleId="3">
     <w:name w:val="Normal Table"/>
     <w:semiHidden/>
+    <w:qFormat/>
     <w:uiPriority w:val="0"/>
     <w:tblPr>
       <w:tblCellMar>

</xml_diff>

<commit_message>
Laravel Multi Auth with Breeze Pt6 and middleware for admin added
</commit_message>
<xml_diff>
--- a/Laravel.docx
+++ b/Laravel.docx
@@ -317,14 +317,6 @@
       </w:tblGrid>
       <w:tr>
         <w:tblPrEx>
-          <w:tblBorders>
-            <w:top w:val="single" w:color="auto" w:sz="4" w:space="0"/>
-            <w:left w:val="single" w:color="auto" w:sz="4" w:space="0"/>
-            <w:bottom w:val="single" w:color="auto" w:sz="4" w:space="0"/>
-            <w:right w:val="single" w:color="auto" w:sz="4" w:space="0"/>
-            <w:insideH w:val="single" w:color="auto" w:sz="4" w:space="0"/>
-            <w:insideV w:val="single" w:color="auto" w:sz="4" w:space="0"/>
-          </w:tblBorders>
           <w:tblCellMar>
             <w:top w:w="0" w:type="dxa"/>
             <w:left w:w="108" w:type="dxa"/>
@@ -2464,6 +2456,12 @@
             <w:insideH w:val="single" w:color="auto" w:sz="4" w:space="0"/>
             <w:insideV w:val="single" w:color="auto" w:sz="4" w:space="0"/>
           </w:tblBorders>
+          <w:tblCellMar>
+            <w:top w:w="0" w:type="dxa"/>
+            <w:left w:w="108" w:type="dxa"/>
+            <w:bottom w:w="0" w:type="dxa"/>
+            <w:right w:w="108" w:type="dxa"/>
+          </w:tblCellMar>
         </w:tblPrEx>
         <w:tc>
           <w:tcPr>
@@ -11314,7 +11312,9 @@
         </w:tblBorders>
         <w:tblLayout w:type="autofit"/>
         <w:tblCellMar>
+          <w:top w:w="0" w:type="dxa"/>
           <w:left w:w="108" w:type="dxa"/>
+          <w:bottom w:w="0" w:type="dxa"/>
           <w:right w:w="108" w:type="dxa"/>
         </w:tblCellMar>
       </w:tblPr>
@@ -11332,7 +11332,9 @@
             <w:insideV w:val="single" w:color="auto" w:sz="4" w:space="0"/>
           </w:tblBorders>
           <w:tblCellMar>
+            <w:top w:w="0" w:type="dxa"/>
             <w:left w:w="108" w:type="dxa"/>
+            <w:bottom w:w="0" w:type="dxa"/>
             <w:right w:w="108" w:type="dxa"/>
           </w:tblCellMar>
         </w:tblPrEx>
@@ -11342,6 +11344,7 @@
           </w:tcPr>
           <w:p>
             <w:pPr>
+              <w:widowControl w:val="0"/>
               <w:numPr>
                 <w:ilvl w:val="0"/>
                 <w:numId w:val="0"/>
@@ -11383,7 +11386,9 @@
             <w:insideV w:val="single" w:color="auto" w:sz="4" w:space="0"/>
           </w:tblBorders>
           <w:tblCellMar>
+            <w:top w:w="0" w:type="dxa"/>
             <w:left w:w="108" w:type="dxa"/>
+            <w:bottom w:w="0" w:type="dxa"/>
             <w:right w:w="108" w:type="dxa"/>
           </w:tblCellMar>
         </w:tblPrEx>
@@ -11393,6 +11398,7 @@
           </w:tcPr>
           <w:p>
             <w:pPr>
+              <w:widowControl w:val="0"/>
               <w:numPr>
                 <w:ilvl w:val="0"/>
                 <w:numId w:val="0"/>
@@ -11515,7 +11521,9 @@
         </w:tblBorders>
         <w:tblLayout w:type="autofit"/>
         <w:tblCellMar>
+          <w:top w:w="0" w:type="dxa"/>
           <w:left w:w="108" w:type="dxa"/>
+          <w:bottom w:w="0" w:type="dxa"/>
           <w:right w:w="108" w:type="dxa"/>
         </w:tblCellMar>
       </w:tblPr>
@@ -11533,7 +11541,9 @@
             <w:insideV w:val="single" w:color="auto" w:sz="4" w:space="0"/>
           </w:tblBorders>
           <w:tblCellMar>
+            <w:top w:w="0" w:type="dxa"/>
             <w:left w:w="108" w:type="dxa"/>
+            <w:bottom w:w="0" w:type="dxa"/>
             <w:right w:w="108" w:type="dxa"/>
           </w:tblCellMar>
         </w:tblPrEx>
@@ -11543,6 +11553,7 @@
           </w:tcPr>
           <w:p>
             <w:pPr>
+              <w:widowControl w:val="0"/>
               <w:numPr>
                 <w:ilvl w:val="0"/>
                 <w:numId w:val="0"/>
@@ -11584,7 +11595,9 @@
             <w:insideV w:val="single" w:color="auto" w:sz="4" w:space="0"/>
           </w:tblBorders>
           <w:tblCellMar>
+            <w:top w:w="0" w:type="dxa"/>
             <w:left w:w="108" w:type="dxa"/>
+            <w:bottom w:w="0" w:type="dxa"/>
             <w:right w:w="108" w:type="dxa"/>
           </w:tblCellMar>
         </w:tblPrEx>
@@ -11594,6 +11607,7 @@
           </w:tcPr>
           <w:p>
             <w:pPr>
+              <w:widowControl w:val="0"/>
               <w:numPr>
                 <w:ilvl w:val="0"/>
                 <w:numId w:val="0"/>
@@ -11716,7 +11730,9 @@
         </w:tblBorders>
         <w:tblLayout w:type="autofit"/>
         <w:tblCellMar>
+          <w:top w:w="0" w:type="dxa"/>
           <w:left w:w="108" w:type="dxa"/>
+          <w:bottom w:w="0" w:type="dxa"/>
           <w:right w:w="108" w:type="dxa"/>
         </w:tblCellMar>
       </w:tblPr>
@@ -11734,7 +11750,9 @@
             <w:insideV w:val="single" w:color="auto" w:sz="4" w:space="0"/>
           </w:tblBorders>
           <w:tblCellMar>
+            <w:top w:w="0" w:type="dxa"/>
             <w:left w:w="108" w:type="dxa"/>
+            <w:bottom w:w="0" w:type="dxa"/>
             <w:right w:w="108" w:type="dxa"/>
           </w:tblCellMar>
         </w:tblPrEx>
@@ -11744,6 +11762,7 @@
           </w:tcPr>
           <w:p>
             <w:pPr>
+              <w:widowControl w:val="0"/>
               <w:numPr>
                 <w:ilvl w:val="0"/>
                 <w:numId w:val="0"/>
@@ -11774,6 +11793,7 @@
           </w:p>
           <w:p>
             <w:pPr>
+              <w:widowControl w:val="0"/>
               <w:numPr>
                 <w:ilvl w:val="0"/>
                 <w:numId w:val="0"/>
@@ -11804,6 +11824,7 @@
           </w:p>
           <w:p>
             <w:pPr>
+              <w:widowControl w:val="0"/>
               <w:numPr>
                 <w:ilvl w:val="0"/>
                 <w:numId w:val="0"/>
@@ -11834,6 +11855,7 @@
           </w:p>
           <w:p>
             <w:pPr>
+              <w:widowControl w:val="0"/>
               <w:numPr>
                 <w:ilvl w:val="0"/>
                 <w:numId w:val="0"/>
@@ -11875,7 +11897,9 @@
             <w:insideV w:val="single" w:color="auto" w:sz="4" w:space="0"/>
           </w:tblBorders>
           <w:tblCellMar>
+            <w:top w:w="0" w:type="dxa"/>
             <w:left w:w="108" w:type="dxa"/>
+            <w:bottom w:w="0" w:type="dxa"/>
             <w:right w:w="108" w:type="dxa"/>
           </w:tblCellMar>
         </w:tblPrEx>
@@ -11885,6 +11909,7 @@
           </w:tcPr>
           <w:p>
             <w:pPr>
+              <w:widowControl w:val="0"/>
               <w:numPr>
                 <w:ilvl w:val="0"/>
                 <w:numId w:val="0"/>
@@ -12016,14 +12041,6 @@
           <w:numId w:val="0"/>
         </w:numPr>
         <w:jc w:val="both"/>
-        <w:rPr>
-          <w:rFonts w:hint="default"/>
-          <w:b w:val="0"/>
-          <w:bCs w:val="0"/>
-          <w:sz w:val="20"/>
-          <w:szCs w:val="20"/>
-          <w:lang w:val="en-US"/>
-        </w:rPr>
       </w:pPr>
       <w:r>
         <w:drawing>
@@ -12068,6 +12085,1241 @@
           </wp:inline>
         </w:drawing>
       </w:r>
+    </w:p>
+    <w:p>
+      <w:pPr>
+        <w:numPr>
+          <w:ilvl w:val="0"/>
+          <w:numId w:val="0"/>
+        </w:numPr>
+        <w:jc w:val="both"/>
+      </w:pPr>
+    </w:p>
+    <w:p>
+      <w:pPr>
+        <w:numPr>
+          <w:ilvl w:val="0"/>
+          <w:numId w:val="1"/>
+        </w:numPr>
+        <w:ind w:left="0" w:leftChars="0" w:firstLine="0" w:firstLineChars="0"/>
+        <w:jc w:val="both"/>
+        <w:rPr>
+          <w:rFonts w:hint="default"/>
+          <w:b/>
+          <w:bCs/>
+          <w:sz w:val="24"/>
+          <w:szCs w:val="24"/>
+          <w:lang w:val="en-US"/>
+        </w:rPr>
+      </w:pPr>
+      <w:r>
+        <w:rPr>
+          <w:rFonts w:hint="default"/>
+          <w:b/>
+          <w:bCs/>
+          <w:sz w:val="24"/>
+          <w:szCs w:val="24"/>
+          <w:lang w:val="en-US"/>
+        </w:rPr>
+        <w:t>Laravel Multi Auth with Breeze Part 6:</w:t>
+      </w:r>
+    </w:p>
+    <w:p>
+      <w:pPr>
+        <w:numPr>
+          <w:ilvl w:val="0"/>
+          <w:numId w:val="0"/>
+        </w:numPr>
+        <w:jc w:val="both"/>
+        <w:rPr>
+          <w:rFonts w:hint="default"/>
+          <w:lang w:val="en-US"/>
+        </w:rPr>
+      </w:pPr>
+    </w:p>
+    <w:p>
+      <w:pPr>
+        <w:numPr>
+          <w:ilvl w:val="0"/>
+          <w:numId w:val="0"/>
+        </w:numPr>
+        <w:jc w:val="both"/>
+        <w:rPr>
+          <w:rFonts w:hint="default"/>
+          <w:lang w:val="en-US"/>
+        </w:rPr>
+      </w:pPr>
+      <w:r>
+        <w:rPr>
+          <w:rFonts w:hint="default"/>
+          <w:lang w:val="en-US"/>
+        </w:rPr>
+        <w:t>Here we will make the functionality in a way that only logged in admin are able to login and redirected to admin dashboard. To do that we need to do as mentioned below.</w:t>
+      </w:r>
+    </w:p>
+    <w:p>
+      <w:pPr>
+        <w:numPr>
+          <w:ilvl w:val="0"/>
+          <w:numId w:val="0"/>
+        </w:numPr>
+        <w:jc w:val="both"/>
+        <w:rPr>
+          <w:rFonts w:hint="default"/>
+          <w:lang w:val="en-US"/>
+        </w:rPr>
+      </w:pPr>
+    </w:p>
+    <w:p>
+      <w:pPr>
+        <w:numPr>
+          <w:ilvl w:val="0"/>
+          <w:numId w:val="0"/>
+        </w:numPr>
+        <w:jc w:val="both"/>
+        <w:rPr>
+          <w:rFonts w:hint="default"/>
+          <w:lang w:val="en-US"/>
+        </w:rPr>
+      </w:pPr>
+      <w:r>
+        <w:rPr>
+          <w:rFonts w:hint="default"/>
+          <w:lang w:val="en-US"/>
+        </w:rPr>
+        <w:t>First we need to create a middleware for the Admin. To do that you need to add the following command in the terminal:</w:t>
+      </w:r>
+    </w:p>
+    <w:tbl>
+      <w:tblPr>
+        <w:tblStyle w:val="4"/>
+        <w:tblW w:w="0" w:type="auto"/>
+        <w:tblInd w:w="0" w:type="dxa"/>
+        <w:tblBorders>
+          <w:top w:val="single" w:color="auto" w:sz="4" w:space="0"/>
+          <w:left w:val="single" w:color="auto" w:sz="4" w:space="0"/>
+          <w:bottom w:val="single" w:color="auto" w:sz="4" w:space="0"/>
+          <w:right w:val="single" w:color="auto" w:sz="4" w:space="0"/>
+          <w:insideH w:val="single" w:color="auto" w:sz="4" w:space="0"/>
+          <w:insideV w:val="single" w:color="auto" w:sz="4" w:space="0"/>
+        </w:tblBorders>
+        <w:tblLayout w:type="autofit"/>
+        <w:tblCellMar>
+          <w:left w:w="108" w:type="dxa"/>
+          <w:right w:w="108" w:type="dxa"/>
+        </w:tblCellMar>
+      </w:tblPr>
+      <w:tblGrid>
+        <w:gridCol w:w="8522"/>
+      </w:tblGrid>
+      <w:tr>
+        <w:tblPrEx>
+          <w:tblBorders>
+            <w:top w:val="single" w:color="auto" w:sz="4" w:space="0"/>
+            <w:left w:val="single" w:color="auto" w:sz="4" w:space="0"/>
+            <w:bottom w:val="single" w:color="auto" w:sz="4" w:space="0"/>
+            <w:right w:val="single" w:color="auto" w:sz="4" w:space="0"/>
+            <w:insideH w:val="single" w:color="auto" w:sz="4" w:space="0"/>
+            <w:insideV w:val="single" w:color="auto" w:sz="4" w:space="0"/>
+          </w:tblBorders>
+          <w:tblCellMar>
+            <w:left w:w="108" w:type="dxa"/>
+            <w:right w:w="108" w:type="dxa"/>
+          </w:tblCellMar>
+        </w:tblPrEx>
+        <w:tc>
+          <w:tcPr>
+            <w:tcW w:w="8522" w:type="dxa"/>
+          </w:tcPr>
+          <w:p>
+            <w:pPr>
+              <w:numPr>
+                <w:ilvl w:val="0"/>
+                <w:numId w:val="0"/>
+              </w:numPr>
+              <w:jc w:val="both"/>
+              <w:rPr>
+                <w:rFonts w:hint="default"/>
+                <w:vertAlign w:val="baseline"/>
+                <w:lang w:val="en-US"/>
+              </w:rPr>
+            </w:pPr>
+            <w:r>
+              <w:rPr>
+                <w:rFonts w:hint="default"/>
+                <w:vertAlign w:val="baseline"/>
+                <w:lang w:val="en-US"/>
+              </w:rPr>
+              <w:t>php artisan make:middleware Admin</w:t>
+            </w:r>
+          </w:p>
+        </w:tc>
+      </w:tr>
+    </w:tbl>
+    <w:p>
+      <w:pPr>
+        <w:numPr>
+          <w:ilvl w:val="0"/>
+          <w:numId w:val="0"/>
+        </w:numPr>
+        <w:jc w:val="both"/>
+        <w:rPr>
+          <w:rFonts w:hint="default"/>
+          <w:lang w:val="en-US"/>
+        </w:rPr>
+      </w:pPr>
+      <w:r>
+        <w:rPr>
+          <w:rFonts w:hint="default"/>
+          <w:lang w:val="en-US"/>
+        </w:rPr>
+        <w:t xml:space="preserve"> </w:t>
+      </w:r>
+    </w:p>
+    <w:p>
+      <w:pPr>
+        <w:numPr>
+          <w:ilvl w:val="0"/>
+          <w:numId w:val="0"/>
+        </w:numPr>
+        <w:jc w:val="both"/>
+        <w:rPr>
+          <w:rFonts w:hint="default"/>
+          <w:lang w:val="en-US"/>
+        </w:rPr>
+      </w:pPr>
+      <w:r>
+        <w:rPr>
+          <w:rFonts w:hint="default"/>
+          <w:lang w:val="en-US"/>
+        </w:rPr>
+        <w:t>The above code will create a middleware named ‘Admin’(http\middleware\Admin.php)</w:t>
+      </w:r>
+    </w:p>
+    <w:p>
+      <w:pPr>
+        <w:numPr>
+          <w:ilvl w:val="0"/>
+          <w:numId w:val="0"/>
+        </w:numPr>
+        <w:jc w:val="both"/>
+        <w:rPr>
+          <w:rFonts w:hint="default"/>
+          <w:lang w:val="en-US"/>
+        </w:rPr>
+      </w:pPr>
+    </w:p>
+    <w:p>
+      <w:pPr>
+        <w:numPr>
+          <w:ilvl w:val="0"/>
+          <w:numId w:val="0"/>
+        </w:numPr>
+        <w:jc w:val="both"/>
+        <w:rPr>
+          <w:rFonts w:hint="default"/>
+          <w:lang w:val="en-US"/>
+        </w:rPr>
+      </w:pPr>
+      <w:r>
+        <w:rPr>
+          <w:rFonts w:hint="default"/>
+          <w:lang w:val="en-US"/>
+        </w:rPr>
+        <w:t>After you have created the middleware you need to register the middleware. To register middleware you need to go to Bootstrap\app.php. Now you need register your middleware inside withMiddleware function as shown below:</w:t>
+      </w:r>
+    </w:p>
+    <w:p>
+      <w:pPr>
+        <w:numPr>
+          <w:ilvl w:val="0"/>
+          <w:numId w:val="0"/>
+        </w:numPr>
+        <w:jc w:val="both"/>
+        <w:rPr>
+          <w:rFonts w:hint="default"/>
+          <w:lang w:val="en-US"/>
+        </w:rPr>
+      </w:pPr>
+    </w:p>
+    <w:tbl>
+      <w:tblPr>
+        <w:tblStyle w:val="4"/>
+        <w:tblW w:w="0" w:type="auto"/>
+        <w:tblInd w:w="0" w:type="dxa"/>
+        <w:tblBorders>
+          <w:top w:val="single" w:color="auto" w:sz="4" w:space="0"/>
+          <w:left w:val="single" w:color="auto" w:sz="4" w:space="0"/>
+          <w:bottom w:val="single" w:color="auto" w:sz="4" w:space="0"/>
+          <w:right w:val="single" w:color="auto" w:sz="4" w:space="0"/>
+          <w:insideH w:val="single" w:color="auto" w:sz="4" w:space="0"/>
+          <w:insideV w:val="single" w:color="auto" w:sz="4" w:space="0"/>
+        </w:tblBorders>
+        <w:tblLayout w:type="autofit"/>
+        <w:tblCellMar>
+          <w:left w:w="108" w:type="dxa"/>
+          <w:right w:w="108" w:type="dxa"/>
+        </w:tblCellMar>
+      </w:tblPr>
+      <w:tblGrid>
+        <w:gridCol w:w="8522"/>
+      </w:tblGrid>
+      <w:tr>
+        <w:tblPrEx>
+          <w:tblBorders>
+            <w:top w:val="single" w:color="auto" w:sz="4" w:space="0"/>
+            <w:left w:val="single" w:color="auto" w:sz="4" w:space="0"/>
+            <w:bottom w:val="single" w:color="auto" w:sz="4" w:space="0"/>
+            <w:right w:val="single" w:color="auto" w:sz="4" w:space="0"/>
+            <w:insideH w:val="single" w:color="auto" w:sz="4" w:space="0"/>
+            <w:insideV w:val="single" w:color="auto" w:sz="4" w:space="0"/>
+          </w:tblBorders>
+          <w:tblCellMar>
+            <w:left w:w="108" w:type="dxa"/>
+            <w:right w:w="108" w:type="dxa"/>
+          </w:tblCellMar>
+        </w:tblPrEx>
+        <w:tc>
+          <w:tcPr>
+            <w:tcW w:w="8522" w:type="dxa"/>
+          </w:tcPr>
+          <w:p>
+            <w:pPr>
+              <w:numPr>
+                <w:ilvl w:val="0"/>
+                <w:numId w:val="0"/>
+              </w:numPr>
+              <w:jc w:val="both"/>
+              <w:rPr>
+                <w:rFonts w:hint="default"/>
+                <w:vertAlign w:val="baseline"/>
+                <w:lang w:val="en-US"/>
+              </w:rPr>
+            </w:pPr>
+            <w:r>
+              <w:rPr>
+                <w:rFonts w:hint="default"/>
+                <w:vertAlign w:val="baseline"/>
+                <w:lang w:val="en-US"/>
+              </w:rPr>
+              <w:t>$middleware-&gt;alias(['admin' =&gt; App\Http\Middleware\Admin::class]);</w:t>
+            </w:r>
+          </w:p>
+        </w:tc>
+      </w:tr>
+      <w:tr>
+        <w:tblPrEx>
+          <w:tblBorders>
+            <w:top w:val="single" w:color="auto" w:sz="4" w:space="0"/>
+            <w:left w:val="single" w:color="auto" w:sz="4" w:space="0"/>
+            <w:bottom w:val="single" w:color="auto" w:sz="4" w:space="0"/>
+            <w:right w:val="single" w:color="auto" w:sz="4" w:space="0"/>
+            <w:insideH w:val="single" w:color="auto" w:sz="4" w:space="0"/>
+            <w:insideV w:val="single" w:color="auto" w:sz="4" w:space="0"/>
+          </w:tblBorders>
+          <w:tblCellMar>
+            <w:left w:w="108" w:type="dxa"/>
+            <w:right w:w="108" w:type="dxa"/>
+          </w:tblCellMar>
+        </w:tblPrEx>
+        <w:tc>
+          <w:tcPr>
+            <w:tcW w:w="8522" w:type="dxa"/>
+          </w:tcPr>
+          <w:p>
+            <w:pPr>
+              <w:numPr>
+                <w:ilvl w:val="0"/>
+                <w:numId w:val="0"/>
+              </w:numPr>
+              <w:jc w:val="both"/>
+              <w:rPr>
+                <w:rFonts w:hint="default"/>
+                <w:vertAlign w:val="baseline"/>
+                <w:lang w:val="en-US"/>
+              </w:rPr>
+            </w:pPr>
+            <w:r>
+              <w:drawing>
+                <wp:inline distT="0" distB="0" distL="114300" distR="114300">
+                  <wp:extent cx="5270500" cy="2760345"/>
+                  <wp:effectExtent l="0" t="0" r="2540" b="13335"/>
+                  <wp:docPr id="59" name="Picture 1"/>
+                  <wp:cNvGraphicFramePr>
+                    <a:graphicFrameLocks xmlns:a="http://schemas.openxmlformats.org/drawingml/2006/main" noChangeAspect="1"/>
+                  </wp:cNvGraphicFramePr>
+                  <a:graphic xmlns:a="http://schemas.openxmlformats.org/drawingml/2006/main">
+                    <a:graphicData uri="http://schemas.openxmlformats.org/drawingml/2006/picture">
+                      <pic:pic xmlns:pic="http://schemas.openxmlformats.org/drawingml/2006/picture">
+                        <pic:nvPicPr>
+                          <pic:cNvPr id="59" name="Picture 1"/>
+                          <pic:cNvPicPr>
+                            <a:picLocks noChangeAspect="1"/>
+                          </pic:cNvPicPr>
+                        </pic:nvPicPr>
+                        <pic:blipFill>
+                          <a:blip r:embed="rId62"/>
+                          <a:stretch>
+                            <a:fillRect/>
+                          </a:stretch>
+                        </pic:blipFill>
+                        <pic:spPr>
+                          <a:xfrm>
+                            <a:off x="0" y="0"/>
+                            <a:ext cx="5270500" cy="2760345"/>
+                          </a:xfrm>
+                          <a:prstGeom prst="rect">
+                            <a:avLst/>
+                          </a:prstGeom>
+                          <a:noFill/>
+                          <a:ln>
+                            <a:noFill/>
+                          </a:ln>
+                        </pic:spPr>
+                      </pic:pic>
+                    </a:graphicData>
+                  </a:graphic>
+                </wp:inline>
+              </w:drawing>
+            </w:r>
+          </w:p>
+        </w:tc>
+      </w:tr>
+    </w:tbl>
+    <w:p>
+      <w:pPr>
+        <w:numPr>
+          <w:ilvl w:val="0"/>
+          <w:numId w:val="0"/>
+        </w:numPr>
+        <w:jc w:val="both"/>
+        <w:rPr>
+          <w:rFonts w:hint="default"/>
+          <w:lang w:val="en-US"/>
+        </w:rPr>
+      </w:pPr>
+      <w:r>
+        <w:rPr>
+          <w:rFonts w:hint="default"/>
+          <w:lang w:val="en-US"/>
+        </w:rPr>
+        <w:t>After this go to the Admin middleware and write the following code on top as shown below:</w:t>
+      </w:r>
+    </w:p>
+    <w:tbl>
+      <w:tblPr>
+        <w:tblStyle w:val="4"/>
+        <w:tblW w:w="0" w:type="auto"/>
+        <w:tblInd w:w="0" w:type="dxa"/>
+        <w:tblBorders>
+          <w:top w:val="single" w:color="auto" w:sz="4" w:space="0"/>
+          <w:left w:val="single" w:color="auto" w:sz="4" w:space="0"/>
+          <w:bottom w:val="single" w:color="auto" w:sz="4" w:space="0"/>
+          <w:right w:val="single" w:color="auto" w:sz="4" w:space="0"/>
+          <w:insideH w:val="single" w:color="auto" w:sz="4" w:space="0"/>
+          <w:insideV w:val="single" w:color="auto" w:sz="4" w:space="0"/>
+        </w:tblBorders>
+        <w:tblLayout w:type="autofit"/>
+        <w:tblCellMar>
+          <w:left w:w="108" w:type="dxa"/>
+          <w:right w:w="108" w:type="dxa"/>
+        </w:tblCellMar>
+      </w:tblPr>
+      <w:tblGrid>
+        <w:gridCol w:w="8522"/>
+      </w:tblGrid>
+      <w:tr>
+        <w:tblPrEx>
+          <w:tblBorders>
+            <w:top w:val="single" w:color="auto" w:sz="4" w:space="0"/>
+            <w:left w:val="single" w:color="auto" w:sz="4" w:space="0"/>
+            <w:bottom w:val="single" w:color="auto" w:sz="4" w:space="0"/>
+            <w:right w:val="single" w:color="auto" w:sz="4" w:space="0"/>
+            <w:insideH w:val="single" w:color="auto" w:sz="4" w:space="0"/>
+            <w:insideV w:val="single" w:color="auto" w:sz="4" w:space="0"/>
+          </w:tblBorders>
+          <w:tblCellMar>
+            <w:left w:w="108" w:type="dxa"/>
+            <w:right w:w="108" w:type="dxa"/>
+          </w:tblCellMar>
+        </w:tblPrEx>
+        <w:tc>
+          <w:tcPr>
+            <w:tcW w:w="8522" w:type="dxa"/>
+          </w:tcPr>
+          <w:p>
+            <w:pPr>
+              <w:numPr>
+                <w:ilvl w:val="0"/>
+                <w:numId w:val="0"/>
+              </w:numPr>
+              <w:jc w:val="both"/>
+              <w:rPr>
+                <w:rFonts w:hint="default"/>
+                <w:vertAlign w:val="baseline"/>
+                <w:lang w:val="en-US"/>
+              </w:rPr>
+            </w:pPr>
+            <w:r>
+              <w:rPr>
+                <w:rFonts w:hint="default"/>
+                <w:vertAlign w:val="baseline"/>
+                <w:lang w:val="en-US"/>
+              </w:rPr>
+              <w:t>use Illuminate\Support\Facades\Auth;</w:t>
+            </w:r>
+          </w:p>
+        </w:tc>
+      </w:tr>
+      <w:tr>
+        <w:tblPrEx>
+          <w:tblBorders>
+            <w:top w:val="single" w:color="auto" w:sz="4" w:space="0"/>
+            <w:left w:val="single" w:color="auto" w:sz="4" w:space="0"/>
+            <w:bottom w:val="single" w:color="auto" w:sz="4" w:space="0"/>
+            <w:right w:val="single" w:color="auto" w:sz="4" w:space="0"/>
+            <w:insideH w:val="single" w:color="auto" w:sz="4" w:space="0"/>
+            <w:insideV w:val="single" w:color="auto" w:sz="4" w:space="0"/>
+          </w:tblBorders>
+          <w:tblCellMar>
+            <w:left w:w="108" w:type="dxa"/>
+            <w:right w:w="108" w:type="dxa"/>
+          </w:tblCellMar>
+        </w:tblPrEx>
+        <w:tc>
+          <w:tcPr>
+            <w:tcW w:w="8522" w:type="dxa"/>
+          </w:tcPr>
+          <w:p>
+            <w:pPr>
+              <w:numPr>
+                <w:ilvl w:val="0"/>
+                <w:numId w:val="0"/>
+              </w:numPr>
+              <w:jc w:val="both"/>
+              <w:rPr>
+                <w:rFonts w:hint="default"/>
+                <w:vertAlign w:val="baseline"/>
+                <w:lang w:val="en-US"/>
+              </w:rPr>
+            </w:pPr>
+            <w:r>
+              <w:drawing>
+                <wp:inline distT="0" distB="0" distL="114300" distR="114300">
+                  <wp:extent cx="4427220" cy="4282440"/>
+                  <wp:effectExtent l="0" t="0" r="7620" b="0"/>
+                  <wp:docPr id="60" name="Picture 2"/>
+                  <wp:cNvGraphicFramePr>
+                    <a:graphicFrameLocks xmlns:a="http://schemas.openxmlformats.org/drawingml/2006/main" noChangeAspect="1"/>
+                  </wp:cNvGraphicFramePr>
+                  <a:graphic xmlns:a="http://schemas.openxmlformats.org/drawingml/2006/main">
+                    <a:graphicData uri="http://schemas.openxmlformats.org/drawingml/2006/picture">
+                      <pic:pic xmlns:pic="http://schemas.openxmlformats.org/drawingml/2006/picture">
+                        <pic:nvPicPr>
+                          <pic:cNvPr id="60" name="Picture 2"/>
+                          <pic:cNvPicPr>
+                            <a:picLocks noChangeAspect="1"/>
+                          </pic:cNvPicPr>
+                        </pic:nvPicPr>
+                        <pic:blipFill>
+                          <a:blip r:embed="rId63"/>
+                          <a:stretch>
+                            <a:fillRect/>
+                          </a:stretch>
+                        </pic:blipFill>
+                        <pic:spPr>
+                          <a:xfrm>
+                            <a:off x="0" y="0"/>
+                            <a:ext cx="4427220" cy="4282440"/>
+                          </a:xfrm>
+                          <a:prstGeom prst="rect">
+                            <a:avLst/>
+                          </a:prstGeom>
+                          <a:noFill/>
+                          <a:ln>
+                            <a:noFill/>
+                          </a:ln>
+                        </pic:spPr>
+                      </pic:pic>
+                    </a:graphicData>
+                  </a:graphic>
+                </wp:inline>
+              </w:drawing>
+            </w:r>
+          </w:p>
+        </w:tc>
+      </w:tr>
+    </w:tbl>
+    <w:p>
+      <w:pPr>
+        <w:numPr>
+          <w:ilvl w:val="0"/>
+          <w:numId w:val="0"/>
+        </w:numPr>
+        <w:jc w:val="both"/>
+        <w:rPr>
+          <w:rFonts w:hint="default"/>
+          <w:lang w:val="en-US"/>
+        </w:rPr>
+      </w:pPr>
+    </w:p>
+    <w:p>
+      <w:pPr>
+        <w:numPr>
+          <w:ilvl w:val="0"/>
+          <w:numId w:val="0"/>
+        </w:numPr>
+        <w:jc w:val="both"/>
+        <w:rPr>
+          <w:rFonts w:hint="default"/>
+          <w:lang w:val="en-US"/>
+        </w:rPr>
+      </w:pPr>
+      <w:r>
+        <w:rPr>
+          <w:rFonts w:hint="default"/>
+          <w:lang w:val="en-US"/>
+        </w:rPr>
+        <w:t>Then inside handle function you need to create ‘if’ function with the following functionality as shown below:</w:t>
+      </w:r>
+    </w:p>
+    <w:tbl>
+      <w:tblPr>
+        <w:tblStyle w:val="4"/>
+        <w:tblW w:w="0" w:type="auto"/>
+        <w:tblInd w:w="0" w:type="dxa"/>
+        <w:tblBorders>
+          <w:top w:val="single" w:color="auto" w:sz="4" w:space="0"/>
+          <w:left w:val="single" w:color="auto" w:sz="4" w:space="0"/>
+          <w:bottom w:val="single" w:color="auto" w:sz="4" w:space="0"/>
+          <w:right w:val="single" w:color="auto" w:sz="4" w:space="0"/>
+          <w:insideH w:val="single" w:color="auto" w:sz="4" w:space="0"/>
+          <w:insideV w:val="single" w:color="auto" w:sz="4" w:space="0"/>
+        </w:tblBorders>
+        <w:tblLayout w:type="autofit"/>
+        <w:tblCellMar>
+          <w:left w:w="108" w:type="dxa"/>
+          <w:right w:w="108" w:type="dxa"/>
+        </w:tblCellMar>
+      </w:tblPr>
+      <w:tblGrid>
+        <w:gridCol w:w="8522"/>
+      </w:tblGrid>
+      <w:tr>
+        <w:tblPrEx>
+          <w:tblBorders>
+            <w:top w:val="single" w:color="auto" w:sz="4" w:space="0"/>
+            <w:left w:val="single" w:color="auto" w:sz="4" w:space="0"/>
+            <w:bottom w:val="single" w:color="auto" w:sz="4" w:space="0"/>
+            <w:right w:val="single" w:color="auto" w:sz="4" w:space="0"/>
+            <w:insideH w:val="single" w:color="auto" w:sz="4" w:space="0"/>
+            <w:insideV w:val="single" w:color="auto" w:sz="4" w:space="0"/>
+          </w:tblBorders>
+        </w:tblPrEx>
+        <w:tc>
+          <w:tcPr>
+            <w:tcW w:w="8522" w:type="dxa"/>
+          </w:tcPr>
+          <w:p>
+            <w:pPr>
+              <w:numPr>
+                <w:ilvl w:val="0"/>
+                <w:numId w:val="0"/>
+              </w:numPr>
+              <w:jc w:val="both"/>
+              <w:rPr>
+                <w:rFonts w:hint="default"/>
+                <w:vertAlign w:val="baseline"/>
+                <w:lang w:val="en-US"/>
+              </w:rPr>
+            </w:pPr>
+            <w:r>
+              <w:rPr>
+                <w:rFonts w:hint="default"/>
+                <w:vertAlign w:val="baseline"/>
+                <w:lang w:val="en-US"/>
+              </w:rPr>
+              <w:t xml:space="preserve"> if (!Auth::guard('admin')-&gt;check()) {</w:t>
+            </w:r>
+          </w:p>
+          <w:p>
+            <w:pPr>
+              <w:numPr>
+                <w:ilvl w:val="0"/>
+                <w:numId w:val="0"/>
+              </w:numPr>
+              <w:jc w:val="both"/>
+              <w:rPr>
+                <w:rFonts w:hint="default"/>
+                <w:vertAlign w:val="baseline"/>
+                <w:lang w:val="en-US"/>
+              </w:rPr>
+            </w:pPr>
+            <w:r>
+              <w:rPr>
+                <w:rFonts w:hint="default"/>
+                <w:vertAlign w:val="baseline"/>
+                <w:lang w:val="en-US"/>
+              </w:rPr>
+              <w:t xml:space="preserve">            return redirect()-&gt;route('admin.login')-&gt;with('error', 'You are not permitted to access this page.');</w:t>
+            </w:r>
+          </w:p>
+          <w:p>
+            <w:pPr>
+              <w:numPr>
+                <w:ilvl w:val="0"/>
+                <w:numId w:val="0"/>
+              </w:numPr>
+              <w:jc w:val="both"/>
+              <w:rPr>
+                <w:rFonts w:hint="default"/>
+                <w:vertAlign w:val="baseline"/>
+                <w:lang w:val="en-US"/>
+              </w:rPr>
+            </w:pPr>
+            <w:r>
+              <w:rPr>
+                <w:rFonts w:hint="default"/>
+                <w:vertAlign w:val="baseline"/>
+                <w:lang w:val="en-US"/>
+              </w:rPr>
+              <w:t xml:space="preserve">        }</w:t>
+            </w:r>
+          </w:p>
+        </w:tc>
+      </w:tr>
+      <w:tr>
+        <w:tblPrEx>
+          <w:tblBorders>
+            <w:top w:val="single" w:color="auto" w:sz="4" w:space="0"/>
+            <w:left w:val="single" w:color="auto" w:sz="4" w:space="0"/>
+            <w:bottom w:val="single" w:color="auto" w:sz="4" w:space="0"/>
+            <w:right w:val="single" w:color="auto" w:sz="4" w:space="0"/>
+            <w:insideH w:val="single" w:color="auto" w:sz="4" w:space="0"/>
+            <w:insideV w:val="single" w:color="auto" w:sz="4" w:space="0"/>
+          </w:tblBorders>
+          <w:tblCellMar>
+            <w:left w:w="108" w:type="dxa"/>
+            <w:right w:w="108" w:type="dxa"/>
+          </w:tblCellMar>
+        </w:tblPrEx>
+        <w:tc>
+          <w:tcPr>
+            <w:tcW w:w="8522" w:type="dxa"/>
+          </w:tcPr>
+          <w:p>
+            <w:pPr>
+              <w:numPr>
+                <w:ilvl w:val="0"/>
+                <w:numId w:val="0"/>
+              </w:numPr>
+              <w:jc w:val="both"/>
+              <w:rPr>
+                <w:rFonts w:hint="default"/>
+                <w:vertAlign w:val="baseline"/>
+                <w:lang w:val="en-US"/>
+              </w:rPr>
+            </w:pPr>
+            <w:r>
+              <w:drawing>
+                <wp:inline distT="0" distB="0" distL="114300" distR="114300">
+                  <wp:extent cx="5266690" cy="3103880"/>
+                  <wp:effectExtent l="0" t="0" r="6350" b="5080"/>
+                  <wp:docPr id="61" name="Picture 3"/>
+                  <wp:cNvGraphicFramePr>
+                    <a:graphicFrameLocks xmlns:a="http://schemas.openxmlformats.org/drawingml/2006/main" noChangeAspect="1"/>
+                  </wp:cNvGraphicFramePr>
+                  <a:graphic xmlns:a="http://schemas.openxmlformats.org/drawingml/2006/main">
+                    <a:graphicData uri="http://schemas.openxmlformats.org/drawingml/2006/picture">
+                      <pic:pic xmlns:pic="http://schemas.openxmlformats.org/drawingml/2006/picture">
+                        <pic:nvPicPr>
+                          <pic:cNvPr id="61" name="Picture 3"/>
+                          <pic:cNvPicPr>
+                            <a:picLocks noChangeAspect="1"/>
+                          </pic:cNvPicPr>
+                        </pic:nvPicPr>
+                        <pic:blipFill>
+                          <a:blip r:embed="rId64"/>
+                          <a:stretch>
+                            <a:fillRect/>
+                          </a:stretch>
+                        </pic:blipFill>
+                        <pic:spPr>
+                          <a:xfrm>
+                            <a:off x="0" y="0"/>
+                            <a:ext cx="5266690" cy="3103880"/>
+                          </a:xfrm>
+                          <a:prstGeom prst="rect">
+                            <a:avLst/>
+                          </a:prstGeom>
+                          <a:noFill/>
+                          <a:ln>
+                            <a:noFill/>
+                          </a:ln>
+                        </pic:spPr>
+                      </pic:pic>
+                    </a:graphicData>
+                  </a:graphic>
+                </wp:inline>
+              </w:drawing>
+            </w:r>
+          </w:p>
+        </w:tc>
+      </w:tr>
+    </w:tbl>
+    <w:p>
+      <w:pPr>
+        <w:numPr>
+          <w:ilvl w:val="0"/>
+          <w:numId w:val="0"/>
+        </w:numPr>
+        <w:jc w:val="both"/>
+        <w:rPr>
+          <w:rFonts w:hint="default"/>
+          <w:lang w:val="en-US"/>
+        </w:rPr>
+      </w:pPr>
+      <w:r>
+        <w:rPr>
+          <w:rFonts w:hint="default"/>
+          <w:lang w:val="en-US"/>
+        </w:rPr>
+        <w:t>After this go to the web.php and add a route for middleware as shown below:</w:t>
+      </w:r>
+    </w:p>
+    <w:tbl>
+      <w:tblPr>
+        <w:tblStyle w:val="4"/>
+        <w:tblW w:w="0" w:type="auto"/>
+        <w:tblInd w:w="0" w:type="dxa"/>
+        <w:tblBorders>
+          <w:top w:val="single" w:color="auto" w:sz="4" w:space="0"/>
+          <w:left w:val="single" w:color="auto" w:sz="4" w:space="0"/>
+          <w:bottom w:val="single" w:color="auto" w:sz="4" w:space="0"/>
+          <w:right w:val="single" w:color="auto" w:sz="4" w:space="0"/>
+          <w:insideH w:val="single" w:color="auto" w:sz="4" w:space="0"/>
+          <w:insideV w:val="single" w:color="auto" w:sz="4" w:space="0"/>
+        </w:tblBorders>
+        <w:tblLayout w:type="autofit"/>
+        <w:tblCellMar>
+          <w:left w:w="108" w:type="dxa"/>
+          <w:right w:w="108" w:type="dxa"/>
+        </w:tblCellMar>
+      </w:tblPr>
+      <w:tblGrid>
+        <w:gridCol w:w="8522"/>
+      </w:tblGrid>
+      <w:tr>
+        <w:tblPrEx>
+          <w:tblBorders>
+            <w:top w:val="single" w:color="auto" w:sz="4" w:space="0"/>
+            <w:left w:val="single" w:color="auto" w:sz="4" w:space="0"/>
+            <w:bottom w:val="single" w:color="auto" w:sz="4" w:space="0"/>
+            <w:right w:val="single" w:color="auto" w:sz="4" w:space="0"/>
+            <w:insideH w:val="single" w:color="auto" w:sz="4" w:space="0"/>
+            <w:insideV w:val="single" w:color="auto" w:sz="4" w:space="0"/>
+          </w:tblBorders>
+        </w:tblPrEx>
+        <w:tc>
+          <w:tcPr>
+            <w:tcW w:w="8522" w:type="dxa"/>
+          </w:tcPr>
+          <w:p>
+            <w:pPr>
+              <w:numPr>
+                <w:ilvl w:val="0"/>
+                <w:numId w:val="0"/>
+              </w:numPr>
+              <w:jc w:val="both"/>
+              <w:rPr>
+                <w:rFonts w:hint="default"/>
+                <w:vertAlign w:val="baseline"/>
+                <w:lang w:val="en-US"/>
+              </w:rPr>
+            </w:pPr>
+            <w:r>
+              <w:rPr>
+                <w:rFonts w:hint="default"/>
+                <w:vertAlign w:val="baseline"/>
+                <w:lang w:val="en-US"/>
+              </w:rPr>
+              <w:t>Route::middleware('admin')-&gt;group(function () {});</w:t>
+            </w:r>
+          </w:p>
+        </w:tc>
+      </w:tr>
+      <w:tr>
+        <w:tblPrEx>
+          <w:tblBorders>
+            <w:top w:val="single" w:color="auto" w:sz="4" w:space="0"/>
+            <w:left w:val="single" w:color="auto" w:sz="4" w:space="0"/>
+            <w:bottom w:val="single" w:color="auto" w:sz="4" w:space="0"/>
+            <w:right w:val="single" w:color="auto" w:sz="4" w:space="0"/>
+            <w:insideH w:val="single" w:color="auto" w:sz="4" w:space="0"/>
+            <w:insideV w:val="single" w:color="auto" w:sz="4" w:space="0"/>
+          </w:tblBorders>
+          <w:tblCellMar>
+            <w:left w:w="108" w:type="dxa"/>
+            <w:right w:w="108" w:type="dxa"/>
+          </w:tblCellMar>
+        </w:tblPrEx>
+        <w:tc>
+          <w:tcPr>
+            <w:tcW w:w="8522" w:type="dxa"/>
+          </w:tcPr>
+          <w:p>
+            <w:pPr>
+              <w:numPr>
+                <w:ilvl w:val="0"/>
+                <w:numId w:val="0"/>
+              </w:numPr>
+              <w:jc w:val="both"/>
+              <w:rPr>
+                <w:rFonts w:hint="default"/>
+                <w:vertAlign w:val="baseline"/>
+                <w:lang w:val="en-US"/>
+              </w:rPr>
+            </w:pPr>
+            <w:r>
+              <w:drawing>
+                <wp:inline distT="0" distB="0" distL="114300" distR="114300">
+                  <wp:extent cx="5271770" cy="1005205"/>
+                  <wp:effectExtent l="0" t="0" r="1270" b="635"/>
+                  <wp:docPr id="62" name="Picture 4"/>
+                  <wp:cNvGraphicFramePr>
+                    <a:graphicFrameLocks xmlns:a="http://schemas.openxmlformats.org/drawingml/2006/main" noChangeAspect="1"/>
+                  </wp:cNvGraphicFramePr>
+                  <a:graphic xmlns:a="http://schemas.openxmlformats.org/drawingml/2006/main">
+                    <a:graphicData uri="http://schemas.openxmlformats.org/drawingml/2006/picture">
+                      <pic:pic xmlns:pic="http://schemas.openxmlformats.org/drawingml/2006/picture">
+                        <pic:nvPicPr>
+                          <pic:cNvPr id="62" name="Picture 4"/>
+                          <pic:cNvPicPr>
+                            <a:picLocks noChangeAspect="1"/>
+                          </pic:cNvPicPr>
+                        </pic:nvPicPr>
+                        <pic:blipFill>
+                          <a:blip r:embed="rId65"/>
+                          <a:stretch>
+                            <a:fillRect/>
+                          </a:stretch>
+                        </pic:blipFill>
+                        <pic:spPr>
+                          <a:xfrm>
+                            <a:off x="0" y="0"/>
+                            <a:ext cx="5271770" cy="1005205"/>
+                          </a:xfrm>
+                          <a:prstGeom prst="rect">
+                            <a:avLst/>
+                          </a:prstGeom>
+                          <a:noFill/>
+                          <a:ln>
+                            <a:noFill/>
+                          </a:ln>
+                        </pic:spPr>
+                      </pic:pic>
+                    </a:graphicData>
+                  </a:graphic>
+                </wp:inline>
+              </w:drawing>
+            </w:r>
+          </w:p>
+        </w:tc>
+      </w:tr>
+    </w:tbl>
+    <w:p>
+      <w:pPr>
+        <w:numPr>
+          <w:ilvl w:val="0"/>
+          <w:numId w:val="0"/>
+        </w:numPr>
+        <w:jc w:val="both"/>
+        <w:rPr>
+          <w:rFonts w:hint="default"/>
+          <w:lang w:val="en-US"/>
+        </w:rPr>
+      </w:pPr>
+    </w:p>
+    <w:p>
+      <w:pPr>
+        <w:numPr>
+          <w:ilvl w:val="0"/>
+          <w:numId w:val="0"/>
+        </w:numPr>
+        <w:jc w:val="both"/>
+        <w:rPr>
+          <w:rFonts w:hint="default"/>
+          <w:lang w:val="en-US"/>
+        </w:rPr>
+      </w:pPr>
+      <w:r>
+        <w:rPr>
+          <w:rFonts w:hint="default"/>
+          <w:lang w:val="en-US"/>
+        </w:rPr>
+        <w:t>Now inside this function copy the dashboard route and paste it as shown below:</w:t>
+      </w:r>
+    </w:p>
+    <w:tbl>
+      <w:tblPr>
+        <w:tblStyle w:val="4"/>
+        <w:tblW w:w="0" w:type="auto"/>
+        <w:tblInd w:w="0" w:type="dxa"/>
+        <w:tblBorders>
+          <w:top w:val="single" w:color="auto" w:sz="4" w:space="0"/>
+          <w:left w:val="single" w:color="auto" w:sz="4" w:space="0"/>
+          <w:bottom w:val="single" w:color="auto" w:sz="4" w:space="0"/>
+          <w:right w:val="single" w:color="auto" w:sz="4" w:space="0"/>
+          <w:insideH w:val="single" w:color="auto" w:sz="4" w:space="0"/>
+          <w:insideV w:val="single" w:color="auto" w:sz="4" w:space="0"/>
+        </w:tblBorders>
+        <w:tblLayout w:type="autofit"/>
+        <w:tblCellMar>
+          <w:left w:w="108" w:type="dxa"/>
+          <w:right w:w="108" w:type="dxa"/>
+        </w:tblCellMar>
+      </w:tblPr>
+      <w:tblGrid>
+        <w:gridCol w:w="8522"/>
+      </w:tblGrid>
+      <w:tr>
+        <w:tblPrEx>
+          <w:tblBorders>
+            <w:top w:val="single" w:color="auto" w:sz="4" w:space="0"/>
+            <w:left w:val="single" w:color="auto" w:sz="4" w:space="0"/>
+            <w:bottom w:val="single" w:color="auto" w:sz="4" w:space="0"/>
+            <w:right w:val="single" w:color="auto" w:sz="4" w:space="0"/>
+            <w:insideH w:val="single" w:color="auto" w:sz="4" w:space="0"/>
+            <w:insideV w:val="single" w:color="auto" w:sz="4" w:space="0"/>
+          </w:tblBorders>
+          <w:tblCellMar>
+            <w:left w:w="108" w:type="dxa"/>
+            <w:right w:w="108" w:type="dxa"/>
+          </w:tblCellMar>
+        </w:tblPrEx>
+        <w:tc>
+          <w:tcPr>
+            <w:tcW w:w="8522" w:type="dxa"/>
+          </w:tcPr>
+          <w:p>
+            <w:pPr>
+              <w:numPr>
+                <w:ilvl w:val="0"/>
+                <w:numId w:val="0"/>
+              </w:numPr>
+              <w:jc w:val="both"/>
+              <w:rPr>
+                <w:rFonts w:hint="default"/>
+                <w:vertAlign w:val="baseline"/>
+                <w:lang w:val="en-US"/>
+              </w:rPr>
+            </w:pPr>
+            <w:r>
+              <w:rPr>
+                <w:rFonts w:hint="default"/>
+                <w:vertAlign w:val="baseline"/>
+                <w:lang w:val="en-US"/>
+              </w:rPr>
+              <w:t>Route::middleware('admin')-&gt;group(function () {</w:t>
+            </w:r>
+          </w:p>
+          <w:p>
+            <w:pPr>
+              <w:numPr>
+                <w:ilvl w:val="0"/>
+                <w:numId w:val="0"/>
+              </w:numPr>
+              <w:jc w:val="both"/>
+              <w:rPr>
+                <w:rFonts w:hint="default"/>
+                <w:vertAlign w:val="baseline"/>
+                <w:lang w:val="en-US"/>
+              </w:rPr>
+            </w:pPr>
+            <w:r>
+              <w:rPr>
+                <w:rFonts w:hint="default"/>
+                <w:vertAlign w:val="baseline"/>
+                <w:lang w:val="en-US"/>
+              </w:rPr>
+              <w:t xml:space="preserve">    Route::get('/admin/dashboard', [AdminController::class, 'AdminDashboard'])-&gt;name('admin.dashboard');</w:t>
+            </w:r>
+          </w:p>
+          <w:p>
+            <w:pPr>
+              <w:numPr>
+                <w:ilvl w:val="0"/>
+                <w:numId w:val="0"/>
+              </w:numPr>
+              <w:jc w:val="both"/>
+              <w:rPr>
+                <w:rFonts w:hint="default"/>
+                <w:vertAlign w:val="baseline"/>
+                <w:lang w:val="en-US"/>
+              </w:rPr>
+            </w:pPr>
+            <w:r>
+              <w:rPr>
+                <w:rFonts w:hint="default"/>
+                <w:vertAlign w:val="baseline"/>
+                <w:lang w:val="en-US"/>
+              </w:rPr>
+              <w:t>});</w:t>
+            </w:r>
+          </w:p>
+          <w:p>
+            <w:pPr>
+              <w:numPr>
+                <w:ilvl w:val="0"/>
+                <w:numId w:val="0"/>
+              </w:numPr>
+              <w:jc w:val="both"/>
+              <w:rPr>
+                <w:rFonts w:hint="default"/>
+                <w:vertAlign w:val="baseline"/>
+                <w:lang w:val="en-US"/>
+              </w:rPr>
+            </w:pPr>
+          </w:p>
+        </w:tc>
+      </w:tr>
+      <w:tr>
+        <w:tblPrEx>
+          <w:tblBorders>
+            <w:top w:val="single" w:color="auto" w:sz="4" w:space="0"/>
+            <w:left w:val="single" w:color="auto" w:sz="4" w:space="0"/>
+            <w:bottom w:val="single" w:color="auto" w:sz="4" w:space="0"/>
+            <w:right w:val="single" w:color="auto" w:sz="4" w:space="0"/>
+            <w:insideH w:val="single" w:color="auto" w:sz="4" w:space="0"/>
+            <w:insideV w:val="single" w:color="auto" w:sz="4" w:space="0"/>
+          </w:tblBorders>
+          <w:tblCellMar>
+            <w:left w:w="108" w:type="dxa"/>
+            <w:right w:w="108" w:type="dxa"/>
+          </w:tblCellMar>
+        </w:tblPrEx>
+        <w:tc>
+          <w:tcPr>
+            <w:tcW w:w="8522" w:type="dxa"/>
+          </w:tcPr>
+          <w:p>
+            <w:pPr>
+              <w:numPr>
+                <w:ilvl w:val="0"/>
+                <w:numId w:val="0"/>
+              </w:numPr>
+              <w:jc w:val="both"/>
+              <w:rPr>
+                <w:rFonts w:hint="default"/>
+                <w:vertAlign w:val="baseline"/>
+                <w:lang w:val="en-US"/>
+              </w:rPr>
+            </w:pPr>
+            <w:r>
+              <w:drawing>
+                <wp:inline distT="0" distB="0" distL="114300" distR="114300">
+                  <wp:extent cx="5267960" cy="471805"/>
+                  <wp:effectExtent l="0" t="0" r="5080" b="635"/>
+                  <wp:docPr id="63" name="Picture 5"/>
+                  <wp:cNvGraphicFramePr>
+                    <a:graphicFrameLocks xmlns:a="http://schemas.openxmlformats.org/drawingml/2006/main" noChangeAspect="1"/>
+                  </wp:cNvGraphicFramePr>
+                  <a:graphic xmlns:a="http://schemas.openxmlformats.org/drawingml/2006/main">
+                    <a:graphicData uri="http://schemas.openxmlformats.org/drawingml/2006/picture">
+                      <pic:pic xmlns:pic="http://schemas.openxmlformats.org/drawingml/2006/picture">
+                        <pic:nvPicPr>
+                          <pic:cNvPr id="63" name="Picture 5"/>
+                          <pic:cNvPicPr>
+                            <a:picLocks noChangeAspect="1"/>
+                          </pic:cNvPicPr>
+                        </pic:nvPicPr>
+                        <pic:blipFill>
+                          <a:blip r:embed="rId66"/>
+                          <a:stretch>
+                            <a:fillRect/>
+                          </a:stretch>
+                        </pic:blipFill>
+                        <pic:spPr>
+                          <a:xfrm>
+                            <a:off x="0" y="0"/>
+                            <a:ext cx="5267960" cy="471805"/>
+                          </a:xfrm>
+                          <a:prstGeom prst="rect">
+                            <a:avLst/>
+                          </a:prstGeom>
+                          <a:noFill/>
+                          <a:ln>
+                            <a:noFill/>
+                          </a:ln>
+                        </pic:spPr>
+                      </pic:pic>
+                    </a:graphicData>
+                  </a:graphic>
+                </wp:inline>
+              </w:drawing>
+            </w:r>
+          </w:p>
+        </w:tc>
+      </w:tr>
+    </w:tbl>
+    <w:p>
+      <w:pPr>
+        <w:numPr>
+          <w:ilvl w:val="0"/>
+          <w:numId w:val="0"/>
+        </w:numPr>
+        <w:jc w:val="both"/>
+        <w:rPr>
+          <w:rFonts w:hint="default"/>
+          <w:lang w:val="en-US"/>
+        </w:rPr>
+      </w:pPr>
+    </w:p>
+    <w:p>
+      <w:pPr>
+        <w:numPr>
+          <w:ilvl w:val="0"/>
+          <w:numId w:val="0"/>
+        </w:numPr>
+        <w:jc w:val="both"/>
+        <w:rPr>
+          <w:rFonts w:hint="default"/>
+          <w:lang w:val="en-US"/>
+        </w:rPr>
+      </w:pPr>
+      <w:r>
+        <w:rPr>
+          <w:rFonts w:hint="default"/>
+          <w:lang w:val="en-US"/>
+        </w:rPr>
+        <w:t>After this when your admin user is not registered then you are not allowed to visit admin dashboard through the url. You are only allowed to enter if your admin user is verified.</w:t>
+      </w:r>
+    </w:p>
+    <w:p>
+      <w:pPr>
+        <w:numPr>
+          <w:ilvl w:val="0"/>
+          <w:numId w:val="0"/>
+        </w:numPr>
+        <w:jc w:val="both"/>
+        <w:rPr>
+          <w:rFonts w:hint="default"/>
+          <w:lang w:val="en-US"/>
+        </w:rPr>
+      </w:pPr>
+    </w:p>
+    <w:p>
+      <w:pPr>
+        <w:numPr>
+          <w:ilvl w:val="0"/>
+          <w:numId w:val="0"/>
+        </w:numPr>
+        <w:jc w:val="both"/>
+        <w:rPr>
+          <w:rFonts w:hint="default"/>
+          <w:lang w:val="en-US"/>
+        </w:rPr>
+      </w:pPr>
       <w:bookmarkStart w:id="0" w:name="_GoBack"/>
       <w:bookmarkEnd w:id="0"/>
     </w:p>

</xml_diff>

<commit_message>
Multi Auth Firget Password for Admin Part1 and where the design and route is created for forget password
</commit_message>
<xml_diff>
--- a/Laravel.docx
+++ b/Laravel.docx
@@ -317,6 +317,14 @@
       </w:tblGrid>
       <w:tr>
         <w:tblPrEx>
+          <w:tblBorders>
+            <w:top w:val="single" w:color="auto" w:sz="4" w:space="0"/>
+            <w:left w:val="single" w:color="auto" w:sz="4" w:space="0"/>
+            <w:bottom w:val="single" w:color="auto" w:sz="4" w:space="0"/>
+            <w:right w:val="single" w:color="auto" w:sz="4" w:space="0"/>
+            <w:insideH w:val="single" w:color="auto" w:sz="4" w:space="0"/>
+            <w:insideV w:val="single" w:color="auto" w:sz="4" w:space="0"/>
+          </w:tblBorders>
           <w:tblCellMar>
             <w:top w:w="0" w:type="dxa"/>
             <w:left w:w="108" w:type="dxa"/>
@@ -12715,6 +12723,10 @@
             <w:insideH w:val="single" w:color="auto" w:sz="4" w:space="0"/>
             <w:insideV w:val="single" w:color="auto" w:sz="4" w:space="0"/>
           </w:tblBorders>
+          <w:tblCellMar>
+            <w:left w:w="108" w:type="dxa"/>
+            <w:right w:w="108" w:type="dxa"/>
+          </w:tblCellMar>
         </w:tblPrEx>
         <w:tc>
           <w:tcPr>
@@ -12919,6 +12931,10 @@
             <w:insideH w:val="single" w:color="auto" w:sz="4" w:space="0"/>
             <w:insideV w:val="single" w:color="auto" w:sz="4" w:space="0"/>
           </w:tblBorders>
+          <w:tblCellMar>
+            <w:left w:w="108" w:type="dxa"/>
+            <w:right w:w="108" w:type="dxa"/>
+          </w:tblCellMar>
         </w:tblPrEx>
         <w:tc>
           <w:tcPr>
@@ -13307,6 +13323,796 @@
           <w:lang w:val="en-US"/>
         </w:rPr>
       </w:pPr>
+    </w:p>
+    <w:p>
+      <w:pPr>
+        <w:numPr>
+          <w:ilvl w:val="0"/>
+          <w:numId w:val="0"/>
+        </w:numPr>
+        <w:jc w:val="both"/>
+        <w:rPr>
+          <w:rFonts w:hint="default" w:ascii="Arial" w:hAnsi="Arial" w:cs="Arial"/>
+          <w:lang w:val="en-US"/>
+        </w:rPr>
+      </w:pPr>
+      <w:r>
+        <w:rPr>
+          <w:rFonts w:hint="default" w:ascii="Arial" w:hAnsi="Arial" w:cs="Arial"/>
+          <w:lang w:val="en-US"/>
+        </w:rPr>
+        <w:t>¥¥¥¥¥¥¥¥¥¥¥¥¥¥¥¥¥¥¥¥¥¥¥¥¥¥¥¥¥¥¥¥¥¥¥¥¥¥¥¥¥¥¥¥¥¥¥¥¥¥¥¥¥¥¥¥¥¥¥¥¥¥¥¥¥¥¥¥¥¥¥¥¥¥</w:t>
+      </w:r>
+    </w:p>
+    <w:p>
+      <w:pPr>
+        <w:numPr>
+          <w:ilvl w:val="0"/>
+          <w:numId w:val="0"/>
+        </w:numPr>
+        <w:jc w:val="both"/>
+        <w:rPr>
+          <w:rFonts w:hint="default" w:ascii="Arial" w:hAnsi="Arial" w:cs="Arial"/>
+          <w:lang w:val="en-US"/>
+        </w:rPr>
+      </w:pPr>
+    </w:p>
+    <w:p>
+      <w:pPr>
+        <w:numPr>
+          <w:ilvl w:val="0"/>
+          <w:numId w:val="0"/>
+        </w:numPr>
+        <w:jc w:val="both"/>
+        <w:rPr>
+          <w:rFonts w:hint="default" w:ascii="Arial" w:hAnsi="Arial" w:cs="Arial"/>
+          <w:lang w:val="en-US"/>
+        </w:rPr>
+      </w:pPr>
+    </w:p>
+    <w:p>
+      <w:pPr>
+        <w:numPr>
+          <w:ilvl w:val="0"/>
+          <w:numId w:val="0"/>
+        </w:numPr>
+        <w:jc w:val="both"/>
+        <w:rPr>
+          <w:rFonts w:hint="default" w:ascii="Arial" w:hAnsi="Arial" w:cs="Arial"/>
+          <w:lang w:val="en-US"/>
+        </w:rPr>
+      </w:pPr>
+    </w:p>
+    <w:p>
+      <w:pPr>
+        <w:numPr>
+          <w:ilvl w:val="0"/>
+          <w:numId w:val="0"/>
+        </w:numPr>
+        <w:jc w:val="both"/>
+        <w:rPr>
+          <w:rFonts w:hint="default" w:ascii="Arial" w:hAnsi="Arial" w:cs="Arial"/>
+          <w:lang w:val="en-US"/>
+        </w:rPr>
+      </w:pPr>
+    </w:p>
+    <w:p>
+      <w:pPr>
+        <w:numPr>
+          <w:ilvl w:val="0"/>
+          <w:numId w:val="0"/>
+        </w:numPr>
+        <w:jc w:val="both"/>
+        <w:rPr>
+          <w:rFonts w:hint="default" w:ascii="Arial" w:hAnsi="Arial" w:cs="Arial"/>
+          <w:lang w:val="en-US"/>
+        </w:rPr>
+      </w:pPr>
+    </w:p>
+    <w:p>
+      <w:pPr>
+        <w:numPr>
+          <w:ilvl w:val="0"/>
+          <w:numId w:val="0"/>
+        </w:numPr>
+        <w:jc w:val="both"/>
+        <w:rPr>
+          <w:rFonts w:hint="default" w:ascii="Arial" w:hAnsi="Arial" w:cs="Arial"/>
+          <w:lang w:val="en-US"/>
+        </w:rPr>
+      </w:pPr>
+    </w:p>
+    <w:p>
+      <w:pPr>
+        <w:numPr>
+          <w:ilvl w:val="0"/>
+          <w:numId w:val="0"/>
+        </w:numPr>
+        <w:jc w:val="both"/>
+        <w:rPr>
+          <w:rFonts w:hint="default" w:ascii="Arial" w:hAnsi="Arial" w:cs="Arial"/>
+          <w:lang w:val="en-US"/>
+        </w:rPr>
+      </w:pPr>
+    </w:p>
+    <w:p>
+      <w:pPr>
+        <w:numPr>
+          <w:ilvl w:val="0"/>
+          <w:numId w:val="0"/>
+        </w:numPr>
+        <w:jc w:val="both"/>
+        <w:rPr>
+          <w:rFonts w:hint="default" w:ascii="Arial" w:hAnsi="Arial" w:cs="Arial"/>
+          <w:lang w:val="en-US"/>
+        </w:rPr>
+      </w:pPr>
+    </w:p>
+    <w:p>
+      <w:pPr>
+        <w:numPr>
+          <w:ilvl w:val="0"/>
+          <w:numId w:val="0"/>
+        </w:numPr>
+        <w:jc w:val="both"/>
+        <w:rPr>
+          <w:rFonts w:hint="default" w:ascii="Arial" w:hAnsi="Arial" w:cs="Arial"/>
+          <w:lang w:val="en-US"/>
+        </w:rPr>
+      </w:pPr>
+    </w:p>
+    <w:p>
+      <w:pPr>
+        <w:numPr>
+          <w:ilvl w:val="0"/>
+          <w:numId w:val="0"/>
+        </w:numPr>
+        <w:jc w:val="both"/>
+        <w:rPr>
+          <w:rFonts w:hint="default" w:ascii="Arial" w:hAnsi="Arial" w:cs="Arial"/>
+          <w:lang w:val="en-US"/>
+        </w:rPr>
+      </w:pPr>
+    </w:p>
+    <w:p>
+      <w:pPr>
+        <w:numPr>
+          <w:ilvl w:val="0"/>
+          <w:numId w:val="0"/>
+        </w:numPr>
+        <w:jc w:val="both"/>
+        <w:rPr>
+          <w:rFonts w:hint="default" w:ascii="Arial" w:hAnsi="Arial" w:cs="Arial"/>
+          <w:lang w:val="en-US"/>
+        </w:rPr>
+      </w:pPr>
+    </w:p>
+    <w:p>
+      <w:pPr>
+        <w:numPr>
+          <w:ilvl w:val="0"/>
+          <w:numId w:val="0"/>
+        </w:numPr>
+        <w:jc w:val="both"/>
+        <w:rPr>
+          <w:rFonts w:hint="default" w:ascii="Arial" w:hAnsi="Arial" w:cs="Arial"/>
+          <w:lang w:val="en-US"/>
+        </w:rPr>
+      </w:pPr>
+    </w:p>
+    <w:p>
+      <w:pPr>
+        <w:numPr>
+          <w:ilvl w:val="0"/>
+          <w:numId w:val="0"/>
+        </w:numPr>
+        <w:jc w:val="both"/>
+        <w:rPr>
+          <w:rFonts w:hint="default" w:ascii="Arial" w:hAnsi="Arial" w:cs="Arial"/>
+          <w:lang w:val="en-US"/>
+        </w:rPr>
+      </w:pPr>
+    </w:p>
+    <w:p>
+      <w:pPr>
+        <w:numPr>
+          <w:ilvl w:val="0"/>
+          <w:numId w:val="0"/>
+        </w:numPr>
+        <w:jc w:val="both"/>
+        <w:rPr>
+          <w:rFonts w:hint="default" w:ascii="Arial" w:hAnsi="Arial" w:cs="Arial"/>
+          <w:lang w:val="en-US"/>
+        </w:rPr>
+      </w:pPr>
+    </w:p>
+    <w:p>
+      <w:pPr>
+        <w:numPr>
+          <w:ilvl w:val="0"/>
+          <w:numId w:val="0"/>
+        </w:numPr>
+        <w:jc w:val="both"/>
+        <w:rPr>
+          <w:rFonts w:hint="default" w:ascii="Arial" w:hAnsi="Arial" w:cs="Arial"/>
+          <w:lang w:val="en-US"/>
+        </w:rPr>
+      </w:pPr>
+    </w:p>
+    <w:p>
+      <w:pPr>
+        <w:numPr>
+          <w:ilvl w:val="0"/>
+          <w:numId w:val="0"/>
+        </w:numPr>
+        <w:jc w:val="both"/>
+        <w:rPr>
+          <w:rFonts w:hint="default" w:ascii="Arial" w:hAnsi="Arial" w:cs="Arial"/>
+          <w:lang w:val="en-US"/>
+        </w:rPr>
+      </w:pPr>
+    </w:p>
+    <w:p>
+      <w:pPr>
+        <w:numPr>
+          <w:ilvl w:val="0"/>
+          <w:numId w:val="0"/>
+        </w:numPr>
+        <w:jc w:val="both"/>
+        <w:rPr>
+          <w:rFonts w:hint="default" w:ascii="Arial" w:hAnsi="Arial" w:cs="Arial"/>
+          <w:lang w:val="en-US"/>
+        </w:rPr>
+      </w:pPr>
+    </w:p>
+    <w:p>
+      <w:pPr>
+        <w:numPr>
+          <w:ilvl w:val="0"/>
+          <w:numId w:val="0"/>
+        </w:numPr>
+        <w:jc w:val="both"/>
+        <w:rPr>
+          <w:rFonts w:hint="default" w:ascii="Arial" w:hAnsi="Arial" w:cs="Arial"/>
+          <w:lang w:val="en-US"/>
+        </w:rPr>
+      </w:pPr>
+    </w:p>
+    <w:p>
+      <w:pPr>
+        <w:numPr>
+          <w:ilvl w:val="0"/>
+          <w:numId w:val="0"/>
+        </w:numPr>
+        <w:jc w:val="both"/>
+        <w:rPr>
+          <w:rFonts w:hint="default" w:ascii="Arial" w:hAnsi="Arial" w:cs="Arial"/>
+          <w:lang w:val="en-US"/>
+        </w:rPr>
+      </w:pPr>
+    </w:p>
+    <w:p>
+      <w:pPr>
+        <w:numPr>
+          <w:ilvl w:val="0"/>
+          <w:numId w:val="0"/>
+        </w:numPr>
+        <w:jc w:val="both"/>
+        <w:rPr>
+          <w:rFonts w:hint="default" w:ascii="Arial" w:hAnsi="Arial" w:cs="Arial"/>
+          <w:lang w:val="en-US"/>
+        </w:rPr>
+      </w:pPr>
+    </w:p>
+    <w:p>
+      <w:pPr>
+        <w:numPr>
+          <w:ilvl w:val="0"/>
+          <w:numId w:val="0"/>
+        </w:numPr>
+        <w:jc w:val="both"/>
+        <w:rPr>
+          <w:rFonts w:hint="default" w:ascii="Arial" w:hAnsi="Arial" w:cs="Arial"/>
+          <w:lang w:val="en-US"/>
+        </w:rPr>
+      </w:pPr>
+    </w:p>
+    <w:p>
+      <w:pPr>
+        <w:numPr>
+          <w:ilvl w:val="0"/>
+          <w:numId w:val="0"/>
+        </w:numPr>
+        <w:jc w:val="both"/>
+        <w:rPr>
+          <w:rFonts w:hint="default" w:ascii="Arial" w:hAnsi="Arial" w:cs="Arial"/>
+          <w:lang w:val="en-US"/>
+        </w:rPr>
+      </w:pPr>
+    </w:p>
+    <w:p>
+      <w:pPr>
+        <w:numPr>
+          <w:ilvl w:val="0"/>
+          <w:numId w:val="0"/>
+        </w:numPr>
+        <w:jc w:val="both"/>
+        <w:rPr>
+          <w:rFonts w:hint="default" w:ascii="Arial" w:hAnsi="Arial" w:cs="Arial"/>
+          <w:lang w:val="en-US"/>
+        </w:rPr>
+      </w:pPr>
+    </w:p>
+    <w:p>
+      <w:pPr>
+        <w:numPr>
+          <w:ilvl w:val="0"/>
+          <w:numId w:val="0"/>
+        </w:numPr>
+        <w:jc w:val="both"/>
+        <w:rPr>
+          <w:rFonts w:hint="default" w:ascii="Arial" w:hAnsi="Arial" w:cs="Arial"/>
+          <w:lang w:val="en-US"/>
+        </w:rPr>
+      </w:pPr>
+    </w:p>
+    <w:p>
+      <w:pPr>
+        <w:numPr>
+          <w:ilvl w:val="0"/>
+          <w:numId w:val="0"/>
+        </w:numPr>
+        <w:jc w:val="both"/>
+        <w:rPr>
+          <w:rFonts w:hint="default" w:ascii="Arial" w:hAnsi="Arial" w:cs="Arial"/>
+          <w:lang w:val="en-US"/>
+        </w:rPr>
+      </w:pPr>
+    </w:p>
+    <w:p>
+      <w:pPr>
+        <w:numPr>
+          <w:ilvl w:val="0"/>
+          <w:numId w:val="0"/>
+        </w:numPr>
+        <w:jc w:val="both"/>
+        <w:rPr>
+          <w:rFonts w:hint="default" w:ascii="Arial" w:hAnsi="Arial" w:cs="Arial"/>
+          <w:lang w:val="en-US"/>
+        </w:rPr>
+      </w:pPr>
+    </w:p>
+    <w:p>
+      <w:pPr>
+        <w:numPr>
+          <w:ilvl w:val="0"/>
+          <w:numId w:val="0"/>
+        </w:numPr>
+        <w:jc w:val="both"/>
+        <w:rPr>
+          <w:rFonts w:hint="default" w:ascii="Arial" w:hAnsi="Arial" w:cs="Arial"/>
+          <w:lang w:val="en-US"/>
+        </w:rPr>
+      </w:pPr>
+    </w:p>
+    <w:p>
+      <w:pPr>
+        <w:numPr>
+          <w:ilvl w:val="0"/>
+          <w:numId w:val="0"/>
+        </w:numPr>
+        <w:jc w:val="both"/>
+        <w:rPr>
+          <w:rFonts w:hint="default" w:ascii="Arial" w:hAnsi="Arial" w:cs="Arial"/>
+          <w:lang w:val="en-US"/>
+        </w:rPr>
+      </w:pPr>
+    </w:p>
+    <w:p>
+      <w:pPr>
+        <w:numPr>
+          <w:ilvl w:val="0"/>
+          <w:numId w:val="0"/>
+        </w:numPr>
+        <w:jc w:val="both"/>
+        <w:rPr>
+          <w:rFonts w:hint="default" w:ascii="Arial" w:hAnsi="Arial" w:cs="Arial"/>
+          <w:lang w:val="en-US"/>
+        </w:rPr>
+      </w:pPr>
+    </w:p>
+    <w:p>
+      <w:pPr>
+        <w:numPr>
+          <w:ilvl w:val="0"/>
+          <w:numId w:val="0"/>
+        </w:numPr>
+        <w:jc w:val="both"/>
+        <w:rPr>
+          <w:rFonts w:hint="default" w:ascii="Arial" w:hAnsi="Arial" w:cs="Arial"/>
+          <w:lang w:val="en-US"/>
+        </w:rPr>
+      </w:pPr>
+    </w:p>
+    <w:p>
+      <w:pPr>
+        <w:numPr>
+          <w:ilvl w:val="0"/>
+          <w:numId w:val="0"/>
+        </w:numPr>
+        <w:jc w:val="both"/>
+        <w:rPr>
+          <w:rFonts w:hint="default" w:ascii="Arial" w:hAnsi="Arial" w:cs="Arial"/>
+          <w:lang w:val="en-US"/>
+        </w:rPr>
+      </w:pPr>
+    </w:p>
+    <w:p>
+      <w:pPr>
+        <w:numPr>
+          <w:ilvl w:val="0"/>
+          <w:numId w:val="0"/>
+        </w:numPr>
+        <w:jc w:val="both"/>
+        <w:rPr>
+          <w:rFonts w:hint="default" w:ascii="Arial" w:hAnsi="Arial" w:cs="Arial"/>
+          <w:lang w:val="en-US"/>
+        </w:rPr>
+      </w:pPr>
+    </w:p>
+    <w:p>
+      <w:pPr>
+        <w:numPr>
+          <w:ilvl w:val="0"/>
+          <w:numId w:val="0"/>
+        </w:numPr>
+        <w:jc w:val="both"/>
+        <w:rPr>
+          <w:rFonts w:hint="default" w:ascii="Arial" w:hAnsi="Arial" w:cs="Arial"/>
+          <w:lang w:val="en-US"/>
+        </w:rPr>
+      </w:pPr>
+    </w:p>
+    <w:p>
+      <w:pPr>
+        <w:numPr>
+          <w:ilvl w:val="0"/>
+          <w:numId w:val="0"/>
+        </w:numPr>
+        <w:jc w:val="both"/>
+        <w:rPr>
+          <w:rFonts w:hint="default" w:ascii="Arial" w:hAnsi="Arial" w:cs="Arial"/>
+          <w:lang w:val="en-US"/>
+        </w:rPr>
+      </w:pPr>
+    </w:p>
+    <w:p>
+      <w:pPr>
+        <w:numPr>
+          <w:ilvl w:val="0"/>
+          <w:numId w:val="0"/>
+        </w:numPr>
+        <w:jc w:val="both"/>
+        <w:rPr>
+          <w:rFonts w:hint="default" w:ascii="Arial" w:hAnsi="Arial" w:cs="Arial"/>
+          <w:lang w:val="en-US"/>
+        </w:rPr>
+      </w:pPr>
+    </w:p>
+    <w:p>
+      <w:pPr>
+        <w:numPr>
+          <w:ilvl w:val="0"/>
+          <w:numId w:val="0"/>
+        </w:numPr>
+        <w:jc w:val="both"/>
+        <w:rPr>
+          <w:rFonts w:hint="default" w:ascii="Arial" w:hAnsi="Arial" w:cs="Arial"/>
+          <w:lang w:val="en-US"/>
+        </w:rPr>
+      </w:pPr>
+    </w:p>
+    <w:p>
+      <w:pPr>
+        <w:numPr>
+          <w:ilvl w:val="0"/>
+          <w:numId w:val="1"/>
+        </w:numPr>
+        <w:ind w:left="0" w:leftChars="0" w:firstLine="0" w:firstLineChars="0"/>
+        <w:jc w:val="both"/>
+        <w:rPr>
+          <w:rFonts w:hint="default"/>
+          <w:b/>
+          <w:bCs/>
+          <w:sz w:val="24"/>
+          <w:szCs w:val="24"/>
+          <w:lang w:val="en-US"/>
+        </w:rPr>
+      </w:pPr>
+      <w:r>
+        <w:rPr>
+          <w:rFonts w:hint="default"/>
+          <w:b/>
+          <w:bCs/>
+          <w:sz w:val="24"/>
+          <w:szCs w:val="24"/>
+          <w:lang w:val="en-US"/>
+        </w:rPr>
+        <w:t xml:space="preserve"> Multi Auth Forget Password for Admin Part 1:</w:t>
+      </w:r>
+    </w:p>
+    <w:p>
+      <w:pPr>
+        <w:numPr>
+          <w:ilvl w:val="0"/>
+          <w:numId w:val="0"/>
+        </w:numPr>
+        <w:jc w:val="both"/>
+        <w:rPr>
+          <w:rFonts w:hint="default"/>
+          <w:lang w:val="en-US"/>
+        </w:rPr>
+      </w:pPr>
+    </w:p>
+    <w:p>
+      <w:pPr>
+        <w:numPr>
+          <w:ilvl w:val="0"/>
+          <w:numId w:val="0"/>
+        </w:numPr>
+        <w:jc w:val="both"/>
+        <w:rPr>
+          <w:rFonts w:hint="default"/>
+          <w:lang w:val="en-US"/>
+        </w:rPr>
+      </w:pPr>
+      <w:r>
+        <w:rPr>
+          <w:rFonts w:hint="default"/>
+          <w:lang w:val="en-US"/>
+        </w:rPr>
+        <w:t>Noe we need to create a custom design for the forget password page. To do this first we need to go to the login page and there you need to add ‘a href’ as shown below:</w:t>
+      </w:r>
+    </w:p>
+    <w:p>
+      <w:pPr>
+        <w:numPr>
+          <w:ilvl w:val="0"/>
+          <w:numId w:val="0"/>
+        </w:numPr>
+        <w:jc w:val="both"/>
+        <w:rPr>
+          <w:rFonts w:hint="default"/>
+          <w:lang w:val="en-US"/>
+        </w:rPr>
+      </w:pPr>
+    </w:p>
+    <w:p>
+      <w:pPr>
+        <w:numPr>
+          <w:ilvl w:val="0"/>
+          <w:numId w:val="0"/>
+        </w:numPr>
+        <w:jc w:val="both"/>
+        <w:rPr>
+          <w:rFonts w:hint="default"/>
+          <w:lang w:val="en-US"/>
+        </w:rPr>
+      </w:pPr>
+      <w:r>
+        <w:drawing>
+          <wp:inline distT="0" distB="0" distL="114300" distR="114300">
+            <wp:extent cx="5269230" cy="3220085"/>
+            <wp:effectExtent l="0" t="0" r="3810" b="10795"/>
+            <wp:docPr id="64" name="Picture 6"/>
+            <wp:cNvGraphicFramePr>
+              <a:graphicFrameLocks xmlns:a="http://schemas.openxmlformats.org/drawingml/2006/main" noChangeAspect="1"/>
+            </wp:cNvGraphicFramePr>
+            <a:graphic xmlns:a="http://schemas.openxmlformats.org/drawingml/2006/main">
+              <a:graphicData uri="http://schemas.openxmlformats.org/drawingml/2006/picture">
+                <pic:pic xmlns:pic="http://schemas.openxmlformats.org/drawingml/2006/picture">
+                  <pic:nvPicPr>
+                    <pic:cNvPr id="64" name="Picture 6"/>
+                    <pic:cNvPicPr>
+                      <a:picLocks noChangeAspect="1"/>
+                    </pic:cNvPicPr>
+                  </pic:nvPicPr>
+                  <pic:blipFill>
+                    <a:blip r:embed="rId67"/>
+                    <a:stretch>
+                      <a:fillRect/>
+                    </a:stretch>
+                  </pic:blipFill>
+                  <pic:spPr>
+                    <a:xfrm>
+                      <a:off x="0" y="0"/>
+                      <a:ext cx="5269230" cy="3220085"/>
+                    </a:xfrm>
+                    <a:prstGeom prst="rect">
+                      <a:avLst/>
+                    </a:prstGeom>
+                    <a:noFill/>
+                    <a:ln>
+                      <a:noFill/>
+                    </a:ln>
+                  </pic:spPr>
+                </pic:pic>
+              </a:graphicData>
+            </a:graphic>
+          </wp:inline>
+        </w:drawing>
+      </w:r>
+    </w:p>
+    <w:p>
+      <w:pPr>
+        <w:numPr>
+          <w:ilvl w:val="0"/>
+          <w:numId w:val="0"/>
+        </w:numPr>
+        <w:jc w:val="both"/>
+        <w:rPr>
+          <w:rFonts w:hint="default"/>
+          <w:lang w:val="en-US"/>
+        </w:rPr>
+      </w:pPr>
+    </w:p>
+    <w:p>
+      <w:pPr>
+        <w:numPr>
+          <w:ilvl w:val="0"/>
+          <w:numId w:val="0"/>
+        </w:numPr>
+        <w:jc w:val="both"/>
+        <w:rPr>
+          <w:rFonts w:hint="default"/>
+          <w:lang w:val="en-US"/>
+        </w:rPr>
+      </w:pPr>
+    </w:p>
+    <w:p>
+      <w:pPr>
+        <w:numPr>
+          <w:ilvl w:val="0"/>
+          <w:numId w:val="0"/>
+        </w:numPr>
+        <w:jc w:val="both"/>
+        <w:rPr>
+          <w:rFonts w:hint="default"/>
+          <w:b/>
+          <w:bCs/>
+          <w:lang w:val="en-US"/>
+        </w:rPr>
+      </w:pPr>
+      <w:r>
+        <w:rPr>
+          <w:rFonts w:hint="default"/>
+          <w:b/>
+          <w:bCs/>
+          <w:lang w:val="en-US"/>
+        </w:rPr>
+        <w:t>Note: Here we have removed the input field for forget password and added ‘a href’.</w:t>
+      </w:r>
+    </w:p>
+    <w:p>
+      <w:pPr>
+        <w:numPr>
+          <w:ilvl w:val="0"/>
+          <w:numId w:val="0"/>
+        </w:numPr>
+        <w:jc w:val="both"/>
+        <w:rPr>
+          <w:rFonts w:hint="default"/>
+          <w:b/>
+          <w:bCs/>
+          <w:lang w:val="en-US"/>
+        </w:rPr>
+      </w:pPr>
+    </w:p>
+    <w:p>
+      <w:pPr>
+        <w:numPr>
+          <w:ilvl w:val="0"/>
+          <w:numId w:val="0"/>
+        </w:numPr>
+        <w:jc w:val="both"/>
+        <w:rPr>
+          <w:rFonts w:hint="default"/>
+          <w:b w:val="0"/>
+          <w:bCs w:val="0"/>
+          <w:lang w:val="en-US"/>
+        </w:rPr>
+      </w:pPr>
+      <w:r>
+        <w:rPr>
+          <w:rFonts w:hint="default"/>
+          <w:b w:val="0"/>
+          <w:bCs w:val="0"/>
+          <w:lang w:val="en-US"/>
+        </w:rPr>
+        <w:t>Now inside the href you need to specify route as {{route(‘admin.forget_passsword’)}} as shown below:</w:t>
+      </w:r>
+    </w:p>
+    <w:p>
+      <w:pPr>
+        <w:numPr>
+          <w:ilvl w:val="0"/>
+          <w:numId w:val="0"/>
+        </w:numPr>
+        <w:jc w:val="both"/>
+        <w:rPr>
+          <w:rFonts w:hint="default"/>
+          <w:lang w:val="en-US"/>
+        </w:rPr>
+      </w:pPr>
+    </w:p>
+    <w:p>
+      <w:pPr>
+        <w:numPr>
+          <w:ilvl w:val="0"/>
+          <w:numId w:val="0"/>
+        </w:numPr>
+        <w:jc w:val="both"/>
+        <w:rPr>
+          <w:rFonts w:hint="default"/>
+          <w:lang w:val="en-US"/>
+        </w:rPr>
+      </w:pPr>
+    </w:p>
+    <w:p>
+      <w:pPr>
+        <w:numPr>
+          <w:ilvl w:val="0"/>
+          <w:numId w:val="0"/>
+        </w:numPr>
+        <w:jc w:val="both"/>
+        <w:rPr>
+          <w:rFonts w:hint="default"/>
+          <w:lang w:val="en-US"/>
+        </w:rPr>
+      </w:pPr>
+      <w:r>
+        <w:drawing>
+          <wp:inline distT="0" distB="0" distL="114300" distR="114300">
+            <wp:extent cx="5269865" cy="2331085"/>
+            <wp:effectExtent l="0" t="0" r="3175" b="635"/>
+            <wp:docPr id="65" name="Picture 7"/>
+            <wp:cNvGraphicFramePr>
+              <a:graphicFrameLocks xmlns:a="http://schemas.openxmlformats.org/drawingml/2006/main" noChangeAspect="1"/>
+            </wp:cNvGraphicFramePr>
+            <a:graphic xmlns:a="http://schemas.openxmlformats.org/drawingml/2006/main">
+              <a:graphicData uri="http://schemas.openxmlformats.org/drawingml/2006/picture">
+                <pic:pic xmlns:pic="http://schemas.openxmlformats.org/drawingml/2006/picture">
+                  <pic:nvPicPr>
+                    <pic:cNvPr id="65" name="Picture 7"/>
+                    <pic:cNvPicPr>
+                      <a:picLocks noChangeAspect="1"/>
+                    </pic:cNvPicPr>
+                  </pic:nvPicPr>
+                  <pic:blipFill>
+                    <a:blip r:embed="rId68"/>
+                    <a:stretch>
+                      <a:fillRect/>
+                    </a:stretch>
+                  </pic:blipFill>
+                  <pic:spPr>
+                    <a:xfrm>
+                      <a:off x="0" y="0"/>
+                      <a:ext cx="5269865" cy="2331085"/>
+                    </a:xfrm>
+                    <a:prstGeom prst="rect">
+                      <a:avLst/>
+                    </a:prstGeom>
+                    <a:noFill/>
+                    <a:ln>
+                      <a:noFill/>
+                    </a:ln>
+                  </pic:spPr>
+                </pic:pic>
+              </a:graphicData>
+            </a:graphic>
+          </wp:inline>
+        </w:drawing>
+      </w:r>
     </w:p>
     <w:p>
       <w:pPr>

</xml_diff>

<commit_message>
Multi Auth Forget Password for Admin Part3 and where the design for reset password page is created
</commit_message>
<xml_diff>
--- a/Laravel.docx
+++ b/Laravel.docx
@@ -17675,6 +17675,10 @@
             <w:insideH w:val="single" w:color="auto" w:sz="4" w:space="0"/>
             <w:insideV w:val="single" w:color="auto" w:sz="4" w:space="0"/>
           </w:tblBorders>
+          <w:tblCellMar>
+            <w:left w:w="108" w:type="dxa"/>
+            <w:right w:w="108" w:type="dxa"/>
+          </w:tblCellMar>
         </w:tblPrEx>
         <w:tc>
           <w:tcPr>
@@ -17736,114 +17740,6 @@
           <w:lang w:val="en-US"/>
         </w:rPr>
         <w:t>After that we need to assign the above generated token to the token property of the Admin model. To do that we need to enter as shown below:</w:t>
-      </w:r>
-    </w:p>
-    <w:p>
-      <w:pPr>
-        <w:numPr>
-          <w:ilvl w:val="0"/>
-          <w:numId w:val="0"/>
-        </w:numPr>
-        <w:jc w:val="both"/>
-        <w:rPr>
-          <w:rFonts w:hint="default"/>
-          <w:lang w:val="en-US"/>
-        </w:rPr>
-      </w:pPr>
-    </w:p>
-    <w:tbl>
-      <w:tblPr>
-        <w:tblStyle w:val="6"/>
-        <w:tblW w:w="0" w:type="auto"/>
-        <w:tblInd w:w="0" w:type="dxa"/>
-        <w:tblBorders>
-          <w:top w:val="single" w:color="auto" w:sz="4" w:space="0"/>
-          <w:left w:val="single" w:color="auto" w:sz="4" w:space="0"/>
-          <w:bottom w:val="single" w:color="auto" w:sz="4" w:space="0"/>
-          <w:right w:val="single" w:color="auto" w:sz="4" w:space="0"/>
-          <w:insideH w:val="single" w:color="auto" w:sz="4" w:space="0"/>
-          <w:insideV w:val="single" w:color="auto" w:sz="4" w:space="0"/>
-        </w:tblBorders>
-        <w:tblLayout w:type="autofit"/>
-        <w:tblCellMar>
-          <w:left w:w="108" w:type="dxa"/>
-          <w:right w:w="108" w:type="dxa"/>
-        </w:tblCellMar>
-      </w:tblPr>
-      <w:tblGrid>
-        <w:gridCol w:w="8522"/>
-      </w:tblGrid>
-      <w:tr>
-        <w:tblPrEx>
-          <w:tblBorders>
-            <w:top w:val="single" w:color="auto" w:sz="4" w:space="0"/>
-            <w:left w:val="single" w:color="auto" w:sz="4" w:space="0"/>
-            <w:bottom w:val="single" w:color="auto" w:sz="4" w:space="0"/>
-            <w:right w:val="single" w:color="auto" w:sz="4" w:space="0"/>
-            <w:insideH w:val="single" w:color="auto" w:sz="4" w:space="0"/>
-            <w:insideV w:val="single" w:color="auto" w:sz="4" w:space="0"/>
-          </w:tblBorders>
-        </w:tblPrEx>
-        <w:tc>
-          <w:tcPr>
-            <w:tcW w:w="8522" w:type="dxa"/>
-          </w:tcPr>
-          <w:p>
-            <w:pPr>
-              <w:numPr>
-                <w:ilvl w:val="0"/>
-                <w:numId w:val="0"/>
-              </w:numPr>
-              <w:jc w:val="both"/>
-              <w:rPr>
-                <w:rFonts w:hint="default"/>
-                <w:vertAlign w:val="baseline"/>
-                <w:lang w:val="en-US"/>
-              </w:rPr>
-            </w:pPr>
-            <w:r>
-              <w:rPr>
-                <w:rFonts w:hint="default"/>
-                <w:vertAlign w:val="baseline"/>
-                <w:lang w:val="en-US"/>
-              </w:rPr>
-              <w:t>$admin_data-&gt;token = $token;</w:t>
-            </w:r>
-          </w:p>
-        </w:tc>
-      </w:tr>
-    </w:tbl>
-    <w:p>
-      <w:pPr>
-        <w:numPr>
-          <w:ilvl w:val="0"/>
-          <w:numId w:val="0"/>
-        </w:numPr>
-        <w:jc w:val="both"/>
-        <w:rPr>
-          <w:rFonts w:hint="default"/>
-          <w:lang w:val="en-US"/>
-        </w:rPr>
-      </w:pPr>
-    </w:p>
-    <w:p>
-      <w:pPr>
-        <w:numPr>
-          <w:ilvl w:val="0"/>
-          <w:numId w:val="0"/>
-        </w:numPr>
-        <w:jc w:val="both"/>
-        <w:rPr>
-          <w:rFonts w:hint="default"/>
-          <w:lang w:val="en-US"/>
-        </w:rPr>
-      </w:pPr>
-      <w:r>
-        <w:rPr>
-          <w:rFonts w:hint="default"/>
-          <w:lang w:val="en-US"/>
-        </w:rPr>
-        <w:t>Then we need to update the token to do that we need to use the following code:</w:t>
       </w:r>
     </w:p>
     <w:p>
@@ -17919,7 +17815,7 @@
                 <w:vertAlign w:val="baseline"/>
                 <w:lang w:val="en-US"/>
               </w:rPr>
-              <w:t>$admin_data-&gt; update;</w:t>
+              <w:t>$admin_data-&gt;token = $token;</w:t>
             </w:r>
           </w:p>
         </w:tc>
@@ -17955,7 +17851,7 @@
           <w:rFonts w:hint="default"/>
           <w:lang w:val="en-US"/>
         </w:rPr>
-        <w:t>Now we need to create a complete URL that admin can click to reset their password. To do that we need to enter the following code:</w:t>
+        <w:t>Then we need to update the token to do that we need to use the following code:</w:t>
       </w:r>
     </w:p>
     <w:p>
@@ -18031,7 +17927,7 @@
                 <w:vertAlign w:val="baseline"/>
                 <w:lang w:val="en-US"/>
               </w:rPr>
-              <w:t>$reset_link = url('admin/reset-password/'.$token.'/'.$request-&gt;email);</w:t>
+              <w:t>$admin_data-&gt; update;</w:t>
             </w:r>
           </w:p>
         </w:tc>
@@ -18067,7 +17963,7 @@
           <w:rFonts w:hint="default"/>
           <w:lang w:val="en-US"/>
         </w:rPr>
-        <w:t>Now we need to create a subject containing the subject for the email that the admin will receive. We need to enter the code shown below:</w:t>
+        <w:t>Now we need to create a complete URL that admin can click to reset their password. To do that we need to enter the following code:</w:t>
       </w:r>
     </w:p>
     <w:p>
@@ -18143,6 +18039,118 @@
                 <w:vertAlign w:val="baseline"/>
                 <w:lang w:val="en-US"/>
               </w:rPr>
+              <w:t>$reset_link = url('admin/reset-password/'.$token.'/'.$request-&gt;email);</w:t>
+            </w:r>
+          </w:p>
+        </w:tc>
+      </w:tr>
+    </w:tbl>
+    <w:p>
+      <w:pPr>
+        <w:numPr>
+          <w:ilvl w:val="0"/>
+          <w:numId w:val="0"/>
+        </w:numPr>
+        <w:jc w:val="both"/>
+        <w:rPr>
+          <w:rFonts w:hint="default"/>
+          <w:lang w:val="en-US"/>
+        </w:rPr>
+      </w:pPr>
+    </w:p>
+    <w:p>
+      <w:pPr>
+        <w:numPr>
+          <w:ilvl w:val="0"/>
+          <w:numId w:val="0"/>
+        </w:numPr>
+        <w:jc w:val="both"/>
+        <w:rPr>
+          <w:rFonts w:hint="default"/>
+          <w:lang w:val="en-US"/>
+        </w:rPr>
+      </w:pPr>
+      <w:r>
+        <w:rPr>
+          <w:rFonts w:hint="default"/>
+          <w:lang w:val="en-US"/>
+        </w:rPr>
+        <w:t>Now we need to create a subject containing the subject for the email that the admin will receive. We need to enter the code shown below:</w:t>
+      </w:r>
+    </w:p>
+    <w:p>
+      <w:pPr>
+        <w:numPr>
+          <w:ilvl w:val="0"/>
+          <w:numId w:val="0"/>
+        </w:numPr>
+        <w:jc w:val="both"/>
+        <w:rPr>
+          <w:rFonts w:hint="default"/>
+          <w:lang w:val="en-US"/>
+        </w:rPr>
+      </w:pPr>
+    </w:p>
+    <w:tbl>
+      <w:tblPr>
+        <w:tblStyle w:val="6"/>
+        <w:tblW w:w="0" w:type="auto"/>
+        <w:tblInd w:w="0" w:type="dxa"/>
+        <w:tblBorders>
+          <w:top w:val="single" w:color="auto" w:sz="4" w:space="0"/>
+          <w:left w:val="single" w:color="auto" w:sz="4" w:space="0"/>
+          <w:bottom w:val="single" w:color="auto" w:sz="4" w:space="0"/>
+          <w:right w:val="single" w:color="auto" w:sz="4" w:space="0"/>
+          <w:insideH w:val="single" w:color="auto" w:sz="4" w:space="0"/>
+          <w:insideV w:val="single" w:color="auto" w:sz="4" w:space="0"/>
+        </w:tblBorders>
+        <w:tblLayout w:type="autofit"/>
+        <w:tblCellMar>
+          <w:left w:w="108" w:type="dxa"/>
+          <w:right w:w="108" w:type="dxa"/>
+        </w:tblCellMar>
+      </w:tblPr>
+      <w:tblGrid>
+        <w:gridCol w:w="8522"/>
+      </w:tblGrid>
+      <w:tr>
+        <w:tblPrEx>
+          <w:tblBorders>
+            <w:top w:val="single" w:color="auto" w:sz="4" w:space="0"/>
+            <w:left w:val="single" w:color="auto" w:sz="4" w:space="0"/>
+            <w:bottom w:val="single" w:color="auto" w:sz="4" w:space="0"/>
+            <w:right w:val="single" w:color="auto" w:sz="4" w:space="0"/>
+            <w:insideH w:val="single" w:color="auto" w:sz="4" w:space="0"/>
+            <w:insideV w:val="single" w:color="auto" w:sz="4" w:space="0"/>
+          </w:tblBorders>
+          <w:tblCellMar>
+            <w:left w:w="108" w:type="dxa"/>
+            <w:right w:w="108" w:type="dxa"/>
+          </w:tblCellMar>
+        </w:tblPrEx>
+        <w:tc>
+          <w:tcPr>
+            <w:tcW w:w="8522" w:type="dxa"/>
+          </w:tcPr>
+          <w:p>
+            <w:pPr>
+              <w:numPr>
+                <w:ilvl w:val="0"/>
+                <w:numId w:val="0"/>
+              </w:numPr>
+              <w:jc w:val="both"/>
+              <w:rPr>
+                <w:rFonts w:hint="default"/>
+                <w:vertAlign w:val="baseline"/>
+                <w:lang w:val="en-US"/>
+              </w:rPr>
+            </w:pPr>
+            <w:r>
+              <w:rPr>
+                <w:rFonts w:hint="default"/>
+                <w:vertAlign w:val="baseline"/>
+                <w:lang w:val="en-US"/>
+              </w:rPr>
               <w:t>$subject = “Reset Password”</w:t>
             </w:r>
           </w:p>
@@ -18532,10 +18540,6 @@
             <w:insideH w:val="single" w:color="auto" w:sz="4" w:space="0"/>
             <w:insideV w:val="single" w:color="auto" w:sz="4" w:space="0"/>
           </w:tblBorders>
-          <w:tblCellMar>
-            <w:left w:w="108" w:type="dxa"/>
-            <w:right w:w="108" w:type="dxa"/>
-          </w:tblCellMar>
         </w:tblPrEx>
         <w:tc>
           <w:tcPr>
@@ -18860,6 +18864,1761 @@
           <w:lang w:val="en-US"/>
         </w:rPr>
         <w:t>Multi Auth Forget Password for Admin Part 3</w:t>
+      </w:r>
+    </w:p>
+    <w:p>
+      <w:pPr>
+        <w:numPr>
+          <w:numId w:val="0"/>
+        </w:numPr>
+        <w:jc w:val="both"/>
+        <w:rPr>
+          <w:rFonts w:hint="default"/>
+          <w:b/>
+          <w:bCs/>
+          <w:sz w:val="24"/>
+          <w:szCs w:val="24"/>
+          <w:lang w:val="en-US"/>
+        </w:rPr>
+      </w:pPr>
+    </w:p>
+    <w:p>
+      <w:pPr>
+        <w:numPr>
+          <w:numId w:val="0"/>
+        </w:numPr>
+        <w:jc w:val="both"/>
+        <w:rPr>
+          <w:rFonts w:hint="default"/>
+          <w:b w:val="0"/>
+          <w:bCs w:val="0"/>
+          <w:sz w:val="20"/>
+          <w:szCs w:val="20"/>
+          <w:lang w:val="en-US"/>
+        </w:rPr>
+      </w:pPr>
+      <w:r>
+        <w:rPr>
+          <w:rFonts w:hint="default"/>
+          <w:b w:val="0"/>
+          <w:bCs w:val="0"/>
+          <w:sz w:val="20"/>
+          <w:szCs w:val="20"/>
+          <w:lang w:val="en-US"/>
+        </w:rPr>
+        <w:t>Now you need to create a route for the admin/reset-password page. To do that go to the web.php and create a route as shown below:</w:t>
+      </w:r>
+    </w:p>
+    <w:p>
+      <w:pPr>
+        <w:numPr>
+          <w:numId w:val="0"/>
+        </w:numPr>
+        <w:jc w:val="both"/>
+        <w:rPr>
+          <w:rFonts w:hint="default"/>
+          <w:b w:val="0"/>
+          <w:bCs w:val="0"/>
+          <w:sz w:val="20"/>
+          <w:szCs w:val="20"/>
+          <w:lang w:val="en-US"/>
+        </w:rPr>
+      </w:pPr>
+    </w:p>
+    <w:tbl>
+      <w:tblPr>
+        <w:tblStyle w:val="6"/>
+        <w:tblW w:w="0" w:type="auto"/>
+        <w:tblInd w:w="0" w:type="dxa"/>
+        <w:tblBorders>
+          <w:top w:val="single" w:color="auto" w:sz="4" w:space="0"/>
+          <w:left w:val="single" w:color="auto" w:sz="4" w:space="0"/>
+          <w:bottom w:val="single" w:color="auto" w:sz="4" w:space="0"/>
+          <w:right w:val="single" w:color="auto" w:sz="4" w:space="0"/>
+          <w:insideH w:val="single" w:color="auto" w:sz="4" w:space="0"/>
+          <w:insideV w:val="single" w:color="auto" w:sz="4" w:space="0"/>
+        </w:tblBorders>
+        <w:tblLayout w:type="autofit"/>
+        <w:tblCellMar>
+          <w:left w:w="108" w:type="dxa"/>
+          <w:right w:w="108" w:type="dxa"/>
+        </w:tblCellMar>
+      </w:tblPr>
+      <w:tblGrid>
+        <w:gridCol w:w="8522"/>
+      </w:tblGrid>
+      <w:tr>
+        <w:tblPrEx>
+          <w:tblBorders>
+            <w:top w:val="single" w:color="auto" w:sz="4" w:space="0"/>
+            <w:left w:val="single" w:color="auto" w:sz="4" w:space="0"/>
+            <w:bottom w:val="single" w:color="auto" w:sz="4" w:space="0"/>
+            <w:right w:val="single" w:color="auto" w:sz="4" w:space="0"/>
+            <w:insideH w:val="single" w:color="auto" w:sz="4" w:space="0"/>
+            <w:insideV w:val="single" w:color="auto" w:sz="4" w:space="0"/>
+          </w:tblBorders>
+          <w:tblCellMar>
+            <w:left w:w="108" w:type="dxa"/>
+            <w:right w:w="108" w:type="dxa"/>
+          </w:tblCellMar>
+        </w:tblPrEx>
+        <w:tc>
+          <w:tcPr>
+            <w:tcW w:w="8522" w:type="dxa"/>
+          </w:tcPr>
+          <w:p>
+            <w:pPr>
+              <w:numPr>
+                <w:numId w:val="0"/>
+              </w:numPr>
+              <w:jc w:val="both"/>
+              <w:rPr>
+                <w:rFonts w:hint="default"/>
+                <w:b w:val="0"/>
+                <w:bCs w:val="0"/>
+                <w:sz w:val="20"/>
+                <w:szCs w:val="20"/>
+                <w:vertAlign w:val="baseline"/>
+                <w:lang w:val="en-US"/>
+              </w:rPr>
+            </w:pPr>
+            <w:r>
+              <w:rPr>
+                <w:rFonts w:hint="default"/>
+                <w:b w:val="0"/>
+                <w:bCs w:val="0"/>
+                <w:sz w:val="20"/>
+                <w:szCs w:val="20"/>
+                <w:vertAlign w:val="baseline"/>
+                <w:lang w:val="en-US"/>
+              </w:rPr>
+              <w:t>Route::get('/admin/reset-password/{token}/{email}', [AdminController::class, 'AdminResetPassword']);</w:t>
+            </w:r>
+          </w:p>
+        </w:tc>
+      </w:tr>
+    </w:tbl>
+    <w:p>
+      <w:pPr>
+        <w:numPr>
+          <w:numId w:val="0"/>
+        </w:numPr>
+        <w:jc w:val="both"/>
+        <w:rPr>
+          <w:rFonts w:hint="default"/>
+          <w:b w:val="0"/>
+          <w:bCs w:val="0"/>
+          <w:sz w:val="20"/>
+          <w:szCs w:val="20"/>
+          <w:lang w:val="en-US"/>
+        </w:rPr>
+      </w:pPr>
+    </w:p>
+    <w:p>
+      <w:pPr>
+        <w:numPr>
+          <w:ilvl w:val="0"/>
+          <w:numId w:val="0"/>
+        </w:numPr>
+        <w:jc w:val="both"/>
+        <w:rPr>
+          <w:rFonts w:hint="default"/>
+          <w:lang w:val="en-US"/>
+        </w:rPr>
+      </w:pPr>
+      <w:r>
+        <w:rPr>
+          <w:rFonts w:hint="default"/>
+          <w:b/>
+          <w:bCs/>
+          <w:lang w:val="en-US"/>
+        </w:rPr>
+        <w:t>Note</w:t>
+      </w:r>
+      <w:r>
+        <w:rPr>
+          <w:rFonts w:hint="default"/>
+          <w:lang w:val="en-US"/>
+        </w:rPr>
+        <w:t>: Here we have not specified name and have passed parameters ‘token’ and ‘email’ as we have defined it as URL.</w:t>
+      </w:r>
+    </w:p>
+    <w:p>
+      <w:pPr>
+        <w:numPr>
+          <w:ilvl w:val="0"/>
+          <w:numId w:val="0"/>
+        </w:numPr>
+        <w:jc w:val="both"/>
+        <w:rPr>
+          <w:rFonts w:hint="default"/>
+          <w:lang w:val="en-US"/>
+        </w:rPr>
+      </w:pPr>
+    </w:p>
+    <w:p>
+      <w:pPr>
+        <w:numPr>
+          <w:ilvl w:val="0"/>
+          <w:numId w:val="0"/>
+        </w:numPr>
+        <w:jc w:val="both"/>
+        <w:rPr>
+          <w:rFonts w:hint="default"/>
+          <w:lang w:val="en-US"/>
+        </w:rPr>
+      </w:pPr>
+      <w:r>
+        <w:rPr>
+          <w:rFonts w:hint="default"/>
+          <w:lang w:val="en-US"/>
+        </w:rPr>
+        <w:t>Now we need to create a function for the AdminResetPassword in the Admin Controller. We should also pass the parameter in the function as shown below as it is through URL and and we need to have email and token.</w:t>
+      </w:r>
+    </w:p>
+    <w:tbl>
+      <w:tblPr>
+        <w:tblStyle w:val="6"/>
+        <w:tblW w:w="0" w:type="auto"/>
+        <w:tblInd w:w="0" w:type="dxa"/>
+        <w:tblBorders>
+          <w:top w:val="single" w:color="auto" w:sz="4" w:space="0"/>
+          <w:left w:val="single" w:color="auto" w:sz="4" w:space="0"/>
+          <w:bottom w:val="single" w:color="auto" w:sz="4" w:space="0"/>
+          <w:right w:val="single" w:color="auto" w:sz="4" w:space="0"/>
+          <w:insideH w:val="single" w:color="auto" w:sz="4" w:space="0"/>
+          <w:insideV w:val="single" w:color="auto" w:sz="4" w:space="0"/>
+        </w:tblBorders>
+        <w:tblLayout w:type="autofit"/>
+        <w:tblCellMar>
+          <w:left w:w="108" w:type="dxa"/>
+          <w:right w:w="108" w:type="dxa"/>
+        </w:tblCellMar>
+      </w:tblPr>
+      <w:tblGrid>
+        <w:gridCol w:w="8522"/>
+      </w:tblGrid>
+      <w:tr>
+        <w:tblPrEx>
+          <w:tblBorders>
+            <w:top w:val="single" w:color="auto" w:sz="4" w:space="0"/>
+            <w:left w:val="single" w:color="auto" w:sz="4" w:space="0"/>
+            <w:bottom w:val="single" w:color="auto" w:sz="4" w:space="0"/>
+            <w:right w:val="single" w:color="auto" w:sz="4" w:space="0"/>
+            <w:insideH w:val="single" w:color="auto" w:sz="4" w:space="0"/>
+            <w:insideV w:val="single" w:color="auto" w:sz="4" w:space="0"/>
+          </w:tblBorders>
+          <w:tblCellMar>
+            <w:left w:w="108" w:type="dxa"/>
+            <w:right w:w="108" w:type="dxa"/>
+          </w:tblCellMar>
+        </w:tblPrEx>
+        <w:tc>
+          <w:tcPr>
+            <w:tcW w:w="8522" w:type="dxa"/>
+          </w:tcPr>
+          <w:p>
+            <w:pPr>
+              <w:numPr>
+                <w:ilvl w:val="0"/>
+                <w:numId w:val="0"/>
+              </w:numPr>
+              <w:jc w:val="both"/>
+              <w:rPr>
+                <w:rFonts w:hint="default"/>
+                <w:vertAlign w:val="baseline"/>
+                <w:lang w:val="en-US"/>
+              </w:rPr>
+            </w:pPr>
+            <w:r>
+              <w:rPr>
+                <w:rFonts w:hint="default"/>
+                <w:vertAlign w:val="baseline"/>
+                <w:lang w:val="en-US"/>
+              </w:rPr>
+              <w:t xml:space="preserve">  public function AdminResetPassword($token,$email){</w:t>
+            </w:r>
+          </w:p>
+          <w:p>
+            <w:pPr>
+              <w:numPr>
+                <w:ilvl w:val="0"/>
+                <w:numId w:val="0"/>
+              </w:numPr>
+              <w:jc w:val="both"/>
+              <w:rPr>
+                <w:rFonts w:hint="default"/>
+                <w:vertAlign w:val="baseline"/>
+                <w:lang w:val="en-US"/>
+              </w:rPr>
+            </w:pPr>
+          </w:p>
+          <w:p>
+            <w:pPr>
+              <w:numPr>
+                <w:ilvl w:val="0"/>
+                <w:numId w:val="0"/>
+              </w:numPr>
+              <w:jc w:val="both"/>
+              <w:rPr>
+                <w:rFonts w:hint="default"/>
+                <w:vertAlign w:val="baseline"/>
+                <w:lang w:val="en-US"/>
+              </w:rPr>
+            </w:pPr>
+            <w:r>
+              <w:rPr>
+                <w:rFonts w:hint="default"/>
+                <w:vertAlign w:val="baseline"/>
+                <w:lang w:val="en-US"/>
+              </w:rPr>
+              <w:t xml:space="preserve">    }</w:t>
+            </w:r>
+          </w:p>
+        </w:tc>
+      </w:tr>
+    </w:tbl>
+    <w:p>
+      <w:pPr>
+        <w:numPr>
+          <w:ilvl w:val="0"/>
+          <w:numId w:val="0"/>
+        </w:numPr>
+        <w:jc w:val="both"/>
+        <w:rPr>
+          <w:rFonts w:hint="default"/>
+          <w:lang w:val="en-US"/>
+        </w:rPr>
+      </w:pPr>
+    </w:p>
+    <w:p>
+      <w:pPr>
+        <w:numPr>
+          <w:ilvl w:val="0"/>
+          <w:numId w:val="0"/>
+        </w:numPr>
+        <w:jc w:val="both"/>
+        <w:rPr>
+          <w:rFonts w:hint="default"/>
+          <w:lang w:val="en-US"/>
+        </w:rPr>
+      </w:pPr>
+      <w:r>
+        <w:rPr>
+          <w:rFonts w:hint="default"/>
+          <w:lang w:val="en-US"/>
+        </w:rPr>
+        <w:t>Now inside the function we need to create a variable named $admin_data in which we need to store the data that user has entered is matched with the data in database. In this case we check if the token and email that is trying to reset password matches the data in database. To do that you need to enter the following code:</w:t>
+      </w:r>
+    </w:p>
+    <w:p>
+      <w:pPr>
+        <w:numPr>
+          <w:ilvl w:val="0"/>
+          <w:numId w:val="0"/>
+        </w:numPr>
+        <w:jc w:val="both"/>
+        <w:rPr>
+          <w:rFonts w:hint="default"/>
+          <w:lang w:val="en-US"/>
+        </w:rPr>
+      </w:pPr>
+    </w:p>
+    <w:tbl>
+      <w:tblPr>
+        <w:tblStyle w:val="6"/>
+        <w:tblW w:w="0" w:type="auto"/>
+        <w:tblInd w:w="0" w:type="dxa"/>
+        <w:tblBorders>
+          <w:top w:val="single" w:color="auto" w:sz="4" w:space="0"/>
+          <w:left w:val="single" w:color="auto" w:sz="4" w:space="0"/>
+          <w:bottom w:val="single" w:color="auto" w:sz="4" w:space="0"/>
+          <w:right w:val="single" w:color="auto" w:sz="4" w:space="0"/>
+          <w:insideH w:val="single" w:color="auto" w:sz="4" w:space="0"/>
+          <w:insideV w:val="single" w:color="auto" w:sz="4" w:space="0"/>
+        </w:tblBorders>
+        <w:tblLayout w:type="autofit"/>
+        <w:tblCellMar>
+          <w:left w:w="108" w:type="dxa"/>
+          <w:right w:w="108" w:type="dxa"/>
+        </w:tblCellMar>
+      </w:tblPr>
+      <w:tblGrid>
+        <w:gridCol w:w="8522"/>
+      </w:tblGrid>
+      <w:tr>
+        <w:tblPrEx>
+          <w:tblBorders>
+            <w:top w:val="single" w:color="auto" w:sz="4" w:space="0"/>
+            <w:left w:val="single" w:color="auto" w:sz="4" w:space="0"/>
+            <w:bottom w:val="single" w:color="auto" w:sz="4" w:space="0"/>
+            <w:right w:val="single" w:color="auto" w:sz="4" w:space="0"/>
+            <w:insideH w:val="single" w:color="auto" w:sz="4" w:space="0"/>
+            <w:insideV w:val="single" w:color="auto" w:sz="4" w:space="0"/>
+          </w:tblBorders>
+          <w:tblCellMar>
+            <w:left w:w="108" w:type="dxa"/>
+            <w:right w:w="108" w:type="dxa"/>
+          </w:tblCellMar>
+        </w:tblPrEx>
+        <w:tc>
+          <w:tcPr>
+            <w:tcW w:w="8522" w:type="dxa"/>
+          </w:tcPr>
+          <w:p>
+            <w:pPr>
+              <w:numPr>
+                <w:ilvl w:val="0"/>
+                <w:numId w:val="0"/>
+              </w:numPr>
+              <w:jc w:val="both"/>
+              <w:rPr>
+                <w:rFonts w:hint="default"/>
+                <w:vertAlign w:val="baseline"/>
+                <w:lang w:val="en-US"/>
+              </w:rPr>
+            </w:pPr>
+            <w:r>
+              <w:rPr>
+                <w:rFonts w:hint="default"/>
+                <w:vertAlign w:val="baseline"/>
+                <w:lang w:val="en-US"/>
+              </w:rPr>
+              <w:t>$admin_data= Admin::where('token',$token)-&gt;where('email',$email)-&gt;first();</w:t>
+            </w:r>
+          </w:p>
+        </w:tc>
+      </w:tr>
+    </w:tbl>
+    <w:p>
+      <w:pPr>
+        <w:numPr>
+          <w:ilvl w:val="0"/>
+          <w:numId w:val="0"/>
+        </w:numPr>
+        <w:jc w:val="both"/>
+        <w:rPr>
+          <w:rFonts w:hint="default"/>
+          <w:lang w:val="en-US"/>
+        </w:rPr>
+      </w:pPr>
+    </w:p>
+    <w:p>
+      <w:pPr>
+        <w:numPr>
+          <w:ilvl w:val="0"/>
+          <w:numId w:val="0"/>
+        </w:numPr>
+        <w:jc w:val="both"/>
+        <w:rPr>
+          <w:rFonts w:hint="default"/>
+          <w:lang w:val="en-US"/>
+        </w:rPr>
+      </w:pPr>
+      <w:r>
+        <w:rPr>
+          <w:rFonts w:hint="default"/>
+          <w:lang w:val="en-US"/>
+        </w:rPr>
+        <w:t>Now you need to create a if function which will tell what to do if $admin_data is matched and what not to do if not.</w:t>
+      </w:r>
+    </w:p>
+    <w:p>
+      <w:pPr>
+        <w:numPr>
+          <w:ilvl w:val="0"/>
+          <w:numId w:val="0"/>
+        </w:numPr>
+        <w:jc w:val="both"/>
+        <w:rPr>
+          <w:rFonts w:hint="default"/>
+          <w:lang w:val="en-US"/>
+        </w:rPr>
+      </w:pPr>
+    </w:p>
+    <w:tbl>
+      <w:tblPr>
+        <w:tblStyle w:val="6"/>
+        <w:tblW w:w="0" w:type="auto"/>
+        <w:tblInd w:w="0" w:type="dxa"/>
+        <w:tblBorders>
+          <w:top w:val="single" w:color="auto" w:sz="4" w:space="0"/>
+          <w:left w:val="single" w:color="auto" w:sz="4" w:space="0"/>
+          <w:bottom w:val="single" w:color="auto" w:sz="4" w:space="0"/>
+          <w:right w:val="single" w:color="auto" w:sz="4" w:space="0"/>
+          <w:insideH w:val="single" w:color="auto" w:sz="4" w:space="0"/>
+          <w:insideV w:val="single" w:color="auto" w:sz="4" w:space="0"/>
+        </w:tblBorders>
+        <w:tblLayout w:type="autofit"/>
+        <w:tblCellMar>
+          <w:left w:w="108" w:type="dxa"/>
+          <w:right w:w="108" w:type="dxa"/>
+        </w:tblCellMar>
+      </w:tblPr>
+      <w:tblGrid>
+        <w:gridCol w:w="8522"/>
+      </w:tblGrid>
+      <w:tr>
+        <w:tblPrEx>
+          <w:tblBorders>
+            <w:top w:val="single" w:color="auto" w:sz="4" w:space="0"/>
+            <w:left w:val="single" w:color="auto" w:sz="4" w:space="0"/>
+            <w:bottom w:val="single" w:color="auto" w:sz="4" w:space="0"/>
+            <w:right w:val="single" w:color="auto" w:sz="4" w:space="0"/>
+            <w:insideH w:val="single" w:color="auto" w:sz="4" w:space="0"/>
+            <w:insideV w:val="single" w:color="auto" w:sz="4" w:space="0"/>
+          </w:tblBorders>
+          <w:tblCellMar>
+            <w:left w:w="108" w:type="dxa"/>
+            <w:right w:w="108" w:type="dxa"/>
+          </w:tblCellMar>
+        </w:tblPrEx>
+        <w:tc>
+          <w:tcPr>
+            <w:tcW w:w="8522" w:type="dxa"/>
+          </w:tcPr>
+          <w:p>
+            <w:pPr>
+              <w:numPr>
+                <w:ilvl w:val="0"/>
+                <w:numId w:val="0"/>
+              </w:numPr>
+              <w:jc w:val="both"/>
+              <w:rPr>
+                <w:rFonts w:hint="default"/>
+                <w:vertAlign w:val="baseline"/>
+                <w:lang w:val="en-US"/>
+              </w:rPr>
+            </w:pPr>
+            <w:r>
+              <w:rPr>
+                <w:rFonts w:hint="default"/>
+                <w:vertAlign w:val="baseline"/>
+                <w:lang w:val="en-US"/>
+              </w:rPr>
+              <w:t>if(!$admin_data){</w:t>
+            </w:r>
+          </w:p>
+          <w:p>
+            <w:pPr>
+              <w:numPr>
+                <w:ilvl w:val="0"/>
+                <w:numId w:val="0"/>
+              </w:numPr>
+              <w:jc w:val="both"/>
+              <w:rPr>
+                <w:rFonts w:hint="default"/>
+                <w:vertAlign w:val="baseline"/>
+                <w:lang w:val="en-US"/>
+              </w:rPr>
+            </w:pPr>
+            <w:r>
+              <w:rPr>
+                <w:rFonts w:hint="default"/>
+                <w:vertAlign w:val="baseline"/>
+                <w:lang w:val="en-US"/>
+              </w:rPr>
+              <w:t xml:space="preserve">            return redirect()-&gt;route('admin.login')-&gt;with('error','Invalid Email or Token');</w:t>
+            </w:r>
+          </w:p>
+          <w:p>
+            <w:pPr>
+              <w:numPr>
+                <w:ilvl w:val="0"/>
+                <w:numId w:val="0"/>
+              </w:numPr>
+              <w:jc w:val="both"/>
+              <w:rPr>
+                <w:rFonts w:hint="default"/>
+                <w:vertAlign w:val="baseline"/>
+                <w:lang w:val="en-US"/>
+              </w:rPr>
+            </w:pPr>
+            <w:r>
+              <w:rPr>
+                <w:rFonts w:hint="default"/>
+                <w:vertAlign w:val="baseline"/>
+                <w:lang w:val="en-US"/>
+              </w:rPr>
+              <w:t xml:space="preserve">        }</w:t>
+            </w:r>
+          </w:p>
+          <w:p>
+            <w:pPr>
+              <w:numPr>
+                <w:ilvl w:val="0"/>
+                <w:numId w:val="0"/>
+              </w:numPr>
+              <w:jc w:val="both"/>
+              <w:rPr>
+                <w:rFonts w:hint="default"/>
+                <w:vertAlign w:val="baseline"/>
+                <w:lang w:val="en-US"/>
+              </w:rPr>
+            </w:pPr>
+            <w:r>
+              <w:rPr>
+                <w:rFonts w:hint="default"/>
+                <w:vertAlign w:val="baseline"/>
+                <w:lang w:val="en-US"/>
+              </w:rPr>
+              <w:t xml:space="preserve">        return view('admin.reset_password',compact('token','email'));</w:t>
+            </w:r>
+          </w:p>
+          <w:p>
+            <w:pPr>
+              <w:numPr>
+                <w:ilvl w:val="0"/>
+                <w:numId w:val="0"/>
+              </w:numPr>
+              <w:jc w:val="both"/>
+              <w:rPr>
+                <w:rFonts w:hint="default"/>
+                <w:vertAlign w:val="baseline"/>
+                <w:lang w:val="en-US"/>
+              </w:rPr>
+            </w:pPr>
+            <w:r>
+              <w:rPr>
+                <w:rFonts w:hint="default"/>
+                <w:vertAlign w:val="baseline"/>
+                <w:lang w:val="en-US"/>
+              </w:rPr>
+              <w:t xml:space="preserve">    }</w:t>
+            </w:r>
+          </w:p>
+        </w:tc>
+      </w:tr>
+    </w:tbl>
+    <w:p>
+      <w:pPr>
+        <w:numPr>
+          <w:ilvl w:val="0"/>
+          <w:numId w:val="0"/>
+        </w:numPr>
+        <w:jc w:val="both"/>
+        <w:rPr>
+          <w:rFonts w:hint="default"/>
+          <w:lang w:val="en-US"/>
+        </w:rPr>
+      </w:pPr>
+    </w:p>
+    <w:p>
+      <w:pPr>
+        <w:numPr>
+          <w:ilvl w:val="0"/>
+          <w:numId w:val="0"/>
+        </w:numPr>
+        <w:jc w:val="both"/>
+        <w:rPr>
+          <w:rFonts w:hint="default"/>
+          <w:lang w:val="en-US"/>
+        </w:rPr>
+      </w:pPr>
+      <w:r>
+        <w:rPr>
+          <w:rFonts w:hint="default"/>
+          <w:lang w:val="en-US"/>
+        </w:rPr>
+        <w:t>The above code will redirect you to the Admin Login Page with error message if email or token is not matched with the database else it will redirect you to the reset_password page.</w:t>
+      </w:r>
+    </w:p>
+    <w:p>
+      <w:pPr>
+        <w:numPr>
+          <w:ilvl w:val="0"/>
+          <w:numId w:val="0"/>
+        </w:numPr>
+        <w:jc w:val="both"/>
+        <w:rPr>
+          <w:rFonts w:hint="default"/>
+          <w:lang w:val="en-US"/>
+        </w:rPr>
+      </w:pPr>
+    </w:p>
+    <w:p>
+      <w:pPr>
+        <w:numPr>
+          <w:ilvl w:val="0"/>
+          <w:numId w:val="0"/>
+        </w:numPr>
+        <w:jc w:val="both"/>
+        <w:rPr>
+          <w:rFonts w:hint="default"/>
+          <w:lang w:val="en-US"/>
+        </w:rPr>
+      </w:pPr>
+      <w:r>
+        <w:rPr>
+          <w:rFonts w:hint="default"/>
+          <w:lang w:val="en-US"/>
+        </w:rPr>
+        <w:t>Now you need to create a new file reset_password inside resources-&gt;views-&gt;admin. Here you need to enter the following in the file.</w:t>
+      </w:r>
+    </w:p>
+    <w:p>
+      <w:pPr>
+        <w:numPr>
+          <w:ilvl w:val="0"/>
+          <w:numId w:val="0"/>
+        </w:numPr>
+        <w:jc w:val="both"/>
+        <w:rPr>
+          <w:rFonts w:hint="default"/>
+          <w:lang w:val="en-US"/>
+        </w:rPr>
+      </w:pPr>
+    </w:p>
+    <w:tbl>
+      <w:tblPr>
+        <w:tblStyle w:val="6"/>
+        <w:tblW w:w="0" w:type="auto"/>
+        <w:tblInd w:w="0" w:type="dxa"/>
+        <w:tblBorders>
+          <w:top w:val="single" w:color="auto" w:sz="4" w:space="0"/>
+          <w:left w:val="single" w:color="auto" w:sz="4" w:space="0"/>
+          <w:bottom w:val="single" w:color="auto" w:sz="4" w:space="0"/>
+          <w:right w:val="single" w:color="auto" w:sz="4" w:space="0"/>
+          <w:insideH w:val="single" w:color="auto" w:sz="4" w:space="0"/>
+          <w:insideV w:val="single" w:color="auto" w:sz="4" w:space="0"/>
+        </w:tblBorders>
+        <w:tblLayout w:type="autofit"/>
+        <w:tblCellMar>
+          <w:left w:w="108" w:type="dxa"/>
+          <w:right w:w="108" w:type="dxa"/>
+        </w:tblCellMar>
+      </w:tblPr>
+      <w:tblGrid>
+        <w:gridCol w:w="8522"/>
+      </w:tblGrid>
+      <w:tr>
+        <w:tblPrEx>
+          <w:tblBorders>
+            <w:top w:val="single" w:color="auto" w:sz="4" w:space="0"/>
+            <w:left w:val="single" w:color="auto" w:sz="4" w:space="0"/>
+            <w:bottom w:val="single" w:color="auto" w:sz="4" w:space="0"/>
+            <w:right w:val="single" w:color="auto" w:sz="4" w:space="0"/>
+            <w:insideH w:val="single" w:color="auto" w:sz="4" w:space="0"/>
+            <w:insideV w:val="single" w:color="auto" w:sz="4" w:space="0"/>
+          </w:tblBorders>
+          <w:tblCellMar>
+            <w:left w:w="108" w:type="dxa"/>
+            <w:right w:w="108" w:type="dxa"/>
+          </w:tblCellMar>
+        </w:tblPrEx>
+        <w:tc>
+          <w:tcPr>
+            <w:tcW w:w="8522" w:type="dxa"/>
+          </w:tcPr>
+          <w:p>
+            <w:pPr>
+              <w:numPr>
+                <w:ilvl w:val="0"/>
+                <w:numId w:val="0"/>
+              </w:numPr>
+              <w:jc w:val="both"/>
+              <w:rPr>
+                <w:rFonts w:hint="default"/>
+                <w:vertAlign w:val="baseline"/>
+                <w:lang w:val="en-US"/>
+              </w:rPr>
+            </w:pPr>
+          </w:p>
+          <w:p>
+            <w:pPr>
+              <w:numPr>
+                <w:ilvl w:val="0"/>
+                <w:numId w:val="0"/>
+              </w:numPr>
+              <w:jc w:val="both"/>
+              <w:rPr>
+                <w:rFonts w:hint="default"/>
+                <w:vertAlign w:val="baseline"/>
+                <w:lang w:val="en-US"/>
+              </w:rPr>
+            </w:pPr>
+            <w:r>
+              <w:rPr>
+                <w:rFonts w:hint="default"/>
+                <w:vertAlign w:val="baseline"/>
+                <w:lang w:val="en-US"/>
+              </w:rPr>
+              <w:t>&lt;html&gt;</w:t>
+            </w:r>
+          </w:p>
+          <w:p>
+            <w:pPr>
+              <w:numPr>
+                <w:ilvl w:val="0"/>
+                <w:numId w:val="0"/>
+              </w:numPr>
+              <w:jc w:val="both"/>
+              <w:rPr>
+                <w:rFonts w:hint="default"/>
+                <w:vertAlign w:val="baseline"/>
+                <w:lang w:val="en-US"/>
+              </w:rPr>
+            </w:pPr>
+            <w:r>
+              <w:rPr>
+                <w:rFonts w:hint="default"/>
+                <w:vertAlign w:val="baseline"/>
+                <w:lang w:val="en-US"/>
+              </w:rPr>
+              <w:t>&lt;title&gt;Reset Password Page&lt;/title&gt;</w:t>
+            </w:r>
+          </w:p>
+          <w:p>
+            <w:pPr>
+              <w:numPr>
+                <w:ilvl w:val="0"/>
+                <w:numId w:val="0"/>
+              </w:numPr>
+              <w:jc w:val="both"/>
+              <w:rPr>
+                <w:rFonts w:hint="default"/>
+                <w:vertAlign w:val="baseline"/>
+                <w:lang w:val="en-US"/>
+              </w:rPr>
+            </w:pPr>
+            <w:r>
+              <w:rPr>
+                <w:rFonts w:hint="default"/>
+                <w:vertAlign w:val="baseline"/>
+                <w:lang w:val="en-US"/>
+              </w:rPr>
+              <w:t>&lt;link href="https://cdn.jsdelivr.net/npm/bootstrap@6.0.0-alpha.1/dist/css/bootstrap.min.css" rel="stylesheet" integrity="sha384-B/GM4XqrwHnWXNOWMbloTmrYXZg10cakYGmpfsR/bbzQ6JAJI4ihuyADKLnBgrCe" crossorigin="anonymous"&gt;</w:t>
+            </w:r>
+          </w:p>
+          <w:p>
+            <w:pPr>
+              <w:numPr>
+                <w:ilvl w:val="0"/>
+                <w:numId w:val="0"/>
+              </w:numPr>
+              <w:jc w:val="both"/>
+              <w:rPr>
+                <w:rFonts w:hint="default"/>
+                <w:vertAlign w:val="baseline"/>
+                <w:lang w:val="en-US"/>
+              </w:rPr>
+            </w:pPr>
+            <w:r>
+              <w:rPr>
+                <w:rFonts w:hint="default"/>
+                <w:vertAlign w:val="baseline"/>
+                <w:lang w:val="en-US"/>
+              </w:rPr>
+              <w:t>&lt;body class="container"&gt;</w:t>
+            </w:r>
+          </w:p>
+          <w:p>
+            <w:pPr>
+              <w:numPr>
+                <w:ilvl w:val="0"/>
+                <w:numId w:val="0"/>
+              </w:numPr>
+              <w:jc w:val="both"/>
+              <w:rPr>
+                <w:rFonts w:hint="default"/>
+                <w:vertAlign w:val="baseline"/>
+                <w:lang w:val="en-US"/>
+              </w:rPr>
+            </w:pPr>
+            <w:r>
+              <w:rPr>
+                <w:rFonts w:hint="default"/>
+                <w:vertAlign w:val="baseline"/>
+                <w:lang w:val="en-US"/>
+              </w:rPr>
+              <w:t>&lt;h1&gt;Reset Password&lt;/h1&gt;</w:t>
+            </w:r>
+          </w:p>
+          <w:p>
+            <w:pPr>
+              <w:numPr>
+                <w:ilvl w:val="0"/>
+                <w:numId w:val="0"/>
+              </w:numPr>
+              <w:jc w:val="both"/>
+              <w:rPr>
+                <w:rFonts w:hint="default"/>
+                <w:vertAlign w:val="baseline"/>
+                <w:lang w:val="en-US"/>
+              </w:rPr>
+            </w:pPr>
+          </w:p>
+          <w:p>
+            <w:pPr>
+              <w:numPr>
+                <w:ilvl w:val="0"/>
+                <w:numId w:val="0"/>
+              </w:numPr>
+              <w:jc w:val="both"/>
+              <w:rPr>
+                <w:rFonts w:hint="default"/>
+                <w:vertAlign w:val="baseline"/>
+                <w:lang w:val="en-US"/>
+              </w:rPr>
+            </w:pPr>
+            <w:r>
+              <w:rPr>
+                <w:rFonts w:hint="default"/>
+                <w:vertAlign w:val="baseline"/>
+                <w:lang w:val="en-US"/>
+              </w:rPr>
+              <w:t>@if($errors-&gt;any())</w:t>
+            </w:r>
+          </w:p>
+          <w:p>
+            <w:pPr>
+              <w:numPr>
+                <w:ilvl w:val="0"/>
+                <w:numId w:val="0"/>
+              </w:numPr>
+              <w:jc w:val="both"/>
+              <w:rPr>
+                <w:rFonts w:hint="default"/>
+                <w:vertAlign w:val="baseline"/>
+                <w:lang w:val="en-US"/>
+              </w:rPr>
+            </w:pPr>
+            <w:r>
+              <w:rPr>
+                <w:rFonts w:hint="default"/>
+                <w:vertAlign w:val="baseline"/>
+                <w:lang w:val="en-US"/>
+              </w:rPr>
+              <w:t xml:space="preserve">    @foreach($errors-&gt;all() as $error)</w:t>
+            </w:r>
+          </w:p>
+          <w:p>
+            <w:pPr>
+              <w:numPr>
+                <w:ilvl w:val="0"/>
+                <w:numId w:val="0"/>
+              </w:numPr>
+              <w:jc w:val="both"/>
+              <w:rPr>
+                <w:rFonts w:hint="default"/>
+                <w:vertAlign w:val="baseline"/>
+                <w:lang w:val="en-US"/>
+              </w:rPr>
+            </w:pPr>
+            <w:r>
+              <w:rPr>
+                <w:rFonts w:hint="default"/>
+                <w:vertAlign w:val="baseline"/>
+                <w:lang w:val="en-US"/>
+              </w:rPr>
+              <w:t xml:space="preserve">        &lt;li&gt;{{$error}}&lt;/li&gt;</w:t>
+            </w:r>
+          </w:p>
+          <w:p>
+            <w:pPr>
+              <w:numPr>
+                <w:ilvl w:val="0"/>
+                <w:numId w:val="0"/>
+              </w:numPr>
+              <w:jc w:val="both"/>
+              <w:rPr>
+                <w:rFonts w:hint="default"/>
+                <w:vertAlign w:val="baseline"/>
+                <w:lang w:val="en-US"/>
+              </w:rPr>
+            </w:pPr>
+            <w:r>
+              <w:rPr>
+                <w:rFonts w:hint="default"/>
+                <w:vertAlign w:val="baseline"/>
+                <w:lang w:val="en-US"/>
+              </w:rPr>
+              <w:t xml:space="preserve">    @endforeach</w:t>
+            </w:r>
+          </w:p>
+          <w:p>
+            <w:pPr>
+              <w:numPr>
+                <w:ilvl w:val="0"/>
+                <w:numId w:val="0"/>
+              </w:numPr>
+              <w:jc w:val="both"/>
+              <w:rPr>
+                <w:rFonts w:hint="default"/>
+                <w:vertAlign w:val="baseline"/>
+                <w:lang w:val="en-US"/>
+              </w:rPr>
+            </w:pPr>
+            <w:r>
+              <w:rPr>
+                <w:rFonts w:hint="default"/>
+                <w:vertAlign w:val="baseline"/>
+                <w:lang w:val="en-US"/>
+              </w:rPr>
+              <w:t>@endif</w:t>
+            </w:r>
+          </w:p>
+          <w:p>
+            <w:pPr>
+              <w:numPr>
+                <w:ilvl w:val="0"/>
+                <w:numId w:val="0"/>
+              </w:numPr>
+              <w:jc w:val="both"/>
+              <w:rPr>
+                <w:rFonts w:hint="default"/>
+                <w:vertAlign w:val="baseline"/>
+                <w:lang w:val="en-US"/>
+              </w:rPr>
+            </w:pPr>
+          </w:p>
+          <w:p>
+            <w:pPr>
+              <w:numPr>
+                <w:ilvl w:val="0"/>
+                <w:numId w:val="0"/>
+              </w:numPr>
+              <w:jc w:val="both"/>
+              <w:rPr>
+                <w:rFonts w:hint="default"/>
+                <w:vertAlign w:val="baseline"/>
+                <w:lang w:val="en-US"/>
+              </w:rPr>
+            </w:pPr>
+            <w:r>
+              <w:rPr>
+                <w:rFonts w:hint="default"/>
+                <w:vertAlign w:val="baseline"/>
+                <w:lang w:val="en-US"/>
+              </w:rPr>
+              <w:t>@if(Session::has('error'))</w:t>
+            </w:r>
+          </w:p>
+          <w:p>
+            <w:pPr>
+              <w:numPr>
+                <w:ilvl w:val="0"/>
+                <w:numId w:val="0"/>
+              </w:numPr>
+              <w:jc w:val="both"/>
+              <w:rPr>
+                <w:rFonts w:hint="default"/>
+                <w:vertAlign w:val="baseline"/>
+                <w:lang w:val="en-US"/>
+              </w:rPr>
+            </w:pPr>
+            <w:r>
+              <w:rPr>
+                <w:rFonts w:hint="default"/>
+                <w:vertAlign w:val="baseline"/>
+                <w:lang w:val="en-US"/>
+              </w:rPr>
+              <w:t xml:space="preserve">    &lt;li&gt;{{Session::get('error')}}&lt;/li&gt;</w:t>
+            </w:r>
+          </w:p>
+          <w:p>
+            <w:pPr>
+              <w:numPr>
+                <w:ilvl w:val="0"/>
+                <w:numId w:val="0"/>
+              </w:numPr>
+              <w:jc w:val="both"/>
+              <w:rPr>
+                <w:rFonts w:hint="default"/>
+                <w:vertAlign w:val="baseline"/>
+                <w:lang w:val="en-US"/>
+              </w:rPr>
+            </w:pPr>
+            <w:r>
+              <w:rPr>
+                <w:rFonts w:hint="default"/>
+                <w:vertAlign w:val="baseline"/>
+                <w:lang w:val="en-US"/>
+              </w:rPr>
+              <w:t>@endif</w:t>
+            </w:r>
+          </w:p>
+          <w:p>
+            <w:pPr>
+              <w:numPr>
+                <w:ilvl w:val="0"/>
+                <w:numId w:val="0"/>
+              </w:numPr>
+              <w:jc w:val="both"/>
+              <w:rPr>
+                <w:rFonts w:hint="default"/>
+                <w:vertAlign w:val="baseline"/>
+                <w:lang w:val="en-US"/>
+              </w:rPr>
+            </w:pPr>
+            <w:r>
+              <w:rPr>
+                <w:rFonts w:hint="default"/>
+                <w:vertAlign w:val="baseline"/>
+                <w:lang w:val="en-US"/>
+              </w:rPr>
+              <w:t>@if(Session::has('success'))</w:t>
+            </w:r>
+          </w:p>
+          <w:p>
+            <w:pPr>
+              <w:numPr>
+                <w:ilvl w:val="0"/>
+                <w:numId w:val="0"/>
+              </w:numPr>
+              <w:jc w:val="both"/>
+              <w:rPr>
+                <w:rFonts w:hint="default"/>
+                <w:vertAlign w:val="baseline"/>
+                <w:lang w:val="en-US"/>
+              </w:rPr>
+            </w:pPr>
+            <w:r>
+              <w:rPr>
+                <w:rFonts w:hint="default"/>
+                <w:vertAlign w:val="baseline"/>
+                <w:lang w:val="en-US"/>
+              </w:rPr>
+              <w:t xml:space="preserve">    &lt;li&gt;{{Session::get('success')}}&lt;/li&gt;</w:t>
+            </w:r>
+          </w:p>
+          <w:p>
+            <w:pPr>
+              <w:numPr>
+                <w:ilvl w:val="0"/>
+                <w:numId w:val="0"/>
+              </w:numPr>
+              <w:jc w:val="both"/>
+              <w:rPr>
+                <w:rFonts w:hint="default"/>
+                <w:vertAlign w:val="baseline"/>
+                <w:lang w:val="en-US"/>
+              </w:rPr>
+            </w:pPr>
+            <w:r>
+              <w:rPr>
+                <w:rFonts w:hint="default"/>
+                <w:vertAlign w:val="baseline"/>
+                <w:lang w:val="en-US"/>
+              </w:rPr>
+              <w:t>@endif</w:t>
+            </w:r>
+          </w:p>
+          <w:p>
+            <w:pPr>
+              <w:numPr>
+                <w:ilvl w:val="0"/>
+                <w:numId w:val="0"/>
+              </w:numPr>
+              <w:jc w:val="both"/>
+              <w:rPr>
+                <w:rFonts w:hint="default"/>
+                <w:vertAlign w:val="baseline"/>
+                <w:lang w:val="en-US"/>
+              </w:rPr>
+            </w:pPr>
+          </w:p>
+          <w:p>
+            <w:pPr>
+              <w:numPr>
+                <w:ilvl w:val="0"/>
+                <w:numId w:val="0"/>
+              </w:numPr>
+              <w:jc w:val="both"/>
+              <w:rPr>
+                <w:rFonts w:hint="default"/>
+                <w:vertAlign w:val="baseline"/>
+                <w:lang w:val="en-US"/>
+              </w:rPr>
+            </w:pPr>
+            <w:r>
+              <w:rPr>
+                <w:rFonts w:hint="default"/>
+                <w:vertAlign w:val="baseline"/>
+                <w:lang w:val="en-US"/>
+              </w:rPr>
+              <w:t>&lt;form action="{{route('admin.login_submit')}}" method="post"&gt;</w:t>
+            </w:r>
+          </w:p>
+          <w:p>
+            <w:pPr>
+              <w:numPr>
+                <w:ilvl w:val="0"/>
+                <w:numId w:val="0"/>
+              </w:numPr>
+              <w:jc w:val="both"/>
+              <w:rPr>
+                <w:rFonts w:hint="default"/>
+                <w:vertAlign w:val="baseline"/>
+                <w:lang w:val="en-US"/>
+              </w:rPr>
+            </w:pPr>
+            <w:r>
+              <w:rPr>
+                <w:rFonts w:hint="default"/>
+                <w:vertAlign w:val="baseline"/>
+                <w:lang w:val="en-US"/>
+              </w:rPr>
+              <w:t xml:space="preserve">    @csrf</w:t>
+            </w:r>
+          </w:p>
+          <w:p>
+            <w:pPr>
+              <w:numPr>
+                <w:ilvl w:val="0"/>
+                <w:numId w:val="0"/>
+              </w:numPr>
+              <w:jc w:val="both"/>
+              <w:rPr>
+                <w:rFonts w:hint="default"/>
+                <w:vertAlign w:val="baseline"/>
+                <w:lang w:val="en-US"/>
+              </w:rPr>
+            </w:pPr>
+            <w:r>
+              <w:rPr>
+                <w:rFonts w:hint="default"/>
+                <w:vertAlign w:val="baseline"/>
+                <w:lang w:val="en-US"/>
+              </w:rPr>
+              <w:t xml:space="preserve">    &lt;input type="hidden" name="token" value="{{$token}}"&gt;</w:t>
+            </w:r>
+          </w:p>
+          <w:p>
+            <w:pPr>
+              <w:numPr>
+                <w:ilvl w:val="0"/>
+                <w:numId w:val="0"/>
+              </w:numPr>
+              <w:jc w:val="both"/>
+              <w:rPr>
+                <w:rFonts w:hint="default"/>
+                <w:vertAlign w:val="baseline"/>
+                <w:lang w:val="en-US"/>
+              </w:rPr>
+            </w:pPr>
+            <w:r>
+              <w:rPr>
+                <w:rFonts w:hint="default"/>
+                <w:vertAlign w:val="baseline"/>
+                <w:lang w:val="en-US"/>
+              </w:rPr>
+              <w:t xml:space="preserve">    &lt;input type="hidden" name="email" value="{{$email}}"&gt;</w:t>
+            </w:r>
+          </w:p>
+          <w:p>
+            <w:pPr>
+              <w:numPr>
+                <w:ilvl w:val="0"/>
+                <w:numId w:val="0"/>
+              </w:numPr>
+              <w:jc w:val="both"/>
+              <w:rPr>
+                <w:rFonts w:hint="default"/>
+                <w:vertAlign w:val="baseline"/>
+                <w:lang w:val="en-US"/>
+              </w:rPr>
+            </w:pPr>
+            <w:r>
+              <w:rPr>
+                <w:rFonts w:hint="default"/>
+                <w:vertAlign w:val="baseline"/>
+                <w:lang w:val="en-US"/>
+              </w:rPr>
+              <w:t xml:space="preserve">    &lt;div class="mb-3"&gt;</w:t>
+            </w:r>
+          </w:p>
+          <w:p>
+            <w:pPr>
+              <w:numPr>
+                <w:ilvl w:val="0"/>
+                <w:numId w:val="0"/>
+              </w:numPr>
+              <w:jc w:val="both"/>
+              <w:rPr>
+                <w:rFonts w:hint="default"/>
+                <w:vertAlign w:val="baseline"/>
+                <w:lang w:val="en-US"/>
+              </w:rPr>
+            </w:pPr>
+            <w:r>
+              <w:rPr>
+                <w:rFonts w:hint="default"/>
+                <w:vertAlign w:val="baseline"/>
+                <w:lang w:val="en-US"/>
+              </w:rPr>
+              <w:t xml:space="preserve">        &lt;label for="exampleInputEmail1" class="form-label"&gt;New Password&lt;/label&gt;</w:t>
+            </w:r>
+          </w:p>
+          <w:p>
+            <w:pPr>
+              <w:numPr>
+                <w:ilvl w:val="0"/>
+                <w:numId w:val="0"/>
+              </w:numPr>
+              <w:jc w:val="both"/>
+              <w:rPr>
+                <w:rFonts w:hint="default"/>
+                <w:vertAlign w:val="baseline"/>
+                <w:lang w:val="en-US"/>
+              </w:rPr>
+            </w:pPr>
+            <w:r>
+              <w:rPr>
+                <w:rFonts w:hint="default"/>
+                <w:vertAlign w:val="baseline"/>
+                <w:lang w:val="en-US"/>
+              </w:rPr>
+              <w:t xml:space="preserve">        &lt;input type="password" name="password" class="form-control" id="exampleInputEmail1" aria-describedby="emailHelp"&gt;</w:t>
+            </w:r>
+          </w:p>
+          <w:p>
+            <w:pPr>
+              <w:numPr>
+                <w:ilvl w:val="0"/>
+                <w:numId w:val="0"/>
+              </w:numPr>
+              <w:jc w:val="both"/>
+              <w:rPr>
+                <w:rFonts w:hint="default"/>
+                <w:vertAlign w:val="baseline"/>
+                <w:lang w:val="en-US"/>
+              </w:rPr>
+            </w:pPr>
+            <w:r>
+              <w:rPr>
+                <w:rFonts w:hint="default"/>
+                <w:vertAlign w:val="baseline"/>
+                <w:lang w:val="en-US"/>
+              </w:rPr>
+              <w:t xml:space="preserve">    &lt;/div&gt;</w:t>
+            </w:r>
+          </w:p>
+          <w:p>
+            <w:pPr>
+              <w:numPr>
+                <w:ilvl w:val="0"/>
+                <w:numId w:val="0"/>
+              </w:numPr>
+              <w:jc w:val="both"/>
+              <w:rPr>
+                <w:rFonts w:hint="default"/>
+                <w:vertAlign w:val="baseline"/>
+                <w:lang w:val="en-US"/>
+              </w:rPr>
+            </w:pPr>
+            <w:r>
+              <w:rPr>
+                <w:rFonts w:hint="default"/>
+                <w:vertAlign w:val="baseline"/>
+                <w:lang w:val="en-US"/>
+              </w:rPr>
+              <w:t xml:space="preserve">    &lt;div class="mb-3"&gt;</w:t>
+            </w:r>
+          </w:p>
+          <w:p>
+            <w:pPr>
+              <w:numPr>
+                <w:ilvl w:val="0"/>
+                <w:numId w:val="0"/>
+              </w:numPr>
+              <w:jc w:val="both"/>
+              <w:rPr>
+                <w:rFonts w:hint="default"/>
+                <w:vertAlign w:val="baseline"/>
+                <w:lang w:val="en-US"/>
+              </w:rPr>
+            </w:pPr>
+            <w:r>
+              <w:rPr>
+                <w:rFonts w:hint="default"/>
+                <w:vertAlign w:val="baseline"/>
+                <w:lang w:val="en-US"/>
+              </w:rPr>
+              <w:t xml:space="preserve">        &lt;label for="exampleInputPassword1" class="form-label"&gt;Confirm New Password&lt;/label&gt;</w:t>
+            </w:r>
+          </w:p>
+          <w:p>
+            <w:pPr>
+              <w:numPr>
+                <w:ilvl w:val="0"/>
+                <w:numId w:val="0"/>
+              </w:numPr>
+              <w:jc w:val="both"/>
+              <w:rPr>
+                <w:rFonts w:hint="default"/>
+                <w:vertAlign w:val="baseline"/>
+                <w:lang w:val="en-US"/>
+              </w:rPr>
+            </w:pPr>
+            <w:r>
+              <w:rPr>
+                <w:rFonts w:hint="default"/>
+                <w:vertAlign w:val="baseline"/>
+                <w:lang w:val="en-US"/>
+              </w:rPr>
+              <w:t xml:space="preserve">        &lt;input type="password" name="password_confirmation" class="form-control" id="exampleInputPassword1"&gt;</w:t>
+            </w:r>
+          </w:p>
+          <w:p>
+            <w:pPr>
+              <w:numPr>
+                <w:ilvl w:val="0"/>
+                <w:numId w:val="0"/>
+              </w:numPr>
+              <w:jc w:val="both"/>
+              <w:rPr>
+                <w:rFonts w:hint="default"/>
+                <w:vertAlign w:val="baseline"/>
+                <w:lang w:val="en-US"/>
+              </w:rPr>
+            </w:pPr>
+            <w:r>
+              <w:rPr>
+                <w:rFonts w:hint="default"/>
+                <w:vertAlign w:val="baseline"/>
+                <w:lang w:val="en-US"/>
+              </w:rPr>
+              <w:t xml:space="preserve">    &lt;/div&gt;</w:t>
+            </w:r>
+          </w:p>
+          <w:p>
+            <w:pPr>
+              <w:numPr>
+                <w:ilvl w:val="0"/>
+                <w:numId w:val="0"/>
+              </w:numPr>
+              <w:jc w:val="both"/>
+              <w:rPr>
+                <w:rFonts w:hint="default"/>
+                <w:vertAlign w:val="baseline"/>
+                <w:lang w:val="en-US"/>
+              </w:rPr>
+            </w:pPr>
+            <w:r>
+              <w:rPr>
+                <w:rFonts w:hint="default"/>
+                <w:vertAlign w:val="baseline"/>
+                <w:lang w:val="en-US"/>
+              </w:rPr>
+              <w:t xml:space="preserve">    &lt;div class="mb-3 form-field"&gt;</w:t>
+            </w:r>
+          </w:p>
+          <w:p>
+            <w:pPr>
+              <w:numPr>
+                <w:ilvl w:val="0"/>
+                <w:numId w:val="0"/>
+              </w:numPr>
+              <w:jc w:val="both"/>
+              <w:rPr>
+                <w:rFonts w:hint="default"/>
+                <w:vertAlign w:val="baseline"/>
+                <w:lang w:val="en-US"/>
+              </w:rPr>
+            </w:pPr>
+          </w:p>
+          <w:p>
+            <w:pPr>
+              <w:numPr>
+                <w:ilvl w:val="0"/>
+                <w:numId w:val="0"/>
+              </w:numPr>
+              <w:jc w:val="both"/>
+              <w:rPr>
+                <w:rFonts w:hint="default"/>
+                <w:vertAlign w:val="baseline"/>
+                <w:lang w:val="en-US"/>
+              </w:rPr>
+            </w:pPr>
+            <w:r>
+              <w:rPr>
+                <w:rFonts w:hint="default"/>
+                <w:vertAlign w:val="baseline"/>
+                <w:lang w:val="en-US"/>
+              </w:rPr>
+              <w:t xml:space="preserve">    &lt;/div&gt;</w:t>
+            </w:r>
+          </w:p>
+          <w:p>
+            <w:pPr>
+              <w:numPr>
+                <w:ilvl w:val="0"/>
+                <w:numId w:val="0"/>
+              </w:numPr>
+              <w:jc w:val="both"/>
+              <w:rPr>
+                <w:rFonts w:hint="default"/>
+                <w:vertAlign w:val="baseline"/>
+                <w:lang w:val="en-US"/>
+              </w:rPr>
+            </w:pPr>
+            <w:r>
+              <w:rPr>
+                <w:rFonts w:hint="default"/>
+                <w:vertAlign w:val="baseline"/>
+                <w:lang w:val="en-US"/>
+              </w:rPr>
+              <w:t xml:space="preserve">    &lt;button type="submit" class="btn-solid theme-primary"&gt;Submit&lt;/button&gt;</w:t>
+            </w:r>
+          </w:p>
+          <w:p>
+            <w:pPr>
+              <w:numPr>
+                <w:ilvl w:val="0"/>
+                <w:numId w:val="0"/>
+              </w:numPr>
+              <w:jc w:val="both"/>
+              <w:rPr>
+                <w:rFonts w:hint="default"/>
+                <w:vertAlign w:val="baseline"/>
+                <w:lang w:val="en-US"/>
+              </w:rPr>
+            </w:pPr>
+            <w:r>
+              <w:rPr>
+                <w:rFonts w:hint="default"/>
+                <w:vertAlign w:val="baseline"/>
+                <w:lang w:val="en-US"/>
+              </w:rPr>
+              <w:t>&lt;/form&gt;</w:t>
+            </w:r>
+          </w:p>
+          <w:p>
+            <w:pPr>
+              <w:numPr>
+                <w:ilvl w:val="0"/>
+                <w:numId w:val="0"/>
+              </w:numPr>
+              <w:jc w:val="both"/>
+              <w:rPr>
+                <w:rFonts w:hint="default"/>
+                <w:vertAlign w:val="baseline"/>
+                <w:lang w:val="en-US"/>
+              </w:rPr>
+            </w:pPr>
+            <w:r>
+              <w:rPr>
+                <w:rFonts w:hint="default"/>
+                <w:vertAlign w:val="baseline"/>
+                <w:lang w:val="en-US"/>
+              </w:rPr>
+              <w:t>&lt;/body&gt;</w:t>
+            </w:r>
+          </w:p>
+          <w:p>
+            <w:pPr>
+              <w:numPr>
+                <w:ilvl w:val="0"/>
+                <w:numId w:val="0"/>
+              </w:numPr>
+              <w:jc w:val="both"/>
+              <w:rPr>
+                <w:rFonts w:hint="default"/>
+                <w:vertAlign w:val="baseline"/>
+                <w:lang w:val="en-US"/>
+              </w:rPr>
+            </w:pPr>
+            <w:r>
+              <w:rPr>
+                <w:rFonts w:hint="default"/>
+                <w:vertAlign w:val="baseline"/>
+                <w:lang w:val="en-US"/>
+              </w:rPr>
+              <w:t>&lt;/html&gt;</w:t>
+            </w:r>
+          </w:p>
+          <w:p>
+            <w:pPr>
+              <w:numPr>
+                <w:ilvl w:val="0"/>
+                <w:numId w:val="0"/>
+              </w:numPr>
+              <w:jc w:val="both"/>
+              <w:rPr>
+                <w:rFonts w:hint="default"/>
+                <w:vertAlign w:val="baseline"/>
+                <w:lang w:val="en-US"/>
+              </w:rPr>
+            </w:pPr>
+          </w:p>
+        </w:tc>
+      </w:tr>
+    </w:tbl>
+    <w:p>
+      <w:pPr>
+        <w:numPr>
+          <w:ilvl w:val="0"/>
+          <w:numId w:val="0"/>
+        </w:numPr>
+        <w:jc w:val="both"/>
+        <w:rPr>
+          <w:rFonts w:hint="default"/>
+          <w:lang w:val="en-US"/>
+        </w:rPr>
+      </w:pPr>
+    </w:p>
+    <w:p>
+      <w:pPr>
+        <w:numPr>
+          <w:ilvl w:val="0"/>
+          <w:numId w:val="0"/>
+        </w:numPr>
+        <w:jc w:val="both"/>
+        <w:rPr>
+          <w:rFonts w:hint="default"/>
+          <w:lang w:val="en-US"/>
+        </w:rPr>
+      </w:pPr>
+      <w:r>
+        <w:rPr>
+          <w:rFonts w:hint="default"/>
+          <w:lang w:val="en-US"/>
+        </w:rPr>
+        <w:t>Now when we click on the reset password link or button in the emal you will be redirected to the following reset_password page.</w:t>
+      </w:r>
+    </w:p>
+    <w:tbl>
+      <w:tblPr>
+        <w:tblStyle w:val="6"/>
+        <w:tblW w:w="0" w:type="auto"/>
+        <w:tblInd w:w="0" w:type="dxa"/>
+        <w:tblBorders>
+          <w:top w:val="single" w:color="auto" w:sz="4" w:space="0"/>
+          <w:left w:val="single" w:color="auto" w:sz="4" w:space="0"/>
+          <w:bottom w:val="single" w:color="auto" w:sz="4" w:space="0"/>
+          <w:right w:val="single" w:color="auto" w:sz="4" w:space="0"/>
+          <w:insideH w:val="single" w:color="auto" w:sz="4" w:space="0"/>
+          <w:insideV w:val="single" w:color="auto" w:sz="4" w:space="0"/>
+        </w:tblBorders>
+        <w:tblLayout w:type="autofit"/>
+        <w:tblCellMar>
+          <w:left w:w="108" w:type="dxa"/>
+          <w:right w:w="108" w:type="dxa"/>
+        </w:tblCellMar>
+      </w:tblPr>
+      <w:tblGrid>
+        <w:gridCol w:w="8522"/>
+      </w:tblGrid>
+      <w:tr>
+        <w:tblPrEx>
+          <w:tblBorders>
+            <w:top w:val="single" w:color="auto" w:sz="4" w:space="0"/>
+            <w:left w:val="single" w:color="auto" w:sz="4" w:space="0"/>
+            <w:bottom w:val="single" w:color="auto" w:sz="4" w:space="0"/>
+            <w:right w:val="single" w:color="auto" w:sz="4" w:space="0"/>
+            <w:insideH w:val="single" w:color="auto" w:sz="4" w:space="0"/>
+            <w:insideV w:val="single" w:color="auto" w:sz="4" w:space="0"/>
+          </w:tblBorders>
+          <w:tblCellMar>
+            <w:left w:w="108" w:type="dxa"/>
+            <w:right w:w="108" w:type="dxa"/>
+          </w:tblCellMar>
+        </w:tblPrEx>
+        <w:tc>
+          <w:tcPr>
+            <w:tcW w:w="8522" w:type="dxa"/>
+          </w:tcPr>
+          <w:p>
+            <w:pPr>
+              <w:numPr>
+                <w:ilvl w:val="0"/>
+                <w:numId w:val="0"/>
+              </w:numPr>
+              <w:jc w:val="both"/>
+              <w:rPr>
+                <w:rFonts w:hint="default"/>
+                <w:vertAlign w:val="baseline"/>
+                <w:lang w:val="en-US"/>
+              </w:rPr>
+            </w:pPr>
+            <w:r>
+              <w:drawing>
+                <wp:inline distT="0" distB="0" distL="114300" distR="114300">
+                  <wp:extent cx="5261610" cy="1374775"/>
+                  <wp:effectExtent l="0" t="0" r="11430" b="12065"/>
+                  <wp:docPr id="86" name="Picture 5"/>
+                  <wp:cNvGraphicFramePr>
+                    <a:graphicFrameLocks xmlns:a="http://schemas.openxmlformats.org/drawingml/2006/main" noChangeAspect="1"/>
+                  </wp:cNvGraphicFramePr>
+                  <a:graphic xmlns:a="http://schemas.openxmlformats.org/drawingml/2006/main">
+                    <a:graphicData uri="http://schemas.openxmlformats.org/drawingml/2006/picture">
+                      <pic:pic xmlns:pic="http://schemas.openxmlformats.org/drawingml/2006/picture">
+                        <pic:nvPicPr>
+                          <pic:cNvPr id="86" name="Picture 5"/>
+                          <pic:cNvPicPr>
+                            <a:picLocks noChangeAspect="1"/>
+                          </pic:cNvPicPr>
+                        </pic:nvPicPr>
+                        <pic:blipFill>
+                          <a:blip r:embed="rId89"/>
+                          <a:stretch>
+                            <a:fillRect/>
+                          </a:stretch>
+                        </pic:blipFill>
+                        <pic:spPr>
+                          <a:xfrm>
+                            <a:off x="0" y="0"/>
+                            <a:ext cx="5261610" cy="1374775"/>
+                          </a:xfrm>
+                          <a:prstGeom prst="rect">
+                            <a:avLst/>
+                          </a:prstGeom>
+                          <a:noFill/>
+                          <a:ln>
+                            <a:noFill/>
+                          </a:ln>
+                        </pic:spPr>
+                      </pic:pic>
+                    </a:graphicData>
+                  </a:graphic>
+                </wp:inline>
+              </w:drawing>
+            </w:r>
+          </w:p>
+        </w:tc>
+      </w:tr>
+    </w:tbl>
+    <w:p>
+      <w:pPr>
+        <w:numPr>
+          <w:ilvl w:val="0"/>
+          <w:numId w:val="0"/>
+        </w:numPr>
+        <w:jc w:val="both"/>
+        <w:rPr>
+          <w:rFonts w:hint="default"/>
+          <w:lang w:val="en-US"/>
+        </w:rPr>
+      </w:pPr>
+    </w:p>
+    <w:p>
+      <w:pPr>
+        <w:numPr>
+          <w:ilvl w:val="0"/>
+          <w:numId w:val="1"/>
+        </w:numPr>
+        <w:ind w:left="0" w:leftChars="0" w:firstLine="0" w:firstLineChars="0"/>
+        <w:jc w:val="both"/>
+        <w:rPr>
+          <w:rFonts w:hint="default"/>
+          <w:b/>
+          <w:bCs/>
+          <w:sz w:val="24"/>
+          <w:szCs w:val="24"/>
+          <w:lang w:val="en-US"/>
+        </w:rPr>
+      </w:pPr>
+      <w:r>
+        <w:rPr>
+          <w:rFonts w:hint="default"/>
+          <w:b/>
+          <w:bCs/>
+          <w:sz w:val="24"/>
+          <w:szCs w:val="24"/>
+          <w:lang w:val="en-US"/>
+        </w:rPr>
+        <w:t>Multi Auth Forget Password for Admin Part 4</w:t>
       </w:r>
       <w:bookmarkStart w:id="0" w:name="_GoBack"/>
       <w:bookmarkEnd w:id="0"/>

</xml_diff>